<commit_message>
feat: crear plantillas para acta entrega analytica
</commit_message>
<xml_diff>
--- a/pesaje/analytica/Report/PrintActaEntrega.docx
+++ b/pesaje/analytica/Report/PrintActaEntrega.docx
@@ -5,37 +5,40 @@
     <w:tbl>
       <w:tblPr>
         <w:tblStyle w:val="Tablaconcuadrcula"/>
-        <w:tblW w:w="11335" w:type="dxa"/>
+        <w:tblW w:w="11477" w:type="dxa"/>
         <w:tblLayout w:type="fixed"/>
         <w:tblLook w:val="04A0" w:firstRow="1" w:lastRow="0" w:firstColumn="1" w:lastColumn="0" w:noHBand="0" w:noVBand="1"/>
       </w:tblPr>
       <w:tblGrid>
-        <w:gridCol w:w="846"/>
+        <w:gridCol w:w="844"/>
         <w:gridCol w:w="1134"/>
-        <w:gridCol w:w="709"/>
+        <w:gridCol w:w="994"/>
+        <w:gridCol w:w="992"/>
+        <w:gridCol w:w="851"/>
         <w:gridCol w:w="567"/>
-        <w:gridCol w:w="425"/>
-        <w:gridCol w:w="992"/>
-        <w:gridCol w:w="1231"/>
-        <w:gridCol w:w="45"/>
-        <w:gridCol w:w="709"/>
+        <w:gridCol w:w="566"/>
+        <w:gridCol w:w="426"/>
+        <w:gridCol w:w="284"/>
         <w:gridCol w:w="1842"/>
-        <w:gridCol w:w="142"/>
-        <w:gridCol w:w="1134"/>
-        <w:gridCol w:w="1559"/>
+        <w:gridCol w:w="426"/>
+        <w:gridCol w:w="1275"/>
+        <w:gridCol w:w="1276"/>
       </w:tblGrid>
       <w:tr>
         <w:tc>
           <w:tcPr>
-            <w:tcW w:w="1980" w:type="dxa"/>
-            <w:gridSpan w:val="2"/>
+            <w:tcW w:w="2972" w:type="dxa"/>
+            <w:gridSpan w:val="3"/>
             <w:vMerge w:val="restart"/>
           </w:tcPr>
           <w:p>
             <w:pPr>
-              <w:rPr>
-                <w:b/>
-                <w:bCs/>
+              <w:jc w:val="center"/>
+              <w:rPr>
+                <w:b/>
+                <w:bCs/>
+                <w:sz w:val="18"/>
+                <w:szCs w:val="18"/>
               </w:rPr>
             </w:pPr>
             <w:r>
@@ -49,15 +52,15 @@
               <mc:AlternateContent>
                 <mc:Choice Requires="wps">
                   <w:drawing>
-                    <wp:anchor distT="0" distB="0" distL="114300" distR="114300" simplePos="0" relativeHeight="251659264" behindDoc="0" locked="0" layoutInCell="1" allowOverlap="1" wp14:anchorId="60653272" wp14:editId="468D6A2A">
+                    <wp:anchor distT="0" distB="0" distL="114300" distR="114300" simplePos="0" relativeHeight="251676672" behindDoc="0" locked="0" layoutInCell="1" allowOverlap="1" wp14:anchorId="7F7A92DC" wp14:editId="01BEA7ED">
                       <wp:simplePos x="0" y="0"/>
                       <wp:positionH relativeFrom="margin">
-                        <wp:posOffset>-48895</wp:posOffset>
+                        <wp:posOffset>-39824</wp:posOffset>
                       </wp:positionH>
                       <wp:positionV relativeFrom="paragraph">
-                        <wp:posOffset>106680</wp:posOffset>
+                        <wp:posOffset>-3810</wp:posOffset>
                       </wp:positionV>
-                      <wp:extent cx="1176867" cy="694944"/>
+                      <wp:extent cx="1839686" cy="968828"/>
                       <wp:effectExtent l="0" t="0" r="0" b="0"/>
                       <wp:wrapNone/>
                       <wp:docPr id="782399144" name="Rectángulo: esquinas redondeadas 782399144"/>
@@ -73,7 +76,7 @@
                             <wps:spPr bwMode="auto">
                               <a:xfrm>
                                 <a:off x="0" y="0"/>
-                                <a:ext cx="1176867" cy="694944"/>
+                                <a:ext cx="1839686" cy="968828"/>
                               </a:xfrm>
                               <a:prstGeom prst="roundRect">
                                 <a:avLst>
@@ -155,7 +158,7 @@
                 </mc:Choice>
                 <mc:Fallback>
                   <w:pict>
-                    <v:roundrect w14:anchorId="60653272" id="Rectángulo: esquinas redondeadas 782399144" o:spid="_x0000_s1026" style="position:absolute;margin-left:-3.85pt;margin-top:8.4pt;width:92.65pt;height:54.7pt;z-index:251659264;visibility:visible;mso-wrap-style:square;mso-width-percent:0;mso-height-percent:0;mso-wrap-distance-left:9pt;mso-wrap-distance-top:0;mso-wrap-distance-right:9pt;mso-wrap-distance-bottom:0;mso-position-horizontal:absolute;mso-position-horizontal-relative:margin;mso-position-vertical:absolute;mso-position-vertical-relative:text;mso-width-percent:0;mso-height-percent:0;mso-width-relative:margin;mso-height-relative:margin;v-text-anchor:top" arcsize="10923f" o:gfxdata="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" filled="f" stroked="f">
+                    <v:roundrect w14:anchorId="7F7A92DC" id="Rectángulo: esquinas redondeadas 782399144" o:spid="_x0000_s1026" style="position:absolute;left:0;text-align:left;margin-left:-3.15pt;margin-top:-.3pt;width:144.85pt;height:76.3pt;z-index:251676672;visibility:visible;mso-wrap-style:square;mso-width-percent:0;mso-height-percent:0;mso-wrap-distance-left:9pt;mso-wrap-distance-top:0;mso-wrap-distance-right:9pt;mso-wrap-distance-bottom:0;mso-position-horizontal:absolute;mso-position-horizontal-relative:margin;mso-position-vertical:absolute;mso-position-vertical-relative:text;mso-width-percent:0;mso-height-percent:0;mso-width-relative:margin;mso-height-relative:margin;v-text-anchor:top" arcsize="10923f" o:gfxdata="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" filled="f" stroked="f">
                       <v:stroke joinstyle="miter"/>
                       <v:textbox>
                         <w:txbxContent>
@@ -217,8 +220,8 @@
         </w:tc>
         <w:tc>
           <w:tcPr>
-            <w:tcW w:w="6662" w:type="dxa"/>
-            <w:gridSpan w:val="9"/>
+            <w:tcW w:w="5954" w:type="dxa"/>
+            <w:gridSpan w:val="8"/>
           </w:tcPr>
           <w:p>
             <w:pPr>
@@ -243,7 +246,7 @@
         </w:tc>
         <w:tc>
           <w:tcPr>
-            <w:tcW w:w="2693" w:type="dxa"/>
+            <w:tcW w:w="2551" w:type="dxa"/>
             <w:gridSpan w:val="2"/>
             <w:vMerge w:val="restart"/>
           </w:tcPr>
@@ -286,23 +289,26 @@
       <w:tr>
         <w:tc>
           <w:tcPr>
-            <w:tcW w:w="1980" w:type="dxa"/>
-            <w:gridSpan w:val="2"/>
+            <w:tcW w:w="2972" w:type="dxa"/>
+            <w:gridSpan w:val="3"/>
             <w:vMerge/>
           </w:tcPr>
           <w:p>
             <w:pPr>
-              <w:rPr>
-                <w:b/>
-                <w:bCs/>
+              <w:jc w:val="center"/>
+              <w:rPr>
+                <w:b/>
+                <w:bCs/>
+                <w:sz w:val="18"/>
+                <w:szCs w:val="18"/>
               </w:rPr>
             </w:pPr>
           </w:p>
         </w:tc>
         <w:tc>
           <w:tcPr>
-            <w:tcW w:w="6662" w:type="dxa"/>
-            <w:gridSpan w:val="9"/>
+            <w:tcW w:w="5954" w:type="dxa"/>
+            <w:gridSpan w:val="8"/>
           </w:tcPr>
           <w:p>
             <w:pPr>
@@ -327,7 +333,7 @@
         </w:tc>
         <w:tc>
           <w:tcPr>
-            <w:tcW w:w="2693" w:type="dxa"/>
+            <w:tcW w:w="2551" w:type="dxa"/>
             <w:gridSpan w:val="2"/>
             <w:vMerge/>
           </w:tcPr>
@@ -344,8 +350,8 @@
       <w:tr>
         <w:tc>
           <w:tcPr>
-            <w:tcW w:w="1980" w:type="dxa"/>
-            <w:gridSpan w:val="2"/>
+            <w:tcW w:w="2972" w:type="dxa"/>
+            <w:gridSpan w:val="3"/>
             <w:vMerge/>
           </w:tcPr>
           <w:p>
@@ -353,14 +359,15 @@
               <w:rPr>
                 <w:b/>
                 <w:bCs/>
+                <w:sz w:val="18"/>
+                <w:szCs w:val="18"/>
               </w:rPr>
             </w:pPr>
           </w:p>
         </w:tc>
         <w:tc>
           <w:tcPr>
-            <w:tcW w:w="2693" w:type="dxa"/>
-            <w:gridSpan w:val="4"/>
+            <w:tcW w:w="992" w:type="dxa"/>
           </w:tcPr>
           <w:p>
             <w:pPr>
@@ -384,8 +391,8 @@
         </w:tc>
         <w:tc>
           <w:tcPr>
-            <w:tcW w:w="3969" w:type="dxa"/>
-            <w:gridSpan w:val="5"/>
+            <w:tcW w:w="4962" w:type="dxa"/>
+            <w:gridSpan w:val="7"/>
           </w:tcPr>
           <w:p>
             <w:pPr>
@@ -434,7 +441,7 @@
         </w:tc>
         <w:tc>
           <w:tcPr>
-            <w:tcW w:w="2693" w:type="dxa"/>
+            <w:tcW w:w="2551" w:type="dxa"/>
             <w:gridSpan w:val="2"/>
             <w:vMerge/>
           </w:tcPr>
@@ -451,8 +458,8 @@
       <w:tr>
         <w:tc>
           <w:tcPr>
-            <w:tcW w:w="1980" w:type="dxa"/>
-            <w:gridSpan w:val="2"/>
+            <w:tcW w:w="2972" w:type="dxa"/>
+            <w:gridSpan w:val="3"/>
             <w:vMerge/>
           </w:tcPr>
           <w:p>
@@ -460,13 +467,39 @@
               <w:rPr>
                 <w:b/>
                 <w:bCs/>
+                <w:sz w:val="18"/>
+                <w:szCs w:val="18"/>
               </w:rPr>
             </w:pPr>
           </w:p>
         </w:tc>
         <w:tc>
           <w:tcPr>
-            <w:tcW w:w="1276" w:type="dxa"/>
+            <w:tcW w:w="992" w:type="dxa"/>
+          </w:tcPr>
+          <w:p>
+            <w:pPr>
+              <w:rPr>
+                <w:b/>
+                <w:bCs/>
+                <w:sz w:val="18"/>
+                <w:szCs w:val="18"/>
+              </w:rPr>
+            </w:pPr>
+            <w:r>
+              <w:rPr>
+                <w:b/>
+                <w:bCs/>
+                <w:sz w:val="18"/>
+                <w:szCs w:val="18"/>
+              </w:rPr>
+              <w:t>CODIGO</w:t>
+            </w:r>
+          </w:p>
+        </w:tc>
+        <w:tc>
+          <w:tcPr>
+            <w:tcW w:w="1418" w:type="dxa"/>
             <w:gridSpan w:val="2"/>
           </w:tcPr>
           <w:p>
@@ -480,18 +513,45 @@
             </w:pPr>
             <w:r>
               <w:rPr>
-                <w:b/>
-                <w:bCs/>
-                <w:sz w:val="18"/>
-                <w:szCs w:val="18"/>
-              </w:rPr>
-              <w:t>CODIGO</w:t>
+                <w:sz w:val="18"/>
+                <w:szCs w:val="18"/>
+              </w:rPr>
+              <w:fldChar w:fldCharType="begin"/>
+            </w:r>
+            <w:r>
+              <w:rPr>
+                <w:sz w:val="18"/>
+                <w:szCs w:val="18"/>
+              </w:rPr>
+              <w:instrText xml:space="preserve"> MERGEFIELD  nro_acta  \* MERGEFORMAT </w:instrText>
+            </w:r>
+            <w:r>
+              <w:rPr>
+                <w:sz w:val="18"/>
+                <w:szCs w:val="18"/>
+              </w:rPr>
+              <w:fldChar w:fldCharType="separate"/>
+            </w:r>
+            <w:r>
+              <w:rPr>
+                <w:noProof/>
+                <w:sz w:val="18"/>
+                <w:szCs w:val="18"/>
+              </w:rPr>
+              <w:t>«nro_acta»</w:t>
+            </w:r>
+            <w:r>
+              <w:rPr>
+                <w:sz w:val="18"/>
+                <w:szCs w:val="18"/>
+              </w:rPr>
+              <w:fldChar w:fldCharType="end"/>
             </w:r>
           </w:p>
         </w:tc>
         <w:tc>
           <w:tcPr>
-            <w:tcW w:w="1417" w:type="dxa"/>
+            <w:tcW w:w="992" w:type="dxa"/>
             <w:gridSpan w:val="2"/>
           </w:tcPr>
           <w:p>
@@ -505,45 +565,19 @@
             </w:pPr>
             <w:r>
               <w:rPr>
-                <w:sz w:val="18"/>
-                <w:szCs w:val="18"/>
-              </w:rPr>
-              <w:fldChar w:fldCharType="begin"/>
-            </w:r>
-            <w:r>
-              <w:rPr>
-                <w:sz w:val="18"/>
-                <w:szCs w:val="18"/>
-              </w:rPr>
-              <w:instrText xml:space="preserve"> MERGEFIELD  nro_acta  \* MERGEFORMAT </w:instrText>
-            </w:r>
-            <w:r>
-              <w:rPr>
-                <w:sz w:val="18"/>
-                <w:szCs w:val="18"/>
-              </w:rPr>
-              <w:fldChar w:fldCharType="separate"/>
-            </w:r>
-            <w:r>
-              <w:rPr>
-                <w:noProof/>
-                <w:sz w:val="18"/>
-                <w:szCs w:val="18"/>
-              </w:rPr>
-              <w:t>«nro_acta»</w:t>
-            </w:r>
-            <w:r>
-              <w:rPr>
-                <w:sz w:val="18"/>
-                <w:szCs w:val="18"/>
-              </w:rPr>
-              <w:fldChar w:fldCharType="end"/>
+                <w:b/>
+                <w:bCs/>
+                <w:sz w:val="18"/>
+                <w:szCs w:val="18"/>
+              </w:rPr>
+              <w:t>FECHA</w:t>
             </w:r>
           </w:p>
         </w:tc>
         <w:tc>
           <w:tcPr>
-            <w:tcW w:w="1231" w:type="dxa"/>
+            <w:tcW w:w="2552" w:type="dxa"/>
+            <w:gridSpan w:val="3"/>
           </w:tcPr>
           <w:p>
             <w:pPr>
@@ -556,70 +590,45 @@
             </w:pPr>
             <w:r>
               <w:rPr>
-                <w:b/>
-                <w:bCs/>
-                <w:sz w:val="18"/>
-                <w:szCs w:val="18"/>
-              </w:rPr>
-              <w:t>FECHA</w:t>
+                <w:sz w:val="18"/>
+                <w:szCs w:val="18"/>
+              </w:rPr>
+              <w:fldChar w:fldCharType="begin"/>
+            </w:r>
+            <w:r>
+              <w:rPr>
+                <w:sz w:val="18"/>
+                <w:szCs w:val="18"/>
+              </w:rPr>
+              <w:instrText xml:space="preserve"> MERGEFIELD  fecha  \* MERGEFORMAT </w:instrText>
+            </w:r>
+            <w:r>
+              <w:rPr>
+                <w:sz w:val="18"/>
+                <w:szCs w:val="18"/>
+              </w:rPr>
+              <w:fldChar w:fldCharType="separate"/>
+            </w:r>
+            <w:r>
+              <w:rPr>
+                <w:noProof/>
+                <w:sz w:val="18"/>
+                <w:szCs w:val="18"/>
+              </w:rPr>
+              <w:t>«fecha»</w:t>
+            </w:r>
+            <w:r>
+              <w:rPr>
+                <w:sz w:val="18"/>
+                <w:szCs w:val="18"/>
+              </w:rPr>
+              <w:fldChar w:fldCharType="end"/>
             </w:r>
           </w:p>
         </w:tc>
         <w:tc>
           <w:tcPr>
-            <w:tcW w:w="2738" w:type="dxa"/>
-            <w:gridSpan w:val="4"/>
-          </w:tcPr>
-          <w:p>
-            <w:pPr>
-              <w:rPr>
-                <w:b/>
-                <w:bCs/>
-                <w:sz w:val="18"/>
-                <w:szCs w:val="18"/>
-              </w:rPr>
-            </w:pPr>
-            <w:r>
-              <w:rPr>
-                <w:sz w:val="18"/>
-                <w:szCs w:val="18"/>
-              </w:rPr>
-              <w:fldChar w:fldCharType="begin"/>
-            </w:r>
-            <w:r>
-              <w:rPr>
-                <w:sz w:val="18"/>
-                <w:szCs w:val="18"/>
-              </w:rPr>
-              <w:instrText xml:space="preserve"> MERGEFIELD  fecha  \* MERGEFORMAT </w:instrText>
-            </w:r>
-            <w:r>
-              <w:rPr>
-                <w:sz w:val="18"/>
-                <w:szCs w:val="18"/>
-              </w:rPr>
-              <w:fldChar w:fldCharType="separate"/>
-            </w:r>
-            <w:r>
-              <w:rPr>
-                <w:noProof/>
-                <w:sz w:val="18"/>
-                <w:szCs w:val="18"/>
-              </w:rPr>
-              <w:t>«fecha»</w:t>
-            </w:r>
-            <w:r>
-              <w:rPr>
-                <w:sz w:val="18"/>
-                <w:szCs w:val="18"/>
-              </w:rPr>
-              <w:fldChar w:fldCharType="end"/>
-            </w:r>
-          </w:p>
-        </w:tc>
-        <w:tc>
-          <w:tcPr>
-            <w:tcW w:w="2693" w:type="dxa"/>
+            <w:tcW w:w="2551" w:type="dxa"/>
             <w:gridSpan w:val="2"/>
             <w:vMerge/>
           </w:tcPr>
@@ -635,12 +644,12 @@
       </w:tr>
       <w:tr>
         <w:trPr>
-          <w:trHeight w:val="78"/>
+          <w:trHeight w:val="303"/>
         </w:trPr>
         <w:tc>
           <w:tcPr>
-            <w:tcW w:w="1980" w:type="dxa"/>
-            <w:gridSpan w:val="2"/>
+            <w:tcW w:w="2972" w:type="dxa"/>
+            <w:gridSpan w:val="3"/>
             <w:vMerge/>
           </w:tcPr>
           <w:p>
@@ -648,13 +657,39 @@
               <w:rPr>
                 <w:b/>
                 <w:bCs/>
+                <w:sz w:val="18"/>
+                <w:szCs w:val="18"/>
               </w:rPr>
             </w:pPr>
           </w:p>
         </w:tc>
         <w:tc>
           <w:tcPr>
-            <w:tcW w:w="1276" w:type="dxa"/>
+            <w:tcW w:w="992" w:type="dxa"/>
+          </w:tcPr>
+          <w:p>
+            <w:pPr>
+              <w:rPr>
+                <w:b/>
+                <w:bCs/>
+                <w:sz w:val="18"/>
+                <w:szCs w:val="18"/>
+              </w:rPr>
+            </w:pPr>
+            <w:r>
+              <w:rPr>
+                <w:b/>
+                <w:bCs/>
+                <w:sz w:val="18"/>
+                <w:szCs w:val="18"/>
+              </w:rPr>
+              <w:t>GUARDIA</w:t>
+            </w:r>
+          </w:p>
+        </w:tc>
+        <w:tc>
+          <w:tcPr>
+            <w:tcW w:w="1418" w:type="dxa"/>
             <w:gridSpan w:val="2"/>
           </w:tcPr>
           <w:p>
@@ -668,18 +703,45 @@
             </w:pPr>
             <w:r>
               <w:rPr>
-                <w:b/>
-                <w:bCs/>
-                <w:sz w:val="18"/>
-                <w:szCs w:val="18"/>
-              </w:rPr>
-              <w:t>GUARDIA</w:t>
+                <w:sz w:val="18"/>
+                <w:szCs w:val="18"/>
+              </w:rPr>
+              <w:fldChar w:fldCharType="begin"/>
+            </w:r>
+            <w:r>
+              <w:rPr>
+                <w:sz w:val="18"/>
+                <w:szCs w:val="18"/>
+              </w:rPr>
+              <w:instrText xml:space="preserve"> MERGEFIELD  guardia  \* MERGEFORMAT </w:instrText>
+            </w:r>
+            <w:r>
+              <w:rPr>
+                <w:sz w:val="18"/>
+                <w:szCs w:val="18"/>
+              </w:rPr>
+              <w:fldChar w:fldCharType="separate"/>
+            </w:r>
+            <w:r>
+              <w:rPr>
+                <w:noProof/>
+                <w:sz w:val="18"/>
+                <w:szCs w:val="18"/>
+              </w:rPr>
+              <w:t>«guardia»</w:t>
+            </w:r>
+            <w:r>
+              <w:rPr>
+                <w:sz w:val="18"/>
+                <w:szCs w:val="18"/>
+              </w:rPr>
+              <w:fldChar w:fldCharType="end"/>
             </w:r>
           </w:p>
         </w:tc>
         <w:tc>
           <w:tcPr>
-            <w:tcW w:w="1417" w:type="dxa"/>
+            <w:tcW w:w="992" w:type="dxa"/>
             <w:gridSpan w:val="2"/>
           </w:tcPr>
           <w:p>
@@ -693,45 +755,19 @@
             </w:pPr>
             <w:r>
               <w:rPr>
-                <w:sz w:val="18"/>
-                <w:szCs w:val="18"/>
-              </w:rPr>
-              <w:fldChar w:fldCharType="begin"/>
-            </w:r>
-            <w:r>
-              <w:rPr>
-                <w:sz w:val="18"/>
-                <w:szCs w:val="18"/>
-              </w:rPr>
-              <w:instrText xml:space="preserve"> MERGEFIELD  guardia  \* MERGEFORMAT </w:instrText>
-            </w:r>
-            <w:r>
-              <w:rPr>
-                <w:sz w:val="18"/>
-                <w:szCs w:val="18"/>
-              </w:rPr>
-              <w:fldChar w:fldCharType="separate"/>
-            </w:r>
-            <w:r>
-              <w:rPr>
-                <w:noProof/>
-                <w:sz w:val="18"/>
-                <w:szCs w:val="18"/>
-              </w:rPr>
-              <w:t>«guardia»</w:t>
-            </w:r>
-            <w:r>
-              <w:rPr>
-                <w:sz w:val="18"/>
-                <w:szCs w:val="18"/>
-              </w:rPr>
-              <w:fldChar w:fldCharType="end"/>
+                <w:b/>
+                <w:bCs/>
+                <w:sz w:val="18"/>
+                <w:szCs w:val="18"/>
+              </w:rPr>
+              <w:t>HORA</w:t>
             </w:r>
           </w:p>
         </w:tc>
         <w:tc>
           <w:tcPr>
-            <w:tcW w:w="1231" w:type="dxa"/>
+            <w:tcW w:w="2552" w:type="dxa"/>
+            <w:gridSpan w:val="3"/>
           </w:tcPr>
           <w:p>
             <w:pPr>
@@ -744,70 +780,45 @@
             </w:pPr>
             <w:r>
               <w:rPr>
-                <w:b/>
-                <w:bCs/>
-                <w:sz w:val="18"/>
-                <w:szCs w:val="18"/>
-              </w:rPr>
-              <w:t>HORA</w:t>
+                <w:sz w:val="18"/>
+                <w:szCs w:val="18"/>
+              </w:rPr>
+              <w:fldChar w:fldCharType="begin"/>
+            </w:r>
+            <w:r>
+              <w:rPr>
+                <w:sz w:val="18"/>
+                <w:szCs w:val="18"/>
+              </w:rPr>
+              <w:instrText xml:space="preserve"> MERGEFIELD  hora  \* MERGEFORMAT </w:instrText>
+            </w:r>
+            <w:r>
+              <w:rPr>
+                <w:sz w:val="18"/>
+                <w:szCs w:val="18"/>
+              </w:rPr>
+              <w:fldChar w:fldCharType="separate"/>
+            </w:r>
+            <w:r>
+              <w:rPr>
+                <w:noProof/>
+                <w:sz w:val="18"/>
+                <w:szCs w:val="18"/>
+              </w:rPr>
+              <w:t>«hora»</w:t>
+            </w:r>
+            <w:r>
+              <w:rPr>
+                <w:sz w:val="18"/>
+                <w:szCs w:val="18"/>
+              </w:rPr>
+              <w:fldChar w:fldCharType="end"/>
             </w:r>
           </w:p>
         </w:tc>
         <w:tc>
           <w:tcPr>
-            <w:tcW w:w="2738" w:type="dxa"/>
-            <w:gridSpan w:val="4"/>
-          </w:tcPr>
-          <w:p>
-            <w:pPr>
-              <w:rPr>
-                <w:b/>
-                <w:bCs/>
-                <w:sz w:val="18"/>
-                <w:szCs w:val="18"/>
-              </w:rPr>
-            </w:pPr>
-            <w:r>
-              <w:rPr>
-                <w:sz w:val="18"/>
-                <w:szCs w:val="18"/>
-              </w:rPr>
-              <w:fldChar w:fldCharType="begin"/>
-            </w:r>
-            <w:r>
-              <w:rPr>
-                <w:sz w:val="18"/>
-                <w:szCs w:val="18"/>
-              </w:rPr>
-              <w:instrText xml:space="preserve"> MERGEFIELD  hora  \* MERGEFORMAT </w:instrText>
-            </w:r>
-            <w:r>
-              <w:rPr>
-                <w:sz w:val="18"/>
-                <w:szCs w:val="18"/>
-              </w:rPr>
-              <w:fldChar w:fldCharType="separate"/>
-            </w:r>
-            <w:r>
-              <w:rPr>
-                <w:noProof/>
-                <w:sz w:val="18"/>
-                <w:szCs w:val="18"/>
-              </w:rPr>
-              <w:t>«hora»</w:t>
-            </w:r>
-            <w:r>
-              <w:rPr>
-                <w:sz w:val="18"/>
-                <w:szCs w:val="18"/>
-              </w:rPr>
-              <w:fldChar w:fldCharType="end"/>
-            </w:r>
-          </w:p>
-        </w:tc>
-        <w:tc>
-          <w:tcPr>
-            <w:tcW w:w="2693" w:type="dxa"/>
+            <w:tcW w:w="2551" w:type="dxa"/>
             <w:gridSpan w:val="2"/>
             <w:vMerge/>
           </w:tcPr>
@@ -824,24 +835,26 @@
       <w:tr>
         <w:tc>
           <w:tcPr>
-            <w:tcW w:w="846" w:type="dxa"/>
+            <w:tcW w:w="844" w:type="dxa"/>
           </w:tcPr>
           <w:p>
             <w:pPr>
               <w:jc w:val="center"/>
               <w:rPr>
-                <w:b/>
-                <w:bCs/>
-                <w:sz w:val="18"/>
-                <w:szCs w:val="18"/>
+                <w:rFonts w:ascii="Calibri" w:hAnsi="Calibri" w:cs="Calibri"/>
+                <w:b/>
+                <w:bCs/>
+                <w:sz w:val="16"/>
+                <w:szCs w:val="16"/>
               </w:rPr>
             </w:pPr>
             <w:r>
               <w:rPr>
-                <w:b/>
-                <w:bCs/>
-                <w:sz w:val="18"/>
-                <w:szCs w:val="18"/>
+                <w:rFonts w:ascii="Calibri" w:hAnsi="Calibri" w:cs="Calibri"/>
+                <w:b/>
+                <w:bCs/>
+                <w:sz w:val="16"/>
+                <w:szCs w:val="16"/>
               </w:rPr>
               <w:t>ITEM</w:t>
             </w:r>
@@ -855,18 +868,20 @@
             <w:pPr>
               <w:jc w:val="center"/>
               <w:rPr>
-                <w:b/>
-                <w:bCs/>
-                <w:sz w:val="18"/>
-                <w:szCs w:val="18"/>
+                <w:rFonts w:ascii="Calibri" w:hAnsi="Calibri" w:cs="Calibri"/>
+                <w:b/>
+                <w:bCs/>
+                <w:sz w:val="16"/>
+                <w:szCs w:val="16"/>
               </w:rPr>
             </w:pPr>
             <w:r>
               <w:rPr>
-                <w:b/>
-                <w:bCs/>
-                <w:sz w:val="18"/>
-                <w:szCs w:val="18"/>
+                <w:rFonts w:ascii="Calibri" w:hAnsi="Calibri" w:cs="Calibri"/>
+                <w:b/>
+                <w:bCs/>
+                <w:sz w:val="16"/>
+                <w:szCs w:val="16"/>
               </w:rPr>
               <w:t>CODIGO</w:t>
             </w:r>
@@ -874,52 +889,28 @@
         </w:tc>
         <w:tc>
           <w:tcPr>
-            <w:tcW w:w="709" w:type="dxa"/>
+            <w:tcW w:w="994" w:type="dxa"/>
           </w:tcPr>
           <w:p>
             <w:pPr>
               <w:jc w:val="center"/>
               <w:rPr>
-                <w:b/>
-                <w:bCs/>
-                <w:sz w:val="18"/>
-                <w:szCs w:val="18"/>
+                <w:rFonts w:ascii="Calibri" w:hAnsi="Calibri" w:cs="Calibri"/>
+                <w:b/>
+                <w:bCs/>
+                <w:sz w:val="16"/>
+                <w:szCs w:val="16"/>
               </w:rPr>
             </w:pPr>
             <w:r>
               <w:rPr>
-                <w:b/>
-                <w:bCs/>
-                <w:sz w:val="18"/>
-                <w:szCs w:val="18"/>
+                <w:rFonts w:ascii="Calibri" w:hAnsi="Calibri" w:cs="Calibri"/>
+                <w:b/>
+                <w:bCs/>
+                <w:sz w:val="16"/>
+                <w:szCs w:val="16"/>
               </w:rPr>
               <w:t>TMH</w:t>
-            </w:r>
-          </w:p>
-        </w:tc>
-        <w:tc>
-          <w:tcPr>
-            <w:tcW w:w="992" w:type="dxa"/>
-            <w:gridSpan w:val="2"/>
-          </w:tcPr>
-          <w:p>
-            <w:pPr>
-              <w:jc w:val="center"/>
-              <w:rPr>
-                <w:b/>
-                <w:bCs/>
-                <w:sz w:val="18"/>
-                <w:szCs w:val="18"/>
-              </w:rPr>
-            </w:pPr>
-            <w:r>
-              <w:rPr>
-                <w:b/>
-                <w:bCs/>
-                <w:sz w:val="18"/>
-                <w:szCs w:val="18"/>
-              </w:rPr>
-              <w:t>BIG BAG</w:t>
             </w:r>
           </w:p>
         </w:tc>
@@ -931,44 +922,75 @@
             <w:pPr>
               <w:jc w:val="center"/>
               <w:rPr>
-                <w:b/>
-                <w:bCs/>
-                <w:sz w:val="18"/>
-                <w:szCs w:val="18"/>
+                <w:rFonts w:ascii="Calibri" w:hAnsi="Calibri" w:cs="Calibri"/>
+                <w:b/>
+                <w:bCs/>
+                <w:sz w:val="16"/>
+                <w:szCs w:val="16"/>
               </w:rPr>
             </w:pPr>
             <w:r>
               <w:rPr>
-                <w:b/>
-                <w:bCs/>
-                <w:sz w:val="18"/>
-                <w:szCs w:val="18"/>
-              </w:rPr>
-              <w:t>GRANEL</w:t>
+                <w:rFonts w:ascii="Calibri" w:hAnsi="Calibri" w:cs="Calibri"/>
+                <w:b/>
+                <w:bCs/>
+                <w:sz w:val="16"/>
+                <w:szCs w:val="16"/>
+              </w:rPr>
+              <w:t>BIG BAG</w:t>
             </w:r>
           </w:p>
         </w:tc>
         <w:tc>
           <w:tcPr>
-            <w:tcW w:w="1276" w:type="dxa"/>
+            <w:tcW w:w="851" w:type="dxa"/>
+          </w:tcPr>
+          <w:p>
+            <w:pPr>
+              <w:jc w:val="center"/>
+              <w:rPr>
+                <w:rFonts w:ascii="Calibri" w:hAnsi="Calibri" w:cs="Calibri"/>
+                <w:b/>
+                <w:bCs/>
+                <w:sz w:val="16"/>
+                <w:szCs w:val="16"/>
+              </w:rPr>
+            </w:pPr>
+            <w:r>
+              <w:rPr>
+                <w:rFonts w:ascii="Calibri" w:hAnsi="Calibri" w:cs="Calibri"/>
+                <w:b/>
+                <w:bCs/>
+                <w:sz w:val="16"/>
+                <w:szCs w:val="16"/>
+              </w:rPr>
+              <w:t>GRANEL</w:t>
+            </w:r>
+          </w:p>
+        </w:tc>
+        <w:tc>
+          <w:tcPr>
+            <w:tcW w:w="1133" w:type="dxa"/>
             <w:gridSpan w:val="2"/>
           </w:tcPr>
           <w:p>
             <w:pPr>
               <w:jc w:val="center"/>
               <w:rPr>
-                <w:b/>
-                <w:bCs/>
-                <w:sz w:val="18"/>
-                <w:szCs w:val="18"/>
+                <w:rFonts w:ascii="Calibri" w:hAnsi="Calibri" w:cs="Calibri"/>
+                <w:b/>
+                <w:bCs/>
+                <w:sz w:val="16"/>
+                <w:szCs w:val="16"/>
               </w:rPr>
             </w:pPr>
             <w:r>
               <w:rPr>
-                <w:b/>
-                <w:bCs/>
-                <w:sz w:val="18"/>
-                <w:szCs w:val="18"/>
+                <w:rFonts w:ascii="Calibri" w:hAnsi="Calibri" w:cs="Calibri"/>
+                <w:b/>
+                <w:bCs/>
+                <w:sz w:val="16"/>
+                <w:szCs w:val="16"/>
               </w:rPr>
               <w:t>UBICACIÓN</w:t>
             </w:r>
@@ -977,18 +999,20 @@
             <w:pPr>
               <w:jc w:val="center"/>
               <w:rPr>
-                <w:b/>
-                <w:bCs/>
-                <w:sz w:val="18"/>
-                <w:szCs w:val="18"/>
+                <w:rFonts w:ascii="Calibri" w:hAnsi="Calibri" w:cs="Calibri"/>
+                <w:b/>
+                <w:bCs/>
+                <w:sz w:val="16"/>
+                <w:szCs w:val="16"/>
               </w:rPr>
             </w:pPr>
             <w:r>
               <w:rPr>
-                <w:b/>
-                <w:bCs/>
-                <w:sz w:val="18"/>
-                <w:szCs w:val="18"/>
+                <w:rFonts w:ascii="Calibri" w:hAnsi="Calibri" w:cs="Calibri"/>
+                <w:b/>
+                <w:bCs/>
+                <w:sz w:val="16"/>
+                <w:szCs w:val="16"/>
               </w:rPr>
               <w:t>(PATIO)</w:t>
             </w:r>
@@ -996,24 +1020,27 @@
         </w:tc>
         <w:tc>
           <w:tcPr>
-            <w:tcW w:w="709" w:type="dxa"/>
+            <w:tcW w:w="710" w:type="dxa"/>
+            <w:gridSpan w:val="2"/>
           </w:tcPr>
           <w:p>
             <w:pPr>
               <w:jc w:val="center"/>
               <w:rPr>
-                <w:b/>
-                <w:bCs/>
-                <w:sz w:val="18"/>
-                <w:szCs w:val="18"/>
+                <w:rFonts w:ascii="Calibri" w:hAnsi="Calibri" w:cs="Calibri"/>
+                <w:b/>
+                <w:bCs/>
+                <w:sz w:val="16"/>
+                <w:szCs w:val="16"/>
               </w:rPr>
             </w:pPr>
             <w:r>
               <w:rPr>
-                <w:b/>
-                <w:bCs/>
-                <w:sz w:val="18"/>
-                <w:szCs w:val="18"/>
+                <w:rFonts w:ascii="Calibri" w:hAnsi="Calibri" w:cs="Calibri"/>
+                <w:b/>
+                <w:bCs/>
+                <w:sz w:val="16"/>
+                <w:szCs w:val="16"/>
               </w:rPr>
               <w:t>TIPO</w:t>
             </w:r>
@@ -1027,87 +1054,75 @@
             <w:pPr>
               <w:jc w:val="center"/>
               <w:rPr>
-                <w:b/>
-                <w:bCs/>
-                <w:sz w:val="18"/>
-                <w:szCs w:val="18"/>
+                <w:rFonts w:ascii="Calibri" w:hAnsi="Calibri" w:cs="Calibri"/>
+                <w:b/>
+                <w:bCs/>
+                <w:sz w:val="16"/>
+                <w:szCs w:val="16"/>
               </w:rPr>
             </w:pPr>
             <w:r>
               <w:rPr>
-                <w:b/>
-                <w:bCs/>
-                <w:sz w:val="18"/>
-                <w:szCs w:val="18"/>
-              </w:rPr>
-              <w:t>CONTRAMUESTRAS</w:t>
-            </w:r>
-            <w:r>
-              <w:rPr>
-                <w:b/>
-                <w:bCs/>
-                <w:sz w:val="18"/>
-                <w:szCs w:val="18"/>
-              </w:rPr>
-              <w:t xml:space="preserve"> </w:t>
-            </w:r>
-            <w:r>
-              <w:rPr>
-                <w:b/>
-                <w:bCs/>
-                <w:sz w:val="18"/>
-                <w:szCs w:val="18"/>
-              </w:rPr>
-              <w:t>(SACOS)</w:t>
+                <w:rFonts w:ascii="Calibri" w:hAnsi="Calibri" w:cs="Calibri"/>
+                <w:b/>
+                <w:bCs/>
+                <w:sz w:val="16"/>
+                <w:szCs w:val="16"/>
+              </w:rPr>
+              <w:t>CONTRAMUESTRAS (SACOS)</w:t>
+            </w:r>
+          </w:p>
+        </w:tc>
+        <w:tc>
+          <w:tcPr>
+            <w:tcW w:w="1701" w:type="dxa"/>
+            <w:gridSpan w:val="2"/>
+          </w:tcPr>
+          <w:p>
+            <w:pPr>
+              <w:jc w:val="center"/>
+              <w:rPr>
+                <w:rFonts w:ascii="Calibri" w:hAnsi="Calibri" w:cs="Calibri"/>
+                <w:b/>
+                <w:bCs/>
+                <w:sz w:val="16"/>
+                <w:szCs w:val="16"/>
+              </w:rPr>
+            </w:pPr>
+            <w:r>
+              <w:rPr>
+                <w:rFonts w:ascii="Calibri" w:hAnsi="Calibri" w:cs="Calibri"/>
+                <w:b/>
+                <w:bCs/>
+                <w:sz w:val="16"/>
+                <w:szCs w:val="16"/>
+              </w:rPr>
+              <w:t>MINERAL RELAVE</w:t>
             </w:r>
           </w:p>
         </w:tc>
         <w:tc>
           <w:tcPr>
             <w:tcW w:w="1276" w:type="dxa"/>
-            <w:gridSpan w:val="2"/>
           </w:tcPr>
           <w:p>
             <w:pPr>
               <w:jc w:val="center"/>
               <w:rPr>
-                <w:b/>
-                <w:bCs/>
-                <w:sz w:val="18"/>
-                <w:szCs w:val="18"/>
+                <w:rFonts w:ascii="Calibri" w:hAnsi="Calibri" w:cs="Calibri"/>
+                <w:b/>
+                <w:bCs/>
+                <w:sz w:val="16"/>
+                <w:szCs w:val="16"/>
               </w:rPr>
             </w:pPr>
             <w:r>
               <w:rPr>
-                <w:b/>
-                <w:bCs/>
-                <w:sz w:val="18"/>
-                <w:szCs w:val="18"/>
-              </w:rPr>
-              <w:t>MINERAL RELAVE</w:t>
-            </w:r>
-          </w:p>
-        </w:tc>
-        <w:tc>
-          <w:tcPr>
-            <w:tcW w:w="1559" w:type="dxa"/>
-          </w:tcPr>
-          <w:p>
-            <w:pPr>
-              <w:jc w:val="center"/>
-              <w:rPr>
-                <w:b/>
-                <w:bCs/>
-                <w:sz w:val="18"/>
-                <w:szCs w:val="18"/>
-              </w:rPr>
-            </w:pPr>
-            <w:r>
-              <w:rPr>
-                <w:b/>
-                <w:bCs/>
-                <w:sz w:val="18"/>
-                <w:szCs w:val="18"/>
+                <w:rFonts w:ascii="Calibri" w:hAnsi="Calibri" w:cs="Calibri"/>
+                <w:b/>
+                <w:bCs/>
+                <w:sz w:val="16"/>
+                <w:szCs w:val="16"/>
               </w:rPr>
               <w:t>MES</w:t>
             </w:r>
@@ -1116,18 +1131,20 @@
             <w:pPr>
               <w:jc w:val="center"/>
               <w:rPr>
-                <w:b/>
-                <w:bCs/>
-                <w:sz w:val="18"/>
-                <w:szCs w:val="18"/>
+                <w:rFonts w:ascii="Calibri" w:hAnsi="Calibri" w:cs="Calibri"/>
+                <w:b/>
+                <w:bCs/>
+                <w:sz w:val="16"/>
+                <w:szCs w:val="16"/>
               </w:rPr>
             </w:pPr>
             <w:r>
               <w:rPr>
-                <w:b/>
-                <w:bCs/>
-                <w:sz w:val="18"/>
-                <w:szCs w:val="18"/>
+                <w:rFonts w:ascii="Calibri" w:hAnsi="Calibri" w:cs="Calibri"/>
+                <w:b/>
+                <w:bCs/>
+                <w:sz w:val="16"/>
+                <w:szCs w:val="16"/>
               </w:rPr>
               <w:t>LIQUIDACION</w:t>
             </w:r>
@@ -1205,21 +1222,21 @@
     <w:tbl>
       <w:tblPr>
         <w:tblStyle w:val="Tablaconcuadrcula"/>
-        <w:tblW w:w="11335" w:type="dxa"/>
+        <w:tblW w:w="11477" w:type="dxa"/>
         <w:tblLayout w:type="fixed"/>
         <w:tblLook w:val="04A0" w:firstRow="1" w:lastRow="0" w:firstColumn="1" w:lastColumn="0" w:noHBand="0" w:noVBand="1"/>
       </w:tblPr>
       <w:tblGrid>
         <w:gridCol w:w="846"/>
         <w:gridCol w:w="1134"/>
-        <w:gridCol w:w="709"/>
         <w:gridCol w:w="992"/>
         <w:gridCol w:w="992"/>
-        <w:gridCol w:w="1276"/>
+        <w:gridCol w:w="851"/>
+        <w:gridCol w:w="1134"/>
         <w:gridCol w:w="709"/>
         <w:gridCol w:w="1842"/>
+        <w:gridCol w:w="1701"/>
         <w:gridCol w:w="1276"/>
-        <w:gridCol w:w="1559"/>
       </w:tblGrid>
       <w:tr>
         <w:trPr>
@@ -1233,28 +1250,50 @@
             <w:pPr>
               <w:spacing w:before="0" w:after="0"/>
               <w:jc w:val="center"/>
+              <w:rPr>
+                <w:rFonts w:ascii="Calibri" w:hAnsi="Calibri" w:cs="Calibri"/>
+                <w:sz w:val="16"/>
+                <w:szCs w:val="16"/>
+              </w:rPr>
             </w:pPr>
             <w:r>
+              <w:rPr>
+                <w:rFonts w:ascii="Calibri" w:hAnsi="Calibri" w:cs="Calibri"/>
+                <w:sz w:val="16"/>
+                <w:szCs w:val="16"/>
+              </w:rPr>
               <w:fldChar w:fldCharType="begin"/>
             </w:r>
             <w:r>
+              <w:rPr>
+                <w:rFonts w:ascii="Calibri" w:hAnsi="Calibri" w:cs="Calibri"/>
+                <w:sz w:val="16"/>
+                <w:szCs w:val="16"/>
+              </w:rPr>
               <w:instrText xml:space="preserve"> MERGEFIELD  item  \* MERGEFORMAT </w:instrText>
             </w:r>
             <w:r>
+              <w:rPr>
+                <w:rFonts w:ascii="Calibri" w:hAnsi="Calibri" w:cs="Calibri"/>
+                <w:sz w:val="16"/>
+                <w:szCs w:val="16"/>
+              </w:rPr>
               <w:fldChar w:fldCharType="separate"/>
             </w:r>
             <w:r>
-              <w:t>«</w:t>
-            </w:r>
-            <w:proofErr w:type="spellStart"/>
-            <w:r>
-              <w:t>item</w:t>
-            </w:r>
-            <w:proofErr w:type="spellEnd"/>
-            <w:r>
-              <w:t>»</w:t>
-            </w:r>
-            <w:r>
+              <w:rPr>
+                <w:rFonts w:ascii="Calibri" w:hAnsi="Calibri" w:cs="Calibri"/>
+                <w:sz w:val="16"/>
+                <w:szCs w:val="16"/>
+              </w:rPr>
+              <w:t>«item»</w:t>
+            </w:r>
+            <w:r>
+              <w:rPr>
+                <w:rFonts w:ascii="Calibri" w:hAnsi="Calibri" w:cs="Calibri"/>
+                <w:sz w:val="16"/>
+                <w:szCs w:val="16"/>
+              </w:rPr>
               <w:fldChar w:fldCharType="end"/>
             </w:r>
           </w:p>
@@ -1272,43 +1311,288 @@
                 <w:b/>
                 <w:caps/>
                 <w:noProof/>
-                <w:sz w:val="18"/>
-                <w:szCs w:val="18"/>
+                <w:sz w:val="16"/>
+                <w:szCs w:val="16"/>
               </w:rPr>
             </w:pPr>
             <w:r>
               <w:rPr>
-                <w:sz w:val="18"/>
-                <w:szCs w:val="18"/>
+                <w:rFonts w:ascii="Calibri" w:hAnsi="Calibri" w:cs="Calibri"/>
+                <w:sz w:val="16"/>
+                <w:szCs w:val="16"/>
               </w:rPr>
               <w:fldChar w:fldCharType="begin"/>
             </w:r>
             <w:r>
               <w:rPr>
-                <w:sz w:val="18"/>
-                <w:szCs w:val="18"/>
+                <w:rFonts w:ascii="Calibri" w:hAnsi="Calibri" w:cs="Calibri"/>
+                <w:sz w:val="16"/>
+                <w:szCs w:val="16"/>
               </w:rPr>
               <w:instrText xml:space="preserve"> MERGEFIELD  nro_lote  \* MERGEFORMAT </w:instrText>
             </w:r>
             <w:r>
               <w:rPr>
-                <w:sz w:val="18"/>
-                <w:szCs w:val="18"/>
+                <w:rFonts w:ascii="Calibri" w:hAnsi="Calibri" w:cs="Calibri"/>
+                <w:sz w:val="16"/>
+                <w:szCs w:val="16"/>
               </w:rPr>
               <w:fldChar w:fldCharType="separate"/>
             </w:r>
             <w:r>
               <w:rPr>
+                <w:rFonts w:ascii="Calibri" w:hAnsi="Calibri" w:cs="Calibri"/>
                 <w:noProof/>
-                <w:sz w:val="18"/>
-                <w:szCs w:val="18"/>
+                <w:sz w:val="16"/>
+                <w:szCs w:val="16"/>
               </w:rPr>
               <w:t>«nro_lote»</w:t>
             </w:r>
             <w:r>
               <w:rPr>
-                <w:sz w:val="18"/>
-                <w:szCs w:val="18"/>
+                <w:rFonts w:ascii="Calibri" w:hAnsi="Calibri" w:cs="Calibri"/>
+                <w:sz w:val="16"/>
+                <w:szCs w:val="16"/>
+              </w:rPr>
+              <w:fldChar w:fldCharType="end"/>
+            </w:r>
+          </w:p>
+        </w:tc>
+        <w:tc>
+          <w:tcPr>
+            <w:tcW w:w="992" w:type="dxa"/>
+          </w:tcPr>
+          <w:p>
+            <w:pPr>
+              <w:spacing w:before="0" w:after="0"/>
+              <w:jc w:val="center"/>
+              <w:rPr>
+                <w:rFonts w:ascii="Calibri" w:hAnsi="Calibri" w:cs="Calibri"/>
+                <w:b/>
+                <w:caps/>
+                <w:noProof/>
+                <w:sz w:val="16"/>
+                <w:szCs w:val="16"/>
+              </w:rPr>
+            </w:pPr>
+            <w:r>
+              <w:rPr>
+                <w:rFonts w:ascii="Calibri" w:hAnsi="Calibri" w:cs="Calibri"/>
+                <w:sz w:val="16"/>
+                <w:szCs w:val="16"/>
+              </w:rPr>
+              <w:fldChar w:fldCharType="begin"/>
+            </w:r>
+            <w:r>
+              <w:rPr>
+                <w:rFonts w:ascii="Calibri" w:hAnsi="Calibri" w:cs="Calibri"/>
+                <w:sz w:val="16"/>
+                <w:szCs w:val="16"/>
+              </w:rPr>
+              <w:instrText xml:space="preserve"> MERGEFIELD  tmh  \* MERGEFORMAT </w:instrText>
+            </w:r>
+            <w:r>
+              <w:rPr>
+                <w:rFonts w:ascii="Calibri" w:hAnsi="Calibri" w:cs="Calibri"/>
+                <w:sz w:val="16"/>
+                <w:szCs w:val="16"/>
+              </w:rPr>
+              <w:fldChar w:fldCharType="separate"/>
+            </w:r>
+            <w:r>
+              <w:rPr>
+                <w:rFonts w:ascii="Calibri" w:hAnsi="Calibri" w:cs="Calibri"/>
+                <w:noProof/>
+                <w:sz w:val="16"/>
+                <w:szCs w:val="16"/>
+              </w:rPr>
+              <w:t>«tmh»</w:t>
+            </w:r>
+            <w:r>
+              <w:rPr>
+                <w:rFonts w:ascii="Calibri" w:hAnsi="Calibri" w:cs="Calibri"/>
+                <w:sz w:val="16"/>
+                <w:szCs w:val="16"/>
+              </w:rPr>
+              <w:fldChar w:fldCharType="end"/>
+            </w:r>
+          </w:p>
+        </w:tc>
+        <w:tc>
+          <w:tcPr>
+            <w:tcW w:w="992" w:type="dxa"/>
+          </w:tcPr>
+          <w:p>
+            <w:pPr>
+              <w:spacing w:before="0" w:after="0"/>
+              <w:jc w:val="center"/>
+              <w:rPr>
+                <w:rFonts w:ascii="Calibri" w:hAnsi="Calibri" w:cs="Calibri"/>
+                <w:b/>
+                <w:caps/>
+                <w:noProof/>
+                <w:sz w:val="16"/>
+                <w:szCs w:val="16"/>
+              </w:rPr>
+            </w:pPr>
+            <w:r>
+              <w:rPr>
+                <w:rFonts w:ascii="Calibri" w:hAnsi="Calibri" w:cs="Calibri"/>
+                <w:sz w:val="16"/>
+                <w:szCs w:val="16"/>
+              </w:rPr>
+              <w:fldChar w:fldCharType="begin"/>
+            </w:r>
+            <w:r>
+              <w:rPr>
+                <w:rFonts w:ascii="Calibri" w:hAnsi="Calibri" w:cs="Calibri"/>
+                <w:sz w:val="16"/>
+                <w:szCs w:val="16"/>
+              </w:rPr>
+              <w:instrText xml:space="preserve"> MERGEFIELD  bigbag  \* MERGEFORMAT </w:instrText>
+            </w:r>
+            <w:r>
+              <w:rPr>
+                <w:rFonts w:ascii="Calibri" w:hAnsi="Calibri" w:cs="Calibri"/>
+                <w:sz w:val="16"/>
+                <w:szCs w:val="16"/>
+              </w:rPr>
+              <w:fldChar w:fldCharType="separate"/>
+            </w:r>
+            <w:r>
+              <w:rPr>
+                <w:rFonts w:ascii="Calibri" w:hAnsi="Calibri" w:cs="Calibri"/>
+                <w:noProof/>
+                <w:sz w:val="16"/>
+                <w:szCs w:val="16"/>
+              </w:rPr>
+              <w:t>«bigbag»</w:t>
+            </w:r>
+            <w:r>
+              <w:rPr>
+                <w:rFonts w:ascii="Calibri" w:hAnsi="Calibri" w:cs="Calibri"/>
+                <w:sz w:val="16"/>
+                <w:szCs w:val="16"/>
+              </w:rPr>
+              <w:fldChar w:fldCharType="end"/>
+            </w:r>
+          </w:p>
+        </w:tc>
+        <w:tc>
+          <w:tcPr>
+            <w:tcW w:w="851" w:type="dxa"/>
+          </w:tcPr>
+          <w:p>
+            <w:pPr>
+              <w:spacing w:before="0" w:after="0"/>
+              <w:jc w:val="center"/>
+              <w:rPr>
+                <w:rFonts w:ascii="Calibri" w:hAnsi="Calibri" w:cs="Calibri"/>
+                <w:b/>
+                <w:caps/>
+                <w:noProof/>
+                <w:sz w:val="16"/>
+                <w:szCs w:val="16"/>
+              </w:rPr>
+            </w:pPr>
+            <w:r>
+              <w:rPr>
+                <w:rFonts w:ascii="Calibri" w:hAnsi="Calibri" w:cs="Calibri"/>
+                <w:sz w:val="16"/>
+                <w:szCs w:val="16"/>
+              </w:rPr>
+              <w:fldChar w:fldCharType="begin"/>
+            </w:r>
+            <w:r>
+              <w:rPr>
+                <w:rFonts w:ascii="Calibri" w:hAnsi="Calibri" w:cs="Calibri"/>
+                <w:sz w:val="16"/>
+                <w:szCs w:val="16"/>
+              </w:rPr>
+              <w:instrText xml:space="preserve"> MERGEFIELD  granel  \* MERGEFORMAT </w:instrText>
+            </w:r>
+            <w:r>
+              <w:rPr>
+                <w:rFonts w:ascii="Calibri" w:hAnsi="Calibri" w:cs="Calibri"/>
+                <w:sz w:val="16"/>
+                <w:szCs w:val="16"/>
+              </w:rPr>
+              <w:fldChar w:fldCharType="separate"/>
+            </w:r>
+            <w:r>
+              <w:rPr>
+                <w:rFonts w:ascii="Calibri" w:hAnsi="Calibri" w:cs="Calibri"/>
+                <w:noProof/>
+                <w:sz w:val="16"/>
+                <w:szCs w:val="16"/>
+              </w:rPr>
+              <w:t>«granel»</w:t>
+            </w:r>
+            <w:r>
+              <w:rPr>
+                <w:rFonts w:ascii="Calibri" w:hAnsi="Calibri" w:cs="Calibri"/>
+                <w:sz w:val="16"/>
+                <w:szCs w:val="16"/>
+              </w:rPr>
+              <w:fldChar w:fldCharType="end"/>
+            </w:r>
+          </w:p>
+        </w:tc>
+        <w:tc>
+          <w:tcPr>
+            <w:tcW w:w="1134" w:type="dxa"/>
+          </w:tcPr>
+          <w:p>
+            <w:pPr>
+              <w:spacing w:before="0" w:after="0"/>
+              <w:jc w:val="center"/>
+              <w:rPr>
+                <w:rFonts w:ascii="Calibri" w:hAnsi="Calibri" w:cs="Calibri"/>
+                <w:b/>
+                <w:caps/>
+                <w:noProof/>
+                <w:sz w:val="16"/>
+                <w:szCs w:val="16"/>
+              </w:rPr>
+            </w:pPr>
+            <w:r>
+              <w:rPr>
+                <w:rFonts w:ascii="Calibri" w:hAnsi="Calibri" w:cs="Calibri"/>
+                <w:sz w:val="16"/>
+                <w:szCs w:val="16"/>
+              </w:rPr>
+              <w:fldChar w:fldCharType="begin"/>
+            </w:r>
+            <w:r>
+              <w:rPr>
+                <w:rFonts w:ascii="Calibri" w:hAnsi="Calibri" w:cs="Calibri"/>
+                <w:sz w:val="16"/>
+                <w:szCs w:val="16"/>
+              </w:rPr>
+              <w:instrText xml:space="preserve"> MERGEFIELD  cancha  \* MERGEFORMAT </w:instrText>
+            </w:r>
+            <w:r>
+              <w:rPr>
+                <w:rFonts w:ascii="Calibri" w:hAnsi="Calibri" w:cs="Calibri"/>
+                <w:sz w:val="16"/>
+                <w:szCs w:val="16"/>
+              </w:rPr>
+              <w:fldChar w:fldCharType="separate"/>
+            </w:r>
+            <w:r>
+              <w:rPr>
+                <w:rFonts w:ascii="Calibri" w:hAnsi="Calibri" w:cs="Calibri"/>
+                <w:noProof/>
+                <w:sz w:val="16"/>
+                <w:szCs w:val="16"/>
+              </w:rPr>
+              <w:t>«cancha»</w:t>
+            </w:r>
+            <w:r>
+              <w:rPr>
+                <w:rFonts w:ascii="Calibri" w:hAnsi="Calibri" w:cs="Calibri"/>
+                <w:sz w:val="16"/>
+                <w:szCs w:val="16"/>
               </w:rPr>
               <w:fldChar w:fldCharType="end"/>
             </w:r>
@@ -1327,43 +1611,48 @@
                 <w:b/>
                 <w:caps/>
                 <w:noProof/>
-                <w:sz w:val="18"/>
-                <w:szCs w:val="18"/>
+                <w:sz w:val="16"/>
+                <w:szCs w:val="16"/>
               </w:rPr>
             </w:pPr>
             <w:r>
               <w:rPr>
-                <w:sz w:val="18"/>
-                <w:szCs w:val="18"/>
+                <w:rFonts w:ascii="Calibri" w:hAnsi="Calibri" w:cs="Calibri"/>
+                <w:sz w:val="16"/>
+                <w:szCs w:val="16"/>
               </w:rPr>
               <w:fldChar w:fldCharType="begin"/>
             </w:r>
             <w:r>
               <w:rPr>
-                <w:sz w:val="18"/>
-                <w:szCs w:val="18"/>
-              </w:rPr>
-              <w:instrText xml:space="preserve"> MERGEFIELD  tmh  \* MERGEFORMAT </w:instrText>
-            </w:r>
-            <w:r>
-              <w:rPr>
-                <w:sz w:val="18"/>
-                <w:szCs w:val="18"/>
+                <w:rFonts w:ascii="Calibri" w:hAnsi="Calibri" w:cs="Calibri"/>
+                <w:sz w:val="16"/>
+                <w:szCs w:val="16"/>
+              </w:rPr>
+              <w:instrText xml:space="preserve"> MERGEFIELD  ley  \* MERGEFORMAT </w:instrText>
+            </w:r>
+            <w:r>
+              <w:rPr>
+                <w:rFonts w:ascii="Calibri" w:hAnsi="Calibri" w:cs="Calibri"/>
+                <w:sz w:val="16"/>
+                <w:szCs w:val="16"/>
               </w:rPr>
               <w:fldChar w:fldCharType="separate"/>
             </w:r>
             <w:r>
               <w:rPr>
+                <w:rFonts w:ascii="Calibri" w:hAnsi="Calibri" w:cs="Calibri"/>
                 <w:noProof/>
-                <w:sz w:val="18"/>
-                <w:szCs w:val="18"/>
-              </w:rPr>
-              <w:t>«tmh»</w:t>
-            </w:r>
-            <w:r>
-              <w:rPr>
-                <w:sz w:val="18"/>
-                <w:szCs w:val="18"/>
+                <w:sz w:val="16"/>
+                <w:szCs w:val="16"/>
+              </w:rPr>
+              <w:t>«ley»</w:t>
+            </w:r>
+            <w:r>
+              <w:rPr>
+                <w:rFonts w:ascii="Calibri" w:hAnsi="Calibri" w:cs="Calibri"/>
+                <w:sz w:val="16"/>
+                <w:szCs w:val="16"/>
               </w:rPr>
               <w:fldChar w:fldCharType="end"/>
             </w:r>
@@ -1371,7 +1660,7 @@
         </w:tc>
         <w:tc>
           <w:tcPr>
-            <w:tcW w:w="992" w:type="dxa"/>
+            <w:tcW w:w="1842" w:type="dxa"/>
           </w:tcPr>
           <w:p>
             <w:pPr>
@@ -1382,43 +1671,48 @@
                 <w:b/>
                 <w:caps/>
                 <w:noProof/>
-                <w:sz w:val="18"/>
-                <w:szCs w:val="18"/>
+                <w:sz w:val="16"/>
+                <w:szCs w:val="16"/>
               </w:rPr>
             </w:pPr>
             <w:r>
               <w:rPr>
-                <w:sz w:val="18"/>
-                <w:szCs w:val="18"/>
+                <w:rFonts w:ascii="Calibri" w:hAnsi="Calibri" w:cs="Calibri"/>
+                <w:sz w:val="16"/>
+                <w:szCs w:val="16"/>
               </w:rPr>
               <w:fldChar w:fldCharType="begin"/>
             </w:r>
             <w:r>
               <w:rPr>
-                <w:sz w:val="18"/>
-                <w:szCs w:val="18"/>
-              </w:rPr>
-              <w:instrText xml:space="preserve"> MERGEFIELD  bigbag  \* MERGEFORMAT </w:instrText>
-            </w:r>
-            <w:r>
-              <w:rPr>
-                <w:sz w:val="18"/>
-                <w:szCs w:val="18"/>
+                <w:rFonts w:ascii="Calibri" w:hAnsi="Calibri" w:cs="Calibri"/>
+                <w:sz w:val="16"/>
+                <w:szCs w:val="16"/>
+              </w:rPr>
+              <w:instrText xml:space="preserve"> MERGEFIELD  contramuestra  \* MERGEFORMAT </w:instrText>
+            </w:r>
+            <w:r>
+              <w:rPr>
+                <w:rFonts w:ascii="Calibri" w:hAnsi="Calibri" w:cs="Calibri"/>
+                <w:sz w:val="16"/>
+                <w:szCs w:val="16"/>
               </w:rPr>
               <w:fldChar w:fldCharType="separate"/>
             </w:r>
             <w:r>
               <w:rPr>
+                <w:rFonts w:ascii="Calibri" w:hAnsi="Calibri" w:cs="Calibri"/>
                 <w:noProof/>
-                <w:sz w:val="18"/>
-                <w:szCs w:val="18"/>
-              </w:rPr>
-              <w:t>«bigbag»</w:t>
-            </w:r>
-            <w:r>
-              <w:rPr>
-                <w:sz w:val="18"/>
-                <w:szCs w:val="18"/>
+                <w:sz w:val="16"/>
+                <w:szCs w:val="16"/>
+              </w:rPr>
+              <w:t>«contramuestra»</w:t>
+            </w:r>
+            <w:r>
+              <w:rPr>
+                <w:rFonts w:ascii="Calibri" w:hAnsi="Calibri" w:cs="Calibri"/>
+                <w:sz w:val="16"/>
+                <w:szCs w:val="16"/>
               </w:rPr>
               <w:fldChar w:fldCharType="end"/>
             </w:r>
@@ -1426,7 +1720,7 @@
         </w:tc>
         <w:tc>
           <w:tcPr>
-            <w:tcW w:w="992" w:type="dxa"/>
+            <w:tcW w:w="1701" w:type="dxa"/>
           </w:tcPr>
           <w:p>
             <w:pPr>
@@ -1437,43 +1731,48 @@
                 <w:b/>
                 <w:caps/>
                 <w:noProof/>
-                <w:sz w:val="18"/>
-                <w:szCs w:val="18"/>
+                <w:sz w:val="16"/>
+                <w:szCs w:val="16"/>
               </w:rPr>
             </w:pPr>
             <w:r>
               <w:rPr>
-                <w:sz w:val="18"/>
-                <w:szCs w:val="18"/>
+                <w:rFonts w:ascii="Calibri" w:hAnsi="Calibri" w:cs="Calibri"/>
+                <w:sz w:val="16"/>
+                <w:szCs w:val="16"/>
               </w:rPr>
               <w:fldChar w:fldCharType="begin"/>
             </w:r>
             <w:r>
               <w:rPr>
-                <w:sz w:val="18"/>
-                <w:szCs w:val="18"/>
-              </w:rPr>
-              <w:instrText xml:space="preserve"> MERGEFIELD  granel  \* MERGEFORMAT </w:instrText>
-            </w:r>
-            <w:r>
-              <w:rPr>
-                <w:sz w:val="18"/>
-                <w:szCs w:val="18"/>
+                <w:rFonts w:ascii="Calibri" w:hAnsi="Calibri" w:cs="Calibri"/>
+                <w:sz w:val="16"/>
+                <w:szCs w:val="16"/>
+              </w:rPr>
+              <w:instrText xml:space="preserve"> MERGEFIELD  tipomineral  \* MERGEFORMAT </w:instrText>
+            </w:r>
+            <w:r>
+              <w:rPr>
+                <w:rFonts w:ascii="Calibri" w:hAnsi="Calibri" w:cs="Calibri"/>
+                <w:sz w:val="16"/>
+                <w:szCs w:val="16"/>
               </w:rPr>
               <w:fldChar w:fldCharType="separate"/>
             </w:r>
             <w:r>
               <w:rPr>
+                <w:rFonts w:ascii="Calibri" w:hAnsi="Calibri" w:cs="Calibri"/>
                 <w:noProof/>
-                <w:sz w:val="18"/>
-                <w:szCs w:val="18"/>
-              </w:rPr>
-              <w:t>«granel»</w:t>
-            </w:r>
-            <w:r>
-              <w:rPr>
-                <w:sz w:val="18"/>
-                <w:szCs w:val="18"/>
+                <w:sz w:val="16"/>
+                <w:szCs w:val="16"/>
+              </w:rPr>
+              <w:t>«tipomineral»</w:t>
+            </w:r>
+            <w:r>
+              <w:rPr>
+                <w:rFonts w:ascii="Calibri" w:hAnsi="Calibri" w:cs="Calibri"/>
+                <w:sz w:val="16"/>
+                <w:szCs w:val="16"/>
               </w:rPr>
               <w:fldChar w:fldCharType="end"/>
             </w:r>
@@ -1492,263 +1791,48 @@
                 <w:b/>
                 <w:caps/>
                 <w:noProof/>
-                <w:sz w:val="18"/>
-                <w:szCs w:val="18"/>
+                <w:sz w:val="16"/>
+                <w:szCs w:val="16"/>
               </w:rPr>
             </w:pPr>
             <w:r>
               <w:rPr>
-                <w:sz w:val="18"/>
-                <w:szCs w:val="18"/>
+                <w:rFonts w:ascii="Calibri" w:hAnsi="Calibri" w:cs="Calibri"/>
+                <w:sz w:val="16"/>
+                <w:szCs w:val="16"/>
               </w:rPr>
               <w:fldChar w:fldCharType="begin"/>
             </w:r>
             <w:r>
               <w:rPr>
-                <w:sz w:val="18"/>
-                <w:szCs w:val="18"/>
-              </w:rPr>
-              <w:instrText xml:space="preserve"> MERGEFIELD  cancha  \* MERGEFORMAT </w:instrText>
-            </w:r>
-            <w:r>
-              <w:rPr>
-                <w:sz w:val="18"/>
-                <w:szCs w:val="18"/>
+                <w:rFonts w:ascii="Calibri" w:hAnsi="Calibri" w:cs="Calibri"/>
+                <w:sz w:val="16"/>
+                <w:szCs w:val="16"/>
+              </w:rPr>
+              <w:instrText xml:space="preserve"> MERGEFIELD  fech_liqui  \* MERGEFORMAT </w:instrText>
+            </w:r>
+            <w:r>
+              <w:rPr>
+                <w:rFonts w:ascii="Calibri" w:hAnsi="Calibri" w:cs="Calibri"/>
+                <w:sz w:val="16"/>
+                <w:szCs w:val="16"/>
               </w:rPr>
               <w:fldChar w:fldCharType="separate"/>
             </w:r>
             <w:r>
               <w:rPr>
+                <w:rFonts w:ascii="Calibri" w:hAnsi="Calibri" w:cs="Calibri"/>
                 <w:noProof/>
-                <w:sz w:val="18"/>
-                <w:szCs w:val="18"/>
-              </w:rPr>
-              <w:t>«cancha»</w:t>
-            </w:r>
-            <w:r>
-              <w:rPr>
-                <w:sz w:val="18"/>
-                <w:szCs w:val="18"/>
-              </w:rPr>
-              <w:fldChar w:fldCharType="end"/>
-            </w:r>
-          </w:p>
-        </w:tc>
-        <w:tc>
-          <w:tcPr>
-            <w:tcW w:w="709" w:type="dxa"/>
-          </w:tcPr>
-          <w:p>
-            <w:pPr>
-              <w:spacing w:before="0" w:after="0"/>
-              <w:jc w:val="center"/>
-              <w:rPr>
-                <w:rFonts w:ascii="Calibri" w:hAnsi="Calibri" w:cs="Calibri"/>
-                <w:b/>
-                <w:caps/>
-                <w:noProof/>
-                <w:sz w:val="18"/>
-                <w:szCs w:val="18"/>
-              </w:rPr>
-            </w:pPr>
-            <w:r>
-              <w:rPr>
-                <w:sz w:val="18"/>
-                <w:szCs w:val="18"/>
-              </w:rPr>
-              <w:fldChar w:fldCharType="begin"/>
-            </w:r>
-            <w:r>
-              <w:rPr>
-                <w:sz w:val="18"/>
-                <w:szCs w:val="18"/>
-              </w:rPr>
-              <w:instrText xml:space="preserve"> MERGEFIELD  ley  \* MERGEFORMAT </w:instrText>
-            </w:r>
-            <w:r>
-              <w:rPr>
-                <w:sz w:val="18"/>
-                <w:szCs w:val="18"/>
-              </w:rPr>
-              <w:fldChar w:fldCharType="separate"/>
-            </w:r>
-            <w:r>
-              <w:rPr>
-                <w:noProof/>
-                <w:sz w:val="18"/>
-                <w:szCs w:val="18"/>
-              </w:rPr>
-              <w:t>«ley»</w:t>
-            </w:r>
-            <w:r>
-              <w:rPr>
-                <w:sz w:val="18"/>
-                <w:szCs w:val="18"/>
-              </w:rPr>
-              <w:fldChar w:fldCharType="end"/>
-            </w:r>
-          </w:p>
-        </w:tc>
-        <w:tc>
-          <w:tcPr>
-            <w:tcW w:w="1842" w:type="dxa"/>
-          </w:tcPr>
-          <w:p>
-            <w:pPr>
-              <w:spacing w:before="0" w:after="0"/>
-              <w:jc w:val="center"/>
-              <w:rPr>
-                <w:rFonts w:ascii="Calibri" w:hAnsi="Calibri" w:cs="Calibri"/>
-                <w:b/>
-                <w:caps/>
-                <w:noProof/>
-                <w:sz w:val="18"/>
-                <w:szCs w:val="18"/>
-              </w:rPr>
-            </w:pPr>
-            <w:r>
-              <w:rPr>
-                <w:sz w:val="18"/>
-                <w:szCs w:val="18"/>
-              </w:rPr>
-              <w:fldChar w:fldCharType="begin"/>
-            </w:r>
-            <w:r>
-              <w:rPr>
-                <w:sz w:val="18"/>
-                <w:szCs w:val="18"/>
-              </w:rPr>
-              <w:instrText xml:space="preserve"> MERGEFIELD  contramuestra  \* MERGEFORMAT </w:instrText>
-            </w:r>
-            <w:r>
-              <w:rPr>
-                <w:sz w:val="18"/>
-                <w:szCs w:val="18"/>
-              </w:rPr>
-              <w:fldChar w:fldCharType="separate"/>
-            </w:r>
-            <w:r>
-              <w:rPr>
-                <w:noProof/>
-                <w:sz w:val="18"/>
-                <w:szCs w:val="18"/>
-              </w:rPr>
-              <w:t>«contramuestra»</w:t>
-            </w:r>
-            <w:r>
-              <w:rPr>
-                <w:sz w:val="18"/>
-                <w:szCs w:val="18"/>
-              </w:rPr>
-              <w:fldChar w:fldCharType="end"/>
-            </w:r>
-          </w:p>
-        </w:tc>
-        <w:tc>
-          <w:tcPr>
-            <w:tcW w:w="1276" w:type="dxa"/>
-          </w:tcPr>
-          <w:p>
-            <w:pPr>
-              <w:spacing w:before="0" w:after="0"/>
-              <w:jc w:val="center"/>
-              <w:rPr>
-                <w:rFonts w:ascii="Calibri" w:hAnsi="Calibri" w:cs="Calibri"/>
-                <w:b/>
-                <w:caps/>
-                <w:noProof/>
-                <w:sz w:val="18"/>
-                <w:szCs w:val="18"/>
-              </w:rPr>
-            </w:pPr>
-            <w:r>
-              <w:rPr>
-                <w:sz w:val="18"/>
-                <w:szCs w:val="18"/>
-              </w:rPr>
-              <w:fldChar w:fldCharType="begin"/>
-            </w:r>
-            <w:r>
-              <w:rPr>
-                <w:sz w:val="18"/>
-                <w:szCs w:val="18"/>
-              </w:rPr>
-              <w:instrText xml:space="preserve"> MERGEFIELD  tipomineral  \* MERGEFORMAT </w:instrText>
-            </w:r>
-            <w:r>
-              <w:rPr>
-                <w:sz w:val="18"/>
-                <w:szCs w:val="18"/>
-              </w:rPr>
-              <w:fldChar w:fldCharType="separate"/>
-            </w:r>
-            <w:r>
-              <w:rPr>
-                <w:noProof/>
-                <w:sz w:val="18"/>
-                <w:szCs w:val="18"/>
-              </w:rPr>
-              <w:t>«tipomineral»</w:t>
-            </w:r>
-            <w:r>
-              <w:rPr>
-                <w:sz w:val="18"/>
-                <w:szCs w:val="18"/>
-              </w:rPr>
-              <w:fldChar w:fldCharType="end"/>
-            </w:r>
-          </w:p>
-        </w:tc>
-        <w:tc>
-          <w:tcPr>
-            <w:tcW w:w="1559" w:type="dxa"/>
-          </w:tcPr>
-          <w:p>
-            <w:pPr>
-              <w:spacing w:before="0" w:after="0"/>
-              <w:jc w:val="center"/>
-              <w:rPr>
-                <w:rFonts w:ascii="Calibri" w:hAnsi="Calibri" w:cs="Calibri"/>
-                <w:b/>
-                <w:caps/>
-                <w:noProof/>
-                <w:sz w:val="18"/>
-                <w:szCs w:val="18"/>
-              </w:rPr>
-            </w:pPr>
-            <w:r>
-              <w:rPr>
-                <w:sz w:val="18"/>
-                <w:szCs w:val="18"/>
-              </w:rPr>
-              <w:fldChar w:fldCharType="begin"/>
-            </w:r>
-            <w:r>
-              <w:rPr>
-                <w:sz w:val="18"/>
-                <w:szCs w:val="18"/>
-              </w:rPr>
-              <w:instrText xml:space="preserve"> MERGEFIELD  fech_liqui  \* MERGEFORMAT </w:instrText>
-            </w:r>
-            <w:r>
-              <w:rPr>
-                <w:sz w:val="18"/>
-                <w:szCs w:val="18"/>
-              </w:rPr>
-              <w:fldChar w:fldCharType="separate"/>
-            </w:r>
-            <w:r>
-              <w:rPr>
-                <w:noProof/>
-                <w:sz w:val="18"/>
-                <w:szCs w:val="18"/>
+                <w:sz w:val="16"/>
+                <w:szCs w:val="16"/>
               </w:rPr>
               <w:t>«fech_liqui»</w:t>
             </w:r>
             <w:r>
               <w:rPr>
-                <w:sz w:val="18"/>
-                <w:szCs w:val="18"/>
+                <w:rFonts w:ascii="Calibri" w:hAnsi="Calibri" w:cs="Calibri"/>
+                <w:sz w:val="16"/>
+                <w:szCs w:val="16"/>
               </w:rPr>
               <w:fldChar w:fldCharType="end"/>
             </w:r>
@@ -1820,21 +1904,21 @@
     <w:tbl>
       <w:tblPr>
         <w:tblStyle w:val="Tablaconcuadrcula"/>
-        <w:tblW w:w="11335" w:type="dxa"/>
+        <w:tblW w:w="11477" w:type="dxa"/>
         <w:tblLayout w:type="fixed"/>
         <w:tblLook w:val="04A0" w:firstRow="1" w:lastRow="0" w:firstColumn="1" w:lastColumn="0" w:noHBand="0" w:noVBand="1"/>
       </w:tblPr>
       <w:tblGrid>
         <w:gridCol w:w="851"/>
         <w:gridCol w:w="1134"/>
-        <w:gridCol w:w="704"/>
+        <w:gridCol w:w="987"/>
         <w:gridCol w:w="992"/>
+        <w:gridCol w:w="993"/>
         <w:gridCol w:w="992"/>
-        <w:gridCol w:w="1276"/>
         <w:gridCol w:w="709"/>
         <w:gridCol w:w="1842"/>
-        <w:gridCol w:w="1284"/>
-        <w:gridCol w:w="1551"/>
+        <w:gridCol w:w="1701"/>
+        <w:gridCol w:w="1276"/>
       </w:tblGrid>
       <w:tr>
         <w:trPr>
@@ -1861,6 +1945,8 @@
             <w:pPr>
               <w:rPr>
                 <w:rFonts w:ascii="Aptos Black" w:hAnsi="Aptos Black"/>
+                <w:b/>
+                <w:bCs/>
                 <w:sz w:val="18"/>
                 <w:szCs w:val="18"/>
               </w:rPr>
@@ -1868,6 +1954,8 @@
             <w:r>
               <w:rPr>
                 <w:rFonts w:ascii="Aptos Black" w:hAnsi="Aptos Black"/>
+                <w:b/>
+                <w:bCs/>
                 <w:sz w:val="18"/>
                 <w:szCs w:val="18"/>
               </w:rPr>
@@ -1877,48 +1965,55 @@
         </w:tc>
         <w:tc>
           <w:tcPr>
-            <w:tcW w:w="704" w:type="dxa"/>
+            <w:tcW w:w="987" w:type="dxa"/>
           </w:tcPr>
           <w:p>
             <w:pPr>
-              <w:rPr>
-                <w:sz w:val="18"/>
-                <w:szCs w:val="18"/>
+              <w:jc w:val="center"/>
+              <w:rPr>
+                <w:rFonts w:ascii="Calibri" w:hAnsi="Calibri" w:cs="Calibri"/>
+                <w:sz w:val="16"/>
+                <w:szCs w:val="16"/>
               </w:rPr>
             </w:pPr>
             <w:r>
               <w:rPr>
-                <w:sz w:val="18"/>
-                <w:szCs w:val="18"/>
+                <w:rFonts w:ascii="Calibri" w:hAnsi="Calibri" w:cs="Calibri"/>
+                <w:sz w:val="16"/>
+                <w:szCs w:val="16"/>
               </w:rPr>
               <w:fldChar w:fldCharType="begin"/>
             </w:r>
             <w:r>
               <w:rPr>
-                <w:sz w:val="18"/>
-                <w:szCs w:val="18"/>
+                <w:rFonts w:ascii="Calibri" w:hAnsi="Calibri" w:cs="Calibri"/>
+                <w:sz w:val="16"/>
+                <w:szCs w:val="16"/>
               </w:rPr>
               <w:instrText xml:space="preserve"> MERGEFIELD  tt  \* MERGEFORMAT </w:instrText>
             </w:r>
             <w:r>
               <w:rPr>
-                <w:sz w:val="18"/>
-                <w:szCs w:val="18"/>
+                <w:rFonts w:ascii="Calibri" w:hAnsi="Calibri" w:cs="Calibri"/>
+                <w:sz w:val="16"/>
+                <w:szCs w:val="16"/>
               </w:rPr>
               <w:fldChar w:fldCharType="separate"/>
             </w:r>
             <w:r>
               <w:rPr>
+                <w:rFonts w:ascii="Calibri" w:hAnsi="Calibri" w:cs="Calibri"/>
                 <w:noProof/>
-                <w:sz w:val="18"/>
-                <w:szCs w:val="18"/>
+                <w:sz w:val="16"/>
+                <w:szCs w:val="16"/>
               </w:rPr>
               <w:t>«tt»</w:t>
             </w:r>
             <w:r>
               <w:rPr>
-                <w:sz w:val="18"/>
-                <w:szCs w:val="18"/>
+                <w:rFonts w:ascii="Calibri" w:hAnsi="Calibri" w:cs="Calibri"/>
+                <w:sz w:val="16"/>
+                <w:szCs w:val="16"/>
               </w:rPr>
               <w:fldChar w:fldCharType="end"/>
             </w:r>
@@ -1930,44 +2025,107 @@
           </w:tcPr>
           <w:p>
             <w:pPr>
-              <w:rPr>
-                <w:sz w:val="18"/>
-                <w:szCs w:val="18"/>
+              <w:jc w:val="center"/>
+              <w:rPr>
+                <w:rFonts w:ascii="Calibri" w:hAnsi="Calibri" w:cs="Calibri"/>
+                <w:sz w:val="16"/>
+                <w:szCs w:val="16"/>
               </w:rPr>
             </w:pPr>
             <w:r>
               <w:rPr>
-                <w:sz w:val="18"/>
-                <w:szCs w:val="18"/>
+                <w:rFonts w:ascii="Calibri" w:hAnsi="Calibri" w:cs="Calibri"/>
+                <w:sz w:val="16"/>
+                <w:szCs w:val="16"/>
               </w:rPr>
               <w:fldChar w:fldCharType="begin"/>
             </w:r>
             <w:r>
               <w:rPr>
-                <w:sz w:val="18"/>
-                <w:szCs w:val="18"/>
+                <w:rFonts w:ascii="Calibri" w:hAnsi="Calibri" w:cs="Calibri"/>
+                <w:sz w:val="16"/>
+                <w:szCs w:val="16"/>
               </w:rPr>
               <w:instrText xml:space="preserve"> MERGEFIELD  t.bigbag  \* MERGEFORMAT </w:instrText>
             </w:r>
             <w:r>
               <w:rPr>
-                <w:sz w:val="18"/>
-                <w:szCs w:val="18"/>
+                <w:rFonts w:ascii="Calibri" w:hAnsi="Calibri" w:cs="Calibri"/>
+                <w:sz w:val="16"/>
+                <w:szCs w:val="16"/>
               </w:rPr>
               <w:fldChar w:fldCharType="separate"/>
             </w:r>
             <w:r>
               <w:rPr>
+                <w:rFonts w:ascii="Calibri" w:hAnsi="Calibri" w:cs="Calibri"/>
                 <w:noProof/>
-                <w:sz w:val="18"/>
-                <w:szCs w:val="18"/>
+                <w:sz w:val="16"/>
+                <w:szCs w:val="16"/>
               </w:rPr>
               <w:t>«t.bigbag»</w:t>
             </w:r>
             <w:r>
               <w:rPr>
-                <w:sz w:val="18"/>
-                <w:szCs w:val="18"/>
+                <w:rFonts w:ascii="Calibri" w:hAnsi="Calibri" w:cs="Calibri"/>
+                <w:sz w:val="16"/>
+                <w:szCs w:val="16"/>
+              </w:rPr>
+              <w:fldChar w:fldCharType="end"/>
+            </w:r>
+          </w:p>
+        </w:tc>
+        <w:tc>
+          <w:tcPr>
+            <w:tcW w:w="993" w:type="dxa"/>
+          </w:tcPr>
+          <w:p>
+            <w:pPr>
+              <w:jc w:val="center"/>
+              <w:rPr>
+                <w:rFonts w:ascii="Calibri" w:hAnsi="Calibri" w:cs="Calibri"/>
+                <w:sz w:val="16"/>
+                <w:szCs w:val="16"/>
+              </w:rPr>
+            </w:pPr>
+            <w:r>
+              <w:rPr>
+                <w:rFonts w:ascii="Calibri" w:hAnsi="Calibri" w:cs="Calibri"/>
+                <w:sz w:val="16"/>
+                <w:szCs w:val="16"/>
+              </w:rPr>
+              <w:fldChar w:fldCharType="begin"/>
+            </w:r>
+            <w:r>
+              <w:rPr>
+                <w:rFonts w:ascii="Calibri" w:hAnsi="Calibri" w:cs="Calibri"/>
+                <w:sz w:val="16"/>
+                <w:szCs w:val="16"/>
+              </w:rPr>
+              <w:instrText xml:space="preserve"> MERGEFIELD  t.granel  \* MERGEFORMAT </w:instrText>
+            </w:r>
+            <w:r>
+              <w:rPr>
+                <w:rFonts w:ascii="Calibri" w:hAnsi="Calibri" w:cs="Calibri"/>
+                <w:sz w:val="16"/>
+                <w:szCs w:val="16"/>
+              </w:rPr>
+              <w:fldChar w:fldCharType="separate"/>
+            </w:r>
+            <w:r>
+              <w:rPr>
+                <w:rFonts w:ascii="Calibri" w:hAnsi="Calibri" w:cs="Calibri"/>
+                <w:noProof/>
+                <w:sz w:val="16"/>
+                <w:szCs w:val="16"/>
+              </w:rPr>
+              <w:t>«t.granel»</w:t>
+            </w:r>
+            <w:r>
+              <w:rPr>
+                <w:rFonts w:ascii="Calibri" w:hAnsi="Calibri" w:cs="Calibri"/>
+                <w:sz w:val="16"/>
+                <w:szCs w:val="16"/>
               </w:rPr>
               <w:fldChar w:fldCharType="end"/>
             </w:r>
@@ -1979,58 +2137,11 @@
           </w:tcPr>
           <w:p>
             <w:pPr>
-              <w:rPr>
-                <w:sz w:val="18"/>
-                <w:szCs w:val="18"/>
-              </w:rPr>
-            </w:pPr>
-            <w:r>
-              <w:rPr>
-                <w:sz w:val="18"/>
-                <w:szCs w:val="18"/>
-              </w:rPr>
-              <w:fldChar w:fldCharType="begin"/>
-            </w:r>
-            <w:r>
-              <w:rPr>
-                <w:sz w:val="18"/>
-                <w:szCs w:val="18"/>
-              </w:rPr>
-              <w:instrText xml:space="preserve"> MERGEFIELD  t.granel  \* MERGEFORMAT </w:instrText>
-            </w:r>
-            <w:r>
-              <w:rPr>
-                <w:sz w:val="18"/>
-                <w:szCs w:val="18"/>
-              </w:rPr>
-              <w:fldChar w:fldCharType="separate"/>
-            </w:r>
-            <w:r>
-              <w:rPr>
-                <w:noProof/>
-                <w:sz w:val="18"/>
-                <w:szCs w:val="18"/>
-              </w:rPr>
-              <w:t>«t.granel»</w:t>
-            </w:r>
-            <w:r>
-              <w:rPr>
-                <w:sz w:val="18"/>
-                <w:szCs w:val="18"/>
-              </w:rPr>
-              <w:fldChar w:fldCharType="end"/>
-            </w:r>
-          </w:p>
-        </w:tc>
-        <w:tc>
-          <w:tcPr>
-            <w:tcW w:w="1276" w:type="dxa"/>
-          </w:tcPr>
-          <w:p>
-            <w:pPr>
-              <w:rPr>
-                <w:sz w:val="18"/>
-                <w:szCs w:val="18"/>
+              <w:jc w:val="center"/>
+              <w:rPr>
+                <w:rFonts w:ascii="Calibri" w:hAnsi="Calibri" w:cs="Calibri"/>
+                <w:sz w:val="16"/>
+                <w:szCs w:val="16"/>
               </w:rPr>
             </w:pPr>
           </w:p>
@@ -2041,9 +2152,11 @@
           </w:tcPr>
           <w:p>
             <w:pPr>
-              <w:rPr>
-                <w:sz w:val="18"/>
-                <w:szCs w:val="18"/>
+              <w:jc w:val="center"/>
+              <w:rPr>
+                <w:rFonts w:ascii="Calibri" w:hAnsi="Calibri" w:cs="Calibri"/>
+                <w:sz w:val="16"/>
+                <w:szCs w:val="16"/>
               </w:rPr>
             </w:pPr>
           </w:p>
@@ -2054,44 +2167,51 @@
           </w:tcPr>
           <w:p>
             <w:pPr>
-              <w:rPr>
-                <w:sz w:val="18"/>
-                <w:szCs w:val="18"/>
+              <w:jc w:val="center"/>
+              <w:rPr>
+                <w:rFonts w:ascii="Calibri" w:hAnsi="Calibri" w:cs="Calibri"/>
+                <w:sz w:val="16"/>
+                <w:szCs w:val="16"/>
               </w:rPr>
             </w:pPr>
             <w:r>
               <w:rPr>
-                <w:sz w:val="18"/>
-                <w:szCs w:val="18"/>
+                <w:rFonts w:ascii="Calibri" w:hAnsi="Calibri" w:cs="Calibri"/>
+                <w:sz w:val="16"/>
+                <w:szCs w:val="16"/>
               </w:rPr>
               <w:fldChar w:fldCharType="begin"/>
             </w:r>
             <w:r>
               <w:rPr>
-                <w:sz w:val="18"/>
-                <w:szCs w:val="18"/>
+                <w:rFonts w:ascii="Calibri" w:hAnsi="Calibri" w:cs="Calibri"/>
+                <w:sz w:val="16"/>
+                <w:szCs w:val="16"/>
               </w:rPr>
               <w:instrText xml:space="preserve"> MERGEFIELD  t.contramuestra  \* MERGEFORMAT </w:instrText>
             </w:r>
             <w:r>
               <w:rPr>
-                <w:sz w:val="18"/>
-                <w:szCs w:val="18"/>
+                <w:rFonts w:ascii="Calibri" w:hAnsi="Calibri" w:cs="Calibri"/>
+                <w:sz w:val="16"/>
+                <w:szCs w:val="16"/>
               </w:rPr>
               <w:fldChar w:fldCharType="separate"/>
             </w:r>
             <w:r>
               <w:rPr>
+                <w:rFonts w:ascii="Calibri" w:hAnsi="Calibri" w:cs="Calibri"/>
                 <w:noProof/>
-                <w:sz w:val="18"/>
-                <w:szCs w:val="18"/>
+                <w:sz w:val="16"/>
+                <w:szCs w:val="16"/>
               </w:rPr>
               <w:t>«t.contramuestra»</w:t>
             </w:r>
             <w:r>
               <w:rPr>
-                <w:sz w:val="18"/>
-                <w:szCs w:val="18"/>
+                <w:rFonts w:ascii="Calibri" w:hAnsi="Calibri" w:cs="Calibri"/>
+                <w:sz w:val="16"/>
+                <w:szCs w:val="16"/>
               </w:rPr>
               <w:fldChar w:fldCharType="end"/>
             </w:r>
@@ -2099,10 +2219,11 @@
         </w:tc>
         <w:tc>
           <w:tcPr>
-            <w:tcW w:w="1284" w:type="dxa"/>
+            <w:tcW w:w="1701" w:type="dxa"/>
           </w:tcPr>
           <w:p>
             <w:pPr>
+              <w:jc w:val="center"/>
               <w:rPr>
                 <w:sz w:val="18"/>
                 <w:szCs w:val="18"/>
@@ -2112,7 +2233,7 @@
         </w:tc>
         <w:tc>
           <w:tcPr>
-            <w:tcW w:w="1551" w:type="dxa"/>
+            <w:tcW w:w="1276" w:type="dxa"/>
           </w:tcPr>
           <w:p>
             <w:pPr>
@@ -2232,7 +2353,7 @@
         <mc:AlternateContent>
           <mc:Choice Requires="wps">
             <w:drawing>
-              <wp:anchor distT="0" distB="0" distL="114300" distR="114300" simplePos="0" relativeHeight="251662336" behindDoc="0" locked="0" layoutInCell="1" allowOverlap="1" wp14:anchorId="2CDD55FC" wp14:editId="4DB26AD1">
+              <wp:anchor distT="0" distB="0" distL="114300" distR="114300" simplePos="0" relativeHeight="251662336" behindDoc="0" locked="0" layoutInCell="1" allowOverlap="1" wp14:anchorId="2CDD55FC" wp14:editId="783AB342">
                 <wp:simplePos x="0" y="0"/>
                 <wp:positionH relativeFrom="column">
                   <wp:posOffset>4258310</wp:posOffset>
@@ -2361,7 +2482,7 @@
                                     <w:spacing w:before="0" w:after="0"/>
                                     <w:jc w:val="center"/>
                                     <w:rPr>
-                                      <w:rFonts w:ascii="Calibri" w:hAnsi="Calibri" w:cs="Calibri"/>
+                                      <w:rFonts w:ascii="Aptos Black" w:hAnsi="Aptos Black" w:cs="Calibri"/>
                                       <w:b/>
                                       <w:caps/>
                                       <w:noProof/>
@@ -2371,7 +2492,7 @@
                                   </w:pPr>
                                   <w:r>
                                     <w:rPr>
-                                      <w:rFonts w:ascii="Calibri" w:hAnsi="Calibri" w:cs="Calibri"/>
+                                      <w:rFonts w:ascii="Aptos Black" w:hAnsi="Aptos Black" w:cs="Calibri"/>
                                       <w:b/>
                                       <w:caps/>
                                       <w:noProof/>
@@ -2391,7 +2512,7 @@
                                     <w:spacing w:before="0" w:after="0"/>
                                     <w:jc w:val="center"/>
                                     <w:rPr>
-                                      <w:rFonts w:ascii="Calibri" w:hAnsi="Calibri" w:cs="Calibri"/>
+                                      <w:rFonts w:ascii="Aptos Black" w:hAnsi="Aptos Black" w:cs="Calibri"/>
                                       <w:b/>
                                       <w:caps/>
                                       <w:noProof/>
@@ -2401,7 +2522,7 @@
                                   </w:pPr>
                                   <w:r>
                                     <w:rPr>
-                                      <w:rFonts w:ascii="Calibri" w:hAnsi="Calibri" w:cs="Calibri"/>
+                                      <w:rFonts w:ascii="Aptos Black" w:hAnsi="Aptos Black" w:cs="Calibri"/>
                                       <w:b/>
                                       <w:caps/>
                                       <w:noProof/>
@@ -2421,7 +2542,7 @@
                                     <w:spacing w:before="0" w:after="0"/>
                                     <w:jc w:val="center"/>
                                     <w:rPr>
-                                      <w:rFonts w:ascii="Calibri" w:hAnsi="Calibri" w:cs="Calibri"/>
+                                      <w:rFonts w:ascii="Aptos Black" w:hAnsi="Aptos Black" w:cs="Calibri"/>
                                       <w:b/>
                                       <w:caps/>
                                       <w:noProof/>
@@ -2431,7 +2552,7 @@
                                   </w:pPr>
                                   <w:r>
                                     <w:rPr>
-                                      <w:rFonts w:ascii="Calibri" w:hAnsi="Calibri" w:cs="Calibri"/>
+                                      <w:rFonts w:ascii="Aptos Black" w:hAnsi="Aptos Black" w:cs="Calibri"/>
                                       <w:b/>
                                       <w:caps/>
                                       <w:noProof/>
@@ -2454,7 +2575,7 @@
                                     <w:spacing w:before="0" w:after="0"/>
                                     <w:jc w:val="center"/>
                                     <w:rPr>
-                                      <w:rFonts w:ascii="Calibri" w:hAnsi="Calibri" w:cs="Calibri"/>
+                                      <w:rFonts w:ascii="Aptos Black" w:hAnsi="Aptos Black" w:cs="Calibri"/>
                                       <w:b/>
                                       <w:caps/>
                                       <w:noProof/>
@@ -2464,7 +2585,7 @@
                                   </w:pPr>
                                   <w:r>
                                     <w:rPr>
-                                      <w:rFonts w:ascii="Calibri" w:hAnsi="Calibri" w:cs="Calibri"/>
+                                      <w:rFonts w:ascii="Aptos Black" w:hAnsi="Aptos Black" w:cs="Calibri"/>
                                       <w:b/>
                                       <w:caps/>
                                       <w:noProof/>
@@ -2587,7 +2708,7 @@
                                       <w:sz w:val="18"/>
                                       <w:szCs w:val="18"/>
                                     </w:rPr>
-                                    <w:instrText xml:space="preserve"> MERGEFIELD  item_v  \* MERGEFORMAT </w:instrText>
+                                    <w:instrText xml:space="preserve"> MERGEFIELD  item  \* MERGEFORMAT </w:instrText>
                                   </w:r>
                                   <w:r>
                                     <w:rPr>
@@ -2604,7 +2725,7 @@
                                       <w:sz w:val="18"/>
                                       <w:szCs w:val="18"/>
                                     </w:rPr>
-                                    <w:t>«item_v»</w:t>
+                                    <w:t>«item»</w:t>
                                   </w:r>
                                   <w:r>
                                     <w:rPr>
@@ -2765,7 +2886,7 @@
                                       <w:sz w:val="18"/>
                                       <w:szCs w:val="18"/>
                                     </w:rPr>
-                                    <w:instrText xml:space="preserve"> MERGEFIELD  tipo_ley  \* MERGEFORMAT </w:instrText>
+                                    <w:instrText xml:space="preserve"> MERGEFIELD  tipoley  \* MERGEFORMAT </w:instrText>
                                   </w:r>
                                   <w:r>
                                     <w:rPr>
@@ -2782,7 +2903,7 @@
                                       <w:sz w:val="18"/>
                                       <w:szCs w:val="18"/>
                                     </w:rPr>
-                                    <w:t>«tipo_ley»</w:t>
+                                    <w:t>«tipoley»</w:t>
                                   </w:r>
                                   <w:r>
                                     <w:rPr>
@@ -2828,7 +2949,7 @@
                                 <w:sz w:val="2"/>
                                 <w:szCs w:val="2"/>
                               </w:rPr>
-                              <w:instrText xml:space="preserve"> MERGEFIELD  TableStart:placas2 \* Lower  \* MERGEFORMAT </w:instrText>
+                              <w:instrText xml:space="preserve"> MERGEFIELD  TableEnd:placas2 \* Lower  \* MERGEFORMAT </w:instrText>
                             </w:r>
                             <w:r>
                               <w:rPr>
@@ -2849,7 +2970,7 @@
                                 <w:sz w:val="2"/>
                                 <w:szCs w:val="2"/>
                               </w:rPr>
-                              <w:t>«tablestart:placas2»</w:t>
+                              <w:t>«tableend:placas2»</w:t>
                             </w:r>
                             <w:r>
                               <w:rPr>
@@ -2910,18 +3031,7 @@
                                       <w:sz w:val="18"/>
                                       <w:szCs w:val="18"/>
                                     </w:rPr>
-                                    <w:t xml:space="preserve">SUB-TOTAL  – </w:t>
-                                  </w:r>
-                                  <w:r>
-                                    <w:rPr>
-                                      <w:rFonts w:ascii="Calibri" w:hAnsi="Calibri" w:cs="Calibri"/>
-                                      <w:b/>
-                                      <w:caps/>
-                                      <w:noProof/>
-                                      <w:sz w:val="18"/>
-                                      <w:szCs w:val="18"/>
-                                    </w:rPr>
-                                    <w:t>2</w:t>
+                                    <w:t>SUB-TOTAL  – 2</w:t>
                                   </w:r>
                                 </w:p>
                               </w:tc>
@@ -3105,7 +3215,7 @@
                               <w:spacing w:before="0" w:after="0"/>
                               <w:jc w:val="center"/>
                               <w:rPr>
-                                <w:rFonts w:ascii="Calibri" w:hAnsi="Calibri" w:cs="Calibri"/>
+                                <w:rFonts w:ascii="Aptos Black" w:hAnsi="Aptos Black" w:cs="Calibri"/>
                                 <w:b/>
                                 <w:caps/>
                                 <w:noProof/>
@@ -3115,7 +3225,7 @@
                             </w:pPr>
                             <w:r>
                               <w:rPr>
-                                <w:rFonts w:ascii="Calibri" w:hAnsi="Calibri" w:cs="Calibri"/>
+                                <w:rFonts w:ascii="Aptos Black" w:hAnsi="Aptos Black" w:cs="Calibri"/>
                                 <w:b/>
                                 <w:caps/>
                                 <w:noProof/>
@@ -3135,7 +3245,7 @@
                               <w:spacing w:before="0" w:after="0"/>
                               <w:jc w:val="center"/>
                               <w:rPr>
-                                <w:rFonts w:ascii="Calibri" w:hAnsi="Calibri" w:cs="Calibri"/>
+                                <w:rFonts w:ascii="Aptos Black" w:hAnsi="Aptos Black" w:cs="Calibri"/>
                                 <w:b/>
                                 <w:caps/>
                                 <w:noProof/>
@@ -3145,7 +3255,7 @@
                             </w:pPr>
                             <w:r>
                               <w:rPr>
-                                <w:rFonts w:ascii="Calibri" w:hAnsi="Calibri" w:cs="Calibri"/>
+                                <w:rFonts w:ascii="Aptos Black" w:hAnsi="Aptos Black" w:cs="Calibri"/>
                                 <w:b/>
                                 <w:caps/>
                                 <w:noProof/>
@@ -3165,7 +3275,7 @@
                               <w:spacing w:before="0" w:after="0"/>
                               <w:jc w:val="center"/>
                               <w:rPr>
-                                <w:rFonts w:ascii="Calibri" w:hAnsi="Calibri" w:cs="Calibri"/>
+                                <w:rFonts w:ascii="Aptos Black" w:hAnsi="Aptos Black" w:cs="Calibri"/>
                                 <w:b/>
                                 <w:caps/>
                                 <w:noProof/>
@@ -3175,7 +3285,7 @@
                             </w:pPr>
                             <w:r>
                               <w:rPr>
-                                <w:rFonts w:ascii="Calibri" w:hAnsi="Calibri" w:cs="Calibri"/>
+                                <w:rFonts w:ascii="Aptos Black" w:hAnsi="Aptos Black" w:cs="Calibri"/>
                                 <w:b/>
                                 <w:caps/>
                                 <w:noProof/>
@@ -3198,7 +3308,7 @@
                               <w:spacing w:before="0" w:after="0"/>
                               <w:jc w:val="center"/>
                               <w:rPr>
-                                <w:rFonts w:ascii="Calibri" w:hAnsi="Calibri" w:cs="Calibri"/>
+                                <w:rFonts w:ascii="Aptos Black" w:hAnsi="Aptos Black" w:cs="Calibri"/>
                                 <w:b/>
                                 <w:caps/>
                                 <w:noProof/>
@@ -3208,7 +3318,7 @@
                             </w:pPr>
                             <w:r>
                               <w:rPr>
-                                <w:rFonts w:ascii="Calibri" w:hAnsi="Calibri" w:cs="Calibri"/>
+                                <w:rFonts w:ascii="Aptos Black" w:hAnsi="Aptos Black" w:cs="Calibri"/>
                                 <w:b/>
                                 <w:caps/>
                                 <w:noProof/>
@@ -3331,7 +3441,7 @@
                                 <w:sz w:val="18"/>
                                 <w:szCs w:val="18"/>
                               </w:rPr>
-                              <w:instrText xml:space="preserve"> MERGEFIELD  item_v  \* MERGEFORMAT </w:instrText>
+                              <w:instrText xml:space="preserve"> MERGEFIELD  item  \* MERGEFORMAT </w:instrText>
                             </w:r>
                             <w:r>
                               <w:rPr>
@@ -3348,7 +3458,7 @@
                                 <w:sz w:val="18"/>
                                 <w:szCs w:val="18"/>
                               </w:rPr>
-                              <w:t>«item_v»</w:t>
+                              <w:t>«item»</w:t>
                             </w:r>
                             <w:r>
                               <w:rPr>
@@ -3509,7 +3619,7 @@
                                 <w:sz w:val="18"/>
                                 <w:szCs w:val="18"/>
                               </w:rPr>
-                              <w:instrText xml:space="preserve"> MERGEFIELD  tipo_ley  \* MERGEFORMAT </w:instrText>
+                              <w:instrText xml:space="preserve"> MERGEFIELD  tipoley  \* MERGEFORMAT </w:instrText>
                             </w:r>
                             <w:r>
                               <w:rPr>
@@ -3526,7 +3636,7 @@
                                 <w:sz w:val="18"/>
                                 <w:szCs w:val="18"/>
                               </w:rPr>
-                              <w:t>«tipo_ley»</w:t>
+                              <w:t>«tipoley»</w:t>
                             </w:r>
                             <w:r>
                               <w:rPr>
@@ -3572,7 +3682,7 @@
                           <w:sz w:val="2"/>
                           <w:szCs w:val="2"/>
                         </w:rPr>
-                        <w:instrText xml:space="preserve"> MERGEFIELD  TableStart:placas2 \* Lower  \* MERGEFORMAT </w:instrText>
+                        <w:instrText xml:space="preserve"> MERGEFIELD  TableEnd:placas2 \* Lower  \* MERGEFORMAT </w:instrText>
                       </w:r>
                       <w:r>
                         <w:rPr>
@@ -3593,7 +3703,7 @@
                           <w:sz w:val="2"/>
                           <w:szCs w:val="2"/>
                         </w:rPr>
-                        <w:t>«tablestart:placas2»</w:t>
+                        <w:t>«tableend:placas2»</w:t>
                       </w:r>
                       <w:r>
                         <w:rPr>
@@ -3654,18 +3764,7 @@
                                 <w:sz w:val="18"/>
                                 <w:szCs w:val="18"/>
                               </w:rPr>
-                              <w:t xml:space="preserve">SUB-TOTAL  – </w:t>
-                            </w:r>
-                            <w:r>
-                              <w:rPr>
-                                <w:rFonts w:ascii="Calibri" w:hAnsi="Calibri" w:cs="Calibri"/>
-                                <w:b/>
-                                <w:caps/>
-                                <w:noProof/>
-                                <w:sz w:val="18"/>
-                                <w:szCs w:val="18"/>
-                              </w:rPr>
-                              <w:t>2</w:t>
+                              <w:t>SUB-TOTAL  – 2</w:t>
                             </w:r>
                           </w:p>
                         </w:tc>
@@ -3755,6 +3854,48 @@
           </mc:Fallback>
         </mc:AlternateContent>
       </w:r>
+    </w:p>
+    <w:p>
+      <w:pPr>
+        <w:spacing w:before="0" w:after="0"/>
+        <w:ind w:firstLine="142"/>
+        <w:rPr>
+          <w:rFonts w:ascii="Calibri" w:hAnsi="Calibri" w:cs="Calibri"/>
+          <w:b/>
+          <w:caps/>
+          <w:noProof/>
+          <w:sz w:val="2"/>
+          <w:szCs w:val="2"/>
+        </w:rPr>
+      </w:pPr>
+    </w:p>
+    <w:p>
+      <w:pPr>
+        <w:spacing w:before="0" w:after="0"/>
+        <w:ind w:firstLine="142"/>
+        <w:rPr>
+          <w:rFonts w:ascii="Calibri" w:hAnsi="Calibri" w:cs="Calibri"/>
+          <w:b/>
+          <w:caps/>
+          <w:noProof/>
+          <w:sz w:val="2"/>
+          <w:szCs w:val="2"/>
+        </w:rPr>
+      </w:pPr>
+    </w:p>
+    <w:p>
+      <w:pPr>
+        <w:spacing w:before="0" w:after="0"/>
+        <w:ind w:firstLine="142"/>
+        <w:rPr>
+          <w:rFonts w:ascii="Calibri" w:hAnsi="Calibri" w:cs="Calibri"/>
+          <w:b/>
+          <w:caps/>
+          <w:noProof/>
+          <w:sz w:val="2"/>
+          <w:szCs w:val="2"/>
+        </w:rPr>
+      </w:pPr>
       <w:r>
         <w:rPr>
           <w:rFonts w:ascii="Calibri" w:hAnsi="Calibri" w:cs="Calibri"/>
@@ -3766,18 +3907,18 @@
         <mc:AlternateContent>
           <mc:Choice Requires="wps">
             <w:drawing>
-              <wp:anchor distT="0" distB="0" distL="114300" distR="114300" simplePos="0" relativeHeight="251660288" behindDoc="0" locked="0" layoutInCell="1" allowOverlap="1" wp14:anchorId="0FF15AAA" wp14:editId="5BFB02EA">
+              <wp:anchor distT="0" distB="0" distL="114300" distR="114300" simplePos="0" relativeHeight="251666432" behindDoc="1" locked="0" layoutInCell="1" allowOverlap="1" wp14:anchorId="5990CF46" wp14:editId="444402E3">
                 <wp:simplePos x="0" y="0"/>
                 <wp:positionH relativeFrom="column">
-                  <wp:posOffset>-2540</wp:posOffset>
+                  <wp:posOffset>635</wp:posOffset>
                 </wp:positionH>
                 <wp:positionV relativeFrom="paragraph">
-                  <wp:posOffset>9525</wp:posOffset>
+                  <wp:posOffset>4445</wp:posOffset>
                 </wp:positionV>
                 <wp:extent cx="2934970" cy="1109980"/>
                 <wp:effectExtent l="0" t="0" r="0" b="0"/>
                 <wp:wrapSquare wrapText="bothSides"/>
-                <wp:docPr id="929766916" name="Rectángulo 2"/>
+                <wp:docPr id="821845427" name="Rectángulo 2"/>
                 <wp:cNvGraphicFramePr/>
                 <a:graphic xmlns:a="http://schemas.openxmlformats.org/drawingml/2006/main">
                   <a:graphicData uri="http://schemas.microsoft.com/office/word/2010/wordprocessingShape">
@@ -3895,7 +4036,7 @@
                                     <w:spacing w:before="0" w:after="0"/>
                                     <w:jc w:val="center"/>
                                     <w:rPr>
-                                      <w:rFonts w:ascii="Calibri" w:hAnsi="Calibri" w:cs="Calibri"/>
+                                      <w:rFonts w:ascii="Aptos Black" w:hAnsi="Aptos Black" w:cs="Calibri"/>
                                       <w:b/>
                                       <w:caps/>
                                       <w:noProof/>
@@ -3905,7 +4046,7 @@
                                   </w:pPr>
                                   <w:r>
                                     <w:rPr>
-                                      <w:rFonts w:ascii="Calibri" w:hAnsi="Calibri" w:cs="Calibri"/>
+                                      <w:rFonts w:ascii="Aptos Black" w:hAnsi="Aptos Black" w:cs="Calibri"/>
                                       <w:b/>
                                       <w:caps/>
                                       <w:noProof/>
@@ -3925,7 +4066,7 @@
                                     <w:spacing w:before="0" w:after="0"/>
                                     <w:jc w:val="center"/>
                                     <w:rPr>
-                                      <w:rFonts w:ascii="Calibri" w:hAnsi="Calibri" w:cs="Calibri"/>
+                                      <w:rFonts w:ascii="Aptos Black" w:hAnsi="Aptos Black" w:cs="Calibri"/>
                                       <w:b/>
                                       <w:caps/>
                                       <w:noProof/>
@@ -3935,7 +4076,7 @@
                                   </w:pPr>
                                   <w:r>
                                     <w:rPr>
-                                      <w:rFonts w:ascii="Calibri" w:hAnsi="Calibri" w:cs="Calibri"/>
+                                      <w:rFonts w:ascii="Aptos Black" w:hAnsi="Aptos Black" w:cs="Calibri"/>
                                       <w:b/>
                                       <w:caps/>
                                       <w:noProof/>
@@ -3955,7 +4096,7 @@
                                     <w:spacing w:before="0" w:after="0"/>
                                     <w:jc w:val="center"/>
                                     <w:rPr>
-                                      <w:rFonts w:ascii="Calibri" w:hAnsi="Calibri" w:cs="Calibri"/>
+                                      <w:rFonts w:ascii="Aptos Black" w:hAnsi="Aptos Black" w:cs="Calibri"/>
                                       <w:b/>
                                       <w:caps/>
                                       <w:noProof/>
@@ -3965,7 +4106,7 @@
                                   </w:pPr>
                                   <w:r>
                                     <w:rPr>
-                                      <w:rFonts w:ascii="Calibri" w:hAnsi="Calibri" w:cs="Calibri"/>
+                                      <w:rFonts w:ascii="Aptos Black" w:hAnsi="Aptos Black" w:cs="Calibri"/>
                                       <w:b/>
                                       <w:caps/>
                                       <w:noProof/>
@@ -3988,7 +4129,7 @@
                                     <w:spacing w:before="0" w:after="0"/>
                                     <w:jc w:val="center"/>
                                     <w:rPr>
-                                      <w:rFonts w:ascii="Calibri" w:hAnsi="Calibri" w:cs="Calibri"/>
+                                      <w:rFonts w:ascii="Aptos Black" w:hAnsi="Aptos Black" w:cs="Calibri"/>
                                       <w:b/>
                                       <w:caps/>
                                       <w:noProof/>
@@ -3998,7 +4139,7 @@
                                   </w:pPr>
                                   <w:r>
                                     <w:rPr>
-                                      <w:rFonts w:ascii="Calibri" w:hAnsi="Calibri" w:cs="Calibri"/>
+                                      <w:rFonts w:ascii="Aptos Black" w:hAnsi="Aptos Black" w:cs="Calibri"/>
                                       <w:b/>
                                       <w:caps/>
                                       <w:noProof/>
@@ -4121,7 +4262,7 @@
                                       <w:sz w:val="18"/>
                                       <w:szCs w:val="18"/>
                                     </w:rPr>
-                                    <w:instrText xml:space="preserve"> MERGEFIELD  item_v  \* MERGEFORMAT </w:instrText>
+                                    <w:instrText xml:space="preserve"> MERGEFIELD  item  \* MERGEFORMAT </w:instrText>
                                   </w:r>
                                   <w:r>
                                     <w:rPr>
@@ -4138,7 +4279,7 @@
                                       <w:sz w:val="18"/>
                                       <w:szCs w:val="18"/>
                                     </w:rPr>
-                                    <w:t>«item_v»</w:t>
+                                    <w:t>«item»</w:t>
                                   </w:r>
                                   <w:r>
                                     <w:rPr>
@@ -4299,7 +4440,7 @@
                                       <w:sz w:val="18"/>
                                       <w:szCs w:val="18"/>
                                     </w:rPr>
-                                    <w:instrText xml:space="preserve"> MERGEFIELD  tipo_ley  \* MERGEFORMAT </w:instrText>
+                                    <w:instrText xml:space="preserve"> MERGEFIELD  tipoley  \* MERGEFORMAT </w:instrText>
                                   </w:r>
                                   <w:r>
                                     <w:rPr>
@@ -4316,7 +4457,7 @@
                                       <w:sz w:val="18"/>
                                       <w:szCs w:val="18"/>
                                     </w:rPr>
-                                    <w:t>«tipo_ley»</w:t>
+                                    <w:t>«tipoley»</w:t>
                                   </w:r>
                                   <w:r>
                                     <w:rPr>
@@ -4362,7 +4503,7 @@
                                 <w:sz w:val="2"/>
                                 <w:szCs w:val="2"/>
                               </w:rPr>
-                              <w:instrText xml:space="preserve"> MERGEFIELD  TableStart:placas1 \* Lower  \* MERGEFORMAT </w:instrText>
+                              <w:instrText xml:space="preserve"> MERGEFIELD  TableEnd:placas1 \* Lower  \* MERGEFORMAT </w:instrText>
                             </w:r>
                             <w:r>
                               <w:rPr>
@@ -4383,7 +4524,7 @@
                                 <w:sz w:val="2"/>
                                 <w:szCs w:val="2"/>
                               </w:rPr>
-                              <w:t>«tablestart:placas1»</w:t>
+                              <w:t>«tableend:placas1»</w:t>
                             </w:r>
                             <w:r>
                               <w:rPr>
@@ -4542,7 +4683,7 @@
           </mc:Choice>
           <mc:Fallback>
             <w:pict>
-              <v:rect w14:anchorId="0FF15AAA" id="_x0000_s1028" style="position:absolute;left:0;text-align:left;margin-left:-.2pt;margin-top:.75pt;width:231.1pt;height:87.4pt;z-index:251660288;visibility:visible;mso-wrap-style:square;mso-wrap-distance-left:9pt;mso-wrap-distance-top:0;mso-wrap-distance-right:9pt;mso-wrap-distance-bottom:0;mso-position-horizontal:absolute;mso-position-horizontal-relative:text;mso-position-vertical:absolute;mso-position-vertical-relative:text;v-text-anchor:middle" o:gfxdata="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" filled="f" stroked="f">
+              <v:rect w14:anchorId="5990CF46" id="_x0000_s1028" style="position:absolute;left:0;text-align:left;margin-left:.05pt;margin-top:.35pt;width:231.1pt;height:87.4pt;z-index:-251650048;visibility:visible;mso-wrap-style:square;mso-wrap-distance-left:9pt;mso-wrap-distance-top:0;mso-wrap-distance-right:9pt;mso-wrap-distance-bottom:0;mso-position-horizontal:absolute;mso-position-horizontal-relative:text;mso-position-vertical:absolute;mso-position-vertical-relative:text;v-text-anchor:middle" o:gfxdata="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" filled="f" stroked="f">
                 <v:textbox>
                   <w:txbxContent>
                     <w:tbl>
@@ -4628,7 +4769,7 @@
                               <w:spacing w:before="0" w:after="0"/>
                               <w:jc w:val="center"/>
                               <w:rPr>
-                                <w:rFonts w:ascii="Calibri" w:hAnsi="Calibri" w:cs="Calibri"/>
+                                <w:rFonts w:ascii="Aptos Black" w:hAnsi="Aptos Black" w:cs="Calibri"/>
                                 <w:b/>
                                 <w:caps/>
                                 <w:noProof/>
@@ -4638,7 +4779,7 @@
                             </w:pPr>
                             <w:r>
                               <w:rPr>
-                                <w:rFonts w:ascii="Calibri" w:hAnsi="Calibri" w:cs="Calibri"/>
+                                <w:rFonts w:ascii="Aptos Black" w:hAnsi="Aptos Black" w:cs="Calibri"/>
                                 <w:b/>
                                 <w:caps/>
                                 <w:noProof/>
@@ -4658,7 +4799,7 @@
                               <w:spacing w:before="0" w:after="0"/>
                               <w:jc w:val="center"/>
                               <w:rPr>
-                                <w:rFonts w:ascii="Calibri" w:hAnsi="Calibri" w:cs="Calibri"/>
+                                <w:rFonts w:ascii="Aptos Black" w:hAnsi="Aptos Black" w:cs="Calibri"/>
                                 <w:b/>
                                 <w:caps/>
                                 <w:noProof/>
@@ -4668,7 +4809,7 @@
                             </w:pPr>
                             <w:r>
                               <w:rPr>
-                                <w:rFonts w:ascii="Calibri" w:hAnsi="Calibri" w:cs="Calibri"/>
+                                <w:rFonts w:ascii="Aptos Black" w:hAnsi="Aptos Black" w:cs="Calibri"/>
                                 <w:b/>
                                 <w:caps/>
                                 <w:noProof/>
@@ -4688,7 +4829,7 @@
                               <w:spacing w:before="0" w:after="0"/>
                               <w:jc w:val="center"/>
                               <w:rPr>
-                                <w:rFonts w:ascii="Calibri" w:hAnsi="Calibri" w:cs="Calibri"/>
+                                <w:rFonts w:ascii="Aptos Black" w:hAnsi="Aptos Black" w:cs="Calibri"/>
                                 <w:b/>
                                 <w:caps/>
                                 <w:noProof/>
@@ -4698,7 +4839,7 @@
                             </w:pPr>
                             <w:r>
                               <w:rPr>
-                                <w:rFonts w:ascii="Calibri" w:hAnsi="Calibri" w:cs="Calibri"/>
+                                <w:rFonts w:ascii="Aptos Black" w:hAnsi="Aptos Black" w:cs="Calibri"/>
                                 <w:b/>
                                 <w:caps/>
                                 <w:noProof/>
@@ -4721,7 +4862,7 @@
                               <w:spacing w:before="0" w:after="0"/>
                               <w:jc w:val="center"/>
                               <w:rPr>
-                                <w:rFonts w:ascii="Calibri" w:hAnsi="Calibri" w:cs="Calibri"/>
+                                <w:rFonts w:ascii="Aptos Black" w:hAnsi="Aptos Black" w:cs="Calibri"/>
                                 <w:b/>
                                 <w:caps/>
                                 <w:noProof/>
@@ -4731,7 +4872,7 @@
                             </w:pPr>
                             <w:r>
                               <w:rPr>
-                                <w:rFonts w:ascii="Calibri" w:hAnsi="Calibri" w:cs="Calibri"/>
+                                <w:rFonts w:ascii="Aptos Black" w:hAnsi="Aptos Black" w:cs="Calibri"/>
                                 <w:b/>
                                 <w:caps/>
                                 <w:noProof/>
@@ -4854,7 +4995,7 @@
                                 <w:sz w:val="18"/>
                                 <w:szCs w:val="18"/>
                               </w:rPr>
-                              <w:instrText xml:space="preserve"> MERGEFIELD  item_v  \* MERGEFORMAT </w:instrText>
+                              <w:instrText xml:space="preserve"> MERGEFIELD  item  \* MERGEFORMAT </w:instrText>
                             </w:r>
                             <w:r>
                               <w:rPr>
@@ -4871,7 +5012,7 @@
                                 <w:sz w:val="18"/>
                                 <w:szCs w:val="18"/>
                               </w:rPr>
-                              <w:t>«item_v»</w:t>
+                              <w:t>«item»</w:t>
                             </w:r>
                             <w:r>
                               <w:rPr>
@@ -5032,7 +5173,7 @@
                                 <w:sz w:val="18"/>
                                 <w:szCs w:val="18"/>
                               </w:rPr>
-                              <w:instrText xml:space="preserve"> MERGEFIELD  tipo_ley  \* MERGEFORMAT </w:instrText>
+                              <w:instrText xml:space="preserve"> MERGEFIELD  tipoley  \* MERGEFORMAT </w:instrText>
                             </w:r>
                             <w:r>
                               <w:rPr>
@@ -5049,7 +5190,7 @@
                                 <w:sz w:val="18"/>
                                 <w:szCs w:val="18"/>
                               </w:rPr>
-                              <w:t>«tipo_ley»</w:t>
+                              <w:t>«tipoley»</w:t>
                             </w:r>
                             <w:r>
                               <w:rPr>
@@ -5095,7 +5236,7 @@
                           <w:sz w:val="2"/>
                           <w:szCs w:val="2"/>
                         </w:rPr>
-                        <w:instrText xml:space="preserve"> MERGEFIELD  TableStart:placas1 \* Lower  \* MERGEFORMAT </w:instrText>
+                        <w:instrText xml:space="preserve"> MERGEFIELD  TableEnd:placas1 \* Lower  \* MERGEFORMAT </w:instrText>
                       </w:r>
                       <w:r>
                         <w:rPr>
@@ -5116,7 +5257,7 @@
                           <w:sz w:val="2"/>
                           <w:szCs w:val="2"/>
                         </w:rPr>
-                        <w:t>«tablestart:placas1»</w:t>
+                        <w:t>«tableend:placas1»</w:t>
                       </w:r>
                       <w:r>
                         <w:rPr>
@@ -5267,48 +5408,6 @@
           </mc:Fallback>
         </mc:AlternateContent>
       </w:r>
-    </w:p>
-    <w:p>
-      <w:pPr>
-        <w:spacing w:before="0" w:after="0"/>
-        <w:ind w:firstLine="142"/>
-        <w:rPr>
-          <w:rFonts w:ascii="Calibri" w:hAnsi="Calibri" w:cs="Calibri"/>
-          <w:b/>
-          <w:caps/>
-          <w:noProof/>
-          <w:sz w:val="2"/>
-          <w:szCs w:val="2"/>
-        </w:rPr>
-      </w:pPr>
-    </w:p>
-    <w:p>
-      <w:pPr>
-        <w:spacing w:before="0" w:after="0"/>
-        <w:ind w:firstLine="142"/>
-        <w:rPr>
-          <w:rFonts w:ascii="Calibri" w:hAnsi="Calibri" w:cs="Calibri"/>
-          <w:b/>
-          <w:caps/>
-          <w:noProof/>
-          <w:sz w:val="2"/>
-          <w:szCs w:val="2"/>
-        </w:rPr>
-      </w:pPr>
-    </w:p>
-    <w:p>
-      <w:pPr>
-        <w:spacing w:before="0" w:after="0"/>
-        <w:ind w:firstLine="142"/>
-        <w:rPr>
-          <w:rFonts w:ascii="Calibri" w:hAnsi="Calibri" w:cs="Calibri"/>
-          <w:b/>
-          <w:caps/>
-          <w:noProof/>
-          <w:sz w:val="2"/>
-          <w:szCs w:val="2"/>
-        </w:rPr>
-      </w:pPr>
     </w:p>
     <w:p>
       <w:pPr>
@@ -5895,8 +5994,8 @@
         <w:gridCol w:w="1891"/>
         <w:gridCol w:w="1626"/>
         <w:gridCol w:w="1019"/>
-        <w:gridCol w:w="1276"/>
-        <w:gridCol w:w="1276"/>
+        <w:gridCol w:w="1564"/>
+        <w:gridCol w:w="1158"/>
         <w:gridCol w:w="1276"/>
       </w:tblGrid>
       <w:tr>
@@ -6035,7 +6134,7 @@
         </w:tc>
         <w:tc>
           <w:tcPr>
-            <w:tcW w:w="1276" w:type="dxa"/>
+            <w:tcW w:w="1564" w:type="dxa"/>
           </w:tcPr>
           <w:p>
             <w:pPr>
@@ -6060,7 +6159,7 @@
         </w:tc>
         <w:tc>
           <w:tcPr>
-            <w:tcW w:w="1276" w:type="dxa"/>
+            <w:tcW w:w="988" w:type="dxa"/>
           </w:tcPr>
           <w:p>
             <w:pPr>
@@ -6212,7 +6311,7 @@
         </w:tc>
         <w:tc>
           <w:tcPr>
-            <w:tcW w:w="1276" w:type="dxa"/>
+            <w:tcW w:w="1564" w:type="dxa"/>
           </w:tcPr>
           <w:p>
             <w:pPr>
@@ -6228,7 +6327,7 @@
         </w:tc>
         <w:tc>
           <w:tcPr>
-            <w:tcW w:w="1276" w:type="dxa"/>
+            <w:tcW w:w="988" w:type="dxa"/>
           </w:tcPr>
           <w:p>
             <w:pPr>
@@ -6350,7 +6449,7 @@
         </w:tc>
         <w:tc>
           <w:tcPr>
-            <w:tcW w:w="1276" w:type="dxa"/>
+            <w:tcW w:w="1564" w:type="dxa"/>
           </w:tcPr>
           <w:p>
             <w:pPr>
@@ -6366,7 +6465,7 @@
         </w:tc>
         <w:tc>
           <w:tcPr>
-            <w:tcW w:w="1276" w:type="dxa"/>
+            <w:tcW w:w="988" w:type="dxa"/>
           </w:tcPr>
           <w:p>
             <w:pPr>
@@ -6569,7 +6668,7 @@
         </w:tc>
         <w:tc>
           <w:tcPr>
-            <w:tcW w:w="1276" w:type="dxa"/>
+            <w:tcW w:w="1564" w:type="dxa"/>
           </w:tcPr>
           <w:p>
             <w:pPr>
@@ -6585,7 +6684,7 @@
         </w:tc>
         <w:tc>
           <w:tcPr>
-            <w:tcW w:w="1276" w:type="dxa"/>
+            <w:tcW w:w="988" w:type="dxa"/>
           </w:tcPr>
           <w:p>
             <w:pPr>
@@ -6626,17 +6725,70 @@
           <w:b/>
           <w:caps/>
           <w:noProof/>
+          <w:sz w:val="2"/>
+          <w:szCs w:val="2"/>
         </w:rPr>
       </w:pPr>
     </w:p>
     <w:sectPr>
-      <w:pgSz w:w="11906" w:h="16838"/>
-      <w:pgMar w:top="142" w:right="424" w:bottom="1417" w:left="284" w:header="708" w:footer="708" w:gutter="0"/>
+      <w:pgSz w:w="11906" w:h="16838" w:code="9"/>
+      <w:pgMar w:top="176" w:right="170" w:bottom="1418" w:left="284" w:header="709" w:footer="0" w:gutter="0"/>
+      <w:paperSrc w:other="15"/>
       <w:cols w:space="708"/>
       <w:docGrid w:linePitch="360"/>
     </w:sectPr>
   </w:body>
 </w:document>
+</file>
+
+<file path=word/endnotes.xml><?xml version="1.0" encoding="utf-8"?>
+<w:endnotes xmlns:wpc="http://schemas.microsoft.com/office/word/2010/wordprocessingCanvas" xmlns:cx="http://schemas.microsoft.com/office/drawing/2014/chartex" xmlns:cx1="http://schemas.microsoft.com/office/drawing/2015/9/8/chartex" xmlns:cx2="http://schemas.microsoft.com/office/drawing/2015/10/21/chartex" xmlns:cx3="http://schemas.microsoft.com/office/drawing/2016/5/9/chartex" xmlns:cx4="http://schemas.microsoft.com/office/drawing/2016/5/10/chartex" xmlns:cx5="http://schemas.microsoft.com/office/drawing/2016/5/11/chartex" xmlns:cx6="http://schemas.microsoft.com/office/drawing/2016/5/12/chartex" xmlns:cx7="http://schemas.microsoft.com/office/drawing/2016/5/13/chartex" xmlns:cx8="http://schemas.microsoft.com/office/drawing/2016/5/14/chartex" xmlns:mc="http://schemas.openxmlformats.org/markup-compatibility/2006" xmlns:aink="http://schemas.microsoft.com/office/drawing/2016/ink" xmlns:am3d="http://schemas.microsoft.com/office/drawing/2017/model3d" xmlns:o="urn:schemas-microsoft-com:office:office" xmlns:oel="http://schemas.microsoft.com/office/2019/extlst" xmlns:r="http://schemas.openxmlformats.org/officeDocument/2006/relationships" xmlns:m="http://schemas.openxmlformats.org/officeDocument/2006/math" xmlns:v="urn:schemas-microsoft-com:vml" xmlns:wp14="http://schemas.microsoft.com/office/word/2010/wordprocessingDrawing" xmlns:wp="http://schemas.openxmlformats.org/drawingml/2006/wordprocessingDrawing" xmlns:w10="urn:schemas-microsoft-com:office:word" xmlns:w="http://schemas.openxmlformats.org/wordprocessingml/2006/main" xmlns:w14="http://schemas.microsoft.com/office/word/2010/wordml" xmlns:w15="http://schemas.microsoft.com/office/word/2012/wordml" xmlns:w16cei="http://schemas.microsoft.com/office/word/2026/wordml/cei" xmlns:w16cex="http://schemas.microsoft.com/office/word/2018/wordml/cex" xmlns:w16cid="http://schemas.microsoft.com/office/word/2016/wordml/cid" xmlns:w16="http://schemas.microsoft.com/office/word/2018/wordml" xmlns:w16du="http://schemas.microsoft.com/office/word/2023/wordml/word16du" xmlns:w16sdtdh="http://schemas.microsoft.com/office/word/2020/wordml/sdtdatahash" xmlns:w16sdtfl="http://schemas.microsoft.com/office/word/2024/wordml/sdtformatlock" xmlns:w16se="http://schemas.microsoft.com/office/word/2015/wordml/symex" xmlns:wpg="http://schemas.microsoft.com/office/word/2010/wordprocessingGroup" xmlns:wpi="http://schemas.microsoft.com/office/word/2010/wordprocessingInk" xmlns:wne="http://schemas.microsoft.com/office/word/2006/wordml" xmlns:wps="http://schemas.microsoft.com/office/word/2010/wordprocessingShape" mc:Ignorable="w14 w15 w16se w16cid w16 w16cex w16sdtdh w16sdtfl w16du wp14">
+  <w:endnote w:type="separator" w:id="-1">
+    <w:p>
+      <w:pPr>
+        <w:spacing w:before="0" w:after="0"/>
+      </w:pPr>
+      <w:r>
+        <w:separator/>
+      </w:r>
+    </w:p>
+  </w:endnote>
+  <w:endnote w:type="continuationSeparator" w:id="0">
+    <w:p>
+      <w:pPr>
+        <w:spacing w:before="0" w:after="0"/>
+      </w:pPr>
+      <w:r>
+        <w:continuationSeparator/>
+      </w:r>
+    </w:p>
+  </w:endnote>
+</w:endnotes>
+</file>
+
+<file path=word/footnotes.xml><?xml version="1.0" encoding="utf-8"?>
+<w:footnotes xmlns:wpc="http://schemas.microsoft.com/office/word/2010/wordprocessingCanvas" xmlns:cx="http://schemas.microsoft.com/office/drawing/2014/chartex" xmlns:cx1="http://schemas.microsoft.com/office/drawing/2015/9/8/chartex" xmlns:cx2="http://schemas.microsoft.com/office/drawing/2015/10/21/chartex" xmlns:cx3="http://schemas.microsoft.com/office/drawing/2016/5/9/chartex" xmlns:cx4="http://schemas.microsoft.com/office/drawing/2016/5/10/chartex" xmlns:cx5="http://schemas.microsoft.com/office/drawing/2016/5/11/chartex" xmlns:cx6="http://schemas.microsoft.com/office/drawing/2016/5/12/chartex" xmlns:cx7="http://schemas.microsoft.com/office/drawing/2016/5/13/chartex" xmlns:cx8="http://schemas.microsoft.com/office/drawing/2016/5/14/chartex" xmlns:mc="http://schemas.openxmlformats.org/markup-compatibility/2006" xmlns:aink="http://schemas.microsoft.com/office/drawing/2016/ink" xmlns:am3d="http://schemas.microsoft.com/office/drawing/2017/model3d" xmlns:o="urn:schemas-microsoft-com:office:office" xmlns:oel="http://schemas.microsoft.com/office/2019/extlst" xmlns:r="http://schemas.openxmlformats.org/officeDocument/2006/relationships" xmlns:m="http://schemas.openxmlformats.org/officeDocument/2006/math" xmlns:v="urn:schemas-microsoft-com:vml" xmlns:wp14="http://schemas.microsoft.com/office/word/2010/wordprocessingDrawing" xmlns:wp="http://schemas.openxmlformats.org/drawingml/2006/wordprocessingDrawing" xmlns:w10="urn:schemas-microsoft-com:office:word" xmlns:w="http://schemas.openxmlformats.org/wordprocessingml/2006/main" xmlns:w14="http://schemas.microsoft.com/office/word/2010/wordml" xmlns:w15="http://schemas.microsoft.com/office/word/2012/wordml" xmlns:w16cei="http://schemas.microsoft.com/office/word/2026/wordml/cei" xmlns:w16cex="http://schemas.microsoft.com/office/word/2018/wordml/cex" xmlns:w16cid="http://schemas.microsoft.com/office/word/2016/wordml/cid" xmlns:w16="http://schemas.microsoft.com/office/word/2018/wordml" xmlns:w16du="http://schemas.microsoft.com/office/word/2023/wordml/word16du" xmlns:w16sdtdh="http://schemas.microsoft.com/office/word/2020/wordml/sdtdatahash" xmlns:w16sdtfl="http://schemas.microsoft.com/office/word/2024/wordml/sdtformatlock" xmlns:w16se="http://schemas.microsoft.com/office/word/2015/wordml/symex" xmlns:wpg="http://schemas.microsoft.com/office/word/2010/wordprocessingGroup" xmlns:wpi="http://schemas.microsoft.com/office/word/2010/wordprocessingInk" xmlns:wne="http://schemas.microsoft.com/office/word/2006/wordml" xmlns:wps="http://schemas.microsoft.com/office/word/2010/wordprocessingShape" mc:Ignorable="w14 w15 w16se w16cid w16 w16cex w16sdtdh w16sdtfl w16du wp14">
+  <w:footnote w:type="separator" w:id="-1">
+    <w:p>
+      <w:pPr>
+        <w:spacing w:before="0" w:after="0"/>
+      </w:pPr>
+      <w:r>
+        <w:separator/>
+      </w:r>
+    </w:p>
+  </w:footnote>
+  <w:footnote w:type="continuationSeparator" w:id="0">
+    <w:p>
+      <w:pPr>
+        <w:spacing w:before="0" w:after="0"/>
+      </w:pPr>
+      <w:r>
+        <w:continuationSeparator/>
+      </w:r>
+    </w:p>
+  </w:footnote>
+</w:footnotes>
 </file>
 
 <file path=word/styles.xml><?xml version="1.0" encoding="utf-8"?>
@@ -7040,7 +7192,7 @@
     <w:name w:val="Normal"/>
     <w:unhideWhenUsed/>
     <w:qFormat/>
-    <w:rsid w:val="005230A6"/>
+    <w:rsid w:val="00093812"/>
     <w:pPr>
       <w:spacing w:before="40" w:after="40" w:line="240" w:lineRule="auto"/>
     </w:pPr>
@@ -7284,6 +7436,7 @@
   <w:style w:type="character" w:default="1" w:styleId="Fuentedeprrafopredeter">
     <w:name w:val="Default Paragraph Font"/>
     <w:uiPriority w:val="1"/>
+    <w:semiHidden/>
     <w:unhideWhenUsed/>
   </w:style>
   <w:style w:type="table" w:default="1" w:styleId="Tablanormal">
@@ -7638,6 +7791,110 @@
       </w:tblBorders>
     </w:tblPr>
   </w:style>
+  <w:style w:type="paragraph" w:styleId="Encabezado">
+    <w:name w:val="header"/>
+    <w:basedOn w:val="Normal"/>
+    <w:link w:val="EncabezadoCar"/>
+    <w:uiPriority w:val="99"/>
+    <w:unhideWhenUsed/>
+    <w:rsid w:val="00413992"/>
+    <w:pPr>
+      <w:tabs>
+        <w:tab w:val="center" w:pos="4419"/>
+        <w:tab w:val="right" w:pos="8838"/>
+      </w:tabs>
+      <w:spacing w:before="0" w:after="0"/>
+    </w:pPr>
+    <w:rPr>
+      <w:rFonts w:ascii="Calibri" w:eastAsia="Calibri" w:hAnsi="Calibri" w:cs="Arial"/>
+      <w:kern w:val="0"/>
+      <w:lang w:val="en-US"/>
+    </w:rPr>
+  </w:style>
+  <w:style w:type="character" w:customStyle="1" w:styleId="EncabezadoCar">
+    <w:name w:val="Encabezado Car"/>
+    <w:basedOn w:val="Fuentedeprrafopredeter"/>
+    <w:link w:val="Encabezado"/>
+    <w:uiPriority w:val="99"/>
+    <w:rsid w:val="00413992"/>
+    <w:rPr>
+      <w:rFonts w:ascii="Calibri" w:eastAsia="Calibri" w:hAnsi="Calibri" w:cs="Arial"/>
+      <w:kern w:val="0"/>
+      <w:sz w:val="20"/>
+      <w:szCs w:val="20"/>
+      <w:lang w:val="en-US"/>
+      <w14:ligatures w14:val="none"/>
+    </w:rPr>
+  </w:style>
+  <w:style w:type="table" w:styleId="Tablaconcuadrculaclara">
+    <w:name w:val="Grid Table Light"/>
+    <w:basedOn w:val="Tablanormal"/>
+    <w:uiPriority w:val="40"/>
+    <w:rsid w:val="00413992"/>
+    <w:pPr>
+      <w:spacing w:before="40" w:after="0" w:line="240" w:lineRule="auto"/>
+    </w:pPr>
+    <w:rPr>
+      <w:rFonts w:eastAsia="MS Mincho"/>
+      <w:color w:val="595959" w:themeColor="text1" w:themeTint="A6"/>
+      <w:kern w:val="0"/>
+      <w:sz w:val="20"/>
+      <w:szCs w:val="20"/>
+      <w14:ligatures w14:val="none"/>
+    </w:rPr>
+    <w:tblPr>
+      <w:tblStyleColBandSize w:val="1"/>
+      <w:tblBorders>
+        <w:top w:val="single" w:sz="4" w:space="0" w:color="BFBFBF" w:themeColor="background1" w:themeShade="BF"/>
+        <w:left w:val="single" w:sz="4" w:space="0" w:color="BFBFBF" w:themeColor="background1" w:themeShade="BF"/>
+        <w:bottom w:val="single" w:sz="4" w:space="0" w:color="BFBFBF" w:themeColor="background1" w:themeShade="BF"/>
+        <w:right w:val="single" w:sz="4" w:space="0" w:color="BFBFBF" w:themeColor="background1" w:themeShade="BF"/>
+        <w:insideH w:val="single" w:sz="4" w:space="0" w:color="BFBFBF" w:themeColor="background1" w:themeShade="BF"/>
+        <w:insideV w:val="single" w:sz="4" w:space="0" w:color="BFBFBF" w:themeColor="background1" w:themeShade="BF"/>
+      </w:tblBorders>
+    </w:tblPr>
+    <w:tcPr>
+      <w:vAlign w:val="center"/>
+    </w:tcPr>
+    <w:tblStylePr w:type="band1Vert">
+      <w:rPr>
+        <w:color w:val="FFFFFF" w:themeColor="background1"/>
+      </w:rPr>
+      <w:tblPr/>
+      <w:tcPr>
+        <w:shd w:val="clear" w:color="auto" w:fill="7F7F7F" w:themeFill="text1" w:themeFillTint="80"/>
+      </w:tcPr>
+    </w:tblStylePr>
+  </w:style>
+  <w:style w:type="paragraph" w:styleId="Piedepgina">
+    <w:name w:val="footer"/>
+    <w:basedOn w:val="Normal"/>
+    <w:link w:val="PiedepginaCar"/>
+    <w:uiPriority w:val="99"/>
+    <w:unhideWhenUsed/>
+    <w:rsid w:val="00093812"/>
+    <w:pPr>
+      <w:tabs>
+        <w:tab w:val="center" w:pos="4252"/>
+        <w:tab w:val="right" w:pos="8504"/>
+      </w:tabs>
+      <w:spacing w:before="0" w:after="0"/>
+    </w:pPr>
+  </w:style>
+  <w:style w:type="character" w:customStyle="1" w:styleId="PiedepginaCar">
+    <w:name w:val="Pie de página Car"/>
+    <w:basedOn w:val="Fuentedeprrafopredeter"/>
+    <w:link w:val="Piedepgina"/>
+    <w:uiPriority w:val="99"/>
+    <w:rsid w:val="00093812"/>
+    <w:rPr>
+      <w:rFonts w:eastAsia="MS Mincho"/>
+      <w:kern w:val="20"/>
+      <w:sz w:val="20"/>
+      <w:szCs w:val="20"/>
+      <w14:ligatures w14:val="none"/>
+    </w:rPr>
+  </w:style>
 </w:styles>
 </file>
 
@@ -7956,6 +8213,28 @@
 </a:theme>
 </file>
 
+<file path=word/webextensions/taskpanes.xml><?xml version="1.0" encoding="utf-8"?>
+<wetp:taskpanes xmlns:wetp="http://schemas.microsoft.com/office/webextensions/taskpanes/2010/11">
+  <wetp:taskpane dockstate="right" visibility="0" width="438" row="2">
+    <wetp:webextensionref xmlns:r="http://schemas.openxmlformats.org/officeDocument/2006/relationships" r:id="rId1"/>
+  </wetp:taskpane>
+</wetp:taskpanes>
+</file>
+
+<file path=word/webextensions/webextension1.xml><?xml version="1.0" encoding="utf-8"?>
+<we:webextension xmlns:we="http://schemas.microsoft.com/office/webextensions/webextension/2010/11" id="{461D7364-EAF9-4739-8747-2AD10E502946}">
+  <we:reference id="wa200010725" version="1.0.0.1" store="es-ES" storeType="OMEX"/>
+  <we:alternateReferences>
+    <we:reference id="WA200010725" version="1.0.0.1" store="" storeType="OMEX"/>
+  </we:alternateReferences>
+  <we:properties>
+    <we:property name="claude.fileId" value="&quot;0f95b534-c47f-45fc-aeb8-9236fc9633b4&quot;"/>
+  </we:properties>
+  <we:bindings/>
+  <we:snapshot xmlns:r="http://schemas.openxmlformats.org/officeDocument/2006/relationships"/>
+</we:webextension>
+</file>
+
 <file path=customXml/item1.xml><?xml version="1.0" encoding="utf-8"?>
 <b:Sources xmlns:b="http://schemas.openxmlformats.org/officeDocument/2006/bibliography" xmlns="http://schemas.openxmlformats.org/officeDocument/2006/bibliography" SelectedStyle="\APASixthEditionOfficeOnline.xsl" StyleName="APA" Version="6"/>
 </file>

</xml_diff>

<commit_message>
feat: actualizar plantilla de acta entrega
</commit_message>
<xml_diff>
--- a/pesaje/analytica/Report/PrintActaEntrega.docx
+++ b/pesaje/analytica/Report/PrintActaEntrega.docx
@@ -1289,25 +1289,7 @@
                 <w:sz w:val="16"/>
                 <w:szCs w:val="16"/>
               </w:rPr>
-              <w:t>«</w:t>
-            </w:r>
-            <w:proofErr w:type="spellStart"/>
-            <w:r>
-              <w:rPr>
-                <w:rFonts w:ascii="Calibri" w:hAnsi="Calibri" w:cs="Calibri"/>
-                <w:sz w:val="16"/>
-                <w:szCs w:val="16"/>
-              </w:rPr>
-              <w:t>item</w:t>
-            </w:r>
-            <w:proofErr w:type="spellEnd"/>
-            <w:r>
-              <w:rPr>
-                <w:rFonts w:ascii="Calibri" w:hAnsi="Calibri" w:cs="Calibri"/>
-                <w:sz w:val="16"/>
-                <w:szCs w:val="16"/>
-              </w:rPr>
-              <w:t>»</w:t>
+              <w:t>«item»</w:t>
             </w:r>
             <w:r>
               <w:rPr>
@@ -1454,51 +1436,39 @@
             <w:pPr>
               <w:jc w:val="center"/>
               <w:rPr>
-                <w:rFonts w:ascii="Calibri" w:hAnsi="Calibri" w:cs="Calibri"/>
-                <w:b/>
-                <w:bCs/>
-                <w:sz w:val="16"/>
-                <w:szCs w:val="16"/>
+                <w:rFonts w:ascii="Aptos Black" w:hAnsi="Aptos Black" w:cs="Calibri"/>
+                <w:b/>
+                <w:bCs/>
               </w:rPr>
             </w:pPr>
             <w:r>
               <w:rPr>
-                <w:rFonts w:ascii="Calibri" w:hAnsi="Calibri" w:cs="Calibri"/>
-                <w:sz w:val="16"/>
-                <w:szCs w:val="16"/>
+                <w:rFonts w:ascii="Aptos Black" w:hAnsi="Aptos Black" w:cs="Calibri"/>
               </w:rPr>
               <w:fldChar w:fldCharType="begin"/>
             </w:r>
             <w:r>
               <w:rPr>
-                <w:rFonts w:ascii="Calibri" w:hAnsi="Calibri" w:cs="Calibri"/>
-                <w:sz w:val="16"/>
-                <w:szCs w:val="16"/>
+                <w:rFonts w:ascii="Aptos Black" w:hAnsi="Aptos Black" w:cs="Calibri"/>
               </w:rPr>
               <w:instrText xml:space="preserve"> MERGEFIELD  bigbag  \* MERGEFORMAT </w:instrText>
             </w:r>
             <w:r>
               <w:rPr>
-                <w:rFonts w:ascii="Calibri" w:hAnsi="Calibri" w:cs="Calibri"/>
-                <w:sz w:val="16"/>
-                <w:szCs w:val="16"/>
+                <w:rFonts w:ascii="Aptos Black" w:hAnsi="Aptos Black" w:cs="Calibri"/>
               </w:rPr>
               <w:fldChar w:fldCharType="separate"/>
             </w:r>
             <w:r>
               <w:rPr>
-                <w:rFonts w:ascii="Calibri" w:hAnsi="Calibri" w:cs="Calibri"/>
+                <w:rFonts w:ascii="Aptos Black" w:hAnsi="Aptos Black" w:cs="Calibri"/>
                 <w:noProof/>
-                <w:sz w:val="16"/>
-                <w:szCs w:val="16"/>
               </w:rPr>
               <w:t>«bigbag»</w:t>
             </w:r>
             <w:r>
               <w:rPr>
-                <w:rFonts w:ascii="Calibri" w:hAnsi="Calibri" w:cs="Calibri"/>
-                <w:sz w:val="16"/>
-                <w:szCs w:val="16"/>
+                <w:rFonts w:ascii="Aptos Black" w:hAnsi="Aptos Black" w:cs="Calibri"/>
               </w:rPr>
               <w:fldChar w:fldCharType="end"/>
             </w:r>
@@ -1515,51 +1485,39 @@
             <w:pPr>
               <w:jc w:val="center"/>
               <w:rPr>
-                <w:rFonts w:ascii="Calibri" w:hAnsi="Calibri" w:cs="Calibri"/>
-                <w:b/>
-                <w:bCs/>
-                <w:sz w:val="16"/>
-                <w:szCs w:val="16"/>
+                <w:rFonts w:ascii="Aptos Black" w:hAnsi="Aptos Black" w:cs="Calibri"/>
+                <w:b/>
+                <w:bCs/>
               </w:rPr>
             </w:pPr>
             <w:r>
               <w:rPr>
-                <w:rFonts w:ascii="Calibri" w:hAnsi="Calibri" w:cs="Calibri"/>
-                <w:sz w:val="16"/>
-                <w:szCs w:val="16"/>
+                <w:rFonts w:ascii="Aptos Black" w:hAnsi="Aptos Black" w:cs="Calibri"/>
               </w:rPr>
               <w:fldChar w:fldCharType="begin"/>
             </w:r>
             <w:r>
               <w:rPr>
-                <w:rFonts w:ascii="Calibri" w:hAnsi="Calibri" w:cs="Calibri"/>
-                <w:sz w:val="16"/>
-                <w:szCs w:val="16"/>
+                <w:rFonts w:ascii="Aptos Black" w:hAnsi="Aptos Black" w:cs="Calibri"/>
               </w:rPr>
               <w:instrText xml:space="preserve"> MERGEFIELD  granel  \* MERGEFORMAT </w:instrText>
             </w:r>
             <w:r>
               <w:rPr>
-                <w:rFonts w:ascii="Calibri" w:hAnsi="Calibri" w:cs="Calibri"/>
-                <w:sz w:val="16"/>
-                <w:szCs w:val="16"/>
+                <w:rFonts w:ascii="Aptos Black" w:hAnsi="Aptos Black" w:cs="Calibri"/>
               </w:rPr>
               <w:fldChar w:fldCharType="separate"/>
             </w:r>
             <w:r>
               <w:rPr>
-                <w:rFonts w:ascii="Calibri" w:hAnsi="Calibri" w:cs="Calibri"/>
+                <w:rFonts w:ascii="Aptos Black" w:hAnsi="Aptos Black" w:cs="Calibri"/>
                 <w:noProof/>
-                <w:sz w:val="16"/>
-                <w:szCs w:val="16"/>
               </w:rPr>
               <w:t>«granel»</w:t>
             </w:r>
             <w:r>
               <w:rPr>
-                <w:rFonts w:ascii="Calibri" w:hAnsi="Calibri" w:cs="Calibri"/>
-                <w:sz w:val="16"/>
-                <w:szCs w:val="16"/>
+                <w:rFonts w:ascii="Aptos Black" w:hAnsi="Aptos Black" w:cs="Calibri"/>
               </w:rPr>
               <w:fldChar w:fldCharType="end"/>
             </w:r>
@@ -1700,51 +1658,39 @@
             <w:pPr>
               <w:jc w:val="center"/>
               <w:rPr>
-                <w:rFonts w:ascii="Calibri" w:hAnsi="Calibri" w:cs="Calibri"/>
-                <w:b/>
-                <w:bCs/>
-                <w:sz w:val="16"/>
-                <w:szCs w:val="16"/>
+                <w:rFonts w:ascii="Aptos Black" w:hAnsi="Aptos Black" w:cs="Calibri"/>
+                <w:b/>
+                <w:bCs/>
               </w:rPr>
             </w:pPr>
             <w:r>
               <w:rPr>
-                <w:rFonts w:ascii="Calibri" w:hAnsi="Calibri" w:cs="Calibri"/>
-                <w:sz w:val="16"/>
-                <w:szCs w:val="16"/>
+                <w:rFonts w:ascii="Aptos Black" w:hAnsi="Aptos Black" w:cs="Calibri"/>
               </w:rPr>
               <w:fldChar w:fldCharType="begin"/>
             </w:r>
             <w:r>
               <w:rPr>
-                <w:rFonts w:ascii="Calibri" w:hAnsi="Calibri" w:cs="Calibri"/>
-                <w:sz w:val="16"/>
-                <w:szCs w:val="16"/>
+                <w:rFonts w:ascii="Aptos Black" w:hAnsi="Aptos Black" w:cs="Calibri"/>
               </w:rPr>
               <w:instrText xml:space="preserve"> MERGEFIELD  contramuestra  \* MERGEFORMAT </w:instrText>
             </w:r>
             <w:r>
               <w:rPr>
-                <w:rFonts w:ascii="Calibri" w:hAnsi="Calibri" w:cs="Calibri"/>
-                <w:sz w:val="16"/>
-                <w:szCs w:val="16"/>
+                <w:rFonts w:ascii="Aptos Black" w:hAnsi="Aptos Black" w:cs="Calibri"/>
               </w:rPr>
               <w:fldChar w:fldCharType="separate"/>
             </w:r>
             <w:r>
               <w:rPr>
-                <w:rFonts w:ascii="Calibri" w:hAnsi="Calibri" w:cs="Calibri"/>
+                <w:rFonts w:ascii="Aptos Black" w:hAnsi="Aptos Black" w:cs="Calibri"/>
                 <w:noProof/>
-                <w:sz w:val="16"/>
-                <w:szCs w:val="16"/>
               </w:rPr>
               <w:t>«contramuestra»</w:t>
             </w:r>
             <w:r>
               <w:rPr>
-                <w:rFonts w:ascii="Calibri" w:hAnsi="Calibri" w:cs="Calibri"/>
-                <w:sz w:val="16"/>
-                <w:szCs w:val="16"/>
+                <w:rFonts w:ascii="Aptos Black" w:hAnsi="Aptos Black" w:cs="Calibri"/>
               </w:rPr>
               <w:fldChar w:fldCharType="end"/>
             </w:r>
@@ -3092,6 +3038,7 @@
                                   <w:pPr>
                                     <w:spacing w:before="0" w:after="0"/>
                                     <w:ind w:right="33"/>
+                                    <w:jc w:val="center"/>
                                     <w:rPr>
                                       <w:rFonts w:ascii="Calibri" w:hAnsi="Calibri" w:cs="Calibri"/>
                                       <w:b/>
@@ -3805,6 +3752,7 @@
                             <w:pPr>
                               <w:spacing w:before="0" w:after="0"/>
                               <w:ind w:right="33"/>
+                              <w:jc w:val="center"/>
                               <w:rPr>
                                 <w:rFonts w:ascii="Calibri" w:hAnsi="Calibri" w:cs="Calibri"/>
                                 <w:b/>
@@ -4606,6 +4554,7 @@
                                   <w:pPr>
                                     <w:spacing w:before="0" w:after="0"/>
                                     <w:ind w:right="33"/>
+                                    <w:jc w:val="center"/>
                                     <w:rPr>
                                       <w:rFonts w:ascii="Calibri" w:hAnsi="Calibri" w:cs="Calibri"/>
                                       <w:b/>
@@ -5319,6 +5268,7 @@
                             <w:pPr>
                               <w:spacing w:before="0" w:after="0"/>
                               <w:ind w:right="33"/>
+                              <w:jc w:val="center"/>
                               <w:rPr>
                                 <w:rFonts w:ascii="Calibri" w:hAnsi="Calibri" w:cs="Calibri"/>
                                 <w:b/>
@@ -6148,7 +6098,7 @@
         </w:tc>
         <w:tc>
           <w:tcPr>
-            <w:tcW w:w="988" w:type="dxa"/>
+            <w:tcW w:w="1158" w:type="dxa"/>
           </w:tcPr>
           <w:p>
             <w:pPr>
@@ -6316,7 +6266,7 @@
         </w:tc>
         <w:tc>
           <w:tcPr>
-            <w:tcW w:w="988" w:type="dxa"/>
+            <w:tcW w:w="1158" w:type="dxa"/>
           </w:tcPr>
           <w:p>
             <w:pPr>
@@ -6454,7 +6404,7 @@
         </w:tc>
         <w:tc>
           <w:tcPr>
-            <w:tcW w:w="988" w:type="dxa"/>
+            <w:tcW w:w="1158" w:type="dxa"/>
           </w:tcPr>
           <w:p>
             <w:pPr>
@@ -6673,7 +6623,7 @@
         </w:tc>
         <w:tc>
           <w:tcPr>
-            <w:tcW w:w="988" w:type="dxa"/>
+            <w:tcW w:w="1158" w:type="dxa"/>
           </w:tcPr>
           <w:p>
             <w:pPr>
@@ -6718,6 +6668,894 @@
           <w:szCs w:val="2"/>
         </w:rPr>
       </w:pPr>
+      <w:r>
+        <w:rPr>
+          <w:rFonts w:ascii="Calibri" w:hAnsi="Calibri" w:cs="Calibri"/>
+          <w:b/>
+          <w:caps/>
+          <w:noProof/>
+          <w14:ligatures w14:val="standardContextual"/>
+        </w:rPr>
+        <mc:AlternateContent>
+          <mc:Choice Requires="wps">
+            <w:drawing>
+              <wp:anchor distT="0" distB="0" distL="114300" distR="114300" simplePos="0" relativeHeight="251682816" behindDoc="1" locked="0" layoutInCell="1" allowOverlap="1" wp14:anchorId="6459E751" wp14:editId="30D9BD42">
+                <wp:simplePos x="0" y="0"/>
+                <wp:positionH relativeFrom="column">
+                  <wp:posOffset>2119630</wp:posOffset>
+                </wp:positionH>
+                <wp:positionV relativeFrom="paragraph">
+                  <wp:posOffset>1483995</wp:posOffset>
+                </wp:positionV>
+                <wp:extent cx="2934970" cy="566420"/>
+                <wp:effectExtent l="0" t="0" r="0" b="5080"/>
+                <wp:wrapTopAndBottom/>
+                <wp:docPr id="1233819399" name="Rectángulo 2"/>
+                <wp:cNvGraphicFramePr/>
+                <a:graphic xmlns:a="http://schemas.openxmlformats.org/drawingml/2006/main">
+                  <a:graphicData uri="http://schemas.microsoft.com/office/word/2010/wordprocessingShape">
+                    <wps:wsp>
+                      <wps:cNvSpPr/>
+                      <wps:spPr>
+                        <a:xfrm>
+                          <a:off x="0" y="0"/>
+                          <a:ext cx="2934970" cy="566420"/>
+                        </a:xfrm>
+                        <a:prstGeom prst="rect">
+                          <a:avLst/>
+                        </a:prstGeom>
+                        <a:noFill/>
+                        <a:ln>
+                          <a:noFill/>
+                        </a:ln>
+                      </wps:spPr>
+                      <wps:style>
+                        <a:lnRef idx="0">
+                          <a:scrgbClr r="0" g="0" b="0"/>
+                        </a:lnRef>
+                        <a:fillRef idx="0">
+                          <a:scrgbClr r="0" g="0" b="0"/>
+                        </a:fillRef>
+                        <a:effectRef idx="0">
+                          <a:scrgbClr r="0" g="0" b="0"/>
+                        </a:effectRef>
+                        <a:fontRef idx="minor">
+                          <a:schemeClr val="dk1"/>
+                        </a:fontRef>
+                      </wps:style>
+                      <wps:txbx>
+                        <w:txbxContent>
+                          <w:tbl>
+                            <w:tblPr>
+                              <w:tblStyle w:val="Tablaconcuadrcula"/>
+                              <w:tblW w:w="0" w:type="auto"/>
+                              <w:tblBorders>
+                                <w:left w:val="none" w:sz="0" w:space="0" w:color="auto"/>
+                                <w:bottom w:val="none" w:sz="0" w:space="0" w:color="auto"/>
+                                <w:right w:val="none" w:sz="0" w:space="0" w:color="auto"/>
+                                <w:insideH w:val="none" w:sz="0" w:space="0" w:color="auto"/>
+                                <w:insideV w:val="none" w:sz="0" w:space="0" w:color="auto"/>
+                              </w:tblBorders>
+                              <w:tblLook w:val="04A0" w:firstRow="1" w:lastRow="0" w:firstColumn="1" w:lastColumn="0" w:noHBand="0" w:noVBand="1"/>
+                            </w:tblPr>
+                            <w:tblGrid>
+                              <w:gridCol w:w="4323"/>
+                            </w:tblGrid>
+                            <w:tr>
+                              <w:trPr>
+                                <w:trHeight w:val="130"/>
+                              </w:trPr>
+                              <w:tc>
+                                <w:tcPr>
+                                  <w:tcW w:w="4323" w:type="dxa"/>
+                                </w:tcPr>
+                                <w:p>
+                                  <w:pPr>
+                                    <w:spacing w:before="0" w:after="0"/>
+                                    <w:jc w:val="center"/>
+                                    <w:rPr>
+                                      <w:rFonts w:ascii="Calibri" w:hAnsi="Calibri" w:cs="Calibri"/>
+                                      <w:b/>
+                                      <w:bCs/>
+                                      <w:sz w:val="16"/>
+                                      <w:szCs w:val="16"/>
+                                    </w:rPr>
+                                  </w:pPr>
+                                  <w:proofErr w:type="spellStart"/>
+                                  <w:r>
+                                    <w:rPr>
+                                      <w:rFonts w:ascii="Calibri" w:hAnsi="Calibri" w:cs="Calibri"/>
+                                      <w:b/>
+                                      <w:bCs/>
+                                      <w:sz w:val="16"/>
+                                      <w:szCs w:val="16"/>
+                                    </w:rPr>
+                                    <w:t>V°B°</w:t>
+                                  </w:r>
+                                  <w:proofErr w:type="spellEnd"/>
+                                </w:p>
+                              </w:tc>
+                            </w:tr>
+                            <w:tr>
+                              <w:tc>
+                                <w:tcPr>
+                                  <w:tcW w:w="4323" w:type="dxa"/>
+                                </w:tcPr>
+                                <w:p>
+                                  <w:pPr>
+                                    <w:spacing w:before="0"/>
+                                    <w:jc w:val="center"/>
+                                    <w:rPr>
+                                      <w:rFonts w:ascii="Calibri" w:hAnsi="Calibri" w:cs="Calibri"/>
+                                      <w:b/>
+                                      <w:bCs/>
+                                      <w:sz w:val="16"/>
+                                      <w:szCs w:val="16"/>
+                                    </w:rPr>
+                                  </w:pPr>
+                                  <w:r>
+                                    <w:rPr>
+                                      <w:rFonts w:ascii="Calibri" w:hAnsi="Calibri" w:cs="Calibri"/>
+                                      <w:b/>
+                                      <w:bCs/>
+                                      <w:sz w:val="16"/>
+                                      <w:szCs w:val="16"/>
+                                    </w:rPr>
+                                    <w:t>Supervisor</w:t>
+                                  </w:r>
+                                  <w:r>
+                                    <w:rPr>
+                                      <w:rFonts w:ascii="Calibri" w:hAnsi="Calibri" w:cs="Calibri"/>
+                                      <w:b/>
+                                      <w:bCs/>
+                                      <w:sz w:val="16"/>
+                                      <w:szCs w:val="16"/>
+                                    </w:rPr>
+                                    <w:t xml:space="preserve"> (</w:t>
+                                  </w:r>
+                                  <w:r>
+                                    <w:rPr>
+                                      <w:rFonts w:ascii="Calibri" w:hAnsi="Calibri" w:cs="Calibri"/>
+                                      <w:b/>
+                                      <w:bCs/>
+                                      <w:sz w:val="16"/>
+                                      <w:szCs w:val="16"/>
+                                    </w:rPr>
+                                    <w:t>Comercialización Acopio</w:t>
+                                  </w:r>
+                                  <w:r>
+                                    <w:rPr>
+                                      <w:rFonts w:ascii="Calibri" w:hAnsi="Calibri" w:cs="Calibri"/>
+                                      <w:b/>
+                                      <w:bCs/>
+                                      <w:sz w:val="16"/>
+                                      <w:szCs w:val="16"/>
+                                    </w:rPr>
+                                    <w:t>)</w:t>
+                                  </w:r>
+                                </w:p>
+                              </w:tc>
+                            </w:tr>
+                          </w:tbl>
+                          <w:p/>
+                        </w:txbxContent>
+                      </wps:txbx>
+                      <wps:bodyPr rot="0" spcFirstLastPara="0" vertOverflow="overflow" horzOverflow="overflow" vert="horz" wrap="square" lIns="91440" tIns="45720" rIns="91440" bIns="45720" numCol="1" spcCol="0" rtlCol="0" fromWordArt="0" anchor="ctr" anchorCtr="0" forceAA="0" compatLnSpc="1">
+                        <a:prstTxWarp prst="textNoShape">
+                          <a:avLst/>
+                        </a:prstTxWarp>
+                        <a:noAutofit/>
+                      </wps:bodyPr>
+                    </wps:wsp>
+                  </a:graphicData>
+                </a:graphic>
+                <wp14:sizeRelH relativeFrom="margin">
+                  <wp14:pctWidth>0</wp14:pctWidth>
+                </wp14:sizeRelH>
+                <wp14:sizeRelV relativeFrom="margin">
+                  <wp14:pctHeight>0</wp14:pctHeight>
+                </wp14:sizeRelV>
+              </wp:anchor>
+            </w:drawing>
+          </mc:Choice>
+          <mc:Fallback>
+            <w:pict>
+              <v:rect w14:anchorId="6459E751" id="_x0000_s1029" style="position:absolute;margin-left:166.9pt;margin-top:116.85pt;width:231.1pt;height:44.6pt;z-index:-251633664;visibility:visible;mso-wrap-style:square;mso-width-percent:0;mso-height-percent:0;mso-wrap-distance-left:9pt;mso-wrap-distance-top:0;mso-wrap-distance-right:9pt;mso-wrap-distance-bottom:0;mso-position-horizontal:absolute;mso-position-horizontal-relative:text;mso-position-vertical:absolute;mso-position-vertical-relative:text;mso-width-percent:0;mso-height-percent:0;mso-width-relative:margin;mso-height-relative:margin;v-text-anchor:middle" o:gfxdata="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" filled="f" stroked="f">
+                <v:textbox>
+                  <w:txbxContent>
+                    <w:tbl>
+                      <w:tblPr>
+                        <w:tblStyle w:val="Tablaconcuadrcula"/>
+                        <w:tblW w:w="0" w:type="auto"/>
+                        <w:tblBorders>
+                          <w:left w:val="none" w:sz="0" w:space="0" w:color="auto"/>
+                          <w:bottom w:val="none" w:sz="0" w:space="0" w:color="auto"/>
+                          <w:right w:val="none" w:sz="0" w:space="0" w:color="auto"/>
+                          <w:insideH w:val="none" w:sz="0" w:space="0" w:color="auto"/>
+                          <w:insideV w:val="none" w:sz="0" w:space="0" w:color="auto"/>
+                        </w:tblBorders>
+                        <w:tblLook w:val="04A0" w:firstRow="1" w:lastRow="0" w:firstColumn="1" w:lastColumn="0" w:noHBand="0" w:noVBand="1"/>
+                      </w:tblPr>
+                      <w:tblGrid>
+                        <w:gridCol w:w="4323"/>
+                      </w:tblGrid>
+                      <w:tr>
+                        <w:trPr>
+                          <w:trHeight w:val="130"/>
+                        </w:trPr>
+                        <w:tc>
+                          <w:tcPr>
+                            <w:tcW w:w="4323" w:type="dxa"/>
+                          </w:tcPr>
+                          <w:p>
+                            <w:pPr>
+                              <w:spacing w:before="0" w:after="0"/>
+                              <w:jc w:val="center"/>
+                              <w:rPr>
+                                <w:rFonts w:ascii="Calibri" w:hAnsi="Calibri" w:cs="Calibri"/>
+                                <w:b/>
+                                <w:bCs/>
+                                <w:sz w:val="16"/>
+                                <w:szCs w:val="16"/>
+                              </w:rPr>
+                            </w:pPr>
+                            <w:proofErr w:type="spellStart"/>
+                            <w:r>
+                              <w:rPr>
+                                <w:rFonts w:ascii="Calibri" w:hAnsi="Calibri" w:cs="Calibri"/>
+                                <w:b/>
+                                <w:bCs/>
+                                <w:sz w:val="16"/>
+                                <w:szCs w:val="16"/>
+                              </w:rPr>
+                              <w:t>V°B°</w:t>
+                            </w:r>
+                            <w:proofErr w:type="spellEnd"/>
+                          </w:p>
+                        </w:tc>
+                      </w:tr>
+                      <w:tr>
+                        <w:tc>
+                          <w:tcPr>
+                            <w:tcW w:w="4323" w:type="dxa"/>
+                          </w:tcPr>
+                          <w:p>
+                            <w:pPr>
+                              <w:spacing w:before="0"/>
+                              <w:jc w:val="center"/>
+                              <w:rPr>
+                                <w:rFonts w:ascii="Calibri" w:hAnsi="Calibri" w:cs="Calibri"/>
+                                <w:b/>
+                                <w:bCs/>
+                                <w:sz w:val="16"/>
+                                <w:szCs w:val="16"/>
+                              </w:rPr>
+                            </w:pPr>
+                            <w:r>
+                              <w:rPr>
+                                <w:rFonts w:ascii="Calibri" w:hAnsi="Calibri" w:cs="Calibri"/>
+                                <w:b/>
+                                <w:bCs/>
+                                <w:sz w:val="16"/>
+                                <w:szCs w:val="16"/>
+                              </w:rPr>
+                              <w:t>Supervisor</w:t>
+                            </w:r>
+                            <w:r>
+                              <w:rPr>
+                                <w:rFonts w:ascii="Calibri" w:hAnsi="Calibri" w:cs="Calibri"/>
+                                <w:b/>
+                                <w:bCs/>
+                                <w:sz w:val="16"/>
+                                <w:szCs w:val="16"/>
+                              </w:rPr>
+                              <w:t xml:space="preserve"> (</w:t>
+                            </w:r>
+                            <w:r>
+                              <w:rPr>
+                                <w:rFonts w:ascii="Calibri" w:hAnsi="Calibri" w:cs="Calibri"/>
+                                <w:b/>
+                                <w:bCs/>
+                                <w:sz w:val="16"/>
+                                <w:szCs w:val="16"/>
+                              </w:rPr>
+                              <w:t>Comercialización Acopio</w:t>
+                            </w:r>
+                            <w:r>
+                              <w:rPr>
+                                <w:rFonts w:ascii="Calibri" w:hAnsi="Calibri" w:cs="Calibri"/>
+                                <w:b/>
+                                <w:bCs/>
+                                <w:sz w:val="16"/>
+                                <w:szCs w:val="16"/>
+                              </w:rPr>
+                              <w:t>)</w:t>
+                            </w:r>
+                          </w:p>
+                        </w:tc>
+                      </w:tr>
+                    </w:tbl>
+                    <w:p/>
+                  </w:txbxContent>
+                </v:textbox>
+                <w10:wrap type="topAndBottom"/>
+              </v:rect>
+            </w:pict>
+          </mc:Fallback>
+        </mc:AlternateContent>
+      </w:r>
+      <w:r>
+        <w:rPr>
+          <w:rFonts w:ascii="Calibri" w:hAnsi="Calibri" w:cs="Calibri"/>
+          <w:b/>
+          <w:caps/>
+          <w:noProof/>
+          <w14:ligatures w14:val="standardContextual"/>
+        </w:rPr>
+        <mc:AlternateContent>
+          <mc:Choice Requires="wps">
+            <w:drawing>
+              <wp:anchor distT="0" distB="0" distL="114300" distR="114300" simplePos="0" relativeHeight="251680768" behindDoc="1" locked="0" layoutInCell="1" allowOverlap="1" wp14:anchorId="72E89588" wp14:editId="5253178E">
+                <wp:simplePos x="0" y="0"/>
+                <wp:positionH relativeFrom="column">
+                  <wp:posOffset>4034155</wp:posOffset>
+                </wp:positionH>
+                <wp:positionV relativeFrom="paragraph">
+                  <wp:posOffset>560070</wp:posOffset>
+                </wp:positionV>
+                <wp:extent cx="2934970" cy="566420"/>
+                <wp:effectExtent l="0" t="0" r="0" b="5080"/>
+                <wp:wrapTopAndBottom/>
+                <wp:docPr id="606034837" name="Rectángulo 2"/>
+                <wp:cNvGraphicFramePr/>
+                <a:graphic xmlns:a="http://schemas.openxmlformats.org/drawingml/2006/main">
+                  <a:graphicData uri="http://schemas.microsoft.com/office/word/2010/wordprocessingShape">
+                    <wps:wsp>
+                      <wps:cNvSpPr/>
+                      <wps:spPr>
+                        <a:xfrm>
+                          <a:off x="0" y="0"/>
+                          <a:ext cx="2934970" cy="566420"/>
+                        </a:xfrm>
+                        <a:prstGeom prst="rect">
+                          <a:avLst/>
+                        </a:prstGeom>
+                        <a:noFill/>
+                        <a:ln>
+                          <a:noFill/>
+                        </a:ln>
+                      </wps:spPr>
+                      <wps:style>
+                        <a:lnRef idx="0">
+                          <a:scrgbClr r="0" g="0" b="0"/>
+                        </a:lnRef>
+                        <a:fillRef idx="0">
+                          <a:scrgbClr r="0" g="0" b="0"/>
+                        </a:fillRef>
+                        <a:effectRef idx="0">
+                          <a:scrgbClr r="0" g="0" b="0"/>
+                        </a:effectRef>
+                        <a:fontRef idx="minor">
+                          <a:schemeClr val="dk1"/>
+                        </a:fontRef>
+                      </wps:style>
+                      <wps:txbx>
+                        <w:txbxContent>
+                          <w:tbl>
+                            <w:tblPr>
+                              <w:tblStyle w:val="Tablaconcuadrcula"/>
+                              <w:tblW w:w="0" w:type="auto"/>
+                              <w:tblBorders>
+                                <w:left w:val="none" w:sz="0" w:space="0" w:color="auto"/>
+                                <w:bottom w:val="none" w:sz="0" w:space="0" w:color="auto"/>
+                                <w:right w:val="none" w:sz="0" w:space="0" w:color="auto"/>
+                                <w:insideH w:val="none" w:sz="0" w:space="0" w:color="auto"/>
+                                <w:insideV w:val="none" w:sz="0" w:space="0" w:color="auto"/>
+                              </w:tblBorders>
+                              <w:tblLook w:val="04A0" w:firstRow="1" w:lastRow="0" w:firstColumn="1" w:lastColumn="0" w:noHBand="0" w:noVBand="1"/>
+                            </w:tblPr>
+                            <w:tblGrid>
+                              <w:gridCol w:w="4323"/>
+                            </w:tblGrid>
+                            <w:tr>
+                              <w:trPr>
+                                <w:trHeight w:val="130"/>
+                              </w:trPr>
+                              <w:tc>
+                                <w:tcPr>
+                                  <w:tcW w:w="4323" w:type="dxa"/>
+                                </w:tcPr>
+                                <w:p>
+                                  <w:pPr>
+                                    <w:spacing w:before="0" w:after="0"/>
+                                    <w:jc w:val="center"/>
+                                    <w:rPr>
+                                      <w:rFonts w:ascii="Calibri" w:hAnsi="Calibri" w:cs="Calibri"/>
+                                      <w:b/>
+                                      <w:bCs/>
+                                      <w:sz w:val="16"/>
+                                      <w:szCs w:val="16"/>
+                                    </w:rPr>
+                                  </w:pPr>
+                                  <w:proofErr w:type="spellStart"/>
+                                  <w:r>
+                                    <w:rPr>
+                                      <w:rFonts w:ascii="Calibri" w:hAnsi="Calibri" w:cs="Calibri"/>
+                                      <w:b/>
+                                      <w:bCs/>
+                                      <w:sz w:val="16"/>
+                                      <w:szCs w:val="16"/>
+                                    </w:rPr>
+                                    <w:t>V°B°</w:t>
+                                  </w:r>
+                                  <w:proofErr w:type="spellEnd"/>
+                                </w:p>
+                              </w:tc>
+                            </w:tr>
+                            <w:tr>
+                              <w:tc>
+                                <w:tcPr>
+                                  <w:tcW w:w="4323" w:type="dxa"/>
+                                </w:tcPr>
+                                <w:p>
+                                  <w:pPr>
+                                    <w:spacing w:before="0"/>
+                                    <w:jc w:val="center"/>
+                                    <w:rPr>
+                                      <w:rFonts w:ascii="Calibri" w:hAnsi="Calibri" w:cs="Calibri"/>
+                                      <w:b/>
+                                      <w:bCs/>
+                                      <w:sz w:val="16"/>
+                                      <w:szCs w:val="16"/>
+                                    </w:rPr>
+                                  </w:pPr>
+                                  <w:r>
+                                    <w:rPr>
+                                      <w:rFonts w:ascii="Calibri" w:hAnsi="Calibri" w:cs="Calibri"/>
+                                      <w:b/>
+                                      <w:bCs/>
+                                      <w:sz w:val="16"/>
+                                      <w:szCs w:val="16"/>
+                                    </w:rPr>
+                                    <w:t>Agente</w:t>
+                                  </w:r>
+                                  <w:r>
+                                    <w:rPr>
+                                      <w:rFonts w:ascii="Calibri" w:hAnsi="Calibri" w:cs="Calibri"/>
+                                      <w:b/>
+                                      <w:bCs/>
+                                      <w:sz w:val="16"/>
+                                      <w:szCs w:val="16"/>
+                                    </w:rPr>
+                                    <w:t xml:space="preserve"> (</w:t>
+                                  </w:r>
+                                  <w:r>
+                                    <w:rPr>
+                                      <w:rFonts w:ascii="Calibri" w:hAnsi="Calibri" w:cs="Calibri"/>
+                                      <w:b/>
+                                      <w:bCs/>
+                                      <w:sz w:val="16"/>
+                                      <w:szCs w:val="16"/>
+                                    </w:rPr>
+                                    <w:t>Seguridad Patrimonial</w:t>
+                                  </w:r>
+                                  <w:r>
+                                    <w:rPr>
+                                      <w:rFonts w:ascii="Calibri" w:hAnsi="Calibri" w:cs="Calibri"/>
+                                      <w:b/>
+                                      <w:bCs/>
+                                      <w:sz w:val="16"/>
+                                      <w:szCs w:val="16"/>
+                                    </w:rPr>
+                                    <w:t>)</w:t>
+                                  </w:r>
+                                </w:p>
+                              </w:tc>
+                            </w:tr>
+                          </w:tbl>
+                          <w:p/>
+                        </w:txbxContent>
+                      </wps:txbx>
+                      <wps:bodyPr rot="0" spcFirstLastPara="0" vertOverflow="overflow" horzOverflow="overflow" vert="horz" wrap="square" lIns="91440" tIns="45720" rIns="91440" bIns="45720" numCol="1" spcCol="0" rtlCol="0" fromWordArt="0" anchor="ctr" anchorCtr="0" forceAA="0" compatLnSpc="1">
+                        <a:prstTxWarp prst="textNoShape">
+                          <a:avLst/>
+                        </a:prstTxWarp>
+                        <a:noAutofit/>
+                      </wps:bodyPr>
+                    </wps:wsp>
+                  </a:graphicData>
+                </a:graphic>
+                <wp14:sizeRelH relativeFrom="margin">
+                  <wp14:pctWidth>0</wp14:pctWidth>
+                </wp14:sizeRelH>
+                <wp14:sizeRelV relativeFrom="margin">
+                  <wp14:pctHeight>0</wp14:pctHeight>
+                </wp14:sizeRelV>
+              </wp:anchor>
+            </w:drawing>
+          </mc:Choice>
+          <mc:Fallback>
+            <w:pict>
+              <v:rect w14:anchorId="72E89588" id="_x0000_s1030" style="position:absolute;margin-left:317.65pt;margin-top:44.1pt;width:231.1pt;height:44.6pt;z-index:-251635712;visibility:visible;mso-wrap-style:square;mso-width-percent:0;mso-height-percent:0;mso-wrap-distance-left:9pt;mso-wrap-distance-top:0;mso-wrap-distance-right:9pt;mso-wrap-distance-bottom:0;mso-position-horizontal:absolute;mso-position-horizontal-relative:text;mso-position-vertical:absolute;mso-position-vertical-relative:text;mso-width-percent:0;mso-height-percent:0;mso-width-relative:margin;mso-height-relative:margin;v-text-anchor:middle" o:gfxdata="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" filled="f" stroked="f">
+                <v:textbox>
+                  <w:txbxContent>
+                    <w:tbl>
+                      <w:tblPr>
+                        <w:tblStyle w:val="Tablaconcuadrcula"/>
+                        <w:tblW w:w="0" w:type="auto"/>
+                        <w:tblBorders>
+                          <w:left w:val="none" w:sz="0" w:space="0" w:color="auto"/>
+                          <w:bottom w:val="none" w:sz="0" w:space="0" w:color="auto"/>
+                          <w:right w:val="none" w:sz="0" w:space="0" w:color="auto"/>
+                          <w:insideH w:val="none" w:sz="0" w:space="0" w:color="auto"/>
+                          <w:insideV w:val="none" w:sz="0" w:space="0" w:color="auto"/>
+                        </w:tblBorders>
+                        <w:tblLook w:val="04A0" w:firstRow="1" w:lastRow="0" w:firstColumn="1" w:lastColumn="0" w:noHBand="0" w:noVBand="1"/>
+                      </w:tblPr>
+                      <w:tblGrid>
+                        <w:gridCol w:w="4323"/>
+                      </w:tblGrid>
+                      <w:tr>
+                        <w:trPr>
+                          <w:trHeight w:val="130"/>
+                        </w:trPr>
+                        <w:tc>
+                          <w:tcPr>
+                            <w:tcW w:w="4323" w:type="dxa"/>
+                          </w:tcPr>
+                          <w:p>
+                            <w:pPr>
+                              <w:spacing w:before="0" w:after="0"/>
+                              <w:jc w:val="center"/>
+                              <w:rPr>
+                                <w:rFonts w:ascii="Calibri" w:hAnsi="Calibri" w:cs="Calibri"/>
+                                <w:b/>
+                                <w:bCs/>
+                                <w:sz w:val="16"/>
+                                <w:szCs w:val="16"/>
+                              </w:rPr>
+                            </w:pPr>
+                            <w:proofErr w:type="spellStart"/>
+                            <w:r>
+                              <w:rPr>
+                                <w:rFonts w:ascii="Calibri" w:hAnsi="Calibri" w:cs="Calibri"/>
+                                <w:b/>
+                                <w:bCs/>
+                                <w:sz w:val="16"/>
+                                <w:szCs w:val="16"/>
+                              </w:rPr>
+                              <w:t>V°B°</w:t>
+                            </w:r>
+                            <w:proofErr w:type="spellEnd"/>
+                          </w:p>
+                        </w:tc>
+                      </w:tr>
+                      <w:tr>
+                        <w:tc>
+                          <w:tcPr>
+                            <w:tcW w:w="4323" w:type="dxa"/>
+                          </w:tcPr>
+                          <w:p>
+                            <w:pPr>
+                              <w:spacing w:before="0"/>
+                              <w:jc w:val="center"/>
+                              <w:rPr>
+                                <w:rFonts w:ascii="Calibri" w:hAnsi="Calibri" w:cs="Calibri"/>
+                                <w:b/>
+                                <w:bCs/>
+                                <w:sz w:val="16"/>
+                                <w:szCs w:val="16"/>
+                              </w:rPr>
+                            </w:pPr>
+                            <w:r>
+                              <w:rPr>
+                                <w:rFonts w:ascii="Calibri" w:hAnsi="Calibri" w:cs="Calibri"/>
+                                <w:b/>
+                                <w:bCs/>
+                                <w:sz w:val="16"/>
+                                <w:szCs w:val="16"/>
+                              </w:rPr>
+                              <w:t>Agente</w:t>
+                            </w:r>
+                            <w:r>
+                              <w:rPr>
+                                <w:rFonts w:ascii="Calibri" w:hAnsi="Calibri" w:cs="Calibri"/>
+                                <w:b/>
+                                <w:bCs/>
+                                <w:sz w:val="16"/>
+                                <w:szCs w:val="16"/>
+                              </w:rPr>
+                              <w:t xml:space="preserve"> (</w:t>
+                            </w:r>
+                            <w:r>
+                              <w:rPr>
+                                <w:rFonts w:ascii="Calibri" w:hAnsi="Calibri" w:cs="Calibri"/>
+                                <w:b/>
+                                <w:bCs/>
+                                <w:sz w:val="16"/>
+                                <w:szCs w:val="16"/>
+                              </w:rPr>
+                              <w:t>Seguridad Patrimonial</w:t>
+                            </w:r>
+                            <w:r>
+                              <w:rPr>
+                                <w:rFonts w:ascii="Calibri" w:hAnsi="Calibri" w:cs="Calibri"/>
+                                <w:b/>
+                                <w:bCs/>
+                                <w:sz w:val="16"/>
+                                <w:szCs w:val="16"/>
+                              </w:rPr>
+                              <w:t>)</w:t>
+                            </w:r>
+                          </w:p>
+                        </w:tc>
+                      </w:tr>
+                    </w:tbl>
+                    <w:p/>
+                  </w:txbxContent>
+                </v:textbox>
+                <w10:wrap type="topAndBottom"/>
+              </v:rect>
+            </w:pict>
+          </mc:Fallback>
+        </mc:AlternateContent>
+      </w:r>
+      <w:r>
+        <w:rPr>
+          <w:rFonts w:ascii="Calibri" w:hAnsi="Calibri" w:cs="Calibri"/>
+          <w:b/>
+          <w:caps/>
+          <w:noProof/>
+          <w14:ligatures w14:val="standardContextual"/>
+        </w:rPr>
+        <mc:AlternateContent>
+          <mc:Choice Requires="wps">
+            <w:drawing>
+              <wp:anchor distT="0" distB="0" distL="114300" distR="114300" simplePos="0" relativeHeight="251678720" behindDoc="1" locked="0" layoutInCell="1" allowOverlap="1" wp14:anchorId="0B163113" wp14:editId="4F4FBAFB">
+                <wp:simplePos x="0" y="0"/>
+                <wp:positionH relativeFrom="column">
+                  <wp:posOffset>210185</wp:posOffset>
+                </wp:positionH>
+                <wp:positionV relativeFrom="paragraph">
+                  <wp:posOffset>560070</wp:posOffset>
+                </wp:positionV>
+                <wp:extent cx="2934970" cy="566420"/>
+                <wp:effectExtent l="0" t="0" r="0" b="5080"/>
+                <wp:wrapTopAndBottom/>
+                <wp:docPr id="2116462633" name="Rectángulo 2"/>
+                <wp:cNvGraphicFramePr/>
+                <a:graphic xmlns:a="http://schemas.openxmlformats.org/drawingml/2006/main">
+                  <a:graphicData uri="http://schemas.microsoft.com/office/word/2010/wordprocessingShape">
+                    <wps:wsp>
+                      <wps:cNvSpPr/>
+                      <wps:spPr>
+                        <a:xfrm>
+                          <a:off x="0" y="0"/>
+                          <a:ext cx="2934970" cy="566420"/>
+                        </a:xfrm>
+                        <a:prstGeom prst="rect">
+                          <a:avLst/>
+                        </a:prstGeom>
+                        <a:noFill/>
+                        <a:ln>
+                          <a:noFill/>
+                        </a:ln>
+                      </wps:spPr>
+                      <wps:style>
+                        <a:lnRef idx="0">
+                          <a:scrgbClr r="0" g="0" b="0"/>
+                        </a:lnRef>
+                        <a:fillRef idx="0">
+                          <a:scrgbClr r="0" g="0" b="0"/>
+                        </a:fillRef>
+                        <a:effectRef idx="0">
+                          <a:scrgbClr r="0" g="0" b="0"/>
+                        </a:effectRef>
+                        <a:fontRef idx="minor">
+                          <a:schemeClr val="dk1"/>
+                        </a:fontRef>
+                      </wps:style>
+                      <wps:txbx>
+                        <w:txbxContent>
+                          <w:tbl>
+                            <w:tblPr>
+                              <w:tblStyle w:val="Tablaconcuadrcula"/>
+                              <w:tblW w:w="0" w:type="auto"/>
+                              <w:tblBorders>
+                                <w:left w:val="none" w:sz="0" w:space="0" w:color="auto"/>
+                                <w:bottom w:val="none" w:sz="0" w:space="0" w:color="auto"/>
+                                <w:right w:val="none" w:sz="0" w:space="0" w:color="auto"/>
+                                <w:insideH w:val="none" w:sz="0" w:space="0" w:color="auto"/>
+                                <w:insideV w:val="none" w:sz="0" w:space="0" w:color="auto"/>
+                              </w:tblBorders>
+                              <w:tblLook w:val="04A0" w:firstRow="1" w:lastRow="0" w:firstColumn="1" w:lastColumn="0" w:noHBand="0" w:noVBand="1"/>
+                            </w:tblPr>
+                            <w:tblGrid>
+                              <w:gridCol w:w="4323"/>
+                            </w:tblGrid>
+                            <w:tr>
+                              <w:trPr>
+                                <w:trHeight w:val="130"/>
+                              </w:trPr>
+                              <w:tc>
+                                <w:tcPr>
+                                  <w:tcW w:w="4323" w:type="dxa"/>
+                                </w:tcPr>
+                                <w:p>
+                                  <w:pPr>
+                                    <w:spacing w:before="0" w:after="0"/>
+                                    <w:jc w:val="center"/>
+                                    <w:rPr>
+                                      <w:rFonts w:ascii="Calibri" w:hAnsi="Calibri" w:cs="Calibri"/>
+                                      <w:b/>
+                                      <w:bCs/>
+                                      <w:sz w:val="16"/>
+                                      <w:szCs w:val="16"/>
+                                    </w:rPr>
+                                  </w:pPr>
+                                  <w:proofErr w:type="spellStart"/>
+                                  <w:r>
+                                    <w:rPr>
+                                      <w:rFonts w:ascii="Calibri" w:hAnsi="Calibri" w:cs="Calibri"/>
+                                      <w:b/>
+                                      <w:bCs/>
+                                      <w:sz w:val="16"/>
+                                      <w:szCs w:val="16"/>
+                                    </w:rPr>
+                                    <w:t>V°B°</w:t>
+                                  </w:r>
+                                  <w:proofErr w:type="spellEnd"/>
+                                </w:p>
+                              </w:tc>
+                            </w:tr>
+                            <w:tr>
+                              <w:tc>
+                                <w:tcPr>
+                                  <w:tcW w:w="4323" w:type="dxa"/>
+                                </w:tcPr>
+                                <w:p>
+                                  <w:pPr>
+                                    <w:spacing w:before="0"/>
+                                    <w:jc w:val="center"/>
+                                    <w:rPr>
+                                      <w:rFonts w:ascii="Calibri" w:hAnsi="Calibri" w:cs="Calibri"/>
+                                      <w:b/>
+                                      <w:bCs/>
+                                      <w:sz w:val="16"/>
+                                      <w:szCs w:val="16"/>
+                                    </w:rPr>
+                                  </w:pPr>
+                                  <w:r>
+                                    <w:rPr>
+                                      <w:rFonts w:ascii="Calibri" w:hAnsi="Calibri" w:cs="Calibri"/>
+                                      <w:b/>
+                                      <w:bCs/>
+                                      <w:sz w:val="16"/>
+                                      <w:szCs w:val="16"/>
+                                    </w:rPr>
+                                    <w:t>Jefe de Guardia (Planta de Procesos)</w:t>
+                                  </w:r>
+                                </w:p>
+                              </w:tc>
+                            </w:tr>
+                          </w:tbl>
+                          <w:p/>
+                        </w:txbxContent>
+                      </wps:txbx>
+                      <wps:bodyPr rot="0" spcFirstLastPara="0" vertOverflow="overflow" horzOverflow="overflow" vert="horz" wrap="square" lIns="91440" tIns="45720" rIns="91440" bIns="45720" numCol="1" spcCol="0" rtlCol="0" fromWordArt="0" anchor="ctr" anchorCtr="0" forceAA="0" compatLnSpc="1">
+                        <a:prstTxWarp prst="textNoShape">
+                          <a:avLst/>
+                        </a:prstTxWarp>
+                        <a:noAutofit/>
+                      </wps:bodyPr>
+                    </wps:wsp>
+                  </a:graphicData>
+                </a:graphic>
+                <wp14:sizeRelH relativeFrom="margin">
+                  <wp14:pctWidth>0</wp14:pctWidth>
+                </wp14:sizeRelH>
+                <wp14:sizeRelV relativeFrom="margin">
+                  <wp14:pctHeight>0</wp14:pctHeight>
+                </wp14:sizeRelV>
+              </wp:anchor>
+            </w:drawing>
+          </mc:Choice>
+          <mc:Fallback>
+            <w:pict>
+              <v:rect w14:anchorId="0B163113" id="_x0000_s1031" style="position:absolute;margin-left:16.55pt;margin-top:44.1pt;width:231.1pt;height:44.6pt;z-index:-251637760;visibility:visible;mso-wrap-style:square;mso-width-percent:0;mso-height-percent:0;mso-wrap-distance-left:9pt;mso-wrap-distance-top:0;mso-wrap-distance-right:9pt;mso-wrap-distance-bottom:0;mso-position-horizontal:absolute;mso-position-horizontal-relative:text;mso-position-vertical:absolute;mso-position-vertical-relative:text;mso-width-percent:0;mso-height-percent:0;mso-width-relative:margin;mso-height-relative:margin;v-text-anchor:middle" o:gfxdata="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" filled="f" stroked="f">
+                <v:textbox>
+                  <w:txbxContent>
+                    <w:tbl>
+                      <w:tblPr>
+                        <w:tblStyle w:val="Tablaconcuadrcula"/>
+                        <w:tblW w:w="0" w:type="auto"/>
+                        <w:tblBorders>
+                          <w:left w:val="none" w:sz="0" w:space="0" w:color="auto"/>
+                          <w:bottom w:val="none" w:sz="0" w:space="0" w:color="auto"/>
+                          <w:right w:val="none" w:sz="0" w:space="0" w:color="auto"/>
+                          <w:insideH w:val="none" w:sz="0" w:space="0" w:color="auto"/>
+                          <w:insideV w:val="none" w:sz="0" w:space="0" w:color="auto"/>
+                        </w:tblBorders>
+                        <w:tblLook w:val="04A0" w:firstRow="1" w:lastRow="0" w:firstColumn="1" w:lastColumn="0" w:noHBand="0" w:noVBand="1"/>
+                      </w:tblPr>
+                      <w:tblGrid>
+                        <w:gridCol w:w="4323"/>
+                      </w:tblGrid>
+                      <w:tr>
+                        <w:trPr>
+                          <w:trHeight w:val="130"/>
+                        </w:trPr>
+                        <w:tc>
+                          <w:tcPr>
+                            <w:tcW w:w="4323" w:type="dxa"/>
+                          </w:tcPr>
+                          <w:p>
+                            <w:pPr>
+                              <w:spacing w:before="0" w:after="0"/>
+                              <w:jc w:val="center"/>
+                              <w:rPr>
+                                <w:rFonts w:ascii="Calibri" w:hAnsi="Calibri" w:cs="Calibri"/>
+                                <w:b/>
+                                <w:bCs/>
+                                <w:sz w:val="16"/>
+                                <w:szCs w:val="16"/>
+                              </w:rPr>
+                            </w:pPr>
+                            <w:proofErr w:type="spellStart"/>
+                            <w:r>
+                              <w:rPr>
+                                <w:rFonts w:ascii="Calibri" w:hAnsi="Calibri" w:cs="Calibri"/>
+                                <w:b/>
+                                <w:bCs/>
+                                <w:sz w:val="16"/>
+                                <w:szCs w:val="16"/>
+                              </w:rPr>
+                              <w:t>V°B°</w:t>
+                            </w:r>
+                            <w:proofErr w:type="spellEnd"/>
+                          </w:p>
+                        </w:tc>
+                      </w:tr>
+                      <w:tr>
+                        <w:tc>
+                          <w:tcPr>
+                            <w:tcW w:w="4323" w:type="dxa"/>
+                          </w:tcPr>
+                          <w:p>
+                            <w:pPr>
+                              <w:spacing w:before="0"/>
+                              <w:jc w:val="center"/>
+                              <w:rPr>
+                                <w:rFonts w:ascii="Calibri" w:hAnsi="Calibri" w:cs="Calibri"/>
+                                <w:b/>
+                                <w:bCs/>
+                                <w:sz w:val="16"/>
+                                <w:szCs w:val="16"/>
+                              </w:rPr>
+                            </w:pPr>
+                            <w:r>
+                              <w:rPr>
+                                <w:rFonts w:ascii="Calibri" w:hAnsi="Calibri" w:cs="Calibri"/>
+                                <w:b/>
+                                <w:bCs/>
+                                <w:sz w:val="16"/>
+                                <w:szCs w:val="16"/>
+                              </w:rPr>
+                              <w:t>Jefe de Guardia (Planta de Procesos)</w:t>
+                            </w:r>
+                          </w:p>
+                        </w:tc>
+                      </w:tr>
+                    </w:tbl>
+                    <w:p/>
+                  </w:txbxContent>
+                </v:textbox>
+                <w10:wrap type="topAndBottom"/>
+              </v:rect>
+            </w:pict>
+          </mc:Fallback>
+        </mc:AlternateContent>
+      </w:r>
     </w:p>
     <w:sectPr>
       <w:pgSz w:w="11906" w:h="16838" w:code="9"/>

</xml_diff>

<commit_message>
feat: actualizar plantillas de acta entrega
</commit_message>
<xml_diff>
--- a/pesaje/analytica/Report/PrintActaEntrega.docx
+++ b/pesaje/analytica/Report/PrintActaEntrega.docx
@@ -10,28 +10,25 @@
         <w:tblLook w:val="04A0" w:firstRow="1" w:lastRow="0" w:firstColumn="1" w:lastColumn="0" w:noHBand="0" w:noVBand="1"/>
       </w:tblPr>
       <w:tblGrid>
-        <w:gridCol w:w="843"/>
-        <w:gridCol w:w="7"/>
-        <w:gridCol w:w="1127"/>
-        <w:gridCol w:w="7"/>
-        <w:gridCol w:w="987"/>
+        <w:gridCol w:w="844"/>
+        <w:gridCol w:w="1134"/>
+        <w:gridCol w:w="994"/>
         <w:gridCol w:w="992"/>
         <w:gridCol w:w="851"/>
-        <w:gridCol w:w="142"/>
-        <w:gridCol w:w="425"/>
         <w:gridCol w:w="567"/>
-        <w:gridCol w:w="425"/>
-        <w:gridCol w:w="285"/>
+        <w:gridCol w:w="566"/>
+        <w:gridCol w:w="426"/>
+        <w:gridCol w:w="284"/>
         <w:gridCol w:w="1842"/>
-        <w:gridCol w:w="425"/>
-        <w:gridCol w:w="1276"/>
+        <w:gridCol w:w="426"/>
+        <w:gridCol w:w="1275"/>
         <w:gridCol w:w="1276"/>
       </w:tblGrid>
       <w:tr>
         <w:tc>
           <w:tcPr>
             <w:tcW w:w="2972" w:type="dxa"/>
-            <w:gridSpan w:val="5"/>
+            <w:gridSpan w:val="3"/>
             <w:vMerge w:val="restart"/>
           </w:tcPr>
           <w:p>
@@ -55,10 +52,10 @@
               <mc:AlternateContent>
                 <mc:Choice Requires="wps">
                   <w:drawing>
-                    <wp:anchor distT="0" distB="0" distL="114300" distR="114300" simplePos="0" relativeHeight="251676672" behindDoc="0" locked="0" layoutInCell="1" allowOverlap="1" wp14:anchorId="7F7A92DC" wp14:editId="01BEA7ED">
+                    <wp:anchor distT="0" distB="0" distL="114300" distR="114300" simplePos="0" relativeHeight="251676672" behindDoc="0" locked="0" layoutInCell="1" allowOverlap="1" wp14:anchorId="7F7A92DC" wp14:editId="0DF5491D">
                       <wp:simplePos x="0" y="0"/>
                       <wp:positionH relativeFrom="margin">
-                        <wp:posOffset>-39824</wp:posOffset>
+                        <wp:posOffset>-67945</wp:posOffset>
                       </wp:positionH>
                       <wp:positionV relativeFrom="paragraph">
                         <wp:posOffset>-3810</wp:posOffset>
@@ -161,7 +158,7 @@
                 </mc:Choice>
                 <mc:Fallback>
                   <w:pict>
-                    <v:roundrect w14:anchorId="7F7A92DC" id="Rectángulo: esquinas redondeadas 782399144" o:spid="_x0000_s1026" style="position:absolute;left:0;text-align:left;margin-left:-3.15pt;margin-top:-.3pt;width:144.85pt;height:76.3pt;z-index:251676672;visibility:visible;mso-wrap-style:square;mso-width-percent:0;mso-height-percent:0;mso-wrap-distance-left:9pt;mso-wrap-distance-top:0;mso-wrap-distance-right:9pt;mso-wrap-distance-bottom:0;mso-position-horizontal:absolute;mso-position-horizontal-relative:margin;mso-position-vertical:absolute;mso-position-vertical-relative:text;mso-width-percent:0;mso-height-percent:0;mso-width-relative:margin;mso-height-relative:margin;v-text-anchor:top" arcsize="10923f" o:gfxdata="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" filled="f" stroked="f">
+                    <v:roundrect w14:anchorId="7F7A92DC" id="Rectángulo: esquinas redondeadas 782399144" o:spid="_x0000_s1026" style="position:absolute;left:0;text-align:left;margin-left:-5.35pt;margin-top:-.3pt;width:144.85pt;height:76.3pt;z-index:251676672;visibility:visible;mso-wrap-style:square;mso-width-percent:0;mso-height-percent:0;mso-wrap-distance-left:9pt;mso-wrap-distance-top:0;mso-wrap-distance-right:9pt;mso-wrap-distance-bottom:0;mso-position-horizontal:absolute;mso-position-horizontal-relative:margin;mso-position-vertical:absolute;mso-position-vertical-relative:text;mso-width-percent:0;mso-height-percent:0;mso-width-relative:margin;mso-height-relative:margin;v-text-anchor:top" arcsize="10923f" o:gfxdata="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" filled="f" stroked="f">
                       <v:stroke joinstyle="miter"/>
                       <v:textbox>
                         <w:txbxContent>
@@ -224,7 +221,7 @@
         <w:tc>
           <w:tcPr>
             <w:tcW w:w="5954" w:type="dxa"/>
-            <w:gridSpan w:val="9"/>
+            <w:gridSpan w:val="8"/>
           </w:tcPr>
           <w:p>
             <w:pPr>
@@ -293,7 +290,7 @@
         <w:tc>
           <w:tcPr>
             <w:tcW w:w="2972" w:type="dxa"/>
-            <w:gridSpan w:val="5"/>
+            <w:gridSpan w:val="3"/>
             <w:vMerge/>
           </w:tcPr>
           <w:p>
@@ -311,7 +308,7 @@
         <w:tc>
           <w:tcPr>
             <w:tcW w:w="5954" w:type="dxa"/>
-            <w:gridSpan w:val="9"/>
+            <w:gridSpan w:val="8"/>
           </w:tcPr>
           <w:p>
             <w:pPr>
@@ -354,7 +351,7 @@
         <w:tc>
           <w:tcPr>
             <w:tcW w:w="2972" w:type="dxa"/>
-            <w:gridSpan w:val="5"/>
+            <w:gridSpan w:val="3"/>
             <w:vMerge/>
           </w:tcPr>
           <w:p>
@@ -395,7 +392,7 @@
         <w:tc>
           <w:tcPr>
             <w:tcW w:w="4962" w:type="dxa"/>
-            <w:gridSpan w:val="8"/>
+            <w:gridSpan w:val="7"/>
           </w:tcPr>
           <w:p>
             <w:pPr>
@@ -462,7 +459,7 @@
         <w:tc>
           <w:tcPr>
             <w:tcW w:w="2972" w:type="dxa"/>
-            <w:gridSpan w:val="5"/>
+            <w:gridSpan w:val="3"/>
             <w:vMerge/>
           </w:tcPr>
           <w:p>
@@ -503,7 +500,7 @@
         <w:tc>
           <w:tcPr>
             <w:tcW w:w="1418" w:type="dxa"/>
-            <w:gridSpan w:val="3"/>
+            <w:gridSpan w:val="2"/>
           </w:tcPr>
           <w:p>
             <w:pPr>
@@ -652,7 +649,7 @@
         <w:tc>
           <w:tcPr>
             <w:tcW w:w="2972" w:type="dxa"/>
-            <w:gridSpan w:val="5"/>
+            <w:gridSpan w:val="3"/>
             <w:vMerge/>
           </w:tcPr>
           <w:p>
@@ -693,7 +690,7 @@
         <w:tc>
           <w:tcPr>
             <w:tcW w:w="1418" w:type="dxa"/>
-            <w:gridSpan w:val="3"/>
+            <w:gridSpan w:val="2"/>
           </w:tcPr>
           <w:p>
             <w:pPr>
@@ -839,9 +836,6 @@
         <w:tc>
           <w:tcPr>
             <w:tcW w:w="844" w:type="dxa"/>
-            <w:tcBorders>
-              <w:bottom w:val="single" w:sz="4" w:space="0" w:color="auto"/>
-            </w:tcBorders>
           </w:tcPr>
           <w:p>
             <w:pPr>
@@ -869,10 +863,6 @@
         <w:tc>
           <w:tcPr>
             <w:tcW w:w="1134" w:type="dxa"/>
-            <w:gridSpan w:val="2"/>
-            <w:tcBorders>
-              <w:bottom w:val="single" w:sz="4" w:space="0" w:color="auto"/>
-            </w:tcBorders>
           </w:tcPr>
           <w:p>
             <w:pPr>
@@ -900,10 +890,6 @@
         <w:tc>
           <w:tcPr>
             <w:tcW w:w="994" w:type="dxa"/>
-            <w:gridSpan w:val="2"/>
-            <w:tcBorders>
-              <w:bottom w:val="single" w:sz="4" w:space="0" w:color="auto"/>
-            </w:tcBorders>
           </w:tcPr>
           <w:p>
             <w:pPr>
@@ -931,9 +917,6 @@
         <w:tc>
           <w:tcPr>
             <w:tcW w:w="992" w:type="dxa"/>
-            <w:tcBorders>
-              <w:bottom w:val="single" w:sz="4" w:space="0" w:color="auto"/>
-            </w:tcBorders>
           </w:tcPr>
           <w:p>
             <w:pPr>
@@ -961,9 +944,6 @@
         <w:tc>
           <w:tcPr>
             <w:tcW w:w="851" w:type="dxa"/>
-            <w:tcBorders>
-              <w:bottom w:val="single" w:sz="4" w:space="0" w:color="auto"/>
-            </w:tcBorders>
           </w:tcPr>
           <w:p>
             <w:pPr>
@@ -991,10 +971,7 @@
         <w:tc>
           <w:tcPr>
             <w:tcW w:w="1133" w:type="dxa"/>
-            <w:gridSpan w:val="3"/>
-            <w:tcBorders>
-              <w:bottom w:val="single" w:sz="4" w:space="0" w:color="auto"/>
-            </w:tcBorders>
+            <w:gridSpan w:val="2"/>
           </w:tcPr>
           <w:p>
             <w:pPr>
@@ -1045,9 +1022,6 @@
           <w:tcPr>
             <w:tcW w:w="710" w:type="dxa"/>
             <w:gridSpan w:val="2"/>
-            <w:tcBorders>
-              <w:bottom w:val="single" w:sz="4" w:space="0" w:color="auto"/>
-            </w:tcBorders>
           </w:tcPr>
           <w:p>
             <w:pPr>
@@ -1075,9 +1049,6 @@
         <w:tc>
           <w:tcPr>
             <w:tcW w:w="1842" w:type="dxa"/>
-            <w:tcBorders>
-              <w:bottom w:val="single" w:sz="4" w:space="0" w:color="auto"/>
-            </w:tcBorders>
           </w:tcPr>
           <w:p>
             <w:pPr>
@@ -1106,9 +1077,6 @@
           <w:tcPr>
             <w:tcW w:w="1701" w:type="dxa"/>
             <w:gridSpan w:val="2"/>
-            <w:tcBorders>
-              <w:bottom w:val="single" w:sz="4" w:space="0" w:color="auto"/>
-            </w:tcBorders>
           </w:tcPr>
           <w:p>
             <w:pPr>
@@ -1136,9 +1104,6 @@
         <w:tc>
           <w:tcPr>
             <w:tcW w:w="1276" w:type="dxa"/>
-            <w:tcBorders>
-              <w:bottom w:val="single" w:sz="4" w:space="0" w:color="auto"/>
-            </w:tcBorders>
           </w:tcPr>
           <w:p>
             <w:pPr>
@@ -1190,9 +1155,6 @@
         <w:tc>
           <w:tcPr>
             <w:tcW w:w="844" w:type="dxa"/>
-            <w:tcBorders>
-              <w:bottom w:val="single" w:sz="4" w:space="0" w:color="auto"/>
-            </w:tcBorders>
           </w:tcPr>
           <w:p>
             <w:pPr>
@@ -1304,10 +1266,6 @@
         <w:tc>
           <w:tcPr>
             <w:tcW w:w="1134" w:type="dxa"/>
-            <w:gridSpan w:val="2"/>
-            <w:tcBorders>
-              <w:bottom w:val="single" w:sz="4" w:space="0" w:color="auto"/>
-            </w:tcBorders>
           </w:tcPr>
           <w:p>
             <w:pPr>
@@ -1366,10 +1324,6 @@
         <w:tc>
           <w:tcPr>
             <w:tcW w:w="994" w:type="dxa"/>
-            <w:gridSpan w:val="2"/>
-            <w:tcBorders>
-              <w:bottom w:val="single" w:sz="4" w:space="0" w:color="auto"/>
-            </w:tcBorders>
           </w:tcPr>
           <w:p>
             <w:pPr>
@@ -1428,47 +1382,72 @@
         <w:tc>
           <w:tcPr>
             <w:tcW w:w="992" w:type="dxa"/>
-            <w:tcBorders>
-              <w:bottom w:val="single" w:sz="4" w:space="0" w:color="auto"/>
-            </w:tcBorders>
           </w:tcPr>
           <w:p>
             <w:pPr>
               <w:jc w:val="center"/>
               <w:rPr>
-                <w:rFonts w:ascii="Aptos Black" w:hAnsi="Aptos Black" w:cs="Calibri"/>
-                <w:b/>
-                <w:bCs/>
+                <w:rFonts w:ascii="Calibri" w:hAnsi="Calibri" w:cs="Calibri"/>
+                <w:b/>
+                <w:bCs/>
+                <w:sz w:val="16"/>
+                <w:szCs w:val="16"/>
               </w:rPr>
             </w:pPr>
             <w:r>
               <w:rPr>
-                <w:rFonts w:ascii="Aptos Black" w:hAnsi="Aptos Black" w:cs="Calibri"/>
+                <w:rFonts w:ascii="Black Han Sans" w:eastAsia="Black Han Sans" w:hAnsi="Calibri" w:cs="Calibri" w:hint="eastAsia"/>
+                <w:b/>
+                <w:bCs/>
               </w:rPr>
               <w:fldChar w:fldCharType="begin"/>
             </w:r>
             <w:r>
               <w:rPr>
-                <w:rFonts w:ascii="Aptos Black" w:hAnsi="Aptos Black" w:cs="Calibri"/>
+                <w:rFonts w:ascii="Black Han Sans" w:eastAsia="Black Han Sans" w:hAnsi="Calibri" w:cs="Calibri" w:hint="eastAsia"/>
+                <w:b/>
+                <w:bCs/>
               </w:rPr>
               <w:instrText xml:space="preserve"> MERGEFIELD  bigbag  \* MERGEFORMAT </w:instrText>
             </w:r>
             <w:r>
               <w:rPr>
-                <w:rFonts w:ascii="Aptos Black" w:hAnsi="Aptos Black" w:cs="Calibri"/>
+                <w:rFonts w:ascii="Black Han Sans" w:eastAsia="Black Han Sans" w:hAnsi="Calibri" w:cs="Calibri" w:hint="eastAsia"/>
+                <w:b/>
+                <w:bCs/>
               </w:rPr>
               <w:fldChar w:fldCharType="separate"/>
             </w:r>
             <w:r>
               <w:rPr>
-                <w:rFonts w:ascii="Aptos Black" w:hAnsi="Aptos Black" w:cs="Calibri"/>
+                <w:rFonts w:ascii="Black Han Sans" w:eastAsia="Black Han Sans" w:hAnsi="Calibri" w:cs="Calibri" w:hint="eastAsia"/>
+                <w:b/>
+                <w:bCs/>
                 <w:noProof/>
               </w:rPr>
-              <w:t>«bigbag»</w:t>
-            </w:r>
-            <w:r>
-              <w:rPr>
-                <w:rFonts w:ascii="Aptos Black" w:hAnsi="Aptos Black" w:cs="Calibri"/>
+              <w:t>«</w:t>
+            </w:r>
+            <w:r>
+              <w:rPr>
+                <w:rFonts w:ascii="Aptos Black" w:eastAsia="Black Han Sans" w:hAnsi="Aptos Black" w:cs="Calibri"/>
+                <w:noProof/>
+              </w:rPr>
+              <w:t>bigbag</w:t>
+            </w:r>
+            <w:r>
+              <w:rPr>
+                <w:rFonts w:ascii="Black Han Sans" w:eastAsia="Black Han Sans" w:hAnsi="Calibri" w:cs="Calibri" w:hint="eastAsia"/>
+                <w:b/>
+                <w:bCs/>
+                <w:noProof/>
+              </w:rPr>
+              <w:t>»</w:t>
+            </w:r>
+            <w:r>
+              <w:rPr>
+                <w:rFonts w:ascii="Black Han Sans" w:eastAsia="Black Han Sans" w:hAnsi="Calibri" w:cs="Calibri" w:hint="eastAsia"/>
+                <w:b/>
+                <w:bCs/>
               </w:rPr>
               <w:fldChar w:fldCharType="end"/>
             </w:r>
@@ -1477,47 +1456,72 @@
         <w:tc>
           <w:tcPr>
             <w:tcW w:w="851" w:type="dxa"/>
-            <w:tcBorders>
-              <w:bottom w:val="single" w:sz="4" w:space="0" w:color="auto"/>
-            </w:tcBorders>
           </w:tcPr>
           <w:p>
             <w:pPr>
               <w:jc w:val="center"/>
               <w:rPr>
+                <w:rFonts w:ascii="Calibri" w:hAnsi="Calibri" w:cs="Calibri"/>
+                <w:b/>
+                <w:bCs/>
+                <w:sz w:val="16"/>
+                <w:szCs w:val="16"/>
+              </w:rPr>
+            </w:pPr>
+            <w:r>
+              <w:rPr>
                 <w:rFonts w:ascii="Aptos Black" w:hAnsi="Aptos Black" w:cs="Calibri"/>
                 <w:b/>
                 <w:bCs/>
               </w:rPr>
-            </w:pPr>
+              <w:fldChar w:fldCharType="begin"/>
+            </w:r>
             <w:r>
               <w:rPr>
                 <w:rFonts w:ascii="Aptos Black" w:hAnsi="Aptos Black" w:cs="Calibri"/>
-              </w:rPr>
-              <w:fldChar w:fldCharType="begin"/>
+                <w:b/>
+                <w:bCs/>
+              </w:rPr>
+              <w:instrText xml:space="preserve"> MERGEFIELD  granel  \* MERGEFORMAT </w:instrText>
             </w:r>
             <w:r>
               <w:rPr>
                 <w:rFonts w:ascii="Aptos Black" w:hAnsi="Aptos Black" w:cs="Calibri"/>
-              </w:rPr>
-              <w:instrText xml:space="preserve"> MERGEFIELD  granel  \* MERGEFORMAT </w:instrText>
+                <w:b/>
+                <w:bCs/>
+              </w:rPr>
+              <w:fldChar w:fldCharType="separate"/>
             </w:r>
             <w:r>
               <w:rPr>
                 <w:rFonts w:ascii="Aptos Black" w:hAnsi="Aptos Black" w:cs="Calibri"/>
-              </w:rPr>
-              <w:fldChar w:fldCharType="separate"/>
+                <w:b/>
+                <w:bCs/>
+                <w:noProof/>
+              </w:rPr>
+              <w:t>«</w:t>
             </w:r>
             <w:r>
               <w:rPr>
                 <w:rFonts w:ascii="Aptos Black" w:hAnsi="Aptos Black" w:cs="Calibri"/>
                 <w:noProof/>
               </w:rPr>
-              <w:t>«granel»</w:t>
+              <w:t>granel</w:t>
             </w:r>
             <w:r>
               <w:rPr>
                 <w:rFonts w:ascii="Aptos Black" w:hAnsi="Aptos Black" w:cs="Calibri"/>
+                <w:b/>
+                <w:bCs/>
+                <w:noProof/>
+              </w:rPr>
+              <w:t>»</w:t>
+            </w:r>
+            <w:r>
+              <w:rPr>
+                <w:rFonts w:ascii="Aptos Black" w:hAnsi="Aptos Black" w:cs="Calibri"/>
+                <w:b/>
+                <w:bCs/>
               </w:rPr>
               <w:fldChar w:fldCharType="end"/>
             </w:r>
@@ -1526,10 +1530,7 @@
         <w:tc>
           <w:tcPr>
             <w:tcW w:w="1133" w:type="dxa"/>
-            <w:gridSpan w:val="3"/>
-            <w:tcBorders>
-              <w:bottom w:val="single" w:sz="4" w:space="0" w:color="auto"/>
-            </w:tcBorders>
+            <w:gridSpan w:val="2"/>
           </w:tcPr>
           <w:p>
             <w:pPr>
@@ -1589,9 +1590,6 @@
           <w:tcPr>
             <w:tcW w:w="710" w:type="dxa"/>
             <w:gridSpan w:val="2"/>
-            <w:tcBorders>
-              <w:bottom w:val="single" w:sz="4" w:space="0" w:color="auto"/>
-            </w:tcBorders>
           </w:tcPr>
           <w:p>
             <w:pPr>
@@ -1650,47 +1648,72 @@
         <w:tc>
           <w:tcPr>
             <w:tcW w:w="1842" w:type="dxa"/>
-            <w:tcBorders>
-              <w:bottom w:val="single" w:sz="4" w:space="0" w:color="auto"/>
-            </w:tcBorders>
           </w:tcPr>
           <w:p>
             <w:pPr>
               <w:jc w:val="center"/>
               <w:rPr>
+                <w:rFonts w:ascii="Calibri" w:hAnsi="Calibri" w:cs="Calibri"/>
+                <w:b/>
+                <w:bCs/>
+                <w:sz w:val="16"/>
+                <w:szCs w:val="16"/>
+              </w:rPr>
+            </w:pPr>
+            <w:r>
+              <w:rPr>
                 <w:rFonts w:ascii="Aptos Black" w:hAnsi="Aptos Black" w:cs="Calibri"/>
                 <w:b/>
                 <w:bCs/>
               </w:rPr>
-            </w:pPr>
+              <w:fldChar w:fldCharType="begin"/>
+            </w:r>
             <w:r>
               <w:rPr>
                 <w:rFonts w:ascii="Aptos Black" w:hAnsi="Aptos Black" w:cs="Calibri"/>
-              </w:rPr>
-              <w:fldChar w:fldCharType="begin"/>
+                <w:b/>
+                <w:bCs/>
+              </w:rPr>
+              <w:instrText xml:space="preserve"> MERGEFIELD  contramuestra  \* MERGEFORMAT </w:instrText>
             </w:r>
             <w:r>
               <w:rPr>
                 <w:rFonts w:ascii="Aptos Black" w:hAnsi="Aptos Black" w:cs="Calibri"/>
-              </w:rPr>
-              <w:instrText xml:space="preserve"> MERGEFIELD  contramuestra  \* MERGEFORMAT </w:instrText>
+                <w:b/>
+                <w:bCs/>
+              </w:rPr>
+              <w:fldChar w:fldCharType="separate"/>
             </w:r>
             <w:r>
               <w:rPr>
                 <w:rFonts w:ascii="Aptos Black" w:hAnsi="Aptos Black" w:cs="Calibri"/>
-              </w:rPr>
-              <w:fldChar w:fldCharType="separate"/>
+                <w:b/>
+                <w:bCs/>
+                <w:noProof/>
+              </w:rPr>
+              <w:t>«</w:t>
             </w:r>
             <w:r>
               <w:rPr>
                 <w:rFonts w:ascii="Aptos Black" w:hAnsi="Aptos Black" w:cs="Calibri"/>
                 <w:noProof/>
               </w:rPr>
-              <w:t>«contramuestra»</w:t>
+              <w:t>contramuestra</w:t>
             </w:r>
             <w:r>
               <w:rPr>
                 <w:rFonts w:ascii="Aptos Black" w:hAnsi="Aptos Black" w:cs="Calibri"/>
+                <w:b/>
+                <w:bCs/>
+                <w:noProof/>
+              </w:rPr>
+              <w:t>»</w:t>
+            </w:r>
+            <w:r>
+              <w:rPr>
+                <w:rFonts w:ascii="Aptos Black" w:hAnsi="Aptos Black" w:cs="Calibri"/>
+                <w:b/>
+                <w:bCs/>
               </w:rPr>
               <w:fldChar w:fldCharType="end"/>
             </w:r>
@@ -1700,9 +1723,6 @@
           <w:tcPr>
             <w:tcW w:w="1701" w:type="dxa"/>
             <w:gridSpan w:val="2"/>
-            <w:tcBorders>
-              <w:bottom w:val="single" w:sz="4" w:space="0" w:color="auto"/>
-            </w:tcBorders>
           </w:tcPr>
           <w:p>
             <w:pPr>
@@ -1761,9 +1781,6 @@
         <w:tc>
           <w:tcPr>
             <w:tcW w:w="1276" w:type="dxa"/>
-            <w:tcBorders>
-              <w:bottom w:val="single" w:sz="4" w:space="0" w:color="auto"/>
-            </w:tcBorders>
           </w:tcPr>
           <w:p>
             <w:pPr>
@@ -1870,281 +1887,220 @@
         </w:tc>
       </w:tr>
       <w:tr>
-        <w:trPr>
-          <w:trHeight w:val="94"/>
-        </w:trPr>
+        <w:tc>
+          <w:tcPr>
+            <w:tcW w:w="1978" w:type="dxa"/>
+            <w:gridSpan w:val="2"/>
+          </w:tcPr>
+          <w:p>
+            <w:pPr>
+              <w:jc w:val="center"/>
+              <w:rPr>
+                <w:rFonts w:ascii="Calibri" w:hAnsi="Calibri" w:cs="Calibri"/>
+                <w:sz w:val="16"/>
+                <w:szCs w:val="16"/>
+              </w:rPr>
+            </w:pPr>
+            <w:r>
+              <w:rPr>
+                <w:rFonts w:ascii="Aptos Black" w:hAnsi="Aptos Black"/>
+                <w:b/>
+                <w:bCs/>
+                <w:sz w:val="18"/>
+                <w:szCs w:val="18"/>
+              </w:rPr>
+              <w:t>TOTAL</w:t>
+            </w:r>
+          </w:p>
+        </w:tc>
+        <w:tc>
+          <w:tcPr>
+            <w:tcW w:w="994" w:type="dxa"/>
+          </w:tcPr>
+          <w:p>
+            <w:pPr>
+              <w:jc w:val="center"/>
+              <w:rPr>
+                <w:rFonts w:ascii="Calibri" w:hAnsi="Calibri" w:cs="Calibri"/>
+                <w:sz w:val="16"/>
+                <w:szCs w:val="16"/>
+              </w:rPr>
+            </w:pPr>
+            <w:r>
+              <w:rPr>
+                <w:rFonts w:ascii="Calibri" w:hAnsi="Calibri" w:cs="Calibri"/>
+                <w:sz w:val="16"/>
+                <w:szCs w:val="16"/>
+              </w:rPr>
+              <w:fldChar w:fldCharType="begin"/>
+            </w:r>
+            <w:r>
+              <w:rPr>
+                <w:rFonts w:ascii="Calibri" w:hAnsi="Calibri" w:cs="Calibri"/>
+                <w:sz w:val="16"/>
+                <w:szCs w:val="16"/>
+              </w:rPr>
+              <w:instrText xml:space="preserve"> MERGEFIELD  tt  \* MERGEFORMAT </w:instrText>
+            </w:r>
+            <w:r>
+              <w:rPr>
+                <w:rFonts w:ascii="Calibri" w:hAnsi="Calibri" w:cs="Calibri"/>
+                <w:sz w:val="16"/>
+                <w:szCs w:val="16"/>
+              </w:rPr>
+              <w:fldChar w:fldCharType="separate"/>
+            </w:r>
+            <w:r>
+              <w:rPr>
+                <w:rFonts w:ascii="Calibri" w:hAnsi="Calibri" w:cs="Calibri"/>
+                <w:noProof/>
+                <w:sz w:val="16"/>
+                <w:szCs w:val="16"/>
+              </w:rPr>
+              <w:t>«tt»</w:t>
+            </w:r>
+            <w:r>
+              <w:rPr>
+                <w:rFonts w:ascii="Calibri" w:hAnsi="Calibri" w:cs="Calibri"/>
+                <w:sz w:val="16"/>
+                <w:szCs w:val="16"/>
+              </w:rPr>
+              <w:fldChar w:fldCharType="end"/>
+            </w:r>
+          </w:p>
+        </w:tc>
+        <w:tc>
+          <w:tcPr>
+            <w:tcW w:w="992" w:type="dxa"/>
+          </w:tcPr>
+          <w:p>
+            <w:pPr>
+              <w:jc w:val="center"/>
+              <w:rPr>
+                <w:rFonts w:ascii="Black Han Sans" w:eastAsia="Black Han Sans" w:hAnsi="Calibri" w:cs="Calibri"/>
+                <w:b/>
+                <w:bCs/>
+              </w:rPr>
+            </w:pPr>
+            <w:r>
+              <w:rPr>
+                <w:rFonts w:ascii="Calibri" w:hAnsi="Calibri" w:cs="Calibri"/>
+                <w:sz w:val="16"/>
+                <w:szCs w:val="16"/>
+              </w:rPr>
+              <w:fldChar w:fldCharType="begin"/>
+            </w:r>
+            <w:r>
+              <w:rPr>
+                <w:rFonts w:ascii="Calibri" w:hAnsi="Calibri" w:cs="Calibri"/>
+                <w:sz w:val="16"/>
+                <w:szCs w:val="16"/>
+              </w:rPr>
+              <w:instrText xml:space="preserve"> MERGEFIELD  t.bigbag  \* MERGEFORMAT </w:instrText>
+            </w:r>
+            <w:r>
+              <w:rPr>
+                <w:rFonts w:ascii="Calibri" w:hAnsi="Calibri" w:cs="Calibri"/>
+                <w:sz w:val="16"/>
+                <w:szCs w:val="16"/>
+              </w:rPr>
+              <w:fldChar w:fldCharType="separate"/>
+            </w:r>
+            <w:r>
+              <w:rPr>
+                <w:rFonts w:ascii="Calibri" w:hAnsi="Calibri" w:cs="Calibri"/>
+                <w:noProof/>
+                <w:sz w:val="16"/>
+                <w:szCs w:val="16"/>
+              </w:rPr>
+              <w:t>«t.bigbag»</w:t>
+            </w:r>
+            <w:r>
+              <w:rPr>
+                <w:rFonts w:ascii="Calibri" w:hAnsi="Calibri" w:cs="Calibri"/>
+                <w:sz w:val="16"/>
+                <w:szCs w:val="16"/>
+              </w:rPr>
+              <w:fldChar w:fldCharType="end"/>
+            </w:r>
+          </w:p>
+        </w:tc>
         <w:tc>
           <w:tcPr>
             <w:tcW w:w="851" w:type="dxa"/>
-            <w:gridSpan w:val="2"/>
-            <w:tcBorders>
-              <w:top w:val="single" w:sz="4" w:space="0" w:color="auto"/>
-              <w:left w:val="nil"/>
-              <w:bottom w:val="nil"/>
-              <w:right w:val="nil"/>
-            </w:tcBorders>
           </w:tcPr>
           <w:p>
             <w:pPr>
-              <w:rPr>
-                <w:sz w:val="18"/>
-                <w:szCs w:val="18"/>
+              <w:jc w:val="center"/>
+              <w:rPr>
+                <w:rFonts w:ascii="Aptos Black" w:hAnsi="Aptos Black" w:cs="Calibri"/>
+                <w:b/>
+                <w:bCs/>
+              </w:rPr>
+            </w:pPr>
+            <w:r>
+              <w:rPr>
+                <w:rFonts w:ascii="Calibri" w:hAnsi="Calibri" w:cs="Calibri"/>
+                <w:sz w:val="16"/>
+                <w:szCs w:val="16"/>
+              </w:rPr>
+              <w:fldChar w:fldCharType="begin"/>
+            </w:r>
+            <w:r>
+              <w:rPr>
+                <w:rFonts w:ascii="Calibri" w:hAnsi="Calibri" w:cs="Calibri"/>
+                <w:sz w:val="16"/>
+                <w:szCs w:val="16"/>
+              </w:rPr>
+              <w:instrText xml:space="preserve"> MERGEFIELD  t.granel  \* MERGEFORMAT </w:instrText>
+            </w:r>
+            <w:r>
+              <w:rPr>
+                <w:rFonts w:ascii="Calibri" w:hAnsi="Calibri" w:cs="Calibri"/>
+                <w:sz w:val="16"/>
+                <w:szCs w:val="16"/>
+              </w:rPr>
+              <w:fldChar w:fldCharType="separate"/>
+            </w:r>
+            <w:r>
+              <w:rPr>
+                <w:rFonts w:ascii="Calibri" w:hAnsi="Calibri" w:cs="Calibri"/>
+                <w:noProof/>
+                <w:sz w:val="16"/>
+                <w:szCs w:val="16"/>
+              </w:rPr>
+              <w:t>«t.granel»</w:t>
+            </w:r>
+            <w:r>
+              <w:rPr>
+                <w:rFonts w:ascii="Calibri" w:hAnsi="Calibri" w:cs="Calibri"/>
+                <w:sz w:val="16"/>
+                <w:szCs w:val="16"/>
+              </w:rPr>
+              <w:fldChar w:fldCharType="end"/>
+            </w:r>
+          </w:p>
+        </w:tc>
+        <w:tc>
+          <w:tcPr>
+            <w:tcW w:w="1133" w:type="dxa"/>
+            <w:gridSpan w:val="2"/>
+          </w:tcPr>
+          <w:p>
+            <w:pPr>
+              <w:jc w:val="center"/>
+              <w:rPr>
+                <w:rFonts w:ascii="Calibri" w:hAnsi="Calibri" w:cs="Calibri"/>
+                <w:sz w:val="16"/>
+                <w:szCs w:val="16"/>
               </w:rPr>
             </w:pPr>
           </w:p>
         </w:tc>
         <w:tc>
           <w:tcPr>
-            <w:tcW w:w="1134" w:type="dxa"/>
+            <w:tcW w:w="710" w:type="dxa"/>
             <w:gridSpan w:val="2"/>
-            <w:tcBorders>
-              <w:top w:val="single" w:sz="4" w:space="0" w:color="auto"/>
-              <w:left w:val="nil"/>
-              <w:bottom w:val="nil"/>
-              <w:right w:val="nil"/>
-            </w:tcBorders>
-          </w:tcPr>
-          <w:p>
-            <w:pPr>
-              <w:rPr>
-                <w:rFonts w:ascii="Aptos Black" w:hAnsi="Aptos Black"/>
-                <w:b/>
-                <w:bCs/>
-                <w:sz w:val="18"/>
-                <w:szCs w:val="18"/>
-              </w:rPr>
-            </w:pPr>
-            <w:r>
-              <w:rPr>
-                <w:rFonts w:ascii="Aptos Black" w:hAnsi="Aptos Black"/>
-                <w:b/>
-                <w:bCs/>
-                <w:sz w:val="18"/>
-                <w:szCs w:val="18"/>
-              </w:rPr>
-              <w:t>TOTAL</w:t>
-            </w:r>
-          </w:p>
-        </w:tc>
-        <w:tc>
-          <w:tcPr>
-            <w:tcW w:w="987" w:type="dxa"/>
-            <w:tcBorders>
-              <w:top w:val="single" w:sz="4" w:space="0" w:color="auto"/>
-              <w:left w:val="nil"/>
-              <w:bottom w:val="nil"/>
-              <w:right w:val="nil"/>
-            </w:tcBorders>
-          </w:tcPr>
-          <w:p>
-            <w:pPr>
-              <w:jc w:val="center"/>
-              <w:rPr>
-                <w:rFonts w:ascii="Calibri" w:hAnsi="Calibri" w:cs="Calibri"/>
-                <w:sz w:val="16"/>
-                <w:szCs w:val="16"/>
-              </w:rPr>
-            </w:pPr>
-            <w:r>
-              <w:rPr>
-                <w:rFonts w:ascii="Calibri" w:hAnsi="Calibri" w:cs="Calibri"/>
-                <w:sz w:val="16"/>
-                <w:szCs w:val="16"/>
-              </w:rPr>
-              <w:fldChar w:fldCharType="begin"/>
-            </w:r>
-            <w:r>
-              <w:rPr>
-                <w:rFonts w:ascii="Calibri" w:hAnsi="Calibri" w:cs="Calibri"/>
-                <w:sz w:val="16"/>
-                <w:szCs w:val="16"/>
-              </w:rPr>
-              <w:instrText xml:space="preserve"> MERGEFIELD  tt  \* MERGEFORMAT </w:instrText>
-            </w:r>
-            <w:r>
-              <w:rPr>
-                <w:rFonts w:ascii="Calibri" w:hAnsi="Calibri" w:cs="Calibri"/>
-                <w:sz w:val="16"/>
-                <w:szCs w:val="16"/>
-              </w:rPr>
-              <w:fldChar w:fldCharType="separate"/>
-            </w:r>
-            <w:r>
-              <w:rPr>
-                <w:rFonts w:ascii="Calibri" w:hAnsi="Calibri" w:cs="Calibri"/>
-                <w:noProof/>
-                <w:sz w:val="16"/>
-                <w:szCs w:val="16"/>
-              </w:rPr>
-              <w:t>«tt»</w:t>
-            </w:r>
-            <w:r>
-              <w:rPr>
-                <w:rFonts w:ascii="Calibri" w:hAnsi="Calibri" w:cs="Calibri"/>
-                <w:sz w:val="16"/>
-                <w:szCs w:val="16"/>
-              </w:rPr>
-              <w:fldChar w:fldCharType="end"/>
-            </w:r>
-          </w:p>
-        </w:tc>
-        <w:tc>
-          <w:tcPr>
-            <w:tcW w:w="992" w:type="dxa"/>
-            <w:tcBorders>
-              <w:top w:val="single" w:sz="4" w:space="0" w:color="auto"/>
-              <w:left w:val="nil"/>
-              <w:bottom w:val="nil"/>
-              <w:right w:val="nil"/>
-            </w:tcBorders>
-          </w:tcPr>
-          <w:p>
-            <w:pPr>
-              <w:jc w:val="center"/>
-              <w:rPr>
-                <w:rFonts w:ascii="Calibri" w:hAnsi="Calibri" w:cs="Calibri"/>
-                <w:sz w:val="16"/>
-                <w:szCs w:val="16"/>
-              </w:rPr>
-            </w:pPr>
-            <w:r>
-              <w:rPr>
-                <w:rFonts w:ascii="Calibri" w:hAnsi="Calibri" w:cs="Calibri"/>
-                <w:sz w:val="16"/>
-                <w:szCs w:val="16"/>
-              </w:rPr>
-              <w:fldChar w:fldCharType="begin"/>
-            </w:r>
-            <w:r>
-              <w:rPr>
-                <w:rFonts w:ascii="Calibri" w:hAnsi="Calibri" w:cs="Calibri"/>
-                <w:sz w:val="16"/>
-                <w:szCs w:val="16"/>
-              </w:rPr>
-              <w:instrText xml:space="preserve"> MERGEFIELD  t.bigbag  \* MERGEFORMAT </w:instrText>
-            </w:r>
-            <w:r>
-              <w:rPr>
-                <w:rFonts w:ascii="Calibri" w:hAnsi="Calibri" w:cs="Calibri"/>
-                <w:sz w:val="16"/>
-                <w:szCs w:val="16"/>
-              </w:rPr>
-              <w:fldChar w:fldCharType="separate"/>
-            </w:r>
-            <w:r>
-              <w:rPr>
-                <w:rFonts w:ascii="Calibri" w:hAnsi="Calibri" w:cs="Calibri"/>
-                <w:noProof/>
-                <w:sz w:val="16"/>
-                <w:szCs w:val="16"/>
-              </w:rPr>
-              <w:t>«t.bigbag»</w:t>
-            </w:r>
-            <w:r>
-              <w:rPr>
-                <w:rFonts w:ascii="Calibri" w:hAnsi="Calibri" w:cs="Calibri"/>
-                <w:sz w:val="16"/>
-                <w:szCs w:val="16"/>
-              </w:rPr>
-              <w:fldChar w:fldCharType="end"/>
-            </w:r>
-          </w:p>
-        </w:tc>
-        <w:tc>
-          <w:tcPr>
-            <w:tcW w:w="993" w:type="dxa"/>
-            <w:gridSpan w:val="2"/>
-            <w:tcBorders>
-              <w:top w:val="single" w:sz="4" w:space="0" w:color="auto"/>
-              <w:left w:val="nil"/>
-              <w:bottom w:val="nil"/>
-              <w:right w:val="nil"/>
-            </w:tcBorders>
-          </w:tcPr>
-          <w:p>
-            <w:pPr>
-              <w:jc w:val="center"/>
-              <w:rPr>
-                <w:rFonts w:ascii="Calibri" w:hAnsi="Calibri" w:cs="Calibri"/>
-                <w:sz w:val="16"/>
-                <w:szCs w:val="16"/>
-              </w:rPr>
-            </w:pPr>
-            <w:r>
-              <w:rPr>
-                <w:rFonts w:ascii="Calibri" w:hAnsi="Calibri" w:cs="Calibri"/>
-                <w:sz w:val="16"/>
-                <w:szCs w:val="16"/>
-              </w:rPr>
-              <w:fldChar w:fldCharType="begin"/>
-            </w:r>
-            <w:r>
-              <w:rPr>
-                <w:rFonts w:ascii="Calibri" w:hAnsi="Calibri" w:cs="Calibri"/>
-                <w:sz w:val="16"/>
-                <w:szCs w:val="16"/>
-              </w:rPr>
-              <w:instrText xml:space="preserve"> MERGEFIELD  t.granel  \* MERGEFORMAT </w:instrText>
-            </w:r>
-            <w:r>
-              <w:rPr>
-                <w:rFonts w:ascii="Calibri" w:hAnsi="Calibri" w:cs="Calibri"/>
-                <w:sz w:val="16"/>
-                <w:szCs w:val="16"/>
-              </w:rPr>
-              <w:fldChar w:fldCharType="separate"/>
-            </w:r>
-            <w:r>
-              <w:rPr>
-                <w:rFonts w:ascii="Calibri" w:hAnsi="Calibri" w:cs="Calibri"/>
-                <w:noProof/>
-                <w:sz w:val="16"/>
-                <w:szCs w:val="16"/>
-              </w:rPr>
-              <w:t>«t.granel»</w:t>
-            </w:r>
-            <w:r>
-              <w:rPr>
-                <w:rFonts w:ascii="Calibri" w:hAnsi="Calibri" w:cs="Calibri"/>
-                <w:sz w:val="16"/>
-                <w:szCs w:val="16"/>
-              </w:rPr>
-              <w:fldChar w:fldCharType="end"/>
-            </w:r>
-          </w:p>
-        </w:tc>
-        <w:tc>
-          <w:tcPr>
-            <w:tcW w:w="992" w:type="dxa"/>
-            <w:gridSpan w:val="2"/>
-            <w:tcBorders>
-              <w:top w:val="single" w:sz="4" w:space="0" w:color="auto"/>
-              <w:left w:val="nil"/>
-              <w:bottom w:val="nil"/>
-              <w:right w:val="nil"/>
-            </w:tcBorders>
-          </w:tcPr>
-          <w:p>
-            <w:pPr>
-              <w:jc w:val="center"/>
-              <w:rPr>
-                <w:rFonts w:ascii="Calibri" w:hAnsi="Calibri" w:cs="Calibri"/>
-                <w:sz w:val="16"/>
-                <w:szCs w:val="16"/>
-              </w:rPr>
-            </w:pPr>
-          </w:p>
-        </w:tc>
-        <w:tc>
-          <w:tcPr>
-            <w:tcW w:w="709" w:type="dxa"/>
-            <w:gridSpan w:val="2"/>
-            <w:tcBorders>
-              <w:top w:val="single" w:sz="4" w:space="0" w:color="auto"/>
-              <w:left w:val="nil"/>
-              <w:bottom w:val="nil"/>
-              <w:right w:val="nil"/>
-            </w:tcBorders>
           </w:tcPr>
           <w:p>
             <w:pPr>
@@ -2160,20 +2116,15 @@
         <w:tc>
           <w:tcPr>
             <w:tcW w:w="1842" w:type="dxa"/>
-            <w:tcBorders>
-              <w:top w:val="single" w:sz="4" w:space="0" w:color="auto"/>
-              <w:left w:val="nil"/>
-              <w:bottom w:val="nil"/>
-              <w:right w:val="nil"/>
-            </w:tcBorders>
           </w:tcPr>
           <w:p>
             <w:pPr>
               <w:jc w:val="center"/>
               <w:rPr>
-                <w:rFonts w:ascii="Calibri" w:hAnsi="Calibri" w:cs="Calibri"/>
-                <w:sz w:val="16"/>
-                <w:szCs w:val="16"/>
+                <w:rFonts w:ascii="Aptos Black" w:hAnsi="Aptos Black" w:cs="Calibri"/>
+                <w:b/>
+                <w:bCs/>
+                <w:u w:val="single"/>
               </w:rPr>
             </w:pPr>
             <w:r>
@@ -2223,19 +2174,14 @@
           <w:tcPr>
             <w:tcW w:w="1701" w:type="dxa"/>
             <w:gridSpan w:val="2"/>
-            <w:tcBorders>
-              <w:top w:val="single" w:sz="4" w:space="0" w:color="auto"/>
-              <w:left w:val="nil"/>
-              <w:bottom w:val="nil"/>
-              <w:right w:val="nil"/>
-            </w:tcBorders>
           </w:tcPr>
           <w:p>
             <w:pPr>
               <w:jc w:val="center"/>
               <w:rPr>
-                <w:sz w:val="18"/>
-                <w:szCs w:val="18"/>
+                <w:rFonts w:ascii="Calibri" w:hAnsi="Calibri" w:cs="Calibri"/>
+                <w:sz w:val="16"/>
+                <w:szCs w:val="16"/>
               </w:rPr>
             </w:pPr>
           </w:p>
@@ -2243,24 +2189,45 @@
         <w:tc>
           <w:tcPr>
             <w:tcW w:w="1276" w:type="dxa"/>
-            <w:tcBorders>
-              <w:top w:val="single" w:sz="4" w:space="0" w:color="auto"/>
-              <w:left w:val="nil"/>
-              <w:bottom w:val="nil"/>
-              <w:right w:val="nil"/>
-            </w:tcBorders>
           </w:tcPr>
           <w:p>
             <w:pPr>
-              <w:rPr>
-                <w:sz w:val="18"/>
-                <w:szCs w:val="18"/>
+              <w:jc w:val="center"/>
+              <w:rPr>
+                <w:rFonts w:ascii="Calibri" w:hAnsi="Calibri" w:cs="Calibri"/>
+                <w:sz w:val="16"/>
+                <w:szCs w:val="16"/>
               </w:rPr>
             </w:pPr>
           </w:p>
         </w:tc>
       </w:tr>
     </w:tbl>
+    <w:p>
+      <w:pPr>
+        <w:spacing w:before="0" w:after="0"/>
+        <w:rPr>
+          <w:rFonts w:ascii="Calibri" w:hAnsi="Calibri" w:cs="Calibri"/>
+          <w:b/>
+          <w:caps/>
+          <w:noProof/>
+          <w:sz w:val="2"/>
+          <w:szCs w:val="2"/>
+        </w:rPr>
+      </w:pPr>
+    </w:p>
+    <w:p>
+      <w:pPr>
+        <w:spacing w:before="0" w:after="0"/>
+        <w:rPr>
+          <w:b/>
+          <w:caps/>
+          <w:noProof/>
+          <w:sz w:val="2"/>
+          <w:szCs w:val="2"/>
+        </w:rPr>
+      </w:pPr>
+    </w:p>
     <w:p>
       <w:pPr>
         <w:spacing w:before="0" w:after="0"/>
@@ -3038,7 +3005,6 @@
                                   <w:pPr>
                                     <w:spacing w:before="0" w:after="0"/>
                                     <w:ind w:right="33"/>
-                                    <w:jc w:val="center"/>
                                     <w:rPr>
                                       <w:rFonts w:ascii="Calibri" w:hAnsi="Calibri" w:cs="Calibri"/>
                                       <w:b/>
@@ -3752,7 +3718,6 @@
                             <w:pPr>
                               <w:spacing w:before="0" w:after="0"/>
                               <w:ind w:right="33"/>
-                              <w:jc w:val="center"/>
                               <w:rPr>
                                 <w:rFonts w:ascii="Calibri" w:hAnsi="Calibri" w:cs="Calibri"/>
                                 <w:b/>
@@ -4554,7 +4519,6 @@
                                   <w:pPr>
                                     <w:spacing w:before="0" w:after="0"/>
                                     <w:ind w:right="33"/>
-                                    <w:jc w:val="center"/>
                                     <w:rPr>
                                       <w:rFonts w:ascii="Calibri" w:hAnsi="Calibri" w:cs="Calibri"/>
                                       <w:b/>
@@ -5268,7 +5232,6 @@
                             <w:pPr>
                               <w:spacing w:before="0" w:after="0"/>
                               <w:ind w:right="33"/>
-                              <w:jc w:val="center"/>
                               <w:rPr>
                                 <w:rFonts w:ascii="Calibri" w:hAnsi="Calibri" w:cs="Calibri"/>
                                 <w:b/>
@@ -6679,13 +6642,13 @@
         <mc:AlternateContent>
           <mc:Choice Requires="wps">
             <w:drawing>
-              <wp:anchor distT="0" distB="0" distL="114300" distR="114300" simplePos="0" relativeHeight="251682816" behindDoc="1" locked="0" layoutInCell="1" allowOverlap="1" wp14:anchorId="6459E751" wp14:editId="30D9BD42">
+              <wp:anchor distT="0" distB="0" distL="114300" distR="114300" simplePos="0" relativeHeight="251682816" behindDoc="1" locked="0" layoutInCell="1" allowOverlap="1" wp14:anchorId="765002FB" wp14:editId="487B699B">
                 <wp:simplePos x="0" y="0"/>
                 <wp:positionH relativeFrom="column">
-                  <wp:posOffset>2119630</wp:posOffset>
+                  <wp:posOffset>2143125</wp:posOffset>
                 </wp:positionH>
                 <wp:positionV relativeFrom="paragraph">
-                  <wp:posOffset>1483995</wp:posOffset>
+                  <wp:posOffset>1914525</wp:posOffset>
                 </wp:positionV>
                 <wp:extent cx="2934970" cy="566420"/>
                 <wp:effectExtent l="0" t="0" r="0" b="5080"/>
@@ -6860,7 +6823,7 @@
           </mc:Choice>
           <mc:Fallback>
             <w:pict>
-              <v:rect w14:anchorId="6459E751" id="_x0000_s1029" style="position:absolute;margin-left:166.9pt;margin-top:116.85pt;width:231.1pt;height:44.6pt;z-index:-251633664;visibility:visible;mso-wrap-style:square;mso-width-percent:0;mso-height-percent:0;mso-wrap-distance-left:9pt;mso-wrap-distance-top:0;mso-wrap-distance-right:9pt;mso-wrap-distance-bottom:0;mso-position-horizontal:absolute;mso-position-horizontal-relative:text;mso-position-vertical:absolute;mso-position-vertical-relative:text;mso-width-percent:0;mso-height-percent:0;mso-width-relative:margin;mso-height-relative:margin;v-text-anchor:middle" o:gfxdata="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" filled="f" stroked="f">
+              <v:rect w14:anchorId="765002FB" id="_x0000_s1029" style="position:absolute;margin-left:168.75pt;margin-top:150.75pt;width:231.1pt;height:44.6pt;z-index:-251633664;visibility:visible;mso-wrap-style:square;mso-width-percent:0;mso-height-percent:0;mso-wrap-distance-left:9pt;mso-wrap-distance-top:0;mso-wrap-distance-right:9pt;mso-wrap-distance-bottom:0;mso-position-horizontal:absolute;mso-position-horizontal-relative:text;mso-position-vertical:absolute;mso-position-vertical-relative:text;mso-width-percent:0;mso-height-percent:0;mso-width-relative:margin;mso-height-relative:margin;v-text-anchor:middle" o:gfxdata="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" filled="f" stroked="f">
                 <v:textbox>
                   <w:txbxContent>
                     <w:tbl>
@@ -6995,13 +6958,269 @@
         <mc:AlternateContent>
           <mc:Choice Requires="wps">
             <w:drawing>
-              <wp:anchor distT="0" distB="0" distL="114300" distR="114300" simplePos="0" relativeHeight="251680768" behindDoc="1" locked="0" layoutInCell="1" allowOverlap="1" wp14:anchorId="72E89588" wp14:editId="5253178E">
+              <wp:anchor distT="0" distB="0" distL="114300" distR="114300" simplePos="0" relativeHeight="251678720" behindDoc="1" locked="0" layoutInCell="1" allowOverlap="1" wp14:anchorId="370B154C" wp14:editId="7F64F941">
                 <wp:simplePos x="0" y="0"/>
                 <wp:positionH relativeFrom="column">
-                  <wp:posOffset>4034155</wp:posOffset>
+                  <wp:posOffset>333375</wp:posOffset>
                 </wp:positionH>
                 <wp:positionV relativeFrom="paragraph">
-                  <wp:posOffset>560070</wp:posOffset>
+                  <wp:posOffset>666750</wp:posOffset>
+                </wp:positionV>
+                <wp:extent cx="2934970" cy="566420"/>
+                <wp:effectExtent l="0" t="0" r="0" b="5080"/>
+                <wp:wrapTopAndBottom/>
+                <wp:docPr id="2116462633" name="Rectángulo 2"/>
+                <wp:cNvGraphicFramePr/>
+                <a:graphic xmlns:a="http://schemas.openxmlformats.org/drawingml/2006/main">
+                  <a:graphicData uri="http://schemas.microsoft.com/office/word/2010/wordprocessingShape">
+                    <wps:wsp>
+                      <wps:cNvSpPr/>
+                      <wps:spPr>
+                        <a:xfrm>
+                          <a:off x="0" y="0"/>
+                          <a:ext cx="2934970" cy="566420"/>
+                        </a:xfrm>
+                        <a:prstGeom prst="rect">
+                          <a:avLst/>
+                        </a:prstGeom>
+                        <a:noFill/>
+                        <a:ln>
+                          <a:noFill/>
+                        </a:ln>
+                      </wps:spPr>
+                      <wps:style>
+                        <a:lnRef idx="0">
+                          <a:scrgbClr r="0" g="0" b="0"/>
+                        </a:lnRef>
+                        <a:fillRef idx="0">
+                          <a:scrgbClr r="0" g="0" b="0"/>
+                        </a:fillRef>
+                        <a:effectRef idx="0">
+                          <a:scrgbClr r="0" g="0" b="0"/>
+                        </a:effectRef>
+                        <a:fontRef idx="minor">
+                          <a:schemeClr val="dk1"/>
+                        </a:fontRef>
+                      </wps:style>
+                      <wps:txbx>
+                        <w:txbxContent>
+                          <w:tbl>
+                            <w:tblPr>
+                              <w:tblStyle w:val="Tablaconcuadrcula"/>
+                              <w:tblW w:w="0" w:type="auto"/>
+                              <w:tblBorders>
+                                <w:left w:val="none" w:sz="0" w:space="0" w:color="auto"/>
+                                <w:bottom w:val="none" w:sz="0" w:space="0" w:color="auto"/>
+                                <w:right w:val="none" w:sz="0" w:space="0" w:color="auto"/>
+                                <w:insideH w:val="none" w:sz="0" w:space="0" w:color="auto"/>
+                                <w:insideV w:val="none" w:sz="0" w:space="0" w:color="auto"/>
+                              </w:tblBorders>
+                              <w:tblLook w:val="04A0" w:firstRow="1" w:lastRow="0" w:firstColumn="1" w:lastColumn="0" w:noHBand="0" w:noVBand="1"/>
+                            </w:tblPr>
+                            <w:tblGrid>
+                              <w:gridCol w:w="4323"/>
+                            </w:tblGrid>
+                            <w:tr>
+                              <w:trPr>
+                                <w:trHeight w:val="130"/>
+                              </w:trPr>
+                              <w:tc>
+                                <w:tcPr>
+                                  <w:tcW w:w="4323" w:type="dxa"/>
+                                </w:tcPr>
+                                <w:p>
+                                  <w:pPr>
+                                    <w:spacing w:before="0" w:after="0"/>
+                                    <w:jc w:val="center"/>
+                                    <w:rPr>
+                                      <w:rFonts w:ascii="Calibri" w:hAnsi="Calibri" w:cs="Calibri"/>
+                                      <w:b/>
+                                      <w:bCs/>
+                                      <w:sz w:val="16"/>
+                                      <w:szCs w:val="16"/>
+                                    </w:rPr>
+                                  </w:pPr>
+                                  <w:proofErr w:type="spellStart"/>
+                                  <w:r>
+                                    <w:rPr>
+                                      <w:rFonts w:ascii="Calibri" w:hAnsi="Calibri" w:cs="Calibri"/>
+                                      <w:b/>
+                                      <w:bCs/>
+                                      <w:sz w:val="16"/>
+                                      <w:szCs w:val="16"/>
+                                    </w:rPr>
+                                    <w:t>V°B°</w:t>
+                                  </w:r>
+                                  <w:proofErr w:type="spellEnd"/>
+                                </w:p>
+                              </w:tc>
+                            </w:tr>
+                            <w:tr>
+                              <w:tc>
+                                <w:tcPr>
+                                  <w:tcW w:w="4323" w:type="dxa"/>
+                                </w:tcPr>
+                                <w:p>
+                                  <w:pPr>
+                                    <w:spacing w:before="0"/>
+                                    <w:jc w:val="center"/>
+                                    <w:rPr>
+                                      <w:rFonts w:ascii="Calibri" w:hAnsi="Calibri" w:cs="Calibri"/>
+                                      <w:b/>
+                                      <w:bCs/>
+                                      <w:sz w:val="16"/>
+                                      <w:szCs w:val="16"/>
+                                    </w:rPr>
+                                  </w:pPr>
+                                  <w:r>
+                                    <w:rPr>
+                                      <w:rFonts w:ascii="Calibri" w:hAnsi="Calibri" w:cs="Calibri"/>
+                                      <w:b/>
+                                      <w:bCs/>
+                                      <w:sz w:val="16"/>
+                                      <w:szCs w:val="16"/>
+                                    </w:rPr>
+                                    <w:t>Jefe de Guardia (Planta de Procesos)</w:t>
+                                  </w:r>
+                                </w:p>
+                              </w:tc>
+                            </w:tr>
+                          </w:tbl>
+                          <w:p/>
+                        </w:txbxContent>
+                      </wps:txbx>
+                      <wps:bodyPr rot="0" spcFirstLastPara="0" vertOverflow="overflow" horzOverflow="overflow" vert="horz" wrap="square" lIns="91440" tIns="45720" rIns="91440" bIns="45720" numCol="1" spcCol="0" rtlCol="0" fromWordArt="0" anchor="ctr" anchorCtr="0" forceAA="0" compatLnSpc="1">
+                        <a:prstTxWarp prst="textNoShape">
+                          <a:avLst/>
+                        </a:prstTxWarp>
+                        <a:noAutofit/>
+                      </wps:bodyPr>
+                    </wps:wsp>
+                  </a:graphicData>
+                </a:graphic>
+                <wp14:sizeRelH relativeFrom="margin">
+                  <wp14:pctWidth>0</wp14:pctWidth>
+                </wp14:sizeRelH>
+                <wp14:sizeRelV relativeFrom="margin">
+                  <wp14:pctHeight>0</wp14:pctHeight>
+                </wp14:sizeRelV>
+              </wp:anchor>
+            </w:drawing>
+          </mc:Choice>
+          <mc:Fallback>
+            <w:pict>
+              <v:rect w14:anchorId="370B154C" id="_x0000_s1030" style="position:absolute;margin-left:26.25pt;margin-top:52.5pt;width:231.1pt;height:44.6pt;z-index:-251637760;visibility:visible;mso-wrap-style:square;mso-width-percent:0;mso-height-percent:0;mso-wrap-distance-left:9pt;mso-wrap-distance-top:0;mso-wrap-distance-right:9pt;mso-wrap-distance-bottom:0;mso-position-horizontal:absolute;mso-position-horizontal-relative:text;mso-position-vertical:absolute;mso-position-vertical-relative:text;mso-width-percent:0;mso-height-percent:0;mso-width-relative:margin;mso-height-relative:margin;v-text-anchor:middle" o:gfxdata="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" filled="f" stroked="f">
+                <v:textbox>
+                  <w:txbxContent>
+                    <w:tbl>
+                      <w:tblPr>
+                        <w:tblStyle w:val="Tablaconcuadrcula"/>
+                        <w:tblW w:w="0" w:type="auto"/>
+                        <w:tblBorders>
+                          <w:left w:val="none" w:sz="0" w:space="0" w:color="auto"/>
+                          <w:bottom w:val="none" w:sz="0" w:space="0" w:color="auto"/>
+                          <w:right w:val="none" w:sz="0" w:space="0" w:color="auto"/>
+                          <w:insideH w:val="none" w:sz="0" w:space="0" w:color="auto"/>
+                          <w:insideV w:val="none" w:sz="0" w:space="0" w:color="auto"/>
+                        </w:tblBorders>
+                        <w:tblLook w:val="04A0" w:firstRow="1" w:lastRow="0" w:firstColumn="1" w:lastColumn="0" w:noHBand="0" w:noVBand="1"/>
+                      </w:tblPr>
+                      <w:tblGrid>
+                        <w:gridCol w:w="4323"/>
+                      </w:tblGrid>
+                      <w:tr>
+                        <w:trPr>
+                          <w:trHeight w:val="130"/>
+                        </w:trPr>
+                        <w:tc>
+                          <w:tcPr>
+                            <w:tcW w:w="4323" w:type="dxa"/>
+                          </w:tcPr>
+                          <w:p>
+                            <w:pPr>
+                              <w:spacing w:before="0" w:after="0"/>
+                              <w:jc w:val="center"/>
+                              <w:rPr>
+                                <w:rFonts w:ascii="Calibri" w:hAnsi="Calibri" w:cs="Calibri"/>
+                                <w:b/>
+                                <w:bCs/>
+                                <w:sz w:val="16"/>
+                                <w:szCs w:val="16"/>
+                              </w:rPr>
+                            </w:pPr>
+                            <w:proofErr w:type="spellStart"/>
+                            <w:r>
+                              <w:rPr>
+                                <w:rFonts w:ascii="Calibri" w:hAnsi="Calibri" w:cs="Calibri"/>
+                                <w:b/>
+                                <w:bCs/>
+                                <w:sz w:val="16"/>
+                                <w:szCs w:val="16"/>
+                              </w:rPr>
+                              <w:t>V°B°</w:t>
+                            </w:r>
+                            <w:proofErr w:type="spellEnd"/>
+                          </w:p>
+                        </w:tc>
+                      </w:tr>
+                      <w:tr>
+                        <w:tc>
+                          <w:tcPr>
+                            <w:tcW w:w="4323" w:type="dxa"/>
+                          </w:tcPr>
+                          <w:p>
+                            <w:pPr>
+                              <w:spacing w:before="0"/>
+                              <w:jc w:val="center"/>
+                              <w:rPr>
+                                <w:rFonts w:ascii="Calibri" w:hAnsi="Calibri" w:cs="Calibri"/>
+                                <w:b/>
+                                <w:bCs/>
+                                <w:sz w:val="16"/>
+                                <w:szCs w:val="16"/>
+                              </w:rPr>
+                            </w:pPr>
+                            <w:r>
+                              <w:rPr>
+                                <w:rFonts w:ascii="Calibri" w:hAnsi="Calibri" w:cs="Calibri"/>
+                                <w:b/>
+                                <w:bCs/>
+                                <w:sz w:val="16"/>
+                                <w:szCs w:val="16"/>
+                              </w:rPr>
+                              <w:t>Jefe de Guardia (Planta de Procesos)</w:t>
+                            </w:r>
+                          </w:p>
+                        </w:tc>
+                      </w:tr>
+                    </w:tbl>
+                    <w:p/>
+                  </w:txbxContent>
+                </v:textbox>
+                <w10:wrap type="topAndBottom"/>
+              </v:rect>
+            </w:pict>
+          </mc:Fallback>
+        </mc:AlternateContent>
+      </w:r>
+      <w:r>
+        <w:rPr>
+          <w:rFonts w:ascii="Calibri" w:hAnsi="Calibri" w:cs="Calibri"/>
+          <w:b/>
+          <w:caps/>
+          <w:noProof/>
+          <w14:ligatures w14:val="standardContextual"/>
+        </w:rPr>
+        <mc:AlternateContent>
+          <mc:Choice Requires="wps">
+            <w:drawing>
+              <wp:anchor distT="0" distB="0" distL="114300" distR="114300" simplePos="0" relativeHeight="251680768" behindDoc="1" locked="0" layoutInCell="1" allowOverlap="1" wp14:anchorId="3B26C10D" wp14:editId="1558C5A4">
+                <wp:simplePos x="0" y="0"/>
+                <wp:positionH relativeFrom="column">
+                  <wp:posOffset>3800475</wp:posOffset>
+                </wp:positionH>
+                <wp:positionV relativeFrom="paragraph">
+                  <wp:posOffset>666750</wp:posOffset>
                 </wp:positionV>
                 <wp:extent cx="2934970" cy="566420"/>
                 <wp:effectExtent l="0" t="0" r="0" b="5080"/>
@@ -7176,7 +7395,7 @@
           </mc:Choice>
           <mc:Fallback>
             <w:pict>
-              <v:rect w14:anchorId="72E89588" id="_x0000_s1030" style="position:absolute;margin-left:317.65pt;margin-top:44.1pt;width:231.1pt;height:44.6pt;z-index:-251635712;visibility:visible;mso-wrap-style:square;mso-width-percent:0;mso-height-percent:0;mso-wrap-distance-left:9pt;mso-wrap-distance-top:0;mso-wrap-distance-right:9pt;mso-wrap-distance-bottom:0;mso-position-horizontal:absolute;mso-position-horizontal-relative:text;mso-position-vertical:absolute;mso-position-vertical-relative:text;mso-width-percent:0;mso-height-percent:0;mso-width-relative:margin;mso-height-relative:margin;v-text-anchor:middle" o:gfxdata="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" filled="f" stroked="f">
+              <v:rect w14:anchorId="3B26C10D" id="_x0000_s1031" style="position:absolute;margin-left:299.25pt;margin-top:52.5pt;width:231.1pt;height:44.6pt;z-index:-251635712;visibility:visible;mso-wrap-style:square;mso-width-percent:0;mso-height-percent:0;mso-wrap-distance-left:9pt;mso-wrap-distance-top:0;mso-wrap-distance-right:9pt;mso-wrap-distance-bottom:0;mso-position-horizontal:absolute;mso-position-horizontal-relative:text;mso-position-vertical:absolute;mso-position-vertical-relative:text;mso-width-percent:0;mso-height-percent:0;mso-width-relative:margin;mso-height-relative:margin;v-text-anchor:middle" o:gfxdata="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" filled="f" stroked="f">
                 <v:textbox>
                   <w:txbxContent>
                     <w:tbl>
@@ -7286,262 +7505,6 @@
                                 <w:szCs w:val="16"/>
                               </w:rPr>
                               <w:t>)</w:t>
-                            </w:r>
-                          </w:p>
-                        </w:tc>
-                      </w:tr>
-                    </w:tbl>
-                    <w:p/>
-                  </w:txbxContent>
-                </v:textbox>
-                <w10:wrap type="topAndBottom"/>
-              </v:rect>
-            </w:pict>
-          </mc:Fallback>
-        </mc:AlternateContent>
-      </w:r>
-      <w:r>
-        <w:rPr>
-          <w:rFonts w:ascii="Calibri" w:hAnsi="Calibri" w:cs="Calibri"/>
-          <w:b/>
-          <w:caps/>
-          <w:noProof/>
-          <w14:ligatures w14:val="standardContextual"/>
-        </w:rPr>
-        <mc:AlternateContent>
-          <mc:Choice Requires="wps">
-            <w:drawing>
-              <wp:anchor distT="0" distB="0" distL="114300" distR="114300" simplePos="0" relativeHeight="251678720" behindDoc="1" locked="0" layoutInCell="1" allowOverlap="1" wp14:anchorId="0B163113" wp14:editId="4F4FBAFB">
-                <wp:simplePos x="0" y="0"/>
-                <wp:positionH relativeFrom="column">
-                  <wp:posOffset>210185</wp:posOffset>
-                </wp:positionH>
-                <wp:positionV relativeFrom="paragraph">
-                  <wp:posOffset>560070</wp:posOffset>
-                </wp:positionV>
-                <wp:extent cx="2934970" cy="566420"/>
-                <wp:effectExtent l="0" t="0" r="0" b="5080"/>
-                <wp:wrapTopAndBottom/>
-                <wp:docPr id="2116462633" name="Rectángulo 2"/>
-                <wp:cNvGraphicFramePr/>
-                <a:graphic xmlns:a="http://schemas.openxmlformats.org/drawingml/2006/main">
-                  <a:graphicData uri="http://schemas.microsoft.com/office/word/2010/wordprocessingShape">
-                    <wps:wsp>
-                      <wps:cNvSpPr/>
-                      <wps:spPr>
-                        <a:xfrm>
-                          <a:off x="0" y="0"/>
-                          <a:ext cx="2934970" cy="566420"/>
-                        </a:xfrm>
-                        <a:prstGeom prst="rect">
-                          <a:avLst/>
-                        </a:prstGeom>
-                        <a:noFill/>
-                        <a:ln>
-                          <a:noFill/>
-                        </a:ln>
-                      </wps:spPr>
-                      <wps:style>
-                        <a:lnRef idx="0">
-                          <a:scrgbClr r="0" g="0" b="0"/>
-                        </a:lnRef>
-                        <a:fillRef idx="0">
-                          <a:scrgbClr r="0" g="0" b="0"/>
-                        </a:fillRef>
-                        <a:effectRef idx="0">
-                          <a:scrgbClr r="0" g="0" b="0"/>
-                        </a:effectRef>
-                        <a:fontRef idx="minor">
-                          <a:schemeClr val="dk1"/>
-                        </a:fontRef>
-                      </wps:style>
-                      <wps:txbx>
-                        <w:txbxContent>
-                          <w:tbl>
-                            <w:tblPr>
-                              <w:tblStyle w:val="Tablaconcuadrcula"/>
-                              <w:tblW w:w="0" w:type="auto"/>
-                              <w:tblBorders>
-                                <w:left w:val="none" w:sz="0" w:space="0" w:color="auto"/>
-                                <w:bottom w:val="none" w:sz="0" w:space="0" w:color="auto"/>
-                                <w:right w:val="none" w:sz="0" w:space="0" w:color="auto"/>
-                                <w:insideH w:val="none" w:sz="0" w:space="0" w:color="auto"/>
-                                <w:insideV w:val="none" w:sz="0" w:space="0" w:color="auto"/>
-                              </w:tblBorders>
-                              <w:tblLook w:val="04A0" w:firstRow="1" w:lastRow="0" w:firstColumn="1" w:lastColumn="0" w:noHBand="0" w:noVBand="1"/>
-                            </w:tblPr>
-                            <w:tblGrid>
-                              <w:gridCol w:w="4323"/>
-                            </w:tblGrid>
-                            <w:tr>
-                              <w:trPr>
-                                <w:trHeight w:val="130"/>
-                              </w:trPr>
-                              <w:tc>
-                                <w:tcPr>
-                                  <w:tcW w:w="4323" w:type="dxa"/>
-                                </w:tcPr>
-                                <w:p>
-                                  <w:pPr>
-                                    <w:spacing w:before="0" w:after="0"/>
-                                    <w:jc w:val="center"/>
-                                    <w:rPr>
-                                      <w:rFonts w:ascii="Calibri" w:hAnsi="Calibri" w:cs="Calibri"/>
-                                      <w:b/>
-                                      <w:bCs/>
-                                      <w:sz w:val="16"/>
-                                      <w:szCs w:val="16"/>
-                                    </w:rPr>
-                                  </w:pPr>
-                                  <w:proofErr w:type="spellStart"/>
-                                  <w:r>
-                                    <w:rPr>
-                                      <w:rFonts w:ascii="Calibri" w:hAnsi="Calibri" w:cs="Calibri"/>
-                                      <w:b/>
-                                      <w:bCs/>
-                                      <w:sz w:val="16"/>
-                                      <w:szCs w:val="16"/>
-                                    </w:rPr>
-                                    <w:t>V°B°</w:t>
-                                  </w:r>
-                                  <w:proofErr w:type="spellEnd"/>
-                                </w:p>
-                              </w:tc>
-                            </w:tr>
-                            <w:tr>
-                              <w:tc>
-                                <w:tcPr>
-                                  <w:tcW w:w="4323" w:type="dxa"/>
-                                </w:tcPr>
-                                <w:p>
-                                  <w:pPr>
-                                    <w:spacing w:before="0"/>
-                                    <w:jc w:val="center"/>
-                                    <w:rPr>
-                                      <w:rFonts w:ascii="Calibri" w:hAnsi="Calibri" w:cs="Calibri"/>
-                                      <w:b/>
-                                      <w:bCs/>
-                                      <w:sz w:val="16"/>
-                                      <w:szCs w:val="16"/>
-                                    </w:rPr>
-                                  </w:pPr>
-                                  <w:r>
-                                    <w:rPr>
-                                      <w:rFonts w:ascii="Calibri" w:hAnsi="Calibri" w:cs="Calibri"/>
-                                      <w:b/>
-                                      <w:bCs/>
-                                      <w:sz w:val="16"/>
-                                      <w:szCs w:val="16"/>
-                                    </w:rPr>
-                                    <w:t>Jefe de Guardia (Planta de Procesos)</w:t>
-                                  </w:r>
-                                </w:p>
-                              </w:tc>
-                            </w:tr>
-                          </w:tbl>
-                          <w:p/>
-                        </w:txbxContent>
-                      </wps:txbx>
-                      <wps:bodyPr rot="0" spcFirstLastPara="0" vertOverflow="overflow" horzOverflow="overflow" vert="horz" wrap="square" lIns="91440" tIns="45720" rIns="91440" bIns="45720" numCol="1" spcCol="0" rtlCol="0" fromWordArt="0" anchor="ctr" anchorCtr="0" forceAA="0" compatLnSpc="1">
-                        <a:prstTxWarp prst="textNoShape">
-                          <a:avLst/>
-                        </a:prstTxWarp>
-                        <a:noAutofit/>
-                      </wps:bodyPr>
-                    </wps:wsp>
-                  </a:graphicData>
-                </a:graphic>
-                <wp14:sizeRelH relativeFrom="margin">
-                  <wp14:pctWidth>0</wp14:pctWidth>
-                </wp14:sizeRelH>
-                <wp14:sizeRelV relativeFrom="margin">
-                  <wp14:pctHeight>0</wp14:pctHeight>
-                </wp14:sizeRelV>
-              </wp:anchor>
-            </w:drawing>
-          </mc:Choice>
-          <mc:Fallback>
-            <w:pict>
-              <v:rect w14:anchorId="0B163113" id="_x0000_s1031" style="position:absolute;margin-left:16.55pt;margin-top:44.1pt;width:231.1pt;height:44.6pt;z-index:-251637760;visibility:visible;mso-wrap-style:square;mso-width-percent:0;mso-height-percent:0;mso-wrap-distance-left:9pt;mso-wrap-distance-top:0;mso-wrap-distance-right:9pt;mso-wrap-distance-bottom:0;mso-position-horizontal:absolute;mso-position-horizontal-relative:text;mso-position-vertical:absolute;mso-position-vertical-relative:text;mso-width-percent:0;mso-height-percent:0;mso-width-relative:margin;mso-height-relative:margin;v-text-anchor:middle" o:gfxdata="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" filled="f" stroked="f">
-                <v:textbox>
-                  <w:txbxContent>
-                    <w:tbl>
-                      <w:tblPr>
-                        <w:tblStyle w:val="Tablaconcuadrcula"/>
-                        <w:tblW w:w="0" w:type="auto"/>
-                        <w:tblBorders>
-                          <w:left w:val="none" w:sz="0" w:space="0" w:color="auto"/>
-                          <w:bottom w:val="none" w:sz="0" w:space="0" w:color="auto"/>
-                          <w:right w:val="none" w:sz="0" w:space="0" w:color="auto"/>
-                          <w:insideH w:val="none" w:sz="0" w:space="0" w:color="auto"/>
-                          <w:insideV w:val="none" w:sz="0" w:space="0" w:color="auto"/>
-                        </w:tblBorders>
-                        <w:tblLook w:val="04A0" w:firstRow="1" w:lastRow="0" w:firstColumn="1" w:lastColumn="0" w:noHBand="0" w:noVBand="1"/>
-                      </w:tblPr>
-                      <w:tblGrid>
-                        <w:gridCol w:w="4323"/>
-                      </w:tblGrid>
-                      <w:tr>
-                        <w:trPr>
-                          <w:trHeight w:val="130"/>
-                        </w:trPr>
-                        <w:tc>
-                          <w:tcPr>
-                            <w:tcW w:w="4323" w:type="dxa"/>
-                          </w:tcPr>
-                          <w:p>
-                            <w:pPr>
-                              <w:spacing w:before="0" w:after="0"/>
-                              <w:jc w:val="center"/>
-                              <w:rPr>
-                                <w:rFonts w:ascii="Calibri" w:hAnsi="Calibri" w:cs="Calibri"/>
-                                <w:b/>
-                                <w:bCs/>
-                                <w:sz w:val="16"/>
-                                <w:szCs w:val="16"/>
-                              </w:rPr>
-                            </w:pPr>
-                            <w:proofErr w:type="spellStart"/>
-                            <w:r>
-                              <w:rPr>
-                                <w:rFonts w:ascii="Calibri" w:hAnsi="Calibri" w:cs="Calibri"/>
-                                <w:b/>
-                                <w:bCs/>
-                                <w:sz w:val="16"/>
-                                <w:szCs w:val="16"/>
-                              </w:rPr>
-                              <w:t>V°B°</w:t>
-                            </w:r>
-                            <w:proofErr w:type="spellEnd"/>
-                          </w:p>
-                        </w:tc>
-                      </w:tr>
-                      <w:tr>
-                        <w:tc>
-                          <w:tcPr>
-                            <w:tcW w:w="4323" w:type="dxa"/>
-                          </w:tcPr>
-                          <w:p>
-                            <w:pPr>
-                              <w:spacing w:before="0"/>
-                              <w:jc w:val="center"/>
-                              <w:rPr>
-                                <w:rFonts w:ascii="Calibri" w:hAnsi="Calibri" w:cs="Calibri"/>
-                                <w:b/>
-                                <w:bCs/>
-                                <w:sz w:val="16"/>
-                                <w:szCs w:val="16"/>
-                              </w:rPr>
-                            </w:pPr>
-                            <w:r>
-                              <w:rPr>
-                                <w:rFonts w:ascii="Calibri" w:hAnsi="Calibri" w:cs="Calibri"/>
-                                <w:b/>
-                                <w:bCs/>
-                                <w:sz w:val="16"/>
-                                <w:szCs w:val="16"/>
-                              </w:rPr>
-                              <w:t>Jefe de Guardia (Planta de Procesos)</w:t>
                             </w:r>
                           </w:p>
                         </w:tc>

</xml_diff>

<commit_message>
feat: agregar guia al reporte de acta entrega
</commit_message>
<xml_diff>
--- a/pesaje/analytica/Report/PrintActaEntrega.docx
+++ b/pesaje/analytica/Report/PrintActaEntrega.docx
@@ -523,7 +523,7 @@
                 <w:sz w:val="18"/>
                 <w:szCs w:val="18"/>
               </w:rPr>
-              <w:instrText xml:space="preserve"> MERGEFIELD  nro_acta  \* MERGEFORMAT </w:instrText>
+              <w:instrText xml:space="preserve"> MERGEFIELD  guia  \* MERGEFORMAT </w:instrText>
             </w:r>
             <w:r>
               <w:rPr>
@@ -538,7 +538,7 @@
                 <w:sz w:val="18"/>
                 <w:szCs w:val="18"/>
               </w:rPr>
-              <w:t>«nro_acta»</w:t>
+              <w:t>«guia»</w:t>
             </w:r>
             <w:r>
               <w:rPr>
@@ -6724,7 +6724,6 @@
                                       <w:szCs w:val="16"/>
                                     </w:rPr>
                                   </w:pPr>
-                                  <w:proofErr w:type="spellStart"/>
                                   <w:r>
                                     <w:rPr>
                                       <w:rFonts w:ascii="Calibri" w:hAnsi="Calibri" w:cs="Calibri"/>
@@ -6735,7 +6734,6 @@
                                     </w:rPr>
                                     <w:t>V°B°</w:t>
                                   </w:r>
-                                  <w:proofErr w:type="spellEnd"/>
                                 </w:p>
                               </w:tc>
                             </w:tr>
@@ -6862,7 +6860,6 @@
                                 <w:szCs w:val="16"/>
                               </w:rPr>
                             </w:pPr>
-                            <w:proofErr w:type="spellStart"/>
                             <w:r>
                               <w:rPr>
                                 <w:rFonts w:ascii="Calibri" w:hAnsi="Calibri" w:cs="Calibri"/>
@@ -6873,7 +6870,6 @@
                               </w:rPr>
                               <w:t>V°B°</w:t>
                             </w:r>
-                            <w:proofErr w:type="spellEnd"/>
                           </w:p>
                         </w:tc>
                       </w:tr>
@@ -7040,7 +7036,6 @@
                                       <w:szCs w:val="16"/>
                                     </w:rPr>
                                   </w:pPr>
-                                  <w:proofErr w:type="spellStart"/>
                                   <w:r>
                                     <w:rPr>
                                       <w:rFonts w:ascii="Calibri" w:hAnsi="Calibri" w:cs="Calibri"/>
@@ -7051,7 +7046,6 @@
                                     </w:rPr>
                                     <w:t>V°B°</w:t>
                                   </w:r>
-                                  <w:proofErr w:type="spellEnd"/>
                                 </w:p>
                               </w:tc>
                             </w:tr>
@@ -7148,7 +7142,6 @@
                                 <w:szCs w:val="16"/>
                               </w:rPr>
                             </w:pPr>
-                            <w:proofErr w:type="spellStart"/>
                             <w:r>
                               <w:rPr>
                                 <w:rFonts w:ascii="Calibri" w:hAnsi="Calibri" w:cs="Calibri"/>
@@ -7159,7 +7152,6 @@
                               </w:rPr>
                               <w:t>V°B°</w:t>
                             </w:r>
-                            <w:proofErr w:type="spellEnd"/>
                           </w:p>
                         </w:tc>
                       </w:tr>
@@ -7296,7 +7288,6 @@
                                       <w:szCs w:val="16"/>
                                     </w:rPr>
                                   </w:pPr>
-                                  <w:proofErr w:type="spellStart"/>
                                   <w:r>
                                     <w:rPr>
                                       <w:rFonts w:ascii="Calibri" w:hAnsi="Calibri" w:cs="Calibri"/>
@@ -7307,7 +7298,6 @@
                                     </w:rPr>
                                     <w:t>V°B°</w:t>
                                   </w:r>
-                                  <w:proofErr w:type="spellEnd"/>
                                 </w:p>
                               </w:tc>
                             </w:tr>
@@ -7434,7 +7424,6 @@
                                 <w:szCs w:val="16"/>
                               </w:rPr>
                             </w:pPr>
-                            <w:proofErr w:type="spellStart"/>
                             <w:r>
                               <w:rPr>
                                 <w:rFonts w:ascii="Calibri" w:hAnsi="Calibri" w:cs="Calibri"/>
@@ -7445,7 +7434,6 @@
                               </w:rPr>
                               <w:t>V°B°</w:t>
                             </w:r>
-                            <w:proofErr w:type="spellEnd"/>
                           </w:p>
                         </w:tc>
                       </w:tr>

</xml_diff>

<commit_message>
feat: actualizar plantilla acta entrega
</commit_message>
<xml_diff>
--- a/pesaje/analytica/Report/PrintActaEntrega.docx
+++ b/pesaje/analytica/Report/PrintActaEntrega.docx
@@ -836,6 +836,9 @@
         <w:tc>
           <w:tcPr>
             <w:tcW w:w="844" w:type="dxa"/>
+            <w:tcBorders>
+              <w:bottom w:val="single" w:sz="4" w:space="0" w:color="auto"/>
+            </w:tcBorders>
           </w:tcPr>
           <w:p>
             <w:pPr>
@@ -863,6 +866,9 @@
         <w:tc>
           <w:tcPr>
             <w:tcW w:w="1134" w:type="dxa"/>
+            <w:tcBorders>
+              <w:bottom w:val="single" w:sz="4" w:space="0" w:color="auto"/>
+            </w:tcBorders>
           </w:tcPr>
           <w:p>
             <w:pPr>
@@ -890,6 +896,9 @@
         <w:tc>
           <w:tcPr>
             <w:tcW w:w="994" w:type="dxa"/>
+            <w:tcBorders>
+              <w:bottom w:val="single" w:sz="4" w:space="0" w:color="auto"/>
+            </w:tcBorders>
           </w:tcPr>
           <w:p>
             <w:pPr>
@@ -917,6 +926,9 @@
         <w:tc>
           <w:tcPr>
             <w:tcW w:w="992" w:type="dxa"/>
+            <w:tcBorders>
+              <w:bottom w:val="single" w:sz="4" w:space="0" w:color="auto"/>
+            </w:tcBorders>
           </w:tcPr>
           <w:p>
             <w:pPr>
@@ -944,6 +956,9 @@
         <w:tc>
           <w:tcPr>
             <w:tcW w:w="851" w:type="dxa"/>
+            <w:tcBorders>
+              <w:bottom w:val="single" w:sz="4" w:space="0" w:color="auto"/>
+            </w:tcBorders>
           </w:tcPr>
           <w:p>
             <w:pPr>
@@ -972,6 +987,9 @@
           <w:tcPr>
             <w:tcW w:w="1133" w:type="dxa"/>
             <w:gridSpan w:val="2"/>
+            <w:tcBorders>
+              <w:bottom w:val="single" w:sz="4" w:space="0" w:color="auto"/>
+            </w:tcBorders>
           </w:tcPr>
           <w:p>
             <w:pPr>
@@ -1022,6 +1040,9 @@
           <w:tcPr>
             <w:tcW w:w="710" w:type="dxa"/>
             <w:gridSpan w:val="2"/>
+            <w:tcBorders>
+              <w:bottom w:val="single" w:sz="4" w:space="0" w:color="auto"/>
+            </w:tcBorders>
           </w:tcPr>
           <w:p>
             <w:pPr>
@@ -1049,6 +1070,9 @@
         <w:tc>
           <w:tcPr>
             <w:tcW w:w="1842" w:type="dxa"/>
+            <w:tcBorders>
+              <w:bottom w:val="single" w:sz="4" w:space="0" w:color="auto"/>
+            </w:tcBorders>
           </w:tcPr>
           <w:p>
             <w:pPr>
@@ -1077,6 +1101,9 @@
           <w:tcPr>
             <w:tcW w:w="1701" w:type="dxa"/>
             <w:gridSpan w:val="2"/>
+            <w:tcBorders>
+              <w:bottom w:val="single" w:sz="4" w:space="0" w:color="auto"/>
+            </w:tcBorders>
           </w:tcPr>
           <w:p>
             <w:pPr>
@@ -1104,6 +1131,9 @@
         <w:tc>
           <w:tcPr>
             <w:tcW w:w="1276" w:type="dxa"/>
+            <w:tcBorders>
+              <w:bottom w:val="single" w:sz="4" w:space="0" w:color="auto"/>
+            </w:tcBorders>
           </w:tcPr>
           <w:p>
             <w:pPr>
@@ -1155,6 +1185,9 @@
         <w:tc>
           <w:tcPr>
             <w:tcW w:w="844" w:type="dxa"/>
+            <w:tcBorders>
+              <w:bottom w:val="single" w:sz="4" w:space="0" w:color="auto"/>
+            </w:tcBorders>
           </w:tcPr>
           <w:p>
             <w:pPr>
@@ -1266,6 +1299,9 @@
         <w:tc>
           <w:tcPr>
             <w:tcW w:w="1134" w:type="dxa"/>
+            <w:tcBorders>
+              <w:bottom w:val="single" w:sz="4" w:space="0" w:color="auto"/>
+            </w:tcBorders>
           </w:tcPr>
           <w:p>
             <w:pPr>
@@ -1324,6 +1360,9 @@
         <w:tc>
           <w:tcPr>
             <w:tcW w:w="994" w:type="dxa"/>
+            <w:tcBorders>
+              <w:bottom w:val="single" w:sz="4" w:space="0" w:color="auto"/>
+            </w:tcBorders>
           </w:tcPr>
           <w:p>
             <w:pPr>
@@ -1382,6 +1421,9 @@
         <w:tc>
           <w:tcPr>
             <w:tcW w:w="992" w:type="dxa"/>
+            <w:tcBorders>
+              <w:bottom w:val="single" w:sz="4" w:space="0" w:color="auto"/>
+            </w:tcBorders>
           </w:tcPr>
           <w:p>
             <w:pPr>
@@ -1399,6 +1441,8 @@
                 <w:rFonts w:ascii="Black Han Sans" w:eastAsia="Black Han Sans" w:hAnsi="Calibri" w:cs="Calibri" w:hint="eastAsia"/>
                 <w:b/>
                 <w:bCs/>
+                <w:sz w:val="16"/>
+                <w:szCs w:val="16"/>
               </w:rPr>
               <w:fldChar w:fldCharType="begin"/>
             </w:r>
@@ -1407,6 +1451,8 @@
                 <w:rFonts w:ascii="Black Han Sans" w:eastAsia="Black Han Sans" w:hAnsi="Calibri" w:cs="Calibri" w:hint="eastAsia"/>
                 <w:b/>
                 <w:bCs/>
+                <w:sz w:val="16"/>
+                <w:szCs w:val="16"/>
               </w:rPr>
               <w:instrText xml:space="preserve"> MERGEFIELD  bigbag  \* MERGEFORMAT </w:instrText>
             </w:r>
@@ -1415,6 +1461,8 @@
                 <w:rFonts w:ascii="Black Han Sans" w:eastAsia="Black Han Sans" w:hAnsi="Calibri" w:cs="Calibri" w:hint="eastAsia"/>
                 <w:b/>
                 <w:bCs/>
+                <w:sz w:val="16"/>
+                <w:szCs w:val="16"/>
               </w:rPr>
               <w:fldChar w:fldCharType="separate"/>
             </w:r>
@@ -1424,6 +1472,8 @@
                 <w:b/>
                 <w:bCs/>
                 <w:noProof/>
+                <w:sz w:val="16"/>
+                <w:szCs w:val="16"/>
               </w:rPr>
               <w:t>«</w:t>
             </w:r>
@@ -1431,6 +1481,8 @@
               <w:rPr>
                 <w:rFonts w:ascii="Aptos Black" w:eastAsia="Black Han Sans" w:hAnsi="Aptos Black" w:cs="Calibri"/>
                 <w:noProof/>
+                <w:sz w:val="16"/>
+                <w:szCs w:val="16"/>
               </w:rPr>
               <w:t>bigbag</w:t>
             </w:r>
@@ -1440,6 +1492,8 @@
                 <w:b/>
                 <w:bCs/>
                 <w:noProof/>
+                <w:sz w:val="16"/>
+                <w:szCs w:val="16"/>
               </w:rPr>
               <w:t>»</w:t>
             </w:r>
@@ -1448,6 +1502,8 @@
                 <w:rFonts w:ascii="Black Han Sans" w:eastAsia="Black Han Sans" w:hAnsi="Calibri" w:cs="Calibri" w:hint="eastAsia"/>
                 <w:b/>
                 <w:bCs/>
+                <w:sz w:val="16"/>
+                <w:szCs w:val="16"/>
               </w:rPr>
               <w:fldChar w:fldCharType="end"/>
             </w:r>
@@ -1456,6 +1512,9 @@
         <w:tc>
           <w:tcPr>
             <w:tcW w:w="851" w:type="dxa"/>
+            <w:tcBorders>
+              <w:bottom w:val="single" w:sz="4" w:space="0" w:color="auto"/>
+            </w:tcBorders>
           </w:tcPr>
           <w:p>
             <w:pPr>
@@ -1473,6 +1532,8 @@
                 <w:rFonts w:ascii="Aptos Black" w:hAnsi="Aptos Black" w:cs="Calibri"/>
                 <w:b/>
                 <w:bCs/>
+                <w:sz w:val="16"/>
+                <w:szCs w:val="16"/>
               </w:rPr>
               <w:fldChar w:fldCharType="begin"/>
             </w:r>
@@ -1481,6 +1542,8 @@
                 <w:rFonts w:ascii="Aptos Black" w:hAnsi="Aptos Black" w:cs="Calibri"/>
                 <w:b/>
                 <w:bCs/>
+                <w:sz w:val="16"/>
+                <w:szCs w:val="16"/>
               </w:rPr>
               <w:instrText xml:space="preserve"> MERGEFIELD  granel  \* MERGEFORMAT </w:instrText>
             </w:r>
@@ -1489,6 +1552,8 @@
                 <w:rFonts w:ascii="Aptos Black" w:hAnsi="Aptos Black" w:cs="Calibri"/>
                 <w:b/>
                 <w:bCs/>
+                <w:sz w:val="16"/>
+                <w:szCs w:val="16"/>
               </w:rPr>
               <w:fldChar w:fldCharType="separate"/>
             </w:r>
@@ -1498,6 +1563,8 @@
                 <w:b/>
                 <w:bCs/>
                 <w:noProof/>
+                <w:sz w:val="16"/>
+                <w:szCs w:val="16"/>
               </w:rPr>
               <w:t>«</w:t>
             </w:r>
@@ -1505,6 +1572,8 @@
               <w:rPr>
                 <w:rFonts w:ascii="Aptos Black" w:hAnsi="Aptos Black" w:cs="Calibri"/>
                 <w:noProof/>
+                <w:sz w:val="16"/>
+                <w:szCs w:val="16"/>
               </w:rPr>
               <w:t>granel</w:t>
             </w:r>
@@ -1514,6 +1583,8 @@
                 <w:b/>
                 <w:bCs/>
                 <w:noProof/>
+                <w:sz w:val="16"/>
+                <w:szCs w:val="16"/>
               </w:rPr>
               <w:t>»</w:t>
             </w:r>
@@ -1522,6 +1593,8 @@
                 <w:rFonts w:ascii="Aptos Black" w:hAnsi="Aptos Black" w:cs="Calibri"/>
                 <w:b/>
                 <w:bCs/>
+                <w:sz w:val="16"/>
+                <w:szCs w:val="16"/>
               </w:rPr>
               <w:fldChar w:fldCharType="end"/>
             </w:r>
@@ -1531,6 +1604,9 @@
           <w:tcPr>
             <w:tcW w:w="1133" w:type="dxa"/>
             <w:gridSpan w:val="2"/>
+            <w:tcBorders>
+              <w:bottom w:val="single" w:sz="4" w:space="0" w:color="auto"/>
+            </w:tcBorders>
           </w:tcPr>
           <w:p>
             <w:pPr>
@@ -1590,6 +1666,9 @@
           <w:tcPr>
             <w:tcW w:w="710" w:type="dxa"/>
             <w:gridSpan w:val="2"/>
+            <w:tcBorders>
+              <w:bottom w:val="single" w:sz="4" w:space="0" w:color="auto"/>
+            </w:tcBorders>
           </w:tcPr>
           <w:p>
             <w:pPr>
@@ -1648,6 +1727,9 @@
         <w:tc>
           <w:tcPr>
             <w:tcW w:w="1842" w:type="dxa"/>
+            <w:tcBorders>
+              <w:bottom w:val="single" w:sz="4" w:space="0" w:color="auto"/>
+            </w:tcBorders>
           </w:tcPr>
           <w:p>
             <w:pPr>
@@ -1665,6 +1747,8 @@
                 <w:rFonts w:ascii="Aptos Black" w:hAnsi="Aptos Black" w:cs="Calibri"/>
                 <w:b/>
                 <w:bCs/>
+                <w:sz w:val="16"/>
+                <w:szCs w:val="16"/>
               </w:rPr>
               <w:fldChar w:fldCharType="begin"/>
             </w:r>
@@ -1673,6 +1757,8 @@
                 <w:rFonts w:ascii="Aptos Black" w:hAnsi="Aptos Black" w:cs="Calibri"/>
                 <w:b/>
                 <w:bCs/>
+                <w:sz w:val="16"/>
+                <w:szCs w:val="16"/>
               </w:rPr>
               <w:instrText xml:space="preserve"> MERGEFIELD  contramuestra  \* MERGEFORMAT </w:instrText>
             </w:r>
@@ -1681,6 +1767,8 @@
                 <w:rFonts w:ascii="Aptos Black" w:hAnsi="Aptos Black" w:cs="Calibri"/>
                 <w:b/>
                 <w:bCs/>
+                <w:sz w:val="16"/>
+                <w:szCs w:val="16"/>
               </w:rPr>
               <w:fldChar w:fldCharType="separate"/>
             </w:r>
@@ -1690,6 +1778,8 @@
                 <w:b/>
                 <w:bCs/>
                 <w:noProof/>
+                <w:sz w:val="16"/>
+                <w:szCs w:val="16"/>
               </w:rPr>
               <w:t>«</w:t>
             </w:r>
@@ -1697,6 +1787,8 @@
               <w:rPr>
                 <w:rFonts w:ascii="Aptos Black" w:hAnsi="Aptos Black" w:cs="Calibri"/>
                 <w:noProof/>
+                <w:sz w:val="16"/>
+                <w:szCs w:val="16"/>
               </w:rPr>
               <w:t>contramuestra</w:t>
             </w:r>
@@ -1706,6 +1798,8 @@
                 <w:b/>
                 <w:bCs/>
                 <w:noProof/>
+                <w:sz w:val="16"/>
+                <w:szCs w:val="16"/>
               </w:rPr>
               <w:t>»</w:t>
             </w:r>
@@ -1714,6 +1808,8 @@
                 <w:rFonts w:ascii="Aptos Black" w:hAnsi="Aptos Black" w:cs="Calibri"/>
                 <w:b/>
                 <w:bCs/>
+                <w:sz w:val="16"/>
+                <w:szCs w:val="16"/>
               </w:rPr>
               <w:fldChar w:fldCharType="end"/>
             </w:r>
@@ -1723,6 +1819,9 @@
           <w:tcPr>
             <w:tcW w:w="1701" w:type="dxa"/>
             <w:gridSpan w:val="2"/>
+            <w:tcBorders>
+              <w:bottom w:val="single" w:sz="4" w:space="0" w:color="auto"/>
+            </w:tcBorders>
           </w:tcPr>
           <w:p>
             <w:pPr>
@@ -1781,6 +1880,9 @@
         <w:tc>
           <w:tcPr>
             <w:tcW w:w="1276" w:type="dxa"/>
+            <w:tcBorders>
+              <w:bottom w:val="single" w:sz="4" w:space="0" w:color="auto"/>
+            </w:tcBorders>
           </w:tcPr>
           <w:p>
             <w:pPr>
@@ -1891,14 +1993,18 @@
           <w:tcPr>
             <w:tcW w:w="1978" w:type="dxa"/>
             <w:gridSpan w:val="2"/>
+            <w:tcBorders>
+              <w:top w:val="single" w:sz="4" w:space="0" w:color="auto"/>
+              <w:left w:val="nil"/>
+              <w:bottom w:val="nil"/>
+              <w:right w:val="nil"/>
+            </w:tcBorders>
           </w:tcPr>
           <w:p>
             <w:pPr>
               <w:jc w:val="center"/>
               <w:rPr>
                 <w:rFonts w:ascii="Calibri" w:hAnsi="Calibri" w:cs="Calibri"/>
-                <w:sz w:val="16"/>
-                <w:szCs w:val="16"/>
               </w:rPr>
             </w:pPr>
             <w:r>
@@ -1906,8 +2012,8 @@
                 <w:rFonts w:ascii="Aptos Black" w:hAnsi="Aptos Black"/>
                 <w:b/>
                 <w:bCs/>
-                <w:sz w:val="18"/>
-                <w:szCs w:val="18"/>
+                <w:sz w:val="22"/>
+                <w:szCs w:val="22"/>
               </w:rPr>
               <w:t>TOTAL</w:t>
             </w:r>
@@ -1916,54 +2022,72 @@
         <w:tc>
           <w:tcPr>
             <w:tcW w:w="994" w:type="dxa"/>
+            <w:tcBorders>
+              <w:top w:val="single" w:sz="4" w:space="0" w:color="auto"/>
+              <w:left w:val="nil"/>
+              <w:bottom w:val="nil"/>
+              <w:right w:val="nil"/>
+            </w:tcBorders>
           </w:tcPr>
           <w:p>
             <w:pPr>
               <w:jc w:val="center"/>
               <w:rPr>
                 <w:rFonts w:ascii="Calibri" w:hAnsi="Calibri" w:cs="Calibri"/>
-                <w:sz w:val="16"/>
-                <w:szCs w:val="16"/>
+                <w:b/>
+                <w:bCs/>
+                <w:sz w:val="18"/>
+                <w:szCs w:val="18"/>
               </w:rPr>
             </w:pPr>
             <w:r>
               <w:rPr>
                 <w:rFonts w:ascii="Calibri" w:hAnsi="Calibri" w:cs="Calibri"/>
-                <w:sz w:val="16"/>
-                <w:szCs w:val="16"/>
+                <w:b/>
+                <w:bCs/>
+                <w:sz w:val="18"/>
+                <w:szCs w:val="18"/>
               </w:rPr>
               <w:fldChar w:fldCharType="begin"/>
             </w:r>
             <w:r>
               <w:rPr>
                 <w:rFonts w:ascii="Calibri" w:hAnsi="Calibri" w:cs="Calibri"/>
-                <w:sz w:val="16"/>
-                <w:szCs w:val="16"/>
+                <w:b/>
+                <w:bCs/>
+                <w:sz w:val="18"/>
+                <w:szCs w:val="18"/>
               </w:rPr>
               <w:instrText xml:space="preserve"> MERGEFIELD  tt  \* MERGEFORMAT </w:instrText>
             </w:r>
             <w:r>
               <w:rPr>
                 <w:rFonts w:ascii="Calibri" w:hAnsi="Calibri" w:cs="Calibri"/>
-                <w:sz w:val="16"/>
-                <w:szCs w:val="16"/>
+                <w:b/>
+                <w:bCs/>
+                <w:sz w:val="18"/>
+                <w:szCs w:val="18"/>
               </w:rPr>
               <w:fldChar w:fldCharType="separate"/>
             </w:r>
             <w:r>
               <w:rPr>
                 <w:rFonts w:ascii="Calibri" w:hAnsi="Calibri" w:cs="Calibri"/>
+                <w:b/>
+                <w:bCs/>
                 <w:noProof/>
-                <w:sz w:val="16"/>
-                <w:szCs w:val="16"/>
+                <w:sz w:val="18"/>
+                <w:szCs w:val="18"/>
               </w:rPr>
               <w:t>«tt»</w:t>
             </w:r>
             <w:r>
               <w:rPr>
                 <w:rFonts w:ascii="Calibri" w:hAnsi="Calibri" w:cs="Calibri"/>
-                <w:sz w:val="16"/>
-                <w:szCs w:val="16"/>
+                <w:b/>
+                <w:bCs/>
+                <w:sz w:val="18"/>
+                <w:szCs w:val="18"/>
               </w:rPr>
               <w:fldChar w:fldCharType="end"/>
             </w:r>
@@ -1972,6 +2096,12 @@
         <w:tc>
           <w:tcPr>
             <w:tcW w:w="992" w:type="dxa"/>
+            <w:tcBorders>
+              <w:top w:val="single" w:sz="4" w:space="0" w:color="auto"/>
+              <w:left w:val="nil"/>
+              <w:bottom w:val="nil"/>
+              <w:right w:val="nil"/>
+            </w:tcBorders>
           </w:tcPr>
           <w:p>
             <w:pPr>
@@ -1980,46 +2110,58 @@
                 <w:rFonts w:ascii="Black Han Sans" w:eastAsia="Black Han Sans" w:hAnsi="Calibri" w:cs="Calibri"/>
                 <w:b/>
                 <w:bCs/>
+                <w:sz w:val="18"/>
+                <w:szCs w:val="18"/>
               </w:rPr>
             </w:pPr>
             <w:r>
               <w:rPr>
                 <w:rFonts w:ascii="Calibri" w:hAnsi="Calibri" w:cs="Calibri"/>
-                <w:sz w:val="16"/>
-                <w:szCs w:val="16"/>
+                <w:b/>
+                <w:bCs/>
+                <w:sz w:val="18"/>
+                <w:szCs w:val="18"/>
               </w:rPr>
               <w:fldChar w:fldCharType="begin"/>
             </w:r>
             <w:r>
               <w:rPr>
                 <w:rFonts w:ascii="Calibri" w:hAnsi="Calibri" w:cs="Calibri"/>
-                <w:sz w:val="16"/>
-                <w:szCs w:val="16"/>
+                <w:b/>
+                <w:bCs/>
+                <w:sz w:val="18"/>
+                <w:szCs w:val="18"/>
               </w:rPr>
               <w:instrText xml:space="preserve"> MERGEFIELD  t.bigbag  \* MERGEFORMAT </w:instrText>
             </w:r>
             <w:r>
               <w:rPr>
                 <w:rFonts w:ascii="Calibri" w:hAnsi="Calibri" w:cs="Calibri"/>
-                <w:sz w:val="16"/>
-                <w:szCs w:val="16"/>
+                <w:b/>
+                <w:bCs/>
+                <w:sz w:val="18"/>
+                <w:szCs w:val="18"/>
               </w:rPr>
               <w:fldChar w:fldCharType="separate"/>
             </w:r>
             <w:r>
               <w:rPr>
                 <w:rFonts w:ascii="Calibri" w:hAnsi="Calibri" w:cs="Calibri"/>
+                <w:b/>
+                <w:bCs/>
                 <w:noProof/>
-                <w:sz w:val="16"/>
-                <w:szCs w:val="16"/>
+                <w:sz w:val="18"/>
+                <w:szCs w:val="18"/>
               </w:rPr>
               <w:t>«t.bigbag»</w:t>
             </w:r>
             <w:r>
               <w:rPr>
                 <w:rFonts w:ascii="Calibri" w:hAnsi="Calibri" w:cs="Calibri"/>
-                <w:sz w:val="16"/>
-                <w:szCs w:val="16"/>
+                <w:b/>
+                <w:bCs/>
+                <w:sz w:val="18"/>
+                <w:szCs w:val="18"/>
               </w:rPr>
               <w:fldChar w:fldCharType="end"/>
             </w:r>
@@ -2028,6 +2170,12 @@
         <w:tc>
           <w:tcPr>
             <w:tcW w:w="851" w:type="dxa"/>
+            <w:tcBorders>
+              <w:top w:val="single" w:sz="4" w:space="0" w:color="auto"/>
+              <w:left w:val="nil"/>
+              <w:bottom w:val="nil"/>
+              <w:right w:val="nil"/>
+            </w:tcBorders>
           </w:tcPr>
           <w:p>
             <w:pPr>
@@ -2036,46 +2184,58 @@
                 <w:rFonts w:ascii="Aptos Black" w:hAnsi="Aptos Black" w:cs="Calibri"/>
                 <w:b/>
                 <w:bCs/>
+                <w:sz w:val="18"/>
+                <w:szCs w:val="18"/>
               </w:rPr>
             </w:pPr>
             <w:r>
               <w:rPr>
                 <w:rFonts w:ascii="Calibri" w:hAnsi="Calibri" w:cs="Calibri"/>
-                <w:sz w:val="16"/>
-                <w:szCs w:val="16"/>
+                <w:b/>
+                <w:bCs/>
+                <w:sz w:val="18"/>
+                <w:szCs w:val="18"/>
               </w:rPr>
               <w:fldChar w:fldCharType="begin"/>
             </w:r>
             <w:r>
               <w:rPr>
                 <w:rFonts w:ascii="Calibri" w:hAnsi="Calibri" w:cs="Calibri"/>
-                <w:sz w:val="16"/>
-                <w:szCs w:val="16"/>
+                <w:b/>
+                <w:bCs/>
+                <w:sz w:val="18"/>
+                <w:szCs w:val="18"/>
               </w:rPr>
               <w:instrText xml:space="preserve"> MERGEFIELD  t.granel  \* MERGEFORMAT </w:instrText>
             </w:r>
             <w:r>
               <w:rPr>
                 <w:rFonts w:ascii="Calibri" w:hAnsi="Calibri" w:cs="Calibri"/>
-                <w:sz w:val="16"/>
-                <w:szCs w:val="16"/>
+                <w:b/>
+                <w:bCs/>
+                <w:sz w:val="18"/>
+                <w:szCs w:val="18"/>
               </w:rPr>
               <w:fldChar w:fldCharType="separate"/>
             </w:r>
             <w:r>
               <w:rPr>
                 <w:rFonts w:ascii="Calibri" w:hAnsi="Calibri" w:cs="Calibri"/>
+                <w:b/>
+                <w:bCs/>
                 <w:noProof/>
-                <w:sz w:val="16"/>
-                <w:szCs w:val="16"/>
+                <w:sz w:val="18"/>
+                <w:szCs w:val="18"/>
               </w:rPr>
               <w:t>«t.granel»</w:t>
             </w:r>
             <w:r>
               <w:rPr>
                 <w:rFonts w:ascii="Calibri" w:hAnsi="Calibri" w:cs="Calibri"/>
-                <w:sz w:val="16"/>
-                <w:szCs w:val="16"/>
+                <w:b/>
+                <w:bCs/>
+                <w:sz w:val="18"/>
+                <w:szCs w:val="18"/>
               </w:rPr>
               <w:fldChar w:fldCharType="end"/>
             </w:r>
@@ -2085,6 +2245,12 @@
           <w:tcPr>
             <w:tcW w:w="1133" w:type="dxa"/>
             <w:gridSpan w:val="2"/>
+            <w:tcBorders>
+              <w:top w:val="single" w:sz="4" w:space="0" w:color="auto"/>
+              <w:left w:val="nil"/>
+              <w:bottom w:val="nil"/>
+              <w:right w:val="nil"/>
+            </w:tcBorders>
           </w:tcPr>
           <w:p>
             <w:pPr>
@@ -2101,6 +2267,12 @@
           <w:tcPr>
             <w:tcW w:w="710" w:type="dxa"/>
             <w:gridSpan w:val="2"/>
+            <w:tcBorders>
+              <w:top w:val="single" w:sz="4" w:space="0" w:color="auto"/>
+              <w:left w:val="nil"/>
+              <w:bottom w:val="nil"/>
+              <w:right w:val="nil"/>
+            </w:tcBorders>
           </w:tcPr>
           <w:p>
             <w:pPr>
@@ -2116,6 +2288,12 @@
         <w:tc>
           <w:tcPr>
             <w:tcW w:w="1842" w:type="dxa"/>
+            <w:tcBorders>
+              <w:top w:val="single" w:sz="4" w:space="0" w:color="auto"/>
+              <w:left w:val="nil"/>
+              <w:bottom w:val="nil"/>
+              <w:right w:val="nil"/>
+            </w:tcBorders>
           </w:tcPr>
           <w:p>
             <w:pPr>
@@ -2174,6 +2352,12 @@
           <w:tcPr>
             <w:tcW w:w="1701" w:type="dxa"/>
             <w:gridSpan w:val="2"/>
+            <w:tcBorders>
+              <w:top w:val="single" w:sz="4" w:space="0" w:color="auto"/>
+              <w:left w:val="nil"/>
+              <w:bottom w:val="nil"/>
+              <w:right w:val="nil"/>
+            </w:tcBorders>
           </w:tcPr>
           <w:p>
             <w:pPr>
@@ -2189,6 +2373,12 @@
         <w:tc>
           <w:tcPr>
             <w:tcW w:w="1276" w:type="dxa"/>
+            <w:tcBorders>
+              <w:top w:val="single" w:sz="4" w:space="0" w:color="auto"/>
+              <w:left w:val="nil"/>
+              <w:bottom w:val="nil"/>
+              <w:right w:val="nil"/>
+            </w:tcBorders>
           </w:tcPr>
           <w:p>
             <w:pPr>
@@ -3011,8 +3201,6 @@
                                       <w:bCs/>
                                       <w:caps/>
                                       <w:noProof/>
-                                      <w:sz w:val="18"/>
-                                      <w:szCs w:val="18"/>
                                     </w:rPr>
                                   </w:pPr>
                                   <w:r>
@@ -3020,8 +3208,6 @@
                                       <w:rFonts w:ascii="Calibri" w:hAnsi="Calibri" w:cs="Calibri"/>
                                       <w:b/>
                                       <w:bCs/>
-                                      <w:sz w:val="18"/>
-                                      <w:szCs w:val="18"/>
                                     </w:rPr>
                                     <w:fldChar w:fldCharType="begin"/>
                                   </w:r>
@@ -3030,8 +3216,6 @@
                                       <w:rFonts w:ascii="Calibri" w:hAnsi="Calibri" w:cs="Calibri"/>
                                       <w:b/>
                                       <w:bCs/>
-                                      <w:sz w:val="18"/>
-                                      <w:szCs w:val="18"/>
                                     </w:rPr>
                                     <w:instrText xml:space="preserve"> MERGEFIELD  total_neto_placa2  \* MERGEFORMAT </w:instrText>
                                   </w:r>
@@ -3040,8 +3224,6 @@
                                       <w:rFonts w:ascii="Calibri" w:hAnsi="Calibri" w:cs="Calibri"/>
                                       <w:b/>
                                       <w:bCs/>
-                                      <w:sz w:val="18"/>
-                                      <w:szCs w:val="18"/>
                                     </w:rPr>
                                     <w:fldChar w:fldCharType="separate"/>
                                   </w:r>
@@ -3051,8 +3233,6 @@
                                       <w:b/>
                                       <w:bCs/>
                                       <w:noProof/>
-                                      <w:sz w:val="18"/>
-                                      <w:szCs w:val="18"/>
                                     </w:rPr>
                                     <w:t>«total_neto_placa2»</w:t>
                                   </w:r>
@@ -3061,8 +3241,6 @@
                                       <w:rFonts w:ascii="Calibri" w:hAnsi="Calibri" w:cs="Calibri"/>
                                       <w:b/>
                                       <w:bCs/>
-                                      <w:sz w:val="18"/>
-                                      <w:szCs w:val="18"/>
                                     </w:rPr>
                                     <w:fldChar w:fldCharType="end"/>
                                   </w:r>
@@ -3724,8 +3902,6 @@
                                 <w:bCs/>
                                 <w:caps/>
                                 <w:noProof/>
-                                <w:sz w:val="18"/>
-                                <w:szCs w:val="18"/>
                               </w:rPr>
                             </w:pPr>
                             <w:r>
@@ -3733,8 +3909,6 @@
                                 <w:rFonts w:ascii="Calibri" w:hAnsi="Calibri" w:cs="Calibri"/>
                                 <w:b/>
                                 <w:bCs/>
-                                <w:sz w:val="18"/>
-                                <w:szCs w:val="18"/>
                               </w:rPr>
                               <w:fldChar w:fldCharType="begin"/>
                             </w:r>
@@ -3743,8 +3917,6 @@
                                 <w:rFonts w:ascii="Calibri" w:hAnsi="Calibri" w:cs="Calibri"/>
                                 <w:b/>
                                 <w:bCs/>
-                                <w:sz w:val="18"/>
-                                <w:szCs w:val="18"/>
                               </w:rPr>
                               <w:instrText xml:space="preserve"> MERGEFIELD  total_neto_placa2  \* MERGEFORMAT </w:instrText>
                             </w:r>
@@ -3753,8 +3925,6 @@
                                 <w:rFonts w:ascii="Calibri" w:hAnsi="Calibri" w:cs="Calibri"/>
                                 <w:b/>
                                 <w:bCs/>
-                                <w:sz w:val="18"/>
-                                <w:szCs w:val="18"/>
                               </w:rPr>
                               <w:fldChar w:fldCharType="separate"/>
                             </w:r>
@@ -3764,8 +3934,6 @@
                                 <w:b/>
                                 <w:bCs/>
                                 <w:noProof/>
-                                <w:sz w:val="18"/>
-                                <w:szCs w:val="18"/>
                               </w:rPr>
                               <w:t>«total_neto_placa2»</w:t>
                             </w:r>
@@ -3774,8 +3942,6 @@
                                 <w:rFonts w:ascii="Calibri" w:hAnsi="Calibri" w:cs="Calibri"/>
                                 <w:b/>
                                 <w:bCs/>
-                                <w:sz w:val="18"/>
-                                <w:szCs w:val="18"/>
                               </w:rPr>
                               <w:fldChar w:fldCharType="end"/>
                             </w:r>
@@ -4525,8 +4691,6 @@
                                       <w:bCs/>
                                       <w:caps/>
                                       <w:noProof/>
-                                      <w:sz w:val="18"/>
-                                      <w:szCs w:val="18"/>
                                     </w:rPr>
                                   </w:pPr>
                                   <w:r>
@@ -4534,8 +4698,6 @@
                                       <w:rFonts w:ascii="Calibri" w:hAnsi="Calibri" w:cs="Calibri"/>
                                       <w:b/>
                                       <w:bCs/>
-                                      <w:sz w:val="18"/>
-                                      <w:szCs w:val="18"/>
                                     </w:rPr>
                                     <w:fldChar w:fldCharType="begin"/>
                                   </w:r>
@@ -4544,8 +4706,6 @@
                                       <w:rFonts w:ascii="Calibri" w:hAnsi="Calibri" w:cs="Calibri"/>
                                       <w:b/>
                                       <w:bCs/>
-                                      <w:sz w:val="18"/>
-                                      <w:szCs w:val="18"/>
                                     </w:rPr>
                                     <w:instrText xml:space="preserve"> MERGEFIELD  total_neto_placa1  \* MERGEFORMAT </w:instrText>
                                   </w:r>
@@ -4554,8 +4714,6 @@
                                       <w:rFonts w:ascii="Calibri" w:hAnsi="Calibri" w:cs="Calibri"/>
                                       <w:b/>
                                       <w:bCs/>
-                                      <w:sz w:val="18"/>
-                                      <w:szCs w:val="18"/>
                                     </w:rPr>
                                     <w:fldChar w:fldCharType="separate"/>
                                   </w:r>
@@ -4565,8 +4723,6 @@
                                       <w:b/>
                                       <w:bCs/>
                                       <w:noProof/>
-                                      <w:sz w:val="18"/>
-                                      <w:szCs w:val="18"/>
                                     </w:rPr>
                                     <w:t>«total_neto_placa1»</w:t>
                                   </w:r>
@@ -4575,8 +4731,6 @@
                                       <w:rFonts w:ascii="Calibri" w:hAnsi="Calibri" w:cs="Calibri"/>
                                       <w:b/>
                                       <w:bCs/>
-                                      <w:sz w:val="18"/>
-                                      <w:szCs w:val="18"/>
                                     </w:rPr>
                                     <w:fldChar w:fldCharType="end"/>
                                   </w:r>
@@ -5238,8 +5392,6 @@
                                 <w:bCs/>
                                 <w:caps/>
                                 <w:noProof/>
-                                <w:sz w:val="18"/>
-                                <w:szCs w:val="18"/>
                               </w:rPr>
                             </w:pPr>
                             <w:r>
@@ -5247,8 +5399,6 @@
                                 <w:rFonts w:ascii="Calibri" w:hAnsi="Calibri" w:cs="Calibri"/>
                                 <w:b/>
                                 <w:bCs/>
-                                <w:sz w:val="18"/>
-                                <w:szCs w:val="18"/>
                               </w:rPr>
                               <w:fldChar w:fldCharType="begin"/>
                             </w:r>
@@ -5257,8 +5407,6 @@
                                 <w:rFonts w:ascii="Calibri" w:hAnsi="Calibri" w:cs="Calibri"/>
                                 <w:b/>
                                 <w:bCs/>
-                                <w:sz w:val="18"/>
-                                <w:szCs w:val="18"/>
                               </w:rPr>
                               <w:instrText xml:space="preserve"> MERGEFIELD  total_neto_placa1  \* MERGEFORMAT </w:instrText>
                             </w:r>
@@ -5267,8 +5415,6 @@
                                 <w:rFonts w:ascii="Calibri" w:hAnsi="Calibri" w:cs="Calibri"/>
                                 <w:b/>
                                 <w:bCs/>
-                                <w:sz w:val="18"/>
-                                <w:szCs w:val="18"/>
                               </w:rPr>
                               <w:fldChar w:fldCharType="separate"/>
                             </w:r>
@@ -5278,8 +5424,6 @@
                                 <w:b/>
                                 <w:bCs/>
                                 <w:noProof/>
-                                <w:sz w:val="18"/>
-                                <w:szCs w:val="18"/>
                               </w:rPr>
                               <w:t>«total_neto_placa1»</w:t>
                             </w:r>
@@ -5288,8 +5432,6 @@
                                 <w:rFonts w:ascii="Calibri" w:hAnsi="Calibri" w:cs="Calibri"/>
                                 <w:b/>
                                 <w:bCs/>
-                                <w:sz w:val="18"/>
-                                <w:szCs w:val="18"/>
                               </w:rPr>
                               <w:fldChar w:fldCharType="end"/>
                             </w:r>
@@ -5894,10 +6036,10 @@
       </w:tblPr>
       <w:tblGrid>
         <w:gridCol w:w="1891"/>
-        <w:gridCol w:w="1626"/>
+        <w:gridCol w:w="1772"/>
         <w:gridCol w:w="1019"/>
         <w:gridCol w:w="1564"/>
-        <w:gridCol w:w="1158"/>
+        <w:gridCol w:w="1257"/>
         <w:gridCol w:w="1276"/>
       </w:tblGrid>
       <w:tr>
@@ -5958,8 +6100,6 @@
                 <w:rFonts w:ascii="Calibri" w:hAnsi="Calibri" w:cs="Calibri"/>
                 <w:b/>
                 <w:bCs/>
-                <w:sz w:val="18"/>
-                <w:szCs w:val="18"/>
               </w:rPr>
               <w:fldChar w:fldCharType="begin"/>
             </w:r>
@@ -5968,8 +6108,6 @@
                 <w:rFonts w:ascii="Calibri" w:hAnsi="Calibri" w:cs="Calibri"/>
                 <w:b/>
                 <w:bCs/>
-                <w:sz w:val="18"/>
-                <w:szCs w:val="18"/>
               </w:rPr>
               <w:instrText xml:space="preserve"> MERGEFIELD  total_entregado  \* MERGEFORMAT </w:instrText>
             </w:r>
@@ -5978,8 +6116,6 @@
                 <w:rFonts w:ascii="Calibri" w:hAnsi="Calibri" w:cs="Calibri"/>
                 <w:b/>
                 <w:bCs/>
-                <w:sz w:val="18"/>
-                <w:szCs w:val="18"/>
               </w:rPr>
               <w:fldChar w:fldCharType="separate"/>
             </w:r>
@@ -5989,8 +6125,6 @@
                 <w:b/>
                 <w:bCs/>
                 <w:noProof/>
-                <w:sz w:val="18"/>
-                <w:szCs w:val="18"/>
               </w:rPr>
               <w:t>«total_entregado»</w:t>
             </w:r>
@@ -5999,8 +6133,6 @@
                 <w:rFonts w:ascii="Calibri" w:hAnsi="Calibri" w:cs="Calibri"/>
                 <w:b/>
                 <w:bCs/>
-                <w:sz w:val="18"/>
-                <w:szCs w:val="18"/>
               </w:rPr>
               <w:fldChar w:fldCharType="end"/>
             </w:r>
@@ -6054,6 +6186,8 @@
                 <w:b/>
                 <w:caps/>
                 <w:noProof/>
+                <w:sz w:val="18"/>
+                <w:szCs w:val="18"/>
               </w:rPr>
               <w:t>DIFERENCIA</w:t>
             </w:r>
@@ -6078,8 +6212,6 @@
                 <w:rFonts w:ascii="Calibri" w:hAnsi="Calibri" w:cs="Calibri"/>
                 <w:b/>
                 <w:bCs/>
-                <w:sz w:val="18"/>
-                <w:szCs w:val="18"/>
               </w:rPr>
               <w:fldChar w:fldCharType="begin"/>
             </w:r>
@@ -6088,8 +6220,6 @@
                 <w:rFonts w:ascii="Calibri" w:hAnsi="Calibri" w:cs="Calibri"/>
                 <w:b/>
                 <w:bCs/>
-                <w:sz w:val="18"/>
-                <w:szCs w:val="18"/>
               </w:rPr>
               <w:instrText xml:space="preserve"> MERGEFIELD  diferencia  \* MERGEFORMAT </w:instrText>
             </w:r>
@@ -6098,8 +6228,6 @@
                 <w:rFonts w:ascii="Calibri" w:hAnsi="Calibri" w:cs="Calibri"/>
                 <w:b/>
                 <w:bCs/>
-                <w:sz w:val="18"/>
-                <w:szCs w:val="18"/>
               </w:rPr>
               <w:fldChar w:fldCharType="separate"/>
             </w:r>
@@ -6109,8 +6237,6 @@
                 <w:b/>
                 <w:bCs/>
                 <w:noProof/>
-                <w:sz w:val="18"/>
-                <w:szCs w:val="18"/>
               </w:rPr>
               <w:t>«diferencia»</w:t>
             </w:r>
@@ -6119,8 +6245,6 @@
                 <w:rFonts w:ascii="Calibri" w:hAnsi="Calibri" w:cs="Calibri"/>
                 <w:b/>
                 <w:bCs/>
-                <w:sz w:val="18"/>
-                <w:szCs w:val="18"/>
               </w:rPr>
               <w:fldChar w:fldCharType="end"/>
             </w:r>
@@ -6724,6 +6848,7 @@
                                       <w:szCs w:val="16"/>
                                     </w:rPr>
                                   </w:pPr>
+                                  <w:proofErr w:type="spellStart"/>
                                   <w:r>
                                     <w:rPr>
                                       <w:rFonts w:ascii="Calibri" w:hAnsi="Calibri" w:cs="Calibri"/>
@@ -6734,6 +6859,7 @@
                                     </w:rPr>
                                     <w:t>V°B°</w:t>
                                   </w:r>
+                                  <w:proofErr w:type="spellEnd"/>
                                 </w:p>
                               </w:tc>
                             </w:tr>
@@ -6860,6 +6986,7 @@
                                 <w:szCs w:val="16"/>
                               </w:rPr>
                             </w:pPr>
+                            <w:proofErr w:type="spellStart"/>
                             <w:r>
                               <w:rPr>
                                 <w:rFonts w:ascii="Calibri" w:hAnsi="Calibri" w:cs="Calibri"/>
@@ -6870,6 +6997,7 @@
                               </w:rPr>
                               <w:t>V°B°</w:t>
                             </w:r>
+                            <w:proofErr w:type="spellEnd"/>
                           </w:p>
                         </w:tc>
                       </w:tr>
@@ -7036,6 +7164,7 @@
                                       <w:szCs w:val="16"/>
                                     </w:rPr>
                                   </w:pPr>
+                                  <w:proofErr w:type="spellStart"/>
                                   <w:r>
                                     <w:rPr>
                                       <w:rFonts w:ascii="Calibri" w:hAnsi="Calibri" w:cs="Calibri"/>
@@ -7046,6 +7175,7 @@
                                     </w:rPr>
                                     <w:t>V°B°</w:t>
                                   </w:r>
+                                  <w:proofErr w:type="spellEnd"/>
                                 </w:p>
                               </w:tc>
                             </w:tr>
@@ -7142,6 +7272,7 @@
                                 <w:szCs w:val="16"/>
                               </w:rPr>
                             </w:pPr>
+                            <w:proofErr w:type="spellStart"/>
                             <w:r>
                               <w:rPr>
                                 <w:rFonts w:ascii="Calibri" w:hAnsi="Calibri" w:cs="Calibri"/>
@@ -7152,6 +7283,7 @@
                               </w:rPr>
                               <w:t>V°B°</w:t>
                             </w:r>
+                            <w:proofErr w:type="spellEnd"/>
                           </w:p>
                         </w:tc>
                       </w:tr>
@@ -7288,6 +7420,7 @@
                                       <w:szCs w:val="16"/>
                                     </w:rPr>
                                   </w:pPr>
+                                  <w:proofErr w:type="spellStart"/>
                                   <w:r>
                                     <w:rPr>
                                       <w:rFonts w:ascii="Calibri" w:hAnsi="Calibri" w:cs="Calibri"/>
@@ -7298,6 +7431,7 @@
                                     </w:rPr>
                                     <w:t>V°B°</w:t>
                                   </w:r>
+                                  <w:proofErr w:type="spellEnd"/>
                                 </w:p>
                               </w:tc>
                             </w:tr>
@@ -7424,6 +7558,7 @@
                                 <w:szCs w:val="16"/>
                               </w:rPr>
                             </w:pPr>
+                            <w:proofErr w:type="spellStart"/>
                             <w:r>
                               <w:rPr>
                                 <w:rFonts w:ascii="Calibri" w:hAnsi="Calibri" w:cs="Calibri"/>
@@ -7434,6 +7569,7 @@
                               </w:rPr>
                               <w:t>V°B°</w:t>
                             </w:r>
+                            <w:proofErr w:type="spellEnd"/>
                           </w:p>
                         </w:tc>
                       </w:tr>

</xml_diff>

<commit_message>
feat: actualizar plantilal de acta entrega en analytica
</commit_message>
<xml_diff>
--- a/pesaje/analytica/Report/PrintActaEntrega.docx
+++ b/pesaje/analytica/Report/PrintActaEntrega.docx
@@ -590,6 +590,8 @@
             </w:pPr>
             <w:r>
               <w:rPr>
+                <w:b/>
+                <w:bCs/>
                 <w:sz w:val="18"/>
                 <w:szCs w:val="18"/>
               </w:rPr>
@@ -597,6 +599,8 @@
             </w:r>
             <w:r>
               <w:rPr>
+                <w:b/>
+                <w:bCs/>
                 <w:sz w:val="18"/>
                 <w:szCs w:val="18"/>
               </w:rPr>
@@ -604,6 +608,8 @@
             </w:r>
             <w:r>
               <w:rPr>
+                <w:b/>
+                <w:bCs/>
                 <w:sz w:val="18"/>
                 <w:szCs w:val="18"/>
               </w:rPr>
@@ -611,6 +617,8 @@
             </w:r>
             <w:r>
               <w:rPr>
+                <w:b/>
+                <w:bCs/>
                 <w:noProof/>
                 <w:sz w:val="18"/>
                 <w:szCs w:val="18"/>
@@ -619,6 +627,8 @@
             </w:r>
             <w:r>
               <w:rPr>
+                <w:b/>
+                <w:bCs/>
                 <w:sz w:val="18"/>
                 <w:szCs w:val="18"/>
               </w:rPr>
@@ -780,6 +790,8 @@
             </w:pPr>
             <w:r>
               <w:rPr>
+                <w:b/>
+                <w:bCs/>
                 <w:sz w:val="18"/>
                 <w:szCs w:val="18"/>
               </w:rPr>
@@ -787,6 +799,8 @@
             </w:r>
             <w:r>
               <w:rPr>
+                <w:b/>
+                <w:bCs/>
                 <w:sz w:val="18"/>
                 <w:szCs w:val="18"/>
               </w:rPr>
@@ -794,6 +808,8 @@
             </w:r>
             <w:r>
               <w:rPr>
+                <w:b/>
+                <w:bCs/>
                 <w:sz w:val="18"/>
                 <w:szCs w:val="18"/>
               </w:rPr>
@@ -801,6 +817,8 @@
             </w:r>
             <w:r>
               <w:rPr>
+                <w:b/>
+                <w:bCs/>
                 <w:noProof/>
                 <w:sz w:val="18"/>
                 <w:szCs w:val="18"/>
@@ -809,6 +827,8 @@
             </w:r>
             <w:r>
               <w:rPr>
+                <w:b/>
+                <w:bCs/>
                 <w:sz w:val="18"/>
                 <w:szCs w:val="18"/>
               </w:rPr>
@@ -2036,8 +2056,8 @@
                 <w:rFonts w:ascii="Calibri" w:hAnsi="Calibri" w:cs="Calibri"/>
                 <w:b/>
                 <w:bCs/>
-                <w:sz w:val="18"/>
-                <w:szCs w:val="18"/>
+                <w:sz w:val="22"/>
+                <w:szCs w:val="22"/>
               </w:rPr>
             </w:pPr>
             <w:r>
@@ -2045,8 +2065,8 @@
                 <w:rFonts w:ascii="Calibri" w:hAnsi="Calibri" w:cs="Calibri"/>
                 <w:b/>
                 <w:bCs/>
-                <w:sz w:val="18"/>
-                <w:szCs w:val="18"/>
+                <w:sz w:val="22"/>
+                <w:szCs w:val="22"/>
               </w:rPr>
               <w:fldChar w:fldCharType="begin"/>
             </w:r>
@@ -2055,8 +2075,8 @@
                 <w:rFonts w:ascii="Calibri" w:hAnsi="Calibri" w:cs="Calibri"/>
                 <w:b/>
                 <w:bCs/>
-                <w:sz w:val="18"/>
-                <w:szCs w:val="18"/>
+                <w:sz w:val="22"/>
+                <w:szCs w:val="22"/>
               </w:rPr>
               <w:instrText xml:space="preserve"> MERGEFIELD  tt  \* MERGEFORMAT </w:instrText>
             </w:r>
@@ -2065,8 +2085,8 @@
                 <w:rFonts w:ascii="Calibri" w:hAnsi="Calibri" w:cs="Calibri"/>
                 <w:b/>
                 <w:bCs/>
-                <w:sz w:val="18"/>
-                <w:szCs w:val="18"/>
+                <w:sz w:val="22"/>
+                <w:szCs w:val="22"/>
               </w:rPr>
               <w:fldChar w:fldCharType="separate"/>
             </w:r>
@@ -2076,8 +2096,8 @@
                 <w:b/>
                 <w:bCs/>
                 <w:noProof/>
-                <w:sz w:val="18"/>
-                <w:szCs w:val="18"/>
+                <w:sz w:val="22"/>
+                <w:szCs w:val="22"/>
               </w:rPr>
               <w:t>«tt»</w:t>
             </w:r>
@@ -2086,8 +2106,8 @@
                 <w:rFonts w:ascii="Calibri" w:hAnsi="Calibri" w:cs="Calibri"/>
                 <w:b/>
                 <w:bCs/>
-                <w:sz w:val="18"/>
-                <w:szCs w:val="18"/>
+                <w:sz w:val="22"/>
+                <w:szCs w:val="22"/>
               </w:rPr>
               <w:fldChar w:fldCharType="end"/>
             </w:r>
@@ -2110,8 +2130,8 @@
                 <w:rFonts w:ascii="Black Han Sans" w:eastAsia="Black Han Sans" w:hAnsi="Calibri" w:cs="Calibri"/>
                 <w:b/>
                 <w:bCs/>
-                <w:sz w:val="18"/>
-                <w:szCs w:val="18"/>
+                <w:sz w:val="22"/>
+                <w:szCs w:val="22"/>
               </w:rPr>
             </w:pPr>
             <w:r>
@@ -2119,8 +2139,8 @@
                 <w:rFonts w:ascii="Calibri" w:hAnsi="Calibri" w:cs="Calibri"/>
                 <w:b/>
                 <w:bCs/>
-                <w:sz w:val="18"/>
-                <w:szCs w:val="18"/>
+                <w:sz w:val="22"/>
+                <w:szCs w:val="22"/>
               </w:rPr>
               <w:fldChar w:fldCharType="begin"/>
             </w:r>
@@ -2129,8 +2149,8 @@
                 <w:rFonts w:ascii="Calibri" w:hAnsi="Calibri" w:cs="Calibri"/>
                 <w:b/>
                 <w:bCs/>
-                <w:sz w:val="18"/>
-                <w:szCs w:val="18"/>
+                <w:sz w:val="22"/>
+                <w:szCs w:val="22"/>
               </w:rPr>
               <w:instrText xml:space="preserve"> MERGEFIELD  t.bigbag  \* MERGEFORMAT </w:instrText>
             </w:r>
@@ -2139,8 +2159,8 @@
                 <w:rFonts w:ascii="Calibri" w:hAnsi="Calibri" w:cs="Calibri"/>
                 <w:b/>
                 <w:bCs/>
-                <w:sz w:val="18"/>
-                <w:szCs w:val="18"/>
+                <w:sz w:val="22"/>
+                <w:szCs w:val="22"/>
               </w:rPr>
               <w:fldChar w:fldCharType="separate"/>
             </w:r>
@@ -2150,8 +2170,8 @@
                 <w:b/>
                 <w:bCs/>
                 <w:noProof/>
-                <w:sz w:val="18"/>
-                <w:szCs w:val="18"/>
+                <w:sz w:val="22"/>
+                <w:szCs w:val="22"/>
               </w:rPr>
               <w:t>«t.bigbag»</w:t>
             </w:r>
@@ -2160,8 +2180,8 @@
                 <w:rFonts w:ascii="Calibri" w:hAnsi="Calibri" w:cs="Calibri"/>
                 <w:b/>
                 <w:bCs/>
-                <w:sz w:val="18"/>
-                <w:szCs w:val="18"/>
+                <w:sz w:val="22"/>
+                <w:szCs w:val="22"/>
               </w:rPr>
               <w:fldChar w:fldCharType="end"/>
             </w:r>
@@ -2184,8 +2204,8 @@
                 <w:rFonts w:ascii="Aptos Black" w:hAnsi="Aptos Black" w:cs="Calibri"/>
                 <w:b/>
                 <w:bCs/>
-                <w:sz w:val="18"/>
-                <w:szCs w:val="18"/>
+                <w:sz w:val="22"/>
+                <w:szCs w:val="22"/>
               </w:rPr>
             </w:pPr>
             <w:r>
@@ -2193,8 +2213,8 @@
                 <w:rFonts w:ascii="Calibri" w:hAnsi="Calibri" w:cs="Calibri"/>
                 <w:b/>
                 <w:bCs/>
-                <w:sz w:val="18"/>
-                <w:szCs w:val="18"/>
+                <w:sz w:val="22"/>
+                <w:szCs w:val="22"/>
               </w:rPr>
               <w:fldChar w:fldCharType="begin"/>
             </w:r>
@@ -2203,8 +2223,8 @@
                 <w:rFonts w:ascii="Calibri" w:hAnsi="Calibri" w:cs="Calibri"/>
                 <w:b/>
                 <w:bCs/>
-                <w:sz w:val="18"/>
-                <w:szCs w:val="18"/>
+                <w:sz w:val="22"/>
+                <w:szCs w:val="22"/>
               </w:rPr>
               <w:instrText xml:space="preserve"> MERGEFIELD  t.granel  \* MERGEFORMAT </w:instrText>
             </w:r>
@@ -2213,8 +2233,8 @@
                 <w:rFonts w:ascii="Calibri" w:hAnsi="Calibri" w:cs="Calibri"/>
                 <w:b/>
                 <w:bCs/>
-                <w:sz w:val="18"/>
-                <w:szCs w:val="18"/>
+                <w:sz w:val="22"/>
+                <w:szCs w:val="22"/>
               </w:rPr>
               <w:fldChar w:fldCharType="separate"/>
             </w:r>
@@ -2224,8 +2244,8 @@
                 <w:b/>
                 <w:bCs/>
                 <w:noProof/>
-                <w:sz w:val="18"/>
-                <w:szCs w:val="18"/>
+                <w:sz w:val="22"/>
+                <w:szCs w:val="22"/>
               </w:rPr>
               <w:t>«t.granel»</w:t>
             </w:r>
@@ -2234,8 +2254,8 @@
                 <w:rFonts w:ascii="Calibri" w:hAnsi="Calibri" w:cs="Calibri"/>
                 <w:b/>
                 <w:bCs/>
-                <w:sz w:val="18"/>
-                <w:szCs w:val="18"/>
+                <w:sz w:val="22"/>
+                <w:szCs w:val="22"/>
               </w:rPr>
               <w:fldChar w:fldCharType="end"/>
             </w:r>
@@ -2302,47 +2322,59 @@
                 <w:rFonts w:ascii="Aptos Black" w:hAnsi="Aptos Black" w:cs="Calibri"/>
                 <w:b/>
                 <w:bCs/>
+                <w:sz w:val="22"/>
+                <w:szCs w:val="22"/>
                 <w:u w:val="single"/>
               </w:rPr>
             </w:pPr>
             <w:r>
               <w:rPr>
                 <w:rFonts w:ascii="Calibri" w:hAnsi="Calibri" w:cs="Calibri"/>
-                <w:sz w:val="16"/>
-                <w:szCs w:val="16"/>
+                <w:b/>
+                <w:bCs/>
+                <w:sz w:val="22"/>
+                <w:szCs w:val="22"/>
               </w:rPr>
               <w:fldChar w:fldCharType="begin"/>
             </w:r>
             <w:r>
               <w:rPr>
                 <w:rFonts w:ascii="Calibri" w:hAnsi="Calibri" w:cs="Calibri"/>
-                <w:sz w:val="16"/>
-                <w:szCs w:val="16"/>
+                <w:b/>
+                <w:bCs/>
+                <w:sz w:val="22"/>
+                <w:szCs w:val="22"/>
               </w:rPr>
               <w:instrText xml:space="preserve"> MERGEFIELD  t.contramuestra  \* MERGEFORMAT </w:instrText>
             </w:r>
             <w:r>
               <w:rPr>
                 <w:rFonts w:ascii="Calibri" w:hAnsi="Calibri" w:cs="Calibri"/>
-                <w:sz w:val="16"/>
-                <w:szCs w:val="16"/>
+                <w:b/>
+                <w:bCs/>
+                <w:sz w:val="22"/>
+                <w:szCs w:val="22"/>
               </w:rPr>
               <w:fldChar w:fldCharType="separate"/>
             </w:r>
             <w:r>
               <w:rPr>
                 <w:rFonts w:ascii="Calibri" w:hAnsi="Calibri" w:cs="Calibri"/>
+                <w:b/>
+                <w:bCs/>
                 <w:noProof/>
-                <w:sz w:val="16"/>
-                <w:szCs w:val="16"/>
+                <w:sz w:val="22"/>
+                <w:szCs w:val="22"/>
               </w:rPr>
               <w:t>«t.contramuestra»</w:t>
             </w:r>
             <w:r>
               <w:rPr>
                 <w:rFonts w:ascii="Calibri" w:hAnsi="Calibri" w:cs="Calibri"/>
-                <w:sz w:val="16"/>
-                <w:szCs w:val="16"/>
+                <w:b/>
+                <w:bCs/>
+                <w:sz w:val="22"/>
+                <w:szCs w:val="22"/>
               </w:rPr>
               <w:fldChar w:fldCharType="end"/>
             </w:r>
@@ -3170,8 +3202,8 @@
                                       <w:b/>
                                       <w:caps/>
                                       <w:noProof/>
-                                      <w:sz w:val="18"/>
-                                      <w:szCs w:val="18"/>
+                                      <w:sz w:val="24"/>
+                                      <w:szCs w:val="24"/>
                                     </w:rPr>
                                   </w:pPr>
                                   <w:r>
@@ -3180,8 +3212,8 @@
                                       <w:b/>
                                       <w:caps/>
                                       <w:noProof/>
-                                      <w:sz w:val="18"/>
-                                      <w:szCs w:val="18"/>
+                                      <w:sz w:val="24"/>
+                                      <w:szCs w:val="24"/>
                                     </w:rPr>
                                     <w:t>SUB-TOTAL  – 2</w:t>
                                   </w:r>
@@ -3201,6 +3233,8 @@
                                       <w:bCs/>
                                       <w:caps/>
                                       <w:noProof/>
+                                      <w:sz w:val="22"/>
+                                      <w:szCs w:val="22"/>
                                     </w:rPr>
                                   </w:pPr>
                                   <w:r>
@@ -3208,6 +3242,8 @@
                                       <w:rFonts w:ascii="Calibri" w:hAnsi="Calibri" w:cs="Calibri"/>
                                       <w:b/>
                                       <w:bCs/>
+                                      <w:sz w:val="22"/>
+                                      <w:szCs w:val="22"/>
                                     </w:rPr>
                                     <w:fldChar w:fldCharType="begin"/>
                                   </w:r>
@@ -3216,6 +3252,8 @@
                                       <w:rFonts w:ascii="Calibri" w:hAnsi="Calibri" w:cs="Calibri"/>
                                       <w:b/>
                                       <w:bCs/>
+                                      <w:sz w:val="22"/>
+                                      <w:szCs w:val="22"/>
                                     </w:rPr>
                                     <w:instrText xml:space="preserve"> MERGEFIELD  total_neto_placa2  \* MERGEFORMAT </w:instrText>
                                   </w:r>
@@ -3224,6 +3262,8 @@
                                       <w:rFonts w:ascii="Calibri" w:hAnsi="Calibri" w:cs="Calibri"/>
                                       <w:b/>
                                       <w:bCs/>
+                                      <w:sz w:val="22"/>
+                                      <w:szCs w:val="22"/>
                                     </w:rPr>
                                     <w:fldChar w:fldCharType="separate"/>
                                   </w:r>
@@ -3233,6 +3273,8 @@
                                       <w:b/>
                                       <w:bCs/>
                                       <w:noProof/>
+                                      <w:sz w:val="22"/>
+                                      <w:szCs w:val="22"/>
                                     </w:rPr>
                                     <w:t>«total_neto_placa2»</w:t>
                                   </w:r>
@@ -3241,6 +3283,8 @@
                                       <w:rFonts w:ascii="Calibri" w:hAnsi="Calibri" w:cs="Calibri"/>
                                       <w:b/>
                                       <w:bCs/>
+                                      <w:sz w:val="22"/>
+                                      <w:szCs w:val="22"/>
                                     </w:rPr>
                                     <w:fldChar w:fldCharType="end"/>
                                   </w:r>
@@ -3871,8 +3915,8 @@
                                 <w:b/>
                                 <w:caps/>
                                 <w:noProof/>
-                                <w:sz w:val="18"/>
-                                <w:szCs w:val="18"/>
+                                <w:sz w:val="24"/>
+                                <w:szCs w:val="24"/>
                               </w:rPr>
                             </w:pPr>
                             <w:r>
@@ -3881,8 +3925,8 @@
                                 <w:b/>
                                 <w:caps/>
                                 <w:noProof/>
-                                <w:sz w:val="18"/>
-                                <w:szCs w:val="18"/>
+                                <w:sz w:val="24"/>
+                                <w:szCs w:val="24"/>
                               </w:rPr>
                               <w:t>SUB-TOTAL  – 2</w:t>
                             </w:r>
@@ -3902,6 +3946,8 @@
                                 <w:bCs/>
                                 <w:caps/>
                                 <w:noProof/>
+                                <w:sz w:val="22"/>
+                                <w:szCs w:val="22"/>
                               </w:rPr>
                             </w:pPr>
                             <w:r>
@@ -3909,6 +3955,8 @@
                                 <w:rFonts w:ascii="Calibri" w:hAnsi="Calibri" w:cs="Calibri"/>
                                 <w:b/>
                                 <w:bCs/>
+                                <w:sz w:val="22"/>
+                                <w:szCs w:val="22"/>
                               </w:rPr>
                               <w:fldChar w:fldCharType="begin"/>
                             </w:r>
@@ -3917,6 +3965,8 @@
                                 <w:rFonts w:ascii="Calibri" w:hAnsi="Calibri" w:cs="Calibri"/>
                                 <w:b/>
                                 <w:bCs/>
+                                <w:sz w:val="22"/>
+                                <w:szCs w:val="22"/>
                               </w:rPr>
                               <w:instrText xml:space="preserve"> MERGEFIELD  total_neto_placa2  \* MERGEFORMAT </w:instrText>
                             </w:r>
@@ -3925,6 +3975,8 @@
                                 <w:rFonts w:ascii="Calibri" w:hAnsi="Calibri" w:cs="Calibri"/>
                                 <w:b/>
                                 <w:bCs/>
+                                <w:sz w:val="22"/>
+                                <w:szCs w:val="22"/>
                               </w:rPr>
                               <w:fldChar w:fldCharType="separate"/>
                             </w:r>
@@ -3934,6 +3986,8 @@
                                 <w:b/>
                                 <w:bCs/>
                                 <w:noProof/>
+                                <w:sz w:val="22"/>
+                                <w:szCs w:val="22"/>
                               </w:rPr>
                               <w:t>«total_neto_placa2»</w:t>
                             </w:r>
@@ -3942,6 +3996,8 @@
                                 <w:rFonts w:ascii="Calibri" w:hAnsi="Calibri" w:cs="Calibri"/>
                                 <w:b/>
                                 <w:bCs/>
+                                <w:sz w:val="22"/>
+                                <w:szCs w:val="22"/>
                               </w:rPr>
                               <w:fldChar w:fldCharType="end"/>
                             </w:r>
@@ -4660,8 +4716,8 @@
                                       <w:b/>
                                       <w:caps/>
                                       <w:noProof/>
-                                      <w:sz w:val="18"/>
-                                      <w:szCs w:val="18"/>
+                                      <w:sz w:val="22"/>
+                                      <w:szCs w:val="22"/>
                                     </w:rPr>
                                   </w:pPr>
                                   <w:r>
@@ -4670,8 +4726,8 @@
                                       <w:b/>
                                       <w:caps/>
                                       <w:noProof/>
-                                      <w:sz w:val="18"/>
-                                      <w:szCs w:val="18"/>
+                                      <w:sz w:val="22"/>
+                                      <w:szCs w:val="22"/>
                                     </w:rPr>
                                     <w:t>SUB-TOTAL  – 1</w:t>
                                   </w:r>
@@ -4691,6 +4747,8 @@
                                       <w:bCs/>
                                       <w:caps/>
                                       <w:noProof/>
+                                      <w:sz w:val="22"/>
+                                      <w:szCs w:val="22"/>
                                     </w:rPr>
                                   </w:pPr>
                                   <w:r>
@@ -4698,6 +4756,8 @@
                                       <w:rFonts w:ascii="Calibri" w:hAnsi="Calibri" w:cs="Calibri"/>
                                       <w:b/>
                                       <w:bCs/>
+                                      <w:sz w:val="22"/>
+                                      <w:szCs w:val="22"/>
                                     </w:rPr>
                                     <w:fldChar w:fldCharType="begin"/>
                                   </w:r>
@@ -4706,6 +4766,8 @@
                                       <w:rFonts w:ascii="Calibri" w:hAnsi="Calibri" w:cs="Calibri"/>
                                       <w:b/>
                                       <w:bCs/>
+                                      <w:sz w:val="22"/>
+                                      <w:szCs w:val="22"/>
                                     </w:rPr>
                                     <w:instrText xml:space="preserve"> MERGEFIELD  total_neto_placa1  \* MERGEFORMAT </w:instrText>
                                   </w:r>
@@ -4714,6 +4776,8 @@
                                       <w:rFonts w:ascii="Calibri" w:hAnsi="Calibri" w:cs="Calibri"/>
                                       <w:b/>
                                       <w:bCs/>
+                                      <w:sz w:val="22"/>
+                                      <w:szCs w:val="22"/>
                                     </w:rPr>
                                     <w:fldChar w:fldCharType="separate"/>
                                   </w:r>
@@ -4723,6 +4787,8 @@
                                       <w:b/>
                                       <w:bCs/>
                                       <w:noProof/>
+                                      <w:sz w:val="22"/>
+                                      <w:szCs w:val="22"/>
                                     </w:rPr>
                                     <w:t>«total_neto_placa1»</w:t>
                                   </w:r>
@@ -4731,6 +4797,8 @@
                                       <w:rFonts w:ascii="Calibri" w:hAnsi="Calibri" w:cs="Calibri"/>
                                       <w:b/>
                                       <w:bCs/>
+                                      <w:sz w:val="22"/>
+                                      <w:szCs w:val="22"/>
                                     </w:rPr>
                                     <w:fldChar w:fldCharType="end"/>
                                   </w:r>
@@ -5361,8 +5429,8 @@
                                 <w:b/>
                                 <w:caps/>
                                 <w:noProof/>
-                                <w:sz w:val="18"/>
-                                <w:szCs w:val="18"/>
+                                <w:sz w:val="22"/>
+                                <w:szCs w:val="22"/>
                               </w:rPr>
                             </w:pPr>
                             <w:r>
@@ -5371,8 +5439,8 @@
                                 <w:b/>
                                 <w:caps/>
                                 <w:noProof/>
-                                <w:sz w:val="18"/>
-                                <w:szCs w:val="18"/>
+                                <w:sz w:val="22"/>
+                                <w:szCs w:val="22"/>
                               </w:rPr>
                               <w:t>SUB-TOTAL  – 1</w:t>
                             </w:r>
@@ -5392,6 +5460,8 @@
                                 <w:bCs/>
                                 <w:caps/>
                                 <w:noProof/>
+                                <w:sz w:val="22"/>
+                                <w:szCs w:val="22"/>
                               </w:rPr>
                             </w:pPr>
                             <w:r>
@@ -5399,6 +5469,8 @@
                                 <w:rFonts w:ascii="Calibri" w:hAnsi="Calibri" w:cs="Calibri"/>
                                 <w:b/>
                                 <w:bCs/>
+                                <w:sz w:val="22"/>
+                                <w:szCs w:val="22"/>
                               </w:rPr>
                               <w:fldChar w:fldCharType="begin"/>
                             </w:r>
@@ -5407,6 +5479,8 @@
                                 <w:rFonts w:ascii="Calibri" w:hAnsi="Calibri" w:cs="Calibri"/>
                                 <w:b/>
                                 <w:bCs/>
+                                <w:sz w:val="22"/>
+                                <w:szCs w:val="22"/>
                               </w:rPr>
                               <w:instrText xml:space="preserve"> MERGEFIELD  total_neto_placa1  \* MERGEFORMAT </w:instrText>
                             </w:r>
@@ -5415,6 +5489,8 @@
                                 <w:rFonts w:ascii="Calibri" w:hAnsi="Calibri" w:cs="Calibri"/>
                                 <w:b/>
                                 <w:bCs/>
+                                <w:sz w:val="22"/>
+                                <w:szCs w:val="22"/>
                               </w:rPr>
                               <w:fldChar w:fldCharType="separate"/>
                             </w:r>
@@ -5424,6 +5500,8 @@
                                 <w:b/>
                                 <w:bCs/>
                                 <w:noProof/>
+                                <w:sz w:val="22"/>
+                                <w:szCs w:val="22"/>
                               </w:rPr>
                               <w:t>«total_neto_placa1»</w:t>
                             </w:r>
@@ -5432,6 +5510,8 @@
                                 <w:rFonts w:ascii="Calibri" w:hAnsi="Calibri" w:cs="Calibri"/>
                                 <w:b/>
                                 <w:bCs/>
+                                <w:sz w:val="22"/>
+                                <w:szCs w:val="22"/>
                               </w:rPr>
                               <w:fldChar w:fldCharType="end"/>
                             </w:r>
@@ -6036,10 +6116,10 @@
       </w:tblPr>
       <w:tblGrid>
         <w:gridCol w:w="1891"/>
-        <w:gridCol w:w="1772"/>
+        <w:gridCol w:w="1927"/>
         <w:gridCol w:w="1019"/>
         <w:gridCol w:w="1564"/>
-        <w:gridCol w:w="1257"/>
+        <w:gridCol w:w="1361"/>
         <w:gridCol w:w="1276"/>
       </w:tblGrid>
       <w:tr>
@@ -6058,8 +6138,6 @@
                 <w:b/>
                 <w:caps/>
                 <w:noProof/>
-                <w:sz w:val="18"/>
-                <w:szCs w:val="18"/>
               </w:rPr>
             </w:pPr>
             <w:r>
@@ -6068,8 +6146,6 @@
                 <w:b/>
                 <w:caps/>
                 <w:noProof/>
-                <w:sz w:val="18"/>
-                <w:szCs w:val="18"/>
               </w:rPr>
               <w:t>total entregado</w:t>
             </w:r>
@@ -6093,6 +6169,8 @@
                 <w:b/>
                 <w:caps/>
                 <w:noProof/>
+                <w:sz w:val="22"/>
+                <w:szCs w:val="22"/>
               </w:rPr>
             </w:pPr>
             <w:r>
@@ -6100,6 +6178,8 @@
                 <w:rFonts w:ascii="Calibri" w:hAnsi="Calibri" w:cs="Calibri"/>
                 <w:b/>
                 <w:bCs/>
+                <w:sz w:val="22"/>
+                <w:szCs w:val="22"/>
               </w:rPr>
               <w:fldChar w:fldCharType="begin"/>
             </w:r>
@@ -6108,6 +6188,8 @@
                 <w:rFonts w:ascii="Calibri" w:hAnsi="Calibri" w:cs="Calibri"/>
                 <w:b/>
                 <w:bCs/>
+                <w:sz w:val="22"/>
+                <w:szCs w:val="22"/>
               </w:rPr>
               <w:instrText xml:space="preserve"> MERGEFIELD  total_entregado  \* MERGEFORMAT </w:instrText>
             </w:r>
@@ -6116,6 +6198,8 @@
                 <w:rFonts w:ascii="Calibri" w:hAnsi="Calibri" w:cs="Calibri"/>
                 <w:b/>
                 <w:bCs/>
+                <w:sz w:val="22"/>
+                <w:szCs w:val="22"/>
               </w:rPr>
               <w:fldChar w:fldCharType="separate"/>
             </w:r>
@@ -6125,6 +6209,8 @@
                 <w:b/>
                 <w:bCs/>
                 <w:noProof/>
+                <w:sz w:val="22"/>
+                <w:szCs w:val="22"/>
               </w:rPr>
               <w:t>«total_entregado»</w:t>
             </w:r>
@@ -6133,6 +6219,8 @@
                 <w:rFonts w:ascii="Calibri" w:hAnsi="Calibri" w:cs="Calibri"/>
                 <w:b/>
                 <w:bCs/>
+                <w:sz w:val="22"/>
+                <w:szCs w:val="22"/>
               </w:rPr>
               <w:fldChar w:fldCharType="end"/>
             </w:r>
@@ -6153,6 +6241,8 @@
                 <w:b/>
                 <w:caps/>
                 <w:noProof/>
+                <w:sz w:val="22"/>
+                <w:szCs w:val="22"/>
               </w:rPr>
             </w:pPr>
             <w:r>
@@ -6161,6 +6251,8 @@
                 <w:b/>
                 <w:caps/>
                 <w:noProof/>
+                <w:sz w:val="22"/>
+                <w:szCs w:val="22"/>
               </w:rPr>
               <w:t>TMH</w:t>
             </w:r>
@@ -6186,8 +6278,6 @@
                 <w:b/>
                 <w:caps/>
                 <w:noProof/>
-                <w:sz w:val="18"/>
-                <w:szCs w:val="18"/>
               </w:rPr>
               <w:t>DIFERENCIA</w:t>
             </w:r>
@@ -6205,6 +6295,8 @@
                 <w:b/>
                 <w:caps/>
                 <w:noProof/>
+                <w:sz w:val="22"/>
+                <w:szCs w:val="22"/>
               </w:rPr>
             </w:pPr>
             <w:r>
@@ -6212,6 +6304,8 @@
                 <w:rFonts w:ascii="Calibri" w:hAnsi="Calibri" w:cs="Calibri"/>
                 <w:b/>
                 <w:bCs/>
+                <w:sz w:val="22"/>
+                <w:szCs w:val="22"/>
               </w:rPr>
               <w:fldChar w:fldCharType="begin"/>
             </w:r>
@@ -6220,6 +6314,8 @@
                 <w:rFonts w:ascii="Calibri" w:hAnsi="Calibri" w:cs="Calibri"/>
                 <w:b/>
                 <w:bCs/>
+                <w:sz w:val="22"/>
+                <w:szCs w:val="22"/>
               </w:rPr>
               <w:instrText xml:space="preserve"> MERGEFIELD  diferencia  \* MERGEFORMAT </w:instrText>
             </w:r>
@@ -6228,6 +6324,8 @@
                 <w:rFonts w:ascii="Calibri" w:hAnsi="Calibri" w:cs="Calibri"/>
                 <w:b/>
                 <w:bCs/>
+                <w:sz w:val="22"/>
+                <w:szCs w:val="22"/>
               </w:rPr>
               <w:fldChar w:fldCharType="separate"/>
             </w:r>
@@ -6237,6 +6335,8 @@
                 <w:b/>
                 <w:bCs/>
                 <w:noProof/>
+                <w:sz w:val="22"/>
+                <w:szCs w:val="22"/>
               </w:rPr>
               <w:t>«diferencia»</w:t>
             </w:r>
@@ -6245,6 +6345,8 @@
                 <w:rFonts w:ascii="Calibri" w:hAnsi="Calibri" w:cs="Calibri"/>
                 <w:b/>
                 <w:bCs/>
+                <w:sz w:val="22"/>
+                <w:szCs w:val="22"/>
               </w:rPr>
               <w:fldChar w:fldCharType="end"/>
             </w:r>

</xml_diff>

<commit_message>
feat: actualizar plantilla de acta de entrega
</commit_message>
<xml_diff>
--- a/pesaje/analytica/Report/PrintActaEntrega.docx
+++ b/pesaje/analytica/Report/PrintActaEntrega.docx
@@ -2564,20 +2564,6 @@
           <w:szCs w:val="2"/>
         </w:rPr>
       </w:pPr>
-    </w:p>
-    <w:p>
-      <w:pPr>
-        <w:spacing w:before="0" w:after="0"/>
-        <w:ind w:firstLine="142"/>
-        <w:rPr>
-          <w:rFonts w:ascii="Calibri" w:hAnsi="Calibri" w:cs="Calibri"/>
-          <w:b/>
-          <w:caps/>
-          <w:noProof/>
-          <w:sz w:val="2"/>
-          <w:szCs w:val="2"/>
-        </w:rPr>
-      </w:pPr>
       <w:r>
         <w:rPr>
           <w:rFonts w:ascii="Calibri" w:hAnsi="Calibri" w:cs="Calibri"/>
@@ -2589,18 +2575,18 @@
         <mc:AlternateContent>
           <mc:Choice Requires="wps">
             <w:drawing>
-              <wp:anchor distT="0" distB="0" distL="114300" distR="114300" simplePos="0" relativeHeight="251662336" behindDoc="0" locked="0" layoutInCell="1" allowOverlap="1" wp14:anchorId="2CDD55FC" wp14:editId="783AB342">
+              <wp:anchor distT="0" distB="0" distL="114300" distR="114300" simplePos="0" relativeHeight="251683840" behindDoc="0" locked="0" layoutInCell="1" allowOverlap="1" wp14:anchorId="5990CF46" wp14:editId="599786B0">
                 <wp:simplePos x="0" y="0"/>
                 <wp:positionH relativeFrom="column">
-                  <wp:posOffset>4258310</wp:posOffset>
+                  <wp:posOffset>92710</wp:posOffset>
                 </wp:positionH>
                 <wp:positionV relativeFrom="paragraph">
-                  <wp:posOffset>6985</wp:posOffset>
+                  <wp:posOffset>1905</wp:posOffset>
                 </wp:positionV>
-                <wp:extent cx="2934970" cy="1109980"/>
+                <wp:extent cx="3905250" cy="1016000"/>
                 <wp:effectExtent l="0" t="0" r="0" b="0"/>
-                <wp:wrapSquare wrapText="bothSides"/>
-                <wp:docPr id="1992824391" name="Rectángulo 2"/>
+                <wp:wrapTopAndBottom/>
+                <wp:docPr id="821845427" name="Rectángulo 2"/>
                 <wp:cNvGraphicFramePr/>
                 <a:graphic xmlns:a="http://schemas.openxmlformats.org/drawingml/2006/main">
                   <a:graphicData uri="http://schemas.microsoft.com/office/word/2010/wordprocessingShape">
@@ -2609,7 +2595,7 @@
                       <wps:spPr>
                         <a:xfrm>
                           <a:off x="0" y="0"/>
-                          <a:ext cx="2934970" cy="1109980"/>
+                          <a:ext cx="3905250" cy="1016000"/>
                         </a:xfrm>
                         <a:prstGeom prst="rect">
                           <a:avLst/>
@@ -2638,19 +2624,26 @@
                           <w:tbl>
                             <w:tblPr>
                               <w:tblStyle w:val="Tablaconcuadrcula"/>
-                              <w:tblW w:w="0" w:type="auto"/>
+                              <w:tblW w:w="6374" w:type="dxa"/>
+                              <w:tblLayout w:type="fixed"/>
                               <w:tblLook w:val="04A0" w:firstRow="1" w:lastRow="0" w:firstColumn="1" w:lastColumn="0" w:noHBand="0" w:noVBand="1"/>
                             </w:tblPr>
                             <w:tblGrid>
-                              <w:gridCol w:w="987"/>
-                              <w:gridCol w:w="1095"/>
-                              <w:gridCol w:w="1164"/>
-                              <w:gridCol w:w="1093"/>
+                              <w:gridCol w:w="942"/>
+                              <w:gridCol w:w="1321"/>
+                              <w:gridCol w:w="1231"/>
+                              <w:gridCol w:w="1321"/>
+                              <w:gridCol w:w="387"/>
+                              <w:gridCol w:w="1172"/>
                             </w:tblGrid>
                             <w:tr>
+                              <w:trPr>
+                                <w:gridAfter w:val="2"/>
+                                <w:wAfter w:w="1559" w:type="dxa"/>
+                              </w:trPr>
                               <w:tc>
                                 <w:tcPr>
-                                  <w:tcW w:w="4294" w:type="dxa"/>
+                                  <w:tcW w:w="4815" w:type="dxa"/>
                                   <w:gridSpan w:val="4"/>
                                   <w:tcBorders>
                                     <w:right w:val="single" w:sz="4" w:space="0" w:color="auto"/>
@@ -2686,7 +2679,7 @@
                                       <w:sz w:val="18"/>
                                       <w:szCs w:val="18"/>
                                     </w:rPr>
-                                    <w:instrText xml:space="preserve"> MERGEFIELD  placa2  \* MERGEFORMAT </w:instrText>
+                                    <w:instrText xml:space="preserve"> MERGEFIELD  placa1  \* MERGEFORMAT </w:instrText>
                                   </w:r>
                                   <w:r>
                                     <w:rPr>
@@ -2705,7 +2698,7 @@
                                       <w:sz w:val="18"/>
                                       <w:szCs w:val="18"/>
                                     </w:rPr>
-                                    <w:t>«placa2»</w:t>
+                                    <w:t>«placa1»</w:t>
                                   </w:r>
                                   <w:r>
                                     <w:rPr>
@@ -2720,9 +2713,16 @@
                               </w:tc>
                             </w:tr>
                             <w:tr>
+                              <w:trPr>
+                                <w:gridAfter w:val="2"/>
+                                <w:wAfter w:w="1559" w:type="dxa"/>
+                              </w:trPr>
                               <w:tc>
                                 <w:tcPr>
-                                  <w:tcW w:w="988" w:type="dxa"/>
+                                  <w:tcW w:w="942" w:type="dxa"/>
+                                  <w:tcBorders>
+                                    <w:bottom w:val="single" w:sz="4" w:space="0" w:color="auto"/>
+                                  </w:tcBorders>
                                 </w:tcPr>
                                 <w:p>
                                   <w:pPr>
@@ -2752,7 +2752,10 @@
                               </w:tc>
                               <w:tc>
                                 <w:tcPr>
-                                  <w:tcW w:w="1097" w:type="dxa"/>
+                                  <w:tcW w:w="1321" w:type="dxa"/>
+                                  <w:tcBorders>
+                                    <w:bottom w:val="single" w:sz="4" w:space="0" w:color="auto"/>
+                                  </w:tcBorders>
                                 </w:tcPr>
                                 <w:p>
                                   <w:pPr>
@@ -2782,7 +2785,10 @@
                               </w:tc>
                               <w:tc>
                                 <w:tcPr>
-                                  <w:tcW w:w="1171" w:type="dxa"/>
+                                  <w:tcW w:w="1231" w:type="dxa"/>
+                                  <w:tcBorders>
+                                    <w:bottom w:val="single" w:sz="4" w:space="0" w:color="auto"/>
+                                  </w:tcBorders>
                                 </w:tcPr>
                                 <w:p>
                                   <w:pPr>
@@ -2812,8 +2818,9 @@
                               </w:tc>
                               <w:tc>
                                 <w:tcPr>
-                                  <w:tcW w:w="1038" w:type="dxa"/>
+                                  <w:tcW w:w="1321" w:type="dxa"/>
                                   <w:tcBorders>
+                                    <w:bottom w:val="single" w:sz="4" w:space="0" w:color="auto"/>
                                     <w:right w:val="single" w:sz="4" w:space="0" w:color="auto"/>
                                   </w:tcBorders>
                                 </w:tcPr>
@@ -2845,9 +2852,16 @@
                               </w:tc>
                             </w:tr>
                             <w:tr>
+                              <w:trPr>
+                                <w:gridAfter w:val="2"/>
+                                <w:wAfter w:w="1559" w:type="dxa"/>
+                              </w:trPr>
                               <w:tc>
                                 <w:tcPr>
-                                  <w:tcW w:w="988" w:type="dxa"/>
+                                  <w:tcW w:w="942" w:type="dxa"/>
+                                  <w:tcBorders>
+                                    <w:bottom w:val="single" w:sz="4" w:space="0" w:color="auto"/>
+                                  </w:tcBorders>
                                 </w:tcPr>
                                 <w:p>
                                   <w:pPr>
@@ -2882,7 +2896,7 @@
                                       <w:sz w:val="2"/>
                                       <w:szCs w:val="2"/>
                                     </w:rPr>
-                                    <w:instrText xml:space="preserve"> MERGEFIELD  TableStart:placas2 \* Lower  \* MERGEFORMAT </w:instrText>
+                                    <w:instrText xml:space="preserve"> MERGEFIELD  TableStart:placas1 \* Lower  \* MERGEFORMAT </w:instrText>
                                   </w:r>
                                   <w:r>
                                     <w:rPr>
@@ -2903,7 +2917,7 @@
                                       <w:sz w:val="2"/>
                                       <w:szCs w:val="2"/>
                                     </w:rPr>
-                                    <w:t>«tablestart:placas2»</w:t>
+                                    <w:t>«tablestart:placas1»</w:t>
                                   </w:r>
                                   <w:r>
                                     <w:rPr>
@@ -2966,7 +2980,10 @@
                               </w:tc>
                               <w:tc>
                                 <w:tcPr>
-                                  <w:tcW w:w="1097" w:type="dxa"/>
+                                  <w:tcW w:w="1321" w:type="dxa"/>
+                                  <w:tcBorders>
+                                    <w:bottom w:val="single" w:sz="4" w:space="0" w:color="auto"/>
+                                  </w:tcBorders>
                                 </w:tcPr>
                                 <w:p>
                                   <w:pPr>
@@ -3031,7 +3048,10 @@
                               </w:tc>
                               <w:tc>
                                 <w:tcPr>
-                                  <w:tcW w:w="1171" w:type="dxa"/>
+                                  <w:tcW w:w="1231" w:type="dxa"/>
+                                  <w:tcBorders>
+                                    <w:bottom w:val="single" w:sz="4" w:space="0" w:color="auto"/>
+                                  </w:tcBorders>
                                 </w:tcPr>
                                 <w:p>
                                   <w:pPr>
@@ -3096,8 +3116,9 @@
                               </w:tc>
                               <w:tc>
                                 <w:tcPr>
-                                  <w:tcW w:w="1038" w:type="dxa"/>
+                                  <w:tcW w:w="1321" w:type="dxa"/>
                                   <w:tcBorders>
+                                    <w:bottom w:val="single" w:sz="4" w:space="0" w:color="auto"/>
                                     <w:right w:val="single" w:sz="4" w:space="0" w:color="auto"/>
                                   </w:tcBorders>
                                 </w:tcPr>
@@ -3180,7 +3201,7 @@
                                       <w:sz w:val="2"/>
                                       <w:szCs w:val="2"/>
                                     </w:rPr>
-                                    <w:instrText xml:space="preserve"> MERGEFIELD  TableEnd:placas2 \* Lower  \* MERGEFORMAT </w:instrText>
+                                    <w:instrText xml:space="preserve"> MERGEFIELD  TableEnd:placas1 \* Lower  \* MERGEFORMAT </w:instrText>
                                   </w:r>
                                   <w:r>
                                     <w:rPr>
@@ -3201,7 +3222,7 @@
                                       <w:sz w:val="2"/>
                                       <w:szCs w:val="2"/>
                                     </w:rPr>
-                                    <w:t>«tableend:placas2»</w:t>
+                                    <w:t>«tableend:placas1»</w:t>
                                   </w:r>
                                   <w:r>
                                     <w:rPr>
@@ -3217,69 +3238,148 @@
                                 </w:p>
                               </w:tc>
                             </w:tr>
-                          </w:tbl>
-                          <w:p>
-                            <w:pPr>
-                              <w:spacing w:before="0" w:after="0"/>
-                              <w:rPr>
-                                <w:rFonts w:ascii="Calibri" w:hAnsi="Calibri" w:cs="Calibri"/>
-                                <w:b/>
-                                <w:caps/>
-                                <w:noProof/>
-                                <w:sz w:val="2"/>
-                                <w:szCs w:val="2"/>
-                              </w:rPr>
-                            </w:pPr>
-                          </w:p>
-                          <w:tbl>
-                            <w:tblPr>
-                              <w:tblStyle w:val="Tablaconcuadrcula"/>
-                              <w:tblW w:w="0" w:type="auto"/>
-                              <w:tblBorders>
-                                <w:top w:val="none" w:sz="0" w:space="0" w:color="auto"/>
-                                <w:left w:val="none" w:sz="0" w:space="0" w:color="auto"/>
-                                <w:bottom w:val="none" w:sz="0" w:space="0" w:color="auto"/>
-                                <w:right w:val="none" w:sz="0" w:space="0" w:color="auto"/>
-                                <w:insideH w:val="none" w:sz="0" w:space="0" w:color="auto"/>
-                                <w:insideV w:val="none" w:sz="0" w:space="0" w:color="auto"/>
-                              </w:tblBorders>
-                              <w:tblLook w:val="04A0" w:firstRow="1" w:lastRow="0" w:firstColumn="1" w:lastColumn="0" w:noHBand="0" w:noVBand="1"/>
-                            </w:tblPr>
-                            <w:tblGrid>
-                              <w:gridCol w:w="2081"/>
-                              <w:gridCol w:w="2213"/>
-                            </w:tblGrid>
+                            <w:tr>
+                              <w:trPr>
+                                <w:trHeight w:val="79"/>
+                              </w:trPr>
+                              <w:tc>
+                                <w:tcPr>
+                                  <w:tcW w:w="942" w:type="dxa"/>
+                                  <w:tcBorders>
+                                    <w:top w:val="single" w:sz="4" w:space="0" w:color="auto"/>
+                                    <w:left w:val="nil"/>
+                                    <w:bottom w:val="single" w:sz="4" w:space="0" w:color="auto"/>
+                                    <w:right w:val="nil"/>
+                                  </w:tcBorders>
+                                </w:tcPr>
+                                <w:p>
+                                  <w:pPr>
+                                    <w:rPr>
+                                      <w:sz w:val="4"/>
+                                      <w:szCs w:val="4"/>
+                                    </w:rPr>
+                                  </w:pPr>
+                                </w:p>
+                              </w:tc>
+                              <w:tc>
+                                <w:tcPr>
+                                  <w:tcW w:w="1321" w:type="dxa"/>
+                                  <w:tcBorders>
+                                    <w:top w:val="single" w:sz="4" w:space="0" w:color="auto"/>
+                                    <w:left w:val="nil"/>
+                                    <w:bottom w:val="single" w:sz="4" w:space="0" w:color="auto"/>
+                                    <w:right w:val="nil"/>
+                                  </w:tcBorders>
+                                </w:tcPr>
+                                <w:p>
+                                  <w:pPr>
+                                    <w:rPr>
+                                      <w:sz w:val="4"/>
+                                      <w:szCs w:val="4"/>
+                                    </w:rPr>
+                                  </w:pPr>
+                                </w:p>
+                              </w:tc>
+                              <w:tc>
+                                <w:tcPr>
+                                  <w:tcW w:w="1231" w:type="dxa"/>
+                                  <w:tcBorders>
+                                    <w:top w:val="single" w:sz="4" w:space="0" w:color="auto"/>
+                                    <w:left w:val="nil"/>
+                                    <w:bottom w:val="nil"/>
+                                    <w:right w:val="nil"/>
+                                  </w:tcBorders>
+                                </w:tcPr>
+                                <w:p>
+                                  <w:pPr>
+                                    <w:rPr>
+                                      <w:sz w:val="4"/>
+                                      <w:szCs w:val="4"/>
+                                    </w:rPr>
+                                  </w:pPr>
+                                </w:p>
+                              </w:tc>
+                              <w:tc>
+                                <w:tcPr>
+                                  <w:tcW w:w="1321" w:type="dxa"/>
+                                  <w:tcBorders>
+                                    <w:top w:val="single" w:sz="4" w:space="0" w:color="auto"/>
+                                    <w:left w:val="nil"/>
+                                    <w:bottom w:val="nil"/>
+                                    <w:right w:val="nil"/>
+                                  </w:tcBorders>
+                                </w:tcPr>
+                                <w:p>
+                                  <w:pPr>
+                                    <w:rPr>
+                                      <w:sz w:val="4"/>
+                                      <w:szCs w:val="4"/>
+                                    </w:rPr>
+                                  </w:pPr>
+                                </w:p>
+                              </w:tc>
+                              <w:tc>
+                                <w:tcPr>
+                                  <w:tcW w:w="387" w:type="dxa"/>
+                                  <w:tcBorders>
+                                    <w:top w:val="nil"/>
+                                    <w:left w:val="nil"/>
+                                    <w:bottom w:val="nil"/>
+                                    <w:right w:val="nil"/>
+                                  </w:tcBorders>
+                                </w:tcPr>
+                                <w:p>
+                                  <w:pPr>
+                                    <w:rPr>
+                                      <w:sz w:val="4"/>
+                                      <w:szCs w:val="4"/>
+                                    </w:rPr>
+                                  </w:pPr>
+                                </w:p>
+                              </w:tc>
+                              <w:tc>
+                                <w:tcPr>
+                                  <w:tcW w:w="1172" w:type="dxa"/>
+                                  <w:tcBorders>
+                                    <w:top w:val="nil"/>
+                                    <w:left w:val="nil"/>
+                                    <w:bottom w:val="nil"/>
+                                    <w:right w:val="nil"/>
+                                  </w:tcBorders>
+                                </w:tcPr>
+                                <w:p>
+                                  <w:pPr>
+                                    <w:rPr>
+                                      <w:sz w:val="4"/>
+                                      <w:szCs w:val="4"/>
+                                    </w:rPr>
+                                  </w:pPr>
+                                </w:p>
+                              </w:tc>
+                            </w:tr>
                             <w:tr>
                               <w:tc>
                                 <w:tcPr>
-                                  <w:tcW w:w="2081" w:type="dxa"/>
+                                  <w:tcW w:w="2263" w:type="dxa"/>
+                                  <w:gridSpan w:val="2"/>
                                   <w:tcBorders>
                                     <w:top w:val="single" w:sz="4" w:space="0" w:color="auto"/>
+                                    <w:left w:val="nil"/>
+                                    <w:bottom w:val="nil"/>
+                                    <w:right w:val="nil"/>
                                   </w:tcBorders>
                                 </w:tcPr>
                                 <w:p>
                                   <w:pPr>
                                     <w:spacing w:before="0" w:after="0"/>
+                                    <w:jc w:val="center"/>
                                     <w:rPr>
                                       <w:rFonts w:ascii="Calibri" w:hAnsi="Calibri" w:cs="Calibri"/>
                                       <w:b/>
-                                      <w:caps/>
-                                      <w:noProof/>
-                                      <w:sz w:val="24"/>
-                                      <w:szCs w:val="24"/>
+                                      <w:sz w:val="18"/>
+                                      <w:szCs w:val="18"/>
                                     </w:rPr>
                                   </w:pPr>
-                                  <w:r>
-                                    <w:rPr>
-                                      <w:rFonts w:ascii="Calibri" w:hAnsi="Calibri" w:cs="Calibri"/>
-                                      <w:b/>
-                                      <w:caps/>
-                                      <w:noProof/>
-                                      <w:sz w:val="24"/>
-                                      <w:szCs w:val="24"/>
-                                    </w:rPr>
-                                    <w:t>SUB-</w:t>
-                                  </w:r>
                                   <w:r>
                                     <w:rPr>
                                       <w:rFonts w:ascii="Calibri" w:hAnsi="Calibri" w:cs="Calibri"/>
@@ -3289,37 +3389,30 @@
                                       <w:sz w:val="22"/>
                                       <w:szCs w:val="22"/>
                                     </w:rPr>
-                                    <w:t>TOTAL</w:t>
-                                  </w:r>
-                                  <w:r>
-                                    <w:rPr>
-                                      <w:rFonts w:ascii="Calibri" w:hAnsi="Calibri" w:cs="Calibri"/>
-                                      <w:b/>
-                                      <w:caps/>
-                                      <w:noProof/>
-                                      <w:sz w:val="24"/>
-                                      <w:szCs w:val="24"/>
-                                    </w:rPr>
-                                    <w:t xml:space="preserve">  – 2</w:t>
+                                    <w:t>SUB-TOTAL  – 1</w:t>
                                   </w:r>
                                 </w:p>
                               </w:tc>
                               <w:tc>
                                 <w:tcPr>
-                                  <w:tcW w:w="2213" w:type="dxa"/>
+                                  <w:tcW w:w="2552" w:type="dxa"/>
+                                  <w:gridSpan w:val="2"/>
+                                  <w:tcBorders>
+                                    <w:top w:val="nil"/>
+                                    <w:left w:val="nil"/>
+                                    <w:bottom w:val="nil"/>
+                                    <w:right w:val="nil"/>
+                                  </w:tcBorders>
                                 </w:tcPr>
                                 <w:p>
                                   <w:pPr>
                                     <w:spacing w:before="0" w:after="0"/>
-                                    <w:ind w:right="33"/>
+                                    <w:jc w:val="center"/>
                                     <w:rPr>
                                       <w:rFonts w:ascii="Calibri" w:hAnsi="Calibri" w:cs="Calibri"/>
                                       <w:b/>
-                                      <w:bCs/>
-                                      <w:caps/>
-                                      <w:noProof/>
-                                      <w:sz w:val="22"/>
-                                      <w:szCs w:val="22"/>
+                                      <w:sz w:val="18"/>
+                                      <w:szCs w:val="18"/>
                                     </w:rPr>
                                   </w:pPr>
                                   <w:r>
@@ -3340,7 +3433,7 @@
                                       <w:sz w:val="22"/>
                                       <w:szCs w:val="22"/>
                                     </w:rPr>
-                                    <w:instrText xml:space="preserve"> MERGEFIELD  total_neto_placa2  \* MERGEFORMAT </w:instrText>
+                                    <w:instrText xml:space="preserve"> MERGEFIELD  total_neto_placa1  \* MERGEFORMAT </w:instrText>
                                   </w:r>
                                   <w:r>
                                     <w:rPr>
@@ -3361,7 +3454,7 @@
                                       <w:sz w:val="22"/>
                                       <w:szCs w:val="22"/>
                                     </w:rPr>
-                                    <w:t>«total_neto_placa2»</w:t>
+                                    <w:t>«total_neto_placa1»</w:t>
                                   </w:r>
                                   <w:r>
                                     <w:rPr>
@@ -3375,13 +3468,57 @@
                                   </w:r>
                                 </w:p>
                               </w:tc>
+                              <w:tc>
+                                <w:tcPr>
+                                  <w:tcW w:w="387" w:type="dxa"/>
+                                  <w:tcBorders>
+                                    <w:top w:val="nil"/>
+                                    <w:left w:val="nil"/>
+                                    <w:bottom w:val="nil"/>
+                                    <w:right w:val="nil"/>
+                                  </w:tcBorders>
+                                </w:tcPr>
+                                <w:p>
+                                  <w:pPr>
+                                    <w:spacing w:before="0" w:after="0"/>
+                                    <w:jc w:val="center"/>
+                                    <w:rPr>
+                                      <w:rFonts w:ascii="Calibri" w:hAnsi="Calibri" w:cs="Calibri"/>
+                                      <w:b/>
+                                      <w:bCs/>
+                                      <w:sz w:val="22"/>
+                                      <w:szCs w:val="22"/>
+                                    </w:rPr>
+                                  </w:pPr>
+                                </w:p>
+                              </w:tc>
+                              <w:tc>
+                                <w:tcPr>
+                                  <w:tcW w:w="1172" w:type="dxa"/>
+                                  <w:tcBorders>
+                                    <w:top w:val="nil"/>
+                                    <w:left w:val="nil"/>
+                                    <w:bottom w:val="nil"/>
+                                    <w:right w:val="nil"/>
+                                  </w:tcBorders>
+                                </w:tcPr>
+                                <w:p>
+                                  <w:pPr>
+                                    <w:spacing w:before="0" w:after="0"/>
+                                    <w:jc w:val="center"/>
+                                    <w:rPr>
+                                      <w:rFonts w:ascii="Calibri" w:hAnsi="Calibri" w:cs="Calibri"/>
+                                      <w:b/>
+                                      <w:bCs/>
+                                      <w:sz w:val="22"/>
+                                      <w:szCs w:val="22"/>
+                                    </w:rPr>
+                                  </w:pPr>
+                                </w:p>
+                              </w:tc>
                             </w:tr>
                           </w:tbl>
-                          <w:p>
-                            <w:pPr>
-                              <w:jc w:val="center"/>
-                            </w:pPr>
-                          </w:p>
+                          <w:p/>
                         </w:txbxContent>
                       </wps:txbx>
                       <wps:bodyPr rot="0" spcFirstLastPara="0" vertOverflow="overflow" horzOverflow="overflow" vert="horz" wrap="square" lIns="91440" tIns="45720" rIns="91440" bIns="45720" numCol="1" spcCol="0" rtlCol="0" fromWordArt="0" anchor="ctr" anchorCtr="0" forceAA="0" compatLnSpc="1">
@@ -3398,25 +3535,32 @@
           </mc:Choice>
           <mc:Fallback>
             <w:pict>
-              <v:rect w14:anchorId="2CDD55FC" id="Rectángulo 2" o:spid="_x0000_s1027" style="position:absolute;left:0;text-align:left;margin-left:335.3pt;margin-top:.55pt;width:231.1pt;height:87.4pt;z-index:251662336;visibility:visible;mso-wrap-style:square;mso-wrap-distance-left:9pt;mso-wrap-distance-top:0;mso-wrap-distance-right:9pt;mso-wrap-distance-bottom:0;mso-position-horizontal:absolute;mso-position-horizontal-relative:text;mso-position-vertical:absolute;mso-position-vertical-relative:text;v-text-anchor:middle" o:gfxdata="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" filled="f" stroked="f">
+              <v:rect w14:anchorId="5990CF46" id="Rectángulo 2" o:spid="_x0000_s1027" style="position:absolute;left:0;text-align:left;margin-left:7.3pt;margin-top:.15pt;width:307.5pt;height:80pt;z-index:251683840;visibility:visible;mso-wrap-style:square;mso-wrap-distance-left:9pt;mso-wrap-distance-top:0;mso-wrap-distance-right:9pt;mso-wrap-distance-bottom:0;mso-position-horizontal:absolute;mso-position-horizontal-relative:text;mso-position-vertical:absolute;mso-position-vertical-relative:text;v-text-anchor:middle" o:gfxdata="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" filled="f" stroked="f">
                 <v:textbox>
                   <w:txbxContent>
                     <w:tbl>
                       <w:tblPr>
                         <w:tblStyle w:val="Tablaconcuadrcula"/>
-                        <w:tblW w:w="0" w:type="auto"/>
+                        <w:tblW w:w="6374" w:type="dxa"/>
+                        <w:tblLayout w:type="fixed"/>
                         <w:tblLook w:val="04A0" w:firstRow="1" w:lastRow="0" w:firstColumn="1" w:lastColumn="0" w:noHBand="0" w:noVBand="1"/>
                       </w:tblPr>
                       <w:tblGrid>
-                        <w:gridCol w:w="987"/>
-                        <w:gridCol w:w="1095"/>
-                        <w:gridCol w:w="1164"/>
-                        <w:gridCol w:w="1093"/>
+                        <w:gridCol w:w="942"/>
+                        <w:gridCol w:w="1321"/>
+                        <w:gridCol w:w="1231"/>
+                        <w:gridCol w:w="1321"/>
+                        <w:gridCol w:w="387"/>
+                        <w:gridCol w:w="1172"/>
                       </w:tblGrid>
                       <w:tr>
+                        <w:trPr>
+                          <w:gridAfter w:val="2"/>
+                          <w:wAfter w:w="1559" w:type="dxa"/>
+                        </w:trPr>
                         <w:tc>
                           <w:tcPr>
-                            <w:tcW w:w="4294" w:type="dxa"/>
+                            <w:tcW w:w="4815" w:type="dxa"/>
                             <w:gridSpan w:val="4"/>
                             <w:tcBorders>
                               <w:right w:val="single" w:sz="4" w:space="0" w:color="auto"/>
@@ -3452,7 +3596,7 @@
                                 <w:sz w:val="18"/>
                                 <w:szCs w:val="18"/>
                               </w:rPr>
-                              <w:instrText xml:space="preserve"> MERGEFIELD  placa2  \* MERGEFORMAT </w:instrText>
+                              <w:instrText xml:space="preserve"> MERGEFIELD  placa1  \* MERGEFORMAT </w:instrText>
                             </w:r>
                             <w:r>
                               <w:rPr>
@@ -3471,7 +3615,7 @@
                                 <w:sz w:val="18"/>
                                 <w:szCs w:val="18"/>
                               </w:rPr>
-                              <w:t>«placa2»</w:t>
+                              <w:t>«placa1»</w:t>
                             </w:r>
                             <w:r>
                               <w:rPr>
@@ -3486,9 +3630,16 @@
                         </w:tc>
                       </w:tr>
                       <w:tr>
+                        <w:trPr>
+                          <w:gridAfter w:val="2"/>
+                          <w:wAfter w:w="1559" w:type="dxa"/>
+                        </w:trPr>
                         <w:tc>
                           <w:tcPr>
-                            <w:tcW w:w="988" w:type="dxa"/>
+                            <w:tcW w:w="942" w:type="dxa"/>
+                            <w:tcBorders>
+                              <w:bottom w:val="single" w:sz="4" w:space="0" w:color="auto"/>
+                            </w:tcBorders>
                           </w:tcPr>
                           <w:p>
                             <w:pPr>
@@ -3518,7 +3669,10 @@
                         </w:tc>
                         <w:tc>
                           <w:tcPr>
-                            <w:tcW w:w="1097" w:type="dxa"/>
+                            <w:tcW w:w="1321" w:type="dxa"/>
+                            <w:tcBorders>
+                              <w:bottom w:val="single" w:sz="4" w:space="0" w:color="auto"/>
+                            </w:tcBorders>
                           </w:tcPr>
                           <w:p>
                             <w:pPr>
@@ -3548,7 +3702,10 @@
                         </w:tc>
                         <w:tc>
                           <w:tcPr>
-                            <w:tcW w:w="1171" w:type="dxa"/>
+                            <w:tcW w:w="1231" w:type="dxa"/>
+                            <w:tcBorders>
+                              <w:bottom w:val="single" w:sz="4" w:space="0" w:color="auto"/>
+                            </w:tcBorders>
                           </w:tcPr>
                           <w:p>
                             <w:pPr>
@@ -3578,8 +3735,9 @@
                         </w:tc>
                         <w:tc>
                           <w:tcPr>
-                            <w:tcW w:w="1038" w:type="dxa"/>
+                            <w:tcW w:w="1321" w:type="dxa"/>
                             <w:tcBorders>
+                              <w:bottom w:val="single" w:sz="4" w:space="0" w:color="auto"/>
                               <w:right w:val="single" w:sz="4" w:space="0" w:color="auto"/>
                             </w:tcBorders>
                           </w:tcPr>
@@ -3611,9 +3769,16 @@
                         </w:tc>
                       </w:tr>
                       <w:tr>
+                        <w:trPr>
+                          <w:gridAfter w:val="2"/>
+                          <w:wAfter w:w="1559" w:type="dxa"/>
+                        </w:trPr>
                         <w:tc>
                           <w:tcPr>
-                            <w:tcW w:w="988" w:type="dxa"/>
+                            <w:tcW w:w="942" w:type="dxa"/>
+                            <w:tcBorders>
+                              <w:bottom w:val="single" w:sz="4" w:space="0" w:color="auto"/>
+                            </w:tcBorders>
                           </w:tcPr>
                           <w:p>
                             <w:pPr>
@@ -3648,7 +3813,7 @@
                                 <w:sz w:val="2"/>
                                 <w:szCs w:val="2"/>
                               </w:rPr>
-                              <w:instrText xml:space="preserve"> MERGEFIELD  TableStart:placas2 \* Lower  \* MERGEFORMAT </w:instrText>
+                              <w:instrText xml:space="preserve"> MERGEFIELD  TableStart:placas1 \* Lower  \* MERGEFORMAT </w:instrText>
                             </w:r>
                             <w:r>
                               <w:rPr>
@@ -3669,7 +3834,7 @@
                                 <w:sz w:val="2"/>
                                 <w:szCs w:val="2"/>
                               </w:rPr>
-                              <w:t>«tablestart:placas2»</w:t>
+                              <w:t>«tablestart:placas1»</w:t>
                             </w:r>
                             <w:r>
                               <w:rPr>
@@ -3732,7 +3897,10 @@
                         </w:tc>
                         <w:tc>
                           <w:tcPr>
-                            <w:tcW w:w="1097" w:type="dxa"/>
+                            <w:tcW w:w="1321" w:type="dxa"/>
+                            <w:tcBorders>
+                              <w:bottom w:val="single" w:sz="4" w:space="0" w:color="auto"/>
+                            </w:tcBorders>
                           </w:tcPr>
                           <w:p>
                             <w:pPr>
@@ -3797,7 +3965,10 @@
                         </w:tc>
                         <w:tc>
                           <w:tcPr>
-                            <w:tcW w:w="1171" w:type="dxa"/>
+                            <w:tcW w:w="1231" w:type="dxa"/>
+                            <w:tcBorders>
+                              <w:bottom w:val="single" w:sz="4" w:space="0" w:color="auto"/>
+                            </w:tcBorders>
                           </w:tcPr>
                           <w:p>
                             <w:pPr>
@@ -3862,8 +4033,9 @@
                         </w:tc>
                         <w:tc>
                           <w:tcPr>
-                            <w:tcW w:w="1038" w:type="dxa"/>
+                            <w:tcW w:w="1321" w:type="dxa"/>
                             <w:tcBorders>
+                              <w:bottom w:val="single" w:sz="4" w:space="0" w:color="auto"/>
                               <w:right w:val="single" w:sz="4" w:space="0" w:color="auto"/>
                             </w:tcBorders>
                           </w:tcPr>
@@ -3946,7 +4118,7 @@
                                 <w:sz w:val="2"/>
                                 <w:szCs w:val="2"/>
                               </w:rPr>
-                              <w:instrText xml:space="preserve"> MERGEFIELD  TableEnd:placas2 \* Lower  \* MERGEFORMAT </w:instrText>
+                              <w:instrText xml:space="preserve"> MERGEFIELD  TableEnd:placas1 \* Lower  \* MERGEFORMAT </w:instrText>
                             </w:r>
                             <w:r>
                               <w:rPr>
@@ -3967,7 +4139,7 @@
                                 <w:sz w:val="2"/>
                                 <w:szCs w:val="2"/>
                               </w:rPr>
-                              <w:t>«tableend:placas2»</w:t>
+                              <w:t>«tableend:placas1»</w:t>
                             </w:r>
                             <w:r>
                               <w:rPr>
@@ -3983,69 +4155,148 @@
                           </w:p>
                         </w:tc>
                       </w:tr>
-                    </w:tbl>
-                    <w:p>
-                      <w:pPr>
-                        <w:spacing w:before="0" w:after="0"/>
-                        <w:rPr>
-                          <w:rFonts w:ascii="Calibri" w:hAnsi="Calibri" w:cs="Calibri"/>
-                          <w:b/>
-                          <w:caps/>
-                          <w:noProof/>
-                          <w:sz w:val="2"/>
-                          <w:szCs w:val="2"/>
-                        </w:rPr>
-                      </w:pPr>
-                    </w:p>
-                    <w:tbl>
-                      <w:tblPr>
-                        <w:tblStyle w:val="Tablaconcuadrcula"/>
-                        <w:tblW w:w="0" w:type="auto"/>
-                        <w:tblBorders>
-                          <w:top w:val="none" w:sz="0" w:space="0" w:color="auto"/>
-                          <w:left w:val="none" w:sz="0" w:space="0" w:color="auto"/>
-                          <w:bottom w:val="none" w:sz="0" w:space="0" w:color="auto"/>
-                          <w:right w:val="none" w:sz="0" w:space="0" w:color="auto"/>
-                          <w:insideH w:val="none" w:sz="0" w:space="0" w:color="auto"/>
-                          <w:insideV w:val="none" w:sz="0" w:space="0" w:color="auto"/>
-                        </w:tblBorders>
-                        <w:tblLook w:val="04A0" w:firstRow="1" w:lastRow="0" w:firstColumn="1" w:lastColumn="0" w:noHBand="0" w:noVBand="1"/>
-                      </w:tblPr>
-                      <w:tblGrid>
-                        <w:gridCol w:w="2081"/>
-                        <w:gridCol w:w="2213"/>
-                      </w:tblGrid>
+                      <w:tr>
+                        <w:trPr>
+                          <w:trHeight w:val="79"/>
+                        </w:trPr>
+                        <w:tc>
+                          <w:tcPr>
+                            <w:tcW w:w="942" w:type="dxa"/>
+                            <w:tcBorders>
+                              <w:top w:val="single" w:sz="4" w:space="0" w:color="auto"/>
+                              <w:left w:val="nil"/>
+                              <w:bottom w:val="single" w:sz="4" w:space="0" w:color="auto"/>
+                              <w:right w:val="nil"/>
+                            </w:tcBorders>
+                          </w:tcPr>
+                          <w:p>
+                            <w:pPr>
+                              <w:rPr>
+                                <w:sz w:val="4"/>
+                                <w:szCs w:val="4"/>
+                              </w:rPr>
+                            </w:pPr>
+                          </w:p>
+                        </w:tc>
+                        <w:tc>
+                          <w:tcPr>
+                            <w:tcW w:w="1321" w:type="dxa"/>
+                            <w:tcBorders>
+                              <w:top w:val="single" w:sz="4" w:space="0" w:color="auto"/>
+                              <w:left w:val="nil"/>
+                              <w:bottom w:val="single" w:sz="4" w:space="0" w:color="auto"/>
+                              <w:right w:val="nil"/>
+                            </w:tcBorders>
+                          </w:tcPr>
+                          <w:p>
+                            <w:pPr>
+                              <w:rPr>
+                                <w:sz w:val="4"/>
+                                <w:szCs w:val="4"/>
+                              </w:rPr>
+                            </w:pPr>
+                          </w:p>
+                        </w:tc>
+                        <w:tc>
+                          <w:tcPr>
+                            <w:tcW w:w="1231" w:type="dxa"/>
+                            <w:tcBorders>
+                              <w:top w:val="single" w:sz="4" w:space="0" w:color="auto"/>
+                              <w:left w:val="nil"/>
+                              <w:bottom w:val="nil"/>
+                              <w:right w:val="nil"/>
+                            </w:tcBorders>
+                          </w:tcPr>
+                          <w:p>
+                            <w:pPr>
+                              <w:rPr>
+                                <w:sz w:val="4"/>
+                                <w:szCs w:val="4"/>
+                              </w:rPr>
+                            </w:pPr>
+                          </w:p>
+                        </w:tc>
+                        <w:tc>
+                          <w:tcPr>
+                            <w:tcW w:w="1321" w:type="dxa"/>
+                            <w:tcBorders>
+                              <w:top w:val="single" w:sz="4" w:space="0" w:color="auto"/>
+                              <w:left w:val="nil"/>
+                              <w:bottom w:val="nil"/>
+                              <w:right w:val="nil"/>
+                            </w:tcBorders>
+                          </w:tcPr>
+                          <w:p>
+                            <w:pPr>
+                              <w:rPr>
+                                <w:sz w:val="4"/>
+                                <w:szCs w:val="4"/>
+                              </w:rPr>
+                            </w:pPr>
+                          </w:p>
+                        </w:tc>
+                        <w:tc>
+                          <w:tcPr>
+                            <w:tcW w:w="387" w:type="dxa"/>
+                            <w:tcBorders>
+                              <w:top w:val="nil"/>
+                              <w:left w:val="nil"/>
+                              <w:bottom w:val="nil"/>
+                              <w:right w:val="nil"/>
+                            </w:tcBorders>
+                          </w:tcPr>
+                          <w:p>
+                            <w:pPr>
+                              <w:rPr>
+                                <w:sz w:val="4"/>
+                                <w:szCs w:val="4"/>
+                              </w:rPr>
+                            </w:pPr>
+                          </w:p>
+                        </w:tc>
+                        <w:tc>
+                          <w:tcPr>
+                            <w:tcW w:w="1172" w:type="dxa"/>
+                            <w:tcBorders>
+                              <w:top w:val="nil"/>
+                              <w:left w:val="nil"/>
+                              <w:bottom w:val="nil"/>
+                              <w:right w:val="nil"/>
+                            </w:tcBorders>
+                          </w:tcPr>
+                          <w:p>
+                            <w:pPr>
+                              <w:rPr>
+                                <w:sz w:val="4"/>
+                                <w:szCs w:val="4"/>
+                              </w:rPr>
+                            </w:pPr>
+                          </w:p>
+                        </w:tc>
+                      </w:tr>
                       <w:tr>
                         <w:tc>
                           <w:tcPr>
-                            <w:tcW w:w="2081" w:type="dxa"/>
+                            <w:tcW w:w="2263" w:type="dxa"/>
+                            <w:gridSpan w:val="2"/>
                             <w:tcBorders>
                               <w:top w:val="single" w:sz="4" w:space="0" w:color="auto"/>
+                              <w:left w:val="nil"/>
+                              <w:bottom w:val="nil"/>
+                              <w:right w:val="nil"/>
                             </w:tcBorders>
                           </w:tcPr>
                           <w:p>
                             <w:pPr>
                               <w:spacing w:before="0" w:after="0"/>
+                              <w:jc w:val="center"/>
                               <w:rPr>
                                 <w:rFonts w:ascii="Calibri" w:hAnsi="Calibri" w:cs="Calibri"/>
                                 <w:b/>
-                                <w:caps/>
-                                <w:noProof/>
-                                <w:sz w:val="24"/>
-                                <w:szCs w:val="24"/>
+                                <w:sz w:val="18"/>
+                                <w:szCs w:val="18"/>
                               </w:rPr>
                             </w:pPr>
-                            <w:r>
-                              <w:rPr>
-                                <w:rFonts w:ascii="Calibri" w:hAnsi="Calibri" w:cs="Calibri"/>
-                                <w:b/>
-                                <w:caps/>
-                                <w:noProof/>
-                                <w:sz w:val="24"/>
-                                <w:szCs w:val="24"/>
-                              </w:rPr>
-                              <w:t>SUB-</w:t>
-                            </w:r>
                             <w:r>
                               <w:rPr>
                                 <w:rFonts w:ascii="Calibri" w:hAnsi="Calibri" w:cs="Calibri"/>
@@ -4055,37 +4306,30 @@
                                 <w:sz w:val="22"/>
                                 <w:szCs w:val="22"/>
                               </w:rPr>
-                              <w:t>TOTAL</w:t>
-                            </w:r>
-                            <w:r>
-                              <w:rPr>
-                                <w:rFonts w:ascii="Calibri" w:hAnsi="Calibri" w:cs="Calibri"/>
-                                <w:b/>
-                                <w:caps/>
-                                <w:noProof/>
-                                <w:sz w:val="24"/>
-                                <w:szCs w:val="24"/>
-                              </w:rPr>
-                              <w:t xml:space="preserve">  – 2</w:t>
+                              <w:t>SUB-TOTAL  – 1</w:t>
                             </w:r>
                           </w:p>
                         </w:tc>
                         <w:tc>
                           <w:tcPr>
-                            <w:tcW w:w="2213" w:type="dxa"/>
+                            <w:tcW w:w="2552" w:type="dxa"/>
+                            <w:gridSpan w:val="2"/>
+                            <w:tcBorders>
+                              <w:top w:val="nil"/>
+                              <w:left w:val="nil"/>
+                              <w:bottom w:val="nil"/>
+                              <w:right w:val="nil"/>
+                            </w:tcBorders>
                           </w:tcPr>
                           <w:p>
                             <w:pPr>
                               <w:spacing w:before="0" w:after="0"/>
-                              <w:ind w:right="33"/>
+                              <w:jc w:val="center"/>
                               <w:rPr>
                                 <w:rFonts w:ascii="Calibri" w:hAnsi="Calibri" w:cs="Calibri"/>
                                 <w:b/>
-                                <w:bCs/>
-                                <w:caps/>
-                                <w:noProof/>
-                                <w:sz w:val="22"/>
-                                <w:szCs w:val="22"/>
+                                <w:sz w:val="18"/>
+                                <w:szCs w:val="18"/>
                               </w:rPr>
                             </w:pPr>
                             <w:r>
@@ -4106,7 +4350,7 @@
                                 <w:sz w:val="22"/>
                                 <w:szCs w:val="22"/>
                               </w:rPr>
-                              <w:instrText xml:space="preserve"> MERGEFIELD  total_neto_placa2  \* MERGEFORMAT </w:instrText>
+                              <w:instrText xml:space="preserve"> MERGEFIELD  total_neto_placa1  \* MERGEFORMAT </w:instrText>
                             </w:r>
                             <w:r>
                               <w:rPr>
@@ -4127,7 +4371,7 @@
                                 <w:sz w:val="22"/>
                                 <w:szCs w:val="22"/>
                               </w:rPr>
-                              <w:t>«total_neto_placa2»</w:t>
+                              <w:t>«total_neto_placa1»</w:t>
                             </w:r>
                             <w:r>
                               <w:rPr>
@@ -4141,883 +4385,14 @@
                             </w:r>
                           </w:p>
                         </w:tc>
-                      </w:tr>
-                    </w:tbl>
-                    <w:p>
-                      <w:pPr>
-                        <w:jc w:val="center"/>
-                      </w:pPr>
-                    </w:p>
-                  </w:txbxContent>
-                </v:textbox>
-                <w10:wrap type="square"/>
-              </v:rect>
-            </w:pict>
-          </mc:Fallback>
-        </mc:AlternateContent>
-      </w:r>
-    </w:p>
-    <w:p>
-      <w:pPr>
-        <w:spacing w:before="0" w:after="0"/>
-        <w:ind w:firstLine="142"/>
-        <w:rPr>
-          <w:rFonts w:ascii="Calibri" w:hAnsi="Calibri" w:cs="Calibri"/>
-          <w:b/>
-          <w:caps/>
-          <w:noProof/>
-          <w:sz w:val="2"/>
-          <w:szCs w:val="2"/>
-        </w:rPr>
-      </w:pPr>
-    </w:p>
-    <w:p>
-      <w:pPr>
-        <w:spacing w:before="0" w:after="0"/>
-        <w:ind w:firstLine="142"/>
-        <w:rPr>
-          <w:rFonts w:ascii="Calibri" w:hAnsi="Calibri" w:cs="Calibri"/>
-          <w:b/>
-          <w:caps/>
-          <w:noProof/>
-          <w:sz w:val="2"/>
-          <w:szCs w:val="2"/>
-        </w:rPr>
-      </w:pPr>
-    </w:p>
-    <w:p>
-      <w:pPr>
-        <w:spacing w:before="0" w:after="0"/>
-        <w:ind w:firstLine="142"/>
-        <w:rPr>
-          <w:rFonts w:ascii="Calibri" w:hAnsi="Calibri" w:cs="Calibri"/>
-          <w:b/>
-          <w:caps/>
-          <w:noProof/>
-          <w:sz w:val="2"/>
-          <w:szCs w:val="2"/>
-        </w:rPr>
-      </w:pPr>
-      <w:r>
-        <w:rPr>
-          <w:rFonts w:ascii="Calibri" w:hAnsi="Calibri" w:cs="Calibri"/>
-          <w:b/>
-          <w:caps/>
-          <w:noProof/>
-          <w14:ligatures w14:val="standardContextual"/>
-        </w:rPr>
-        <mc:AlternateContent>
-          <mc:Choice Requires="wps">
-            <w:drawing>
-              <wp:anchor distT="0" distB="0" distL="114300" distR="114300" simplePos="0" relativeHeight="251666432" behindDoc="1" locked="0" layoutInCell="1" allowOverlap="1" wp14:anchorId="5990CF46" wp14:editId="444402E3">
-                <wp:simplePos x="0" y="0"/>
-                <wp:positionH relativeFrom="column">
-                  <wp:posOffset>635</wp:posOffset>
-                </wp:positionH>
-                <wp:positionV relativeFrom="paragraph">
-                  <wp:posOffset>4445</wp:posOffset>
-                </wp:positionV>
-                <wp:extent cx="2934970" cy="1109980"/>
-                <wp:effectExtent l="0" t="0" r="0" b="0"/>
-                <wp:wrapSquare wrapText="bothSides"/>
-                <wp:docPr id="821845427" name="Rectángulo 2"/>
-                <wp:cNvGraphicFramePr/>
-                <a:graphic xmlns:a="http://schemas.openxmlformats.org/drawingml/2006/main">
-                  <a:graphicData uri="http://schemas.microsoft.com/office/word/2010/wordprocessingShape">
-                    <wps:wsp>
-                      <wps:cNvSpPr/>
-                      <wps:spPr>
-                        <a:xfrm>
-                          <a:off x="0" y="0"/>
-                          <a:ext cx="2934970" cy="1109980"/>
-                        </a:xfrm>
-                        <a:prstGeom prst="rect">
-                          <a:avLst/>
-                        </a:prstGeom>
-                        <a:noFill/>
-                        <a:ln>
-                          <a:noFill/>
-                        </a:ln>
-                      </wps:spPr>
-                      <wps:style>
-                        <a:lnRef idx="0">
-                          <a:scrgbClr r="0" g="0" b="0"/>
-                        </a:lnRef>
-                        <a:fillRef idx="0">
-                          <a:scrgbClr r="0" g="0" b="0"/>
-                        </a:fillRef>
-                        <a:effectRef idx="0">
-                          <a:scrgbClr r="0" g="0" b="0"/>
-                        </a:effectRef>
-                        <a:fontRef idx="minor">
-                          <a:schemeClr val="dk1"/>
-                        </a:fontRef>
-                      </wps:style>
-                      <wps:txbx>
-                        <w:txbxContent>
-                          <w:tbl>
-                            <w:tblPr>
-                              <w:tblStyle w:val="Tablaconcuadrcula"/>
-                              <w:tblW w:w="0" w:type="auto"/>
-                              <w:tblLook w:val="04A0" w:firstRow="1" w:lastRow="0" w:firstColumn="1" w:lastColumn="0" w:noHBand="0" w:noVBand="1"/>
-                            </w:tblPr>
-                            <w:tblGrid>
-                              <w:gridCol w:w="987"/>
-                              <w:gridCol w:w="1095"/>
-                              <w:gridCol w:w="1164"/>
-                              <w:gridCol w:w="1093"/>
-                            </w:tblGrid>
-                            <w:tr>
-                              <w:tc>
-                                <w:tcPr>
-                                  <w:tcW w:w="4294" w:type="dxa"/>
-                                  <w:gridSpan w:val="4"/>
-                                  <w:tcBorders>
-                                    <w:right w:val="single" w:sz="4" w:space="0" w:color="auto"/>
-                                  </w:tcBorders>
-                                </w:tcPr>
-                                <w:p>
-                                  <w:pPr>
-                                    <w:spacing w:before="0" w:after="0"/>
-                                    <w:jc w:val="center"/>
-                                    <w:rPr>
-                                      <w:rFonts w:ascii="Calibri" w:hAnsi="Calibri" w:cs="Calibri"/>
-                                      <w:b/>
-                                      <w:bCs/>
-                                      <w:caps/>
-                                      <w:noProof/>
-                                      <w:sz w:val="18"/>
-                                      <w:szCs w:val="18"/>
-                                    </w:rPr>
-                                  </w:pPr>
-                                  <w:r>
-                                    <w:rPr>
-                                      <w:b/>
-                                      <w:bCs/>
-                                      <w:sz w:val="18"/>
-                                      <w:szCs w:val="18"/>
-                                    </w:rPr>
-                                    <w:fldChar w:fldCharType="begin"/>
-                                  </w:r>
-                                  <w:r>
-                                    <w:rPr>
-                                      <w:b/>
-                                      <w:bCs/>
-                                      <w:sz w:val="18"/>
-                                      <w:szCs w:val="18"/>
-                                    </w:rPr>
-                                    <w:instrText xml:space="preserve"> MERGEFIELD  placa1  \* MERGEFORMAT </w:instrText>
-                                  </w:r>
-                                  <w:r>
-                                    <w:rPr>
-                                      <w:b/>
-                                      <w:bCs/>
-                                      <w:sz w:val="18"/>
-                                      <w:szCs w:val="18"/>
-                                    </w:rPr>
-                                    <w:fldChar w:fldCharType="separate"/>
-                                  </w:r>
-                                  <w:r>
-                                    <w:rPr>
-                                      <w:b/>
-                                      <w:bCs/>
-                                      <w:noProof/>
-                                      <w:sz w:val="18"/>
-                                      <w:szCs w:val="18"/>
-                                    </w:rPr>
-                                    <w:t>«placa1»</w:t>
-                                  </w:r>
-                                  <w:r>
-                                    <w:rPr>
-                                      <w:b/>
-                                      <w:bCs/>
-                                      <w:sz w:val="18"/>
-                                      <w:szCs w:val="18"/>
-                                    </w:rPr>
-                                    <w:fldChar w:fldCharType="end"/>
-                                  </w:r>
-                                </w:p>
-                              </w:tc>
-                            </w:tr>
-                            <w:tr>
-                              <w:tc>
-                                <w:tcPr>
-                                  <w:tcW w:w="988" w:type="dxa"/>
-                                </w:tcPr>
-                                <w:p>
-                                  <w:pPr>
-                                    <w:spacing w:before="0" w:after="0"/>
-                                    <w:jc w:val="center"/>
-                                    <w:rPr>
-                                      <w:rFonts w:ascii="Aptos Black" w:hAnsi="Aptos Black" w:cs="Calibri"/>
-                                      <w:b/>
-                                      <w:caps/>
-                                      <w:noProof/>
-                                      <w:sz w:val="18"/>
-                                      <w:szCs w:val="18"/>
-                                    </w:rPr>
-                                  </w:pPr>
-                                  <w:r>
-                                    <w:rPr>
-                                      <w:rFonts w:ascii="Aptos Black" w:hAnsi="Aptos Black" w:cs="Calibri"/>
-                                      <w:b/>
-                                      <w:caps/>
-                                      <w:noProof/>
-                                      <w:sz w:val="18"/>
-                                      <w:szCs w:val="18"/>
-                                    </w:rPr>
-                                    <w:t>VIAJE</w:t>
-                                  </w:r>
-                                </w:p>
-                              </w:tc>
-                              <w:tc>
-                                <w:tcPr>
-                                  <w:tcW w:w="1097" w:type="dxa"/>
-                                </w:tcPr>
-                                <w:p>
-                                  <w:pPr>
-                                    <w:spacing w:before="0" w:after="0"/>
-                                    <w:jc w:val="center"/>
-                                    <w:rPr>
-                                      <w:rFonts w:ascii="Aptos Black" w:hAnsi="Aptos Black" w:cs="Calibri"/>
-                                      <w:b/>
-                                      <w:caps/>
-                                      <w:noProof/>
-                                      <w:sz w:val="18"/>
-                                      <w:szCs w:val="18"/>
-                                    </w:rPr>
-                                  </w:pPr>
-                                  <w:r>
-                                    <w:rPr>
-                                      <w:rFonts w:ascii="Aptos Black" w:hAnsi="Aptos Black" w:cs="Calibri"/>
-                                      <w:b/>
-                                      <w:caps/>
-                                      <w:noProof/>
-                                      <w:sz w:val="18"/>
-                                      <w:szCs w:val="18"/>
-                                    </w:rPr>
-                                    <w:t>PESO BRUTO</w:t>
-                                  </w:r>
-                                </w:p>
-                              </w:tc>
-                              <w:tc>
-                                <w:tcPr>
-                                  <w:tcW w:w="1171" w:type="dxa"/>
-                                </w:tcPr>
-                                <w:p>
-                                  <w:pPr>
-                                    <w:spacing w:before="0" w:after="0"/>
-                                    <w:jc w:val="center"/>
-                                    <w:rPr>
-                                      <w:rFonts w:ascii="Aptos Black" w:hAnsi="Aptos Black" w:cs="Calibri"/>
-                                      <w:b/>
-                                      <w:caps/>
-                                      <w:noProof/>
-                                      <w:sz w:val="18"/>
-                                      <w:szCs w:val="18"/>
-                                    </w:rPr>
-                                  </w:pPr>
-                                  <w:r>
-                                    <w:rPr>
-                                      <w:rFonts w:ascii="Aptos Black" w:hAnsi="Aptos Black" w:cs="Calibri"/>
-                                      <w:b/>
-                                      <w:caps/>
-                                      <w:noProof/>
-                                      <w:sz w:val="18"/>
-                                      <w:szCs w:val="18"/>
-                                    </w:rPr>
-                                    <w:t>PESO NETO</w:t>
-                                  </w:r>
-                                </w:p>
-                              </w:tc>
-                              <w:tc>
-                                <w:tcPr>
-                                  <w:tcW w:w="1038" w:type="dxa"/>
-                                  <w:tcBorders>
-                                    <w:right w:val="single" w:sz="4" w:space="0" w:color="auto"/>
-                                  </w:tcBorders>
-                                </w:tcPr>
-                                <w:p>
-                                  <w:pPr>
-                                    <w:spacing w:before="0" w:after="0"/>
-                                    <w:jc w:val="center"/>
-                                    <w:rPr>
-                                      <w:rFonts w:ascii="Aptos Black" w:hAnsi="Aptos Black" w:cs="Calibri"/>
-                                      <w:b/>
-                                      <w:caps/>
-                                      <w:noProof/>
-                                      <w:sz w:val="18"/>
-                                      <w:szCs w:val="18"/>
-                                    </w:rPr>
-                                  </w:pPr>
-                                  <w:r>
-                                    <w:rPr>
-                                      <w:rFonts w:ascii="Aptos Black" w:hAnsi="Aptos Black" w:cs="Calibri"/>
-                                      <w:b/>
-                                      <w:caps/>
-                                      <w:noProof/>
-                                      <w:sz w:val="18"/>
-                                      <w:szCs w:val="18"/>
-                                    </w:rPr>
-                                    <w:t>TIPO</w:t>
-                                  </w:r>
-                                </w:p>
-                              </w:tc>
-                            </w:tr>
-                            <w:tr>
-                              <w:tc>
-                                <w:tcPr>
-                                  <w:tcW w:w="988" w:type="dxa"/>
-                                </w:tcPr>
-                                <w:p>
-                                  <w:pPr>
-                                    <w:spacing w:before="0" w:after="0"/>
-                                    <w:jc w:val="center"/>
-                                    <w:rPr>
-                                      <w:rFonts w:ascii="Aptos Black" w:hAnsi="Aptos Black" w:cs="Calibri"/>
-                                      <w:b/>
-                                      <w:caps/>
-                                      <w:noProof/>
-                                      <w:sz w:val="18"/>
-                                      <w:szCs w:val="18"/>
-                                    </w:rPr>
-                                  </w:pPr>
-                                  <w:r>
-                                    <w:rPr>
-                                      <w:rFonts w:ascii="Calibri" w:hAnsi="Calibri" w:cs="Calibri"/>
-                                      <w:b/>
-                                      <w:caps/>
-                                      <w:noProof/>
-                                      <w:sz w:val="2"/>
-                                      <w:szCs w:val="2"/>
-                                    </w:rPr>
-                                    <w:fldChar w:fldCharType="begin"/>
-                                  </w:r>
-                                  <w:r>
-                                    <w:rPr>
-                                      <w:rFonts w:ascii="Calibri" w:hAnsi="Calibri" w:cs="Calibri"/>
-                                      <w:b/>
-                                      <w:caps/>
-                                      <w:noProof/>
-                                      <w:sz w:val="2"/>
-                                      <w:szCs w:val="2"/>
-                                    </w:rPr>
-                                    <w:instrText xml:space="preserve"> MERGEFIELD  TableStart:placas1 \* Lower  \* MERGEFORMAT </w:instrText>
-                                  </w:r>
-                                  <w:r>
-                                    <w:rPr>
-                                      <w:rFonts w:ascii="Calibri" w:hAnsi="Calibri" w:cs="Calibri"/>
-                                      <w:b/>
-                                      <w:caps/>
-                                      <w:noProof/>
-                                      <w:sz w:val="2"/>
-                                      <w:szCs w:val="2"/>
-                                    </w:rPr>
-                                    <w:fldChar w:fldCharType="separate"/>
-                                  </w:r>
-                                  <w:r>
-                                    <w:rPr>
-                                      <w:rFonts w:ascii="Calibri" w:hAnsi="Calibri" w:cs="Calibri"/>
-                                      <w:b/>
-                                      <w:noProof/>
-                                      <w:sz w:val="2"/>
-                                      <w:szCs w:val="2"/>
-                                    </w:rPr>
-                                    <w:t>«tablestart:placas1»</w:t>
-                                  </w:r>
-                                  <w:r>
-                                    <w:rPr>
-                                      <w:rFonts w:ascii="Calibri" w:hAnsi="Calibri" w:cs="Calibri"/>
-                                      <w:b/>
-                                      <w:caps/>
-                                      <w:noProof/>
-                                      <w:sz w:val="2"/>
-                                      <w:szCs w:val="2"/>
-                                    </w:rPr>
-                                    <w:fldChar w:fldCharType="end"/>
-                                  </w:r>
-                                  <w:r>
-                                    <w:rPr>
-                                      <w:rFonts w:ascii="Calibri" w:hAnsi="Calibri" w:cs="Calibri"/>
-                                      <w:b/>
-                                      <w:sz w:val="18"/>
-                                      <w:szCs w:val="18"/>
-                                    </w:rPr>
-                                    <w:fldChar w:fldCharType="begin"/>
-                                  </w:r>
-                                  <w:r>
-                                    <w:rPr>
-                                      <w:rFonts w:ascii="Calibri" w:hAnsi="Calibri" w:cs="Calibri"/>
-                                      <w:b/>
-                                      <w:sz w:val="18"/>
-                                      <w:szCs w:val="18"/>
-                                    </w:rPr>
-                                    <w:instrText xml:space="preserve"> MERGEFIELD  item  \* MERGEFORMAT </w:instrText>
-                                  </w:r>
-                                  <w:r>
-                                    <w:rPr>
-                                      <w:rFonts w:ascii="Calibri" w:hAnsi="Calibri" w:cs="Calibri"/>
-                                      <w:b/>
-                                      <w:sz w:val="18"/>
-                                      <w:szCs w:val="18"/>
-                                    </w:rPr>
-                                    <w:fldChar w:fldCharType="separate"/>
-                                  </w:r>
-                                  <w:r>
-                                    <w:rPr>
-                                      <w:rFonts w:ascii="Calibri" w:hAnsi="Calibri" w:cs="Calibri"/>
-                                      <w:b/>
-                                      <w:noProof/>
-                                      <w:sz w:val="18"/>
-                                      <w:szCs w:val="18"/>
-                                    </w:rPr>
-                                    <w:t>«item»</w:t>
-                                  </w:r>
-                                  <w:r>
-                                    <w:rPr>
-                                      <w:rFonts w:ascii="Calibri" w:hAnsi="Calibri" w:cs="Calibri"/>
-                                      <w:b/>
-                                      <w:sz w:val="18"/>
-                                      <w:szCs w:val="18"/>
-                                    </w:rPr>
-                                    <w:fldChar w:fldCharType="end"/>
-                                  </w:r>
-                                </w:p>
-                              </w:tc>
-                              <w:tc>
-                                <w:tcPr>
-                                  <w:tcW w:w="1097" w:type="dxa"/>
-                                </w:tcPr>
-                                <w:p>
-                                  <w:pPr>
-                                    <w:spacing w:before="0" w:after="0"/>
-                                    <w:jc w:val="center"/>
-                                    <w:rPr>
-                                      <w:rFonts w:ascii="Aptos Black" w:hAnsi="Aptos Black" w:cs="Calibri"/>
-                                      <w:b/>
-                                      <w:caps/>
-                                      <w:noProof/>
-                                      <w:sz w:val="18"/>
-                                      <w:szCs w:val="18"/>
-                                    </w:rPr>
-                                  </w:pPr>
-                                  <w:r>
-                                    <w:rPr>
-                                      <w:rFonts w:ascii="Calibri" w:hAnsi="Calibri" w:cs="Calibri"/>
-                                      <w:b/>
-                                      <w:sz w:val="18"/>
-                                      <w:szCs w:val="18"/>
-                                    </w:rPr>
-                                    <w:fldChar w:fldCharType="begin"/>
-                                  </w:r>
-                                  <w:r>
-                                    <w:rPr>
-                                      <w:rFonts w:ascii="Calibri" w:hAnsi="Calibri" w:cs="Calibri"/>
-                                      <w:b/>
-                                      <w:sz w:val="18"/>
-                                      <w:szCs w:val="18"/>
-                                    </w:rPr>
-                                    <w:instrText xml:space="preserve"> MERGEFIELD  p_bruto  \* MERGEFORMAT </w:instrText>
-                                  </w:r>
-                                  <w:r>
-                                    <w:rPr>
-                                      <w:rFonts w:ascii="Calibri" w:hAnsi="Calibri" w:cs="Calibri"/>
-                                      <w:b/>
-                                      <w:sz w:val="18"/>
-                                      <w:szCs w:val="18"/>
-                                    </w:rPr>
-                                    <w:fldChar w:fldCharType="separate"/>
-                                  </w:r>
-                                  <w:r>
-                                    <w:rPr>
-                                      <w:rFonts w:ascii="Calibri" w:hAnsi="Calibri" w:cs="Calibri"/>
-                                      <w:b/>
-                                      <w:noProof/>
-                                      <w:sz w:val="18"/>
-                                      <w:szCs w:val="18"/>
-                                    </w:rPr>
-                                    <w:t>«p_bruto»</w:t>
-                                  </w:r>
-                                  <w:r>
-                                    <w:rPr>
-                                      <w:rFonts w:ascii="Calibri" w:hAnsi="Calibri" w:cs="Calibri"/>
-                                      <w:b/>
-                                      <w:sz w:val="18"/>
-                                      <w:szCs w:val="18"/>
-                                    </w:rPr>
-                                    <w:fldChar w:fldCharType="end"/>
-                                  </w:r>
-                                </w:p>
-                              </w:tc>
-                              <w:tc>
-                                <w:tcPr>
-                                  <w:tcW w:w="1171" w:type="dxa"/>
-                                </w:tcPr>
-                                <w:p>
-                                  <w:pPr>
-                                    <w:spacing w:before="0" w:after="0"/>
-                                    <w:jc w:val="center"/>
-                                    <w:rPr>
-                                      <w:rFonts w:ascii="Aptos Black" w:hAnsi="Aptos Black" w:cs="Calibri"/>
-                                      <w:b/>
-                                      <w:caps/>
-                                      <w:noProof/>
-                                      <w:sz w:val="18"/>
-                                      <w:szCs w:val="18"/>
-                                    </w:rPr>
-                                  </w:pPr>
-                                  <w:r>
-                                    <w:rPr>
-                                      <w:rFonts w:ascii="Calibri" w:hAnsi="Calibri" w:cs="Calibri"/>
-                                      <w:b/>
-                                      <w:sz w:val="18"/>
-                                      <w:szCs w:val="18"/>
-                                    </w:rPr>
-                                    <w:fldChar w:fldCharType="begin"/>
-                                  </w:r>
-                                  <w:r>
-                                    <w:rPr>
-                                      <w:rFonts w:ascii="Calibri" w:hAnsi="Calibri" w:cs="Calibri"/>
-                                      <w:b/>
-                                      <w:sz w:val="18"/>
-                                      <w:szCs w:val="18"/>
-                                    </w:rPr>
-                                    <w:instrText xml:space="preserve"> MERGEFIELD  pneto  \* MERGEFORMAT </w:instrText>
-                                  </w:r>
-                                  <w:r>
-                                    <w:rPr>
-                                      <w:rFonts w:ascii="Calibri" w:hAnsi="Calibri" w:cs="Calibri"/>
-                                      <w:b/>
-                                      <w:sz w:val="18"/>
-                                      <w:szCs w:val="18"/>
-                                    </w:rPr>
-                                    <w:fldChar w:fldCharType="separate"/>
-                                  </w:r>
-                                  <w:r>
-                                    <w:rPr>
-                                      <w:rFonts w:ascii="Calibri" w:hAnsi="Calibri" w:cs="Calibri"/>
-                                      <w:b/>
-                                      <w:noProof/>
-                                      <w:sz w:val="18"/>
-                                      <w:szCs w:val="18"/>
-                                    </w:rPr>
-                                    <w:t>«pneto»</w:t>
-                                  </w:r>
-                                  <w:r>
-                                    <w:rPr>
-                                      <w:rFonts w:ascii="Calibri" w:hAnsi="Calibri" w:cs="Calibri"/>
-                                      <w:b/>
-                                      <w:sz w:val="18"/>
-                                      <w:szCs w:val="18"/>
-                                    </w:rPr>
-                                    <w:fldChar w:fldCharType="end"/>
-                                  </w:r>
-                                </w:p>
-                              </w:tc>
-                              <w:tc>
-                                <w:tcPr>
-                                  <w:tcW w:w="1038" w:type="dxa"/>
-                                  <w:tcBorders>
-                                    <w:right w:val="single" w:sz="4" w:space="0" w:color="auto"/>
-                                  </w:tcBorders>
-                                </w:tcPr>
-                                <w:p>
-                                  <w:pPr>
-                                    <w:spacing w:before="0" w:after="0"/>
-                                    <w:jc w:val="center"/>
-                                    <w:rPr>
-                                      <w:rFonts w:ascii="Aptos Black" w:hAnsi="Aptos Black" w:cs="Calibri"/>
-                                      <w:b/>
-                                      <w:caps/>
-                                      <w:noProof/>
-                                      <w:sz w:val="18"/>
-                                      <w:szCs w:val="18"/>
-                                    </w:rPr>
-                                  </w:pPr>
-                                  <w:r>
-                                    <w:rPr>
-                                      <w:rFonts w:ascii="Calibri" w:hAnsi="Calibri" w:cs="Calibri"/>
-                                      <w:b/>
-                                      <w:sz w:val="18"/>
-                                      <w:szCs w:val="18"/>
-                                    </w:rPr>
-                                    <w:fldChar w:fldCharType="begin"/>
-                                  </w:r>
-                                  <w:r>
-                                    <w:rPr>
-                                      <w:rFonts w:ascii="Calibri" w:hAnsi="Calibri" w:cs="Calibri"/>
-                                      <w:b/>
-                                      <w:sz w:val="18"/>
-                                      <w:szCs w:val="18"/>
-                                    </w:rPr>
-                                    <w:instrText xml:space="preserve"> MERGEFIELD  tipoley  \* MERGEFORMAT </w:instrText>
-                                  </w:r>
-                                  <w:r>
-                                    <w:rPr>
-                                      <w:rFonts w:ascii="Calibri" w:hAnsi="Calibri" w:cs="Calibri"/>
-                                      <w:b/>
-                                      <w:sz w:val="18"/>
-                                      <w:szCs w:val="18"/>
-                                    </w:rPr>
-                                    <w:fldChar w:fldCharType="separate"/>
-                                  </w:r>
-                                  <w:r>
-                                    <w:rPr>
-                                      <w:rFonts w:ascii="Calibri" w:hAnsi="Calibri" w:cs="Calibri"/>
-                                      <w:b/>
-                                      <w:noProof/>
-                                      <w:sz w:val="18"/>
-                                      <w:szCs w:val="18"/>
-                                    </w:rPr>
-                                    <w:t>«tipoley»</w:t>
-                                  </w:r>
-                                  <w:r>
-                                    <w:rPr>
-                                      <w:rFonts w:ascii="Calibri" w:hAnsi="Calibri" w:cs="Calibri"/>
-                                      <w:b/>
-                                      <w:sz w:val="18"/>
-                                      <w:szCs w:val="18"/>
-                                    </w:rPr>
-                                    <w:fldChar w:fldCharType="end"/>
-                                  </w:r>
-                                  <w:r>
-                                    <w:rPr>
-                                      <w:rFonts w:ascii="Calibri" w:hAnsi="Calibri" w:cs="Calibri"/>
-                                      <w:b/>
-                                      <w:caps/>
-                                      <w:noProof/>
-                                      <w:sz w:val="2"/>
-                                      <w:szCs w:val="2"/>
-                                    </w:rPr>
-                                    <w:fldChar w:fldCharType="begin"/>
-                                  </w:r>
-                                  <w:r>
-                                    <w:rPr>
-                                      <w:rFonts w:ascii="Calibri" w:hAnsi="Calibri" w:cs="Calibri"/>
-                                      <w:b/>
-                                      <w:caps/>
-                                      <w:noProof/>
-                                      <w:sz w:val="2"/>
-                                      <w:szCs w:val="2"/>
-                                    </w:rPr>
-                                    <w:instrText xml:space="preserve"> MERGEFIELD  TableEnd:placas1 \* Lower  \* MERGEFORMAT </w:instrText>
-                                  </w:r>
-                                  <w:r>
-                                    <w:rPr>
-                                      <w:rFonts w:ascii="Calibri" w:hAnsi="Calibri" w:cs="Calibri"/>
-                                      <w:b/>
-                                      <w:caps/>
-                                      <w:noProof/>
-                                      <w:sz w:val="2"/>
-                                      <w:szCs w:val="2"/>
-                                    </w:rPr>
-                                    <w:fldChar w:fldCharType="separate"/>
-                                  </w:r>
-                                  <w:r>
-                                    <w:rPr>
-                                      <w:rFonts w:ascii="Calibri" w:hAnsi="Calibri" w:cs="Calibri"/>
-                                      <w:b/>
-                                      <w:noProof/>
-                                      <w:sz w:val="2"/>
-                                      <w:szCs w:val="2"/>
-                                    </w:rPr>
-                                    <w:t>«tableend:placas1»</w:t>
-                                  </w:r>
-                                  <w:r>
-                                    <w:rPr>
-                                      <w:rFonts w:ascii="Calibri" w:hAnsi="Calibri" w:cs="Calibri"/>
-                                      <w:b/>
-                                      <w:caps/>
-                                      <w:noProof/>
-                                      <w:sz w:val="2"/>
-                                      <w:szCs w:val="2"/>
-                                    </w:rPr>
-                                    <w:fldChar w:fldCharType="end"/>
-                                  </w:r>
-                                </w:p>
-                              </w:tc>
-                            </w:tr>
-                          </w:tbl>
-                          <w:p>
-                            <w:pPr>
-                              <w:spacing w:before="0" w:after="0"/>
-                              <w:rPr>
-                                <w:rFonts w:ascii="Calibri" w:hAnsi="Calibri" w:cs="Calibri"/>
-                                <w:b/>
-                                <w:caps/>
-                                <w:noProof/>
-                                <w:sz w:val="2"/>
-                                <w:szCs w:val="2"/>
-                              </w:rPr>
-                            </w:pPr>
-                          </w:p>
-                          <w:tbl>
-                            <w:tblPr>
-                              <w:tblStyle w:val="Tablaconcuadrcula"/>
-                              <w:tblW w:w="0" w:type="auto"/>
-                              <w:tblBorders>
-                                <w:top w:val="none" w:sz="0" w:space="0" w:color="auto"/>
-                                <w:left w:val="none" w:sz="0" w:space="0" w:color="auto"/>
-                                <w:bottom w:val="none" w:sz="0" w:space="0" w:color="auto"/>
-                                <w:right w:val="none" w:sz="0" w:space="0" w:color="auto"/>
-                                <w:insideH w:val="none" w:sz="0" w:space="0" w:color="auto"/>
-                                <w:insideV w:val="none" w:sz="0" w:space="0" w:color="auto"/>
-                              </w:tblBorders>
-                              <w:tblLook w:val="04A0" w:firstRow="1" w:lastRow="0" w:firstColumn="1" w:lastColumn="0" w:noHBand="0" w:noVBand="1"/>
-                            </w:tblPr>
-                            <w:tblGrid>
-                              <w:gridCol w:w="2081"/>
-                              <w:gridCol w:w="2213"/>
-                            </w:tblGrid>
-                            <w:tr>
-                              <w:tc>
-                                <w:tcPr>
-                                  <w:tcW w:w="2081" w:type="dxa"/>
-                                  <w:tcBorders>
-                                    <w:top w:val="single" w:sz="4" w:space="0" w:color="auto"/>
-                                  </w:tcBorders>
-                                </w:tcPr>
-                                <w:p>
-                                  <w:pPr>
-                                    <w:spacing w:before="0" w:after="0"/>
-                                    <w:rPr>
-                                      <w:rFonts w:ascii="Calibri" w:hAnsi="Calibri" w:cs="Calibri"/>
-                                      <w:b/>
-                                      <w:caps/>
-                                      <w:noProof/>
-                                      <w:sz w:val="22"/>
-                                      <w:szCs w:val="22"/>
-                                    </w:rPr>
-                                  </w:pPr>
-                                  <w:r>
-                                    <w:rPr>
-                                      <w:rFonts w:ascii="Calibri" w:hAnsi="Calibri" w:cs="Calibri"/>
-                                      <w:b/>
-                                      <w:caps/>
-                                      <w:noProof/>
-                                      <w:sz w:val="22"/>
-                                      <w:szCs w:val="22"/>
-                                    </w:rPr>
-                                    <w:t>SUB-TOTAL  – 1</w:t>
-                                  </w:r>
-                                </w:p>
-                              </w:tc>
-                              <w:tc>
-                                <w:tcPr>
-                                  <w:tcW w:w="2213" w:type="dxa"/>
-                                </w:tcPr>
-                                <w:p>
-                                  <w:pPr>
-                                    <w:spacing w:before="0" w:after="0"/>
-                                    <w:ind w:right="33"/>
-                                    <w:rPr>
-                                      <w:rFonts w:ascii="Calibri" w:hAnsi="Calibri" w:cs="Calibri"/>
-                                      <w:b/>
-                                      <w:bCs/>
-                                      <w:caps/>
-                                      <w:noProof/>
-                                      <w:sz w:val="22"/>
-                                      <w:szCs w:val="22"/>
-                                    </w:rPr>
-                                  </w:pPr>
-                                  <w:r>
-                                    <w:rPr>
-                                      <w:rFonts w:ascii="Calibri" w:hAnsi="Calibri" w:cs="Calibri"/>
-                                      <w:b/>
-                                      <w:bCs/>
-                                      <w:sz w:val="22"/>
-                                      <w:szCs w:val="22"/>
-                                    </w:rPr>
-                                    <w:fldChar w:fldCharType="begin"/>
-                                  </w:r>
-                                  <w:r>
-                                    <w:rPr>
-                                      <w:rFonts w:ascii="Calibri" w:hAnsi="Calibri" w:cs="Calibri"/>
-                                      <w:b/>
-                                      <w:bCs/>
-                                      <w:sz w:val="22"/>
-                                      <w:szCs w:val="22"/>
-                                    </w:rPr>
-                                    <w:instrText xml:space="preserve"> MERGEFIELD  total_neto_placa1  \* MERGEFORMAT </w:instrText>
-                                  </w:r>
-                                  <w:r>
-                                    <w:rPr>
-                                      <w:rFonts w:ascii="Calibri" w:hAnsi="Calibri" w:cs="Calibri"/>
-                                      <w:b/>
-                                      <w:bCs/>
-                                      <w:sz w:val="22"/>
-                                      <w:szCs w:val="22"/>
-                                    </w:rPr>
-                                    <w:fldChar w:fldCharType="separate"/>
-                                  </w:r>
-                                  <w:r>
-                                    <w:rPr>
-                                      <w:rFonts w:ascii="Calibri" w:hAnsi="Calibri" w:cs="Calibri"/>
-                                      <w:b/>
-                                      <w:bCs/>
-                                      <w:noProof/>
-                                      <w:sz w:val="22"/>
-                                      <w:szCs w:val="22"/>
-                                    </w:rPr>
-                                    <w:t>«total_neto_placa1»</w:t>
-                                  </w:r>
-                                  <w:r>
-                                    <w:rPr>
-                                      <w:rFonts w:ascii="Calibri" w:hAnsi="Calibri" w:cs="Calibri"/>
-                                      <w:b/>
-                                      <w:bCs/>
-                                      <w:sz w:val="22"/>
-                                      <w:szCs w:val="22"/>
-                                    </w:rPr>
-                                    <w:fldChar w:fldCharType="end"/>
-                                  </w:r>
-                                </w:p>
-                              </w:tc>
-                            </w:tr>
-                          </w:tbl>
-                          <w:p>
-                            <w:pPr>
-                              <w:jc w:val="center"/>
-                            </w:pPr>
-                          </w:p>
-                        </w:txbxContent>
-                      </wps:txbx>
-                      <wps:bodyPr rot="0" spcFirstLastPara="0" vertOverflow="overflow" horzOverflow="overflow" vert="horz" wrap="square" lIns="91440" tIns="45720" rIns="91440" bIns="45720" numCol="1" spcCol="0" rtlCol="0" fromWordArt="0" anchor="ctr" anchorCtr="0" forceAA="0" compatLnSpc="1">
-                        <a:prstTxWarp prst="textNoShape">
-                          <a:avLst/>
-                        </a:prstTxWarp>
-                        <a:noAutofit/>
-                      </wps:bodyPr>
-                    </wps:wsp>
-                  </a:graphicData>
-                </a:graphic>
-              </wp:anchor>
-            </w:drawing>
-          </mc:Choice>
-          <mc:Fallback>
-            <w:pict>
-              <v:rect w14:anchorId="5990CF46" id="_x0000_s1028" style="position:absolute;left:0;text-align:left;margin-left:.05pt;margin-top:.35pt;width:231.1pt;height:87.4pt;z-index:-251650048;visibility:visible;mso-wrap-style:square;mso-wrap-distance-left:9pt;mso-wrap-distance-top:0;mso-wrap-distance-right:9pt;mso-wrap-distance-bottom:0;mso-position-horizontal:absolute;mso-position-horizontal-relative:text;mso-position-vertical:absolute;mso-position-vertical-relative:text;v-text-anchor:middle" o:gfxdata="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" filled="f" stroked="f">
-                <v:textbox>
-                  <w:txbxContent>
-                    <w:tbl>
-                      <w:tblPr>
-                        <w:tblStyle w:val="Tablaconcuadrcula"/>
-                        <w:tblW w:w="0" w:type="auto"/>
-                        <w:tblLook w:val="04A0" w:firstRow="1" w:lastRow="0" w:firstColumn="1" w:lastColumn="0" w:noHBand="0" w:noVBand="1"/>
-                      </w:tblPr>
-                      <w:tblGrid>
-                        <w:gridCol w:w="987"/>
-                        <w:gridCol w:w="1095"/>
-                        <w:gridCol w:w="1164"/>
-                        <w:gridCol w:w="1093"/>
-                      </w:tblGrid>
-                      <w:tr>
                         <w:tc>
                           <w:tcPr>
-                            <w:tcW w:w="4294" w:type="dxa"/>
-                            <w:gridSpan w:val="4"/>
+                            <w:tcW w:w="387" w:type="dxa"/>
                             <w:tcBorders>
-                              <w:right w:val="single" w:sz="4" w:space="0" w:color="auto"/>
+                              <w:top w:val="nil"/>
+                              <w:left w:val="nil"/>
+                              <w:bottom w:val="nil"/>
+                              <w:right w:val="nil"/>
                             </w:tcBorders>
                           </w:tcPr>
                           <w:p>
@@ -5028,157 +4403,20 @@
                                 <w:rFonts w:ascii="Calibri" w:hAnsi="Calibri" w:cs="Calibri"/>
                                 <w:b/>
                                 <w:bCs/>
-                                <w:caps/>
-                                <w:noProof/>
-                                <w:sz w:val="18"/>
-                                <w:szCs w:val="18"/>
+                                <w:sz w:val="22"/>
+                                <w:szCs w:val="22"/>
                               </w:rPr>
                             </w:pPr>
-                            <w:r>
-                              <w:rPr>
-                                <w:b/>
-                                <w:bCs/>
-                                <w:sz w:val="18"/>
-                                <w:szCs w:val="18"/>
-                              </w:rPr>
-                              <w:fldChar w:fldCharType="begin"/>
-                            </w:r>
-                            <w:r>
-                              <w:rPr>
-                                <w:b/>
-                                <w:bCs/>
-                                <w:sz w:val="18"/>
-                                <w:szCs w:val="18"/>
-                              </w:rPr>
-                              <w:instrText xml:space="preserve"> MERGEFIELD  placa1  \* MERGEFORMAT </w:instrText>
-                            </w:r>
-                            <w:r>
-                              <w:rPr>
-                                <w:b/>
-                                <w:bCs/>
-                                <w:sz w:val="18"/>
-                                <w:szCs w:val="18"/>
-                              </w:rPr>
-                              <w:fldChar w:fldCharType="separate"/>
-                            </w:r>
-                            <w:r>
-                              <w:rPr>
-                                <w:b/>
-                                <w:bCs/>
-                                <w:noProof/>
-                                <w:sz w:val="18"/>
-                                <w:szCs w:val="18"/>
-                              </w:rPr>
-                              <w:t>«placa1»</w:t>
-                            </w:r>
-                            <w:r>
-                              <w:rPr>
-                                <w:b/>
-                                <w:bCs/>
-                                <w:sz w:val="18"/>
-                                <w:szCs w:val="18"/>
-                              </w:rPr>
-                              <w:fldChar w:fldCharType="end"/>
-                            </w:r>
-                          </w:p>
-                        </w:tc>
-                      </w:tr>
-                      <w:tr>
-                        <w:tc>
-                          <w:tcPr>
-                            <w:tcW w:w="988" w:type="dxa"/>
-                          </w:tcPr>
-                          <w:p>
-                            <w:pPr>
-                              <w:spacing w:before="0" w:after="0"/>
-                              <w:jc w:val="center"/>
-                              <w:rPr>
-                                <w:rFonts w:ascii="Aptos Black" w:hAnsi="Aptos Black" w:cs="Calibri"/>
-                                <w:b/>
-                                <w:caps/>
-                                <w:noProof/>
-                                <w:sz w:val="18"/>
-                                <w:szCs w:val="18"/>
-                              </w:rPr>
-                            </w:pPr>
-                            <w:r>
-                              <w:rPr>
-                                <w:rFonts w:ascii="Aptos Black" w:hAnsi="Aptos Black" w:cs="Calibri"/>
-                                <w:b/>
-                                <w:caps/>
-                                <w:noProof/>
-                                <w:sz w:val="18"/>
-                                <w:szCs w:val="18"/>
-                              </w:rPr>
-                              <w:t>VIAJE</w:t>
-                            </w:r>
                           </w:p>
                         </w:tc>
                         <w:tc>
                           <w:tcPr>
-                            <w:tcW w:w="1097" w:type="dxa"/>
-                          </w:tcPr>
-                          <w:p>
-                            <w:pPr>
-                              <w:spacing w:before="0" w:after="0"/>
-                              <w:jc w:val="center"/>
-                              <w:rPr>
-                                <w:rFonts w:ascii="Aptos Black" w:hAnsi="Aptos Black" w:cs="Calibri"/>
-                                <w:b/>
-                                <w:caps/>
-                                <w:noProof/>
-                                <w:sz w:val="18"/>
-                                <w:szCs w:val="18"/>
-                              </w:rPr>
-                            </w:pPr>
-                            <w:r>
-                              <w:rPr>
-                                <w:rFonts w:ascii="Aptos Black" w:hAnsi="Aptos Black" w:cs="Calibri"/>
-                                <w:b/>
-                                <w:caps/>
-                                <w:noProof/>
-                                <w:sz w:val="18"/>
-                                <w:szCs w:val="18"/>
-                              </w:rPr>
-                              <w:t>PESO BRUTO</w:t>
-                            </w:r>
-                          </w:p>
-                        </w:tc>
-                        <w:tc>
-                          <w:tcPr>
-                            <w:tcW w:w="1171" w:type="dxa"/>
-                          </w:tcPr>
-                          <w:p>
-                            <w:pPr>
-                              <w:spacing w:before="0" w:after="0"/>
-                              <w:jc w:val="center"/>
-                              <w:rPr>
-                                <w:rFonts w:ascii="Aptos Black" w:hAnsi="Aptos Black" w:cs="Calibri"/>
-                                <w:b/>
-                                <w:caps/>
-                                <w:noProof/>
-                                <w:sz w:val="18"/>
-                                <w:szCs w:val="18"/>
-                              </w:rPr>
-                            </w:pPr>
-                            <w:r>
-                              <w:rPr>
-                                <w:rFonts w:ascii="Aptos Black" w:hAnsi="Aptos Black" w:cs="Calibri"/>
-                                <w:b/>
-                                <w:caps/>
-                                <w:noProof/>
-                                <w:sz w:val="18"/>
-                                <w:szCs w:val="18"/>
-                              </w:rPr>
-                              <w:t>PESO NETO</w:t>
-                            </w:r>
-                          </w:p>
-                        </w:tc>
-                        <w:tc>
-                          <w:tcPr>
-                            <w:tcW w:w="1038" w:type="dxa"/>
+                            <w:tcW w:w="1172" w:type="dxa"/>
                             <w:tcBorders>
-                              <w:right w:val="single" w:sz="4" w:space="0" w:color="auto"/>
+                              <w:top w:val="nil"/>
+                              <w:left w:val="nil"/>
+                              <w:bottom w:val="nil"/>
+                              <w:right w:val="nil"/>
                             </w:tcBorders>
                           </w:tcPr>
                           <w:p>
@@ -5186,547 +4424,21 @@
                               <w:spacing w:before="0" w:after="0"/>
                               <w:jc w:val="center"/>
                               <w:rPr>
-                                <w:rFonts w:ascii="Aptos Black" w:hAnsi="Aptos Black" w:cs="Calibri"/>
-                                <w:b/>
-                                <w:caps/>
-                                <w:noProof/>
-                                <w:sz w:val="18"/>
-                                <w:szCs w:val="18"/>
-                              </w:rPr>
-                            </w:pPr>
-                            <w:r>
-                              <w:rPr>
-                                <w:rFonts w:ascii="Aptos Black" w:hAnsi="Aptos Black" w:cs="Calibri"/>
-                                <w:b/>
-                                <w:caps/>
-                                <w:noProof/>
-                                <w:sz w:val="18"/>
-                                <w:szCs w:val="18"/>
-                              </w:rPr>
-                              <w:t>TIPO</w:t>
-                            </w:r>
-                          </w:p>
-                        </w:tc>
-                      </w:tr>
-                      <w:tr>
-                        <w:tc>
-                          <w:tcPr>
-                            <w:tcW w:w="988" w:type="dxa"/>
-                          </w:tcPr>
-                          <w:p>
-                            <w:pPr>
-                              <w:spacing w:before="0" w:after="0"/>
-                              <w:jc w:val="center"/>
-                              <w:rPr>
-                                <w:rFonts w:ascii="Aptos Black" w:hAnsi="Aptos Black" w:cs="Calibri"/>
-                                <w:b/>
-                                <w:caps/>
-                                <w:noProof/>
-                                <w:sz w:val="18"/>
-                                <w:szCs w:val="18"/>
-                              </w:rPr>
-                            </w:pPr>
-                            <w:r>
-                              <w:rPr>
-                                <w:rFonts w:ascii="Calibri" w:hAnsi="Calibri" w:cs="Calibri"/>
-                                <w:b/>
-                                <w:caps/>
-                                <w:noProof/>
-                                <w:sz w:val="2"/>
-                                <w:szCs w:val="2"/>
-                              </w:rPr>
-                              <w:fldChar w:fldCharType="begin"/>
-                            </w:r>
-                            <w:r>
-                              <w:rPr>
-                                <w:rFonts w:ascii="Calibri" w:hAnsi="Calibri" w:cs="Calibri"/>
-                                <w:b/>
-                                <w:caps/>
-                                <w:noProof/>
-                                <w:sz w:val="2"/>
-                                <w:szCs w:val="2"/>
-                              </w:rPr>
-                              <w:instrText xml:space="preserve"> MERGEFIELD  TableStart:placas1 \* Lower  \* MERGEFORMAT </w:instrText>
-                            </w:r>
-                            <w:r>
-                              <w:rPr>
-                                <w:rFonts w:ascii="Calibri" w:hAnsi="Calibri" w:cs="Calibri"/>
-                                <w:b/>
-                                <w:caps/>
-                                <w:noProof/>
-                                <w:sz w:val="2"/>
-                                <w:szCs w:val="2"/>
-                              </w:rPr>
-                              <w:fldChar w:fldCharType="separate"/>
-                            </w:r>
-                            <w:r>
-                              <w:rPr>
-                                <w:rFonts w:ascii="Calibri" w:hAnsi="Calibri" w:cs="Calibri"/>
-                                <w:b/>
-                                <w:noProof/>
-                                <w:sz w:val="2"/>
-                                <w:szCs w:val="2"/>
-                              </w:rPr>
-                              <w:t>«tablestart:placas1»</w:t>
-                            </w:r>
-                            <w:r>
-                              <w:rPr>
-                                <w:rFonts w:ascii="Calibri" w:hAnsi="Calibri" w:cs="Calibri"/>
-                                <w:b/>
-                                <w:caps/>
-                                <w:noProof/>
-                                <w:sz w:val="2"/>
-                                <w:szCs w:val="2"/>
-                              </w:rPr>
-                              <w:fldChar w:fldCharType="end"/>
-                            </w:r>
-                            <w:r>
-                              <w:rPr>
-                                <w:rFonts w:ascii="Calibri" w:hAnsi="Calibri" w:cs="Calibri"/>
-                                <w:b/>
-                                <w:sz w:val="18"/>
-                                <w:szCs w:val="18"/>
-                              </w:rPr>
-                              <w:fldChar w:fldCharType="begin"/>
-                            </w:r>
-                            <w:r>
-                              <w:rPr>
-                                <w:rFonts w:ascii="Calibri" w:hAnsi="Calibri" w:cs="Calibri"/>
-                                <w:b/>
-                                <w:sz w:val="18"/>
-                                <w:szCs w:val="18"/>
-                              </w:rPr>
-                              <w:instrText xml:space="preserve"> MERGEFIELD  item  \* MERGEFORMAT </w:instrText>
-                            </w:r>
-                            <w:r>
-                              <w:rPr>
-                                <w:rFonts w:ascii="Calibri" w:hAnsi="Calibri" w:cs="Calibri"/>
-                                <w:b/>
-                                <w:sz w:val="18"/>
-                                <w:szCs w:val="18"/>
-                              </w:rPr>
-                              <w:fldChar w:fldCharType="separate"/>
-                            </w:r>
-                            <w:r>
-                              <w:rPr>
-                                <w:rFonts w:ascii="Calibri" w:hAnsi="Calibri" w:cs="Calibri"/>
-                                <w:b/>
-                                <w:noProof/>
-                                <w:sz w:val="18"/>
-                                <w:szCs w:val="18"/>
-                              </w:rPr>
-                              <w:t>«item»</w:t>
-                            </w:r>
-                            <w:r>
-                              <w:rPr>
-                                <w:rFonts w:ascii="Calibri" w:hAnsi="Calibri" w:cs="Calibri"/>
-                                <w:b/>
-                                <w:sz w:val="18"/>
-                                <w:szCs w:val="18"/>
-                              </w:rPr>
-                              <w:fldChar w:fldCharType="end"/>
-                            </w:r>
-                          </w:p>
-                        </w:tc>
-                        <w:tc>
-                          <w:tcPr>
-                            <w:tcW w:w="1097" w:type="dxa"/>
-                          </w:tcPr>
-                          <w:p>
-                            <w:pPr>
-                              <w:spacing w:before="0" w:after="0"/>
-                              <w:jc w:val="center"/>
-                              <w:rPr>
-                                <w:rFonts w:ascii="Aptos Black" w:hAnsi="Aptos Black" w:cs="Calibri"/>
-                                <w:b/>
-                                <w:caps/>
-                                <w:noProof/>
-                                <w:sz w:val="18"/>
-                                <w:szCs w:val="18"/>
-                              </w:rPr>
-                            </w:pPr>
-                            <w:r>
-                              <w:rPr>
-                                <w:rFonts w:ascii="Calibri" w:hAnsi="Calibri" w:cs="Calibri"/>
-                                <w:b/>
-                                <w:sz w:val="18"/>
-                                <w:szCs w:val="18"/>
-                              </w:rPr>
-                              <w:fldChar w:fldCharType="begin"/>
-                            </w:r>
-                            <w:r>
-                              <w:rPr>
-                                <w:rFonts w:ascii="Calibri" w:hAnsi="Calibri" w:cs="Calibri"/>
-                                <w:b/>
-                                <w:sz w:val="18"/>
-                                <w:szCs w:val="18"/>
-                              </w:rPr>
-                              <w:instrText xml:space="preserve"> MERGEFIELD  p_bruto  \* MERGEFORMAT </w:instrText>
-                            </w:r>
-                            <w:r>
-                              <w:rPr>
-                                <w:rFonts w:ascii="Calibri" w:hAnsi="Calibri" w:cs="Calibri"/>
-                                <w:b/>
-                                <w:sz w:val="18"/>
-                                <w:szCs w:val="18"/>
-                              </w:rPr>
-                              <w:fldChar w:fldCharType="separate"/>
-                            </w:r>
-                            <w:r>
-                              <w:rPr>
-                                <w:rFonts w:ascii="Calibri" w:hAnsi="Calibri" w:cs="Calibri"/>
-                                <w:b/>
-                                <w:noProof/>
-                                <w:sz w:val="18"/>
-                                <w:szCs w:val="18"/>
-                              </w:rPr>
-                              <w:t>«p_bruto»</w:t>
-                            </w:r>
-                            <w:r>
-                              <w:rPr>
-                                <w:rFonts w:ascii="Calibri" w:hAnsi="Calibri" w:cs="Calibri"/>
-                                <w:b/>
-                                <w:sz w:val="18"/>
-                                <w:szCs w:val="18"/>
-                              </w:rPr>
-                              <w:fldChar w:fldCharType="end"/>
-                            </w:r>
-                          </w:p>
-                        </w:tc>
-                        <w:tc>
-                          <w:tcPr>
-                            <w:tcW w:w="1171" w:type="dxa"/>
-                          </w:tcPr>
-                          <w:p>
-                            <w:pPr>
-                              <w:spacing w:before="0" w:after="0"/>
-                              <w:jc w:val="center"/>
-                              <w:rPr>
-                                <w:rFonts w:ascii="Aptos Black" w:hAnsi="Aptos Black" w:cs="Calibri"/>
-                                <w:b/>
-                                <w:caps/>
-                                <w:noProof/>
-                                <w:sz w:val="18"/>
-                                <w:szCs w:val="18"/>
-                              </w:rPr>
-                            </w:pPr>
-                            <w:r>
-                              <w:rPr>
-                                <w:rFonts w:ascii="Calibri" w:hAnsi="Calibri" w:cs="Calibri"/>
-                                <w:b/>
-                                <w:sz w:val="18"/>
-                                <w:szCs w:val="18"/>
-                              </w:rPr>
-                              <w:fldChar w:fldCharType="begin"/>
-                            </w:r>
-                            <w:r>
-                              <w:rPr>
-                                <w:rFonts w:ascii="Calibri" w:hAnsi="Calibri" w:cs="Calibri"/>
-                                <w:b/>
-                                <w:sz w:val="18"/>
-                                <w:szCs w:val="18"/>
-                              </w:rPr>
-                              <w:instrText xml:space="preserve"> MERGEFIELD  pneto  \* MERGEFORMAT </w:instrText>
-                            </w:r>
-                            <w:r>
-                              <w:rPr>
-                                <w:rFonts w:ascii="Calibri" w:hAnsi="Calibri" w:cs="Calibri"/>
-                                <w:b/>
-                                <w:sz w:val="18"/>
-                                <w:szCs w:val="18"/>
-                              </w:rPr>
-                              <w:fldChar w:fldCharType="separate"/>
-                            </w:r>
-                            <w:r>
-                              <w:rPr>
-                                <w:rFonts w:ascii="Calibri" w:hAnsi="Calibri" w:cs="Calibri"/>
-                                <w:b/>
-                                <w:noProof/>
-                                <w:sz w:val="18"/>
-                                <w:szCs w:val="18"/>
-                              </w:rPr>
-                              <w:t>«pneto»</w:t>
-                            </w:r>
-                            <w:r>
-                              <w:rPr>
-                                <w:rFonts w:ascii="Calibri" w:hAnsi="Calibri" w:cs="Calibri"/>
-                                <w:b/>
-                                <w:sz w:val="18"/>
-                                <w:szCs w:val="18"/>
-                              </w:rPr>
-                              <w:fldChar w:fldCharType="end"/>
-                            </w:r>
-                          </w:p>
-                        </w:tc>
-                        <w:tc>
-                          <w:tcPr>
-                            <w:tcW w:w="1038" w:type="dxa"/>
-                            <w:tcBorders>
-                              <w:right w:val="single" w:sz="4" w:space="0" w:color="auto"/>
-                            </w:tcBorders>
-                          </w:tcPr>
-                          <w:p>
-                            <w:pPr>
-                              <w:spacing w:before="0" w:after="0"/>
-                              <w:jc w:val="center"/>
-                              <w:rPr>
-                                <w:rFonts w:ascii="Aptos Black" w:hAnsi="Aptos Black" w:cs="Calibri"/>
-                                <w:b/>
-                                <w:caps/>
-                                <w:noProof/>
-                                <w:sz w:val="18"/>
-                                <w:szCs w:val="18"/>
-                              </w:rPr>
-                            </w:pPr>
-                            <w:r>
-                              <w:rPr>
-                                <w:rFonts w:ascii="Calibri" w:hAnsi="Calibri" w:cs="Calibri"/>
-                                <w:b/>
-                                <w:sz w:val="18"/>
-                                <w:szCs w:val="18"/>
-                              </w:rPr>
-                              <w:fldChar w:fldCharType="begin"/>
-                            </w:r>
-                            <w:r>
-                              <w:rPr>
-                                <w:rFonts w:ascii="Calibri" w:hAnsi="Calibri" w:cs="Calibri"/>
-                                <w:b/>
-                                <w:sz w:val="18"/>
-                                <w:szCs w:val="18"/>
-                              </w:rPr>
-                              <w:instrText xml:space="preserve"> MERGEFIELD  tipoley  \* MERGEFORMAT </w:instrText>
-                            </w:r>
-                            <w:r>
-                              <w:rPr>
-                                <w:rFonts w:ascii="Calibri" w:hAnsi="Calibri" w:cs="Calibri"/>
-                                <w:b/>
-                                <w:sz w:val="18"/>
-                                <w:szCs w:val="18"/>
-                              </w:rPr>
-                              <w:fldChar w:fldCharType="separate"/>
-                            </w:r>
-                            <w:r>
-                              <w:rPr>
-                                <w:rFonts w:ascii="Calibri" w:hAnsi="Calibri" w:cs="Calibri"/>
-                                <w:b/>
-                                <w:noProof/>
-                                <w:sz w:val="18"/>
-                                <w:szCs w:val="18"/>
-                              </w:rPr>
-                              <w:t>«tipoley»</w:t>
-                            </w:r>
-                            <w:r>
-                              <w:rPr>
-                                <w:rFonts w:ascii="Calibri" w:hAnsi="Calibri" w:cs="Calibri"/>
-                                <w:b/>
-                                <w:sz w:val="18"/>
-                                <w:szCs w:val="18"/>
-                              </w:rPr>
-                              <w:fldChar w:fldCharType="end"/>
-                            </w:r>
-                            <w:r>
-                              <w:rPr>
-                                <w:rFonts w:ascii="Calibri" w:hAnsi="Calibri" w:cs="Calibri"/>
-                                <w:b/>
-                                <w:caps/>
-                                <w:noProof/>
-                                <w:sz w:val="2"/>
-                                <w:szCs w:val="2"/>
-                              </w:rPr>
-                              <w:fldChar w:fldCharType="begin"/>
-                            </w:r>
-                            <w:r>
-                              <w:rPr>
-                                <w:rFonts w:ascii="Calibri" w:hAnsi="Calibri" w:cs="Calibri"/>
-                                <w:b/>
-                                <w:caps/>
-                                <w:noProof/>
-                                <w:sz w:val="2"/>
-                                <w:szCs w:val="2"/>
-                              </w:rPr>
-                              <w:instrText xml:space="preserve"> MERGEFIELD  TableEnd:placas1 \* Lower  \* MERGEFORMAT </w:instrText>
-                            </w:r>
-                            <w:r>
-                              <w:rPr>
-                                <w:rFonts w:ascii="Calibri" w:hAnsi="Calibri" w:cs="Calibri"/>
-                                <w:b/>
-                                <w:caps/>
-                                <w:noProof/>
-                                <w:sz w:val="2"/>
-                                <w:szCs w:val="2"/>
-                              </w:rPr>
-                              <w:fldChar w:fldCharType="separate"/>
-                            </w:r>
-                            <w:r>
-                              <w:rPr>
-                                <w:rFonts w:ascii="Calibri" w:hAnsi="Calibri" w:cs="Calibri"/>
-                                <w:b/>
-                                <w:noProof/>
-                                <w:sz w:val="2"/>
-                                <w:szCs w:val="2"/>
-                              </w:rPr>
-                              <w:t>«tableend:placas1»</w:t>
-                            </w:r>
-                            <w:r>
-                              <w:rPr>
-                                <w:rFonts w:ascii="Calibri" w:hAnsi="Calibri" w:cs="Calibri"/>
-                                <w:b/>
-                                <w:caps/>
-                                <w:noProof/>
-                                <w:sz w:val="2"/>
-                                <w:szCs w:val="2"/>
-                              </w:rPr>
-                              <w:fldChar w:fldCharType="end"/>
-                            </w:r>
-                          </w:p>
-                        </w:tc>
-                      </w:tr>
-                    </w:tbl>
-                    <w:p>
-                      <w:pPr>
-                        <w:spacing w:before="0" w:after="0"/>
-                        <w:rPr>
-                          <w:rFonts w:ascii="Calibri" w:hAnsi="Calibri" w:cs="Calibri"/>
-                          <w:b/>
-                          <w:caps/>
-                          <w:noProof/>
-                          <w:sz w:val="2"/>
-                          <w:szCs w:val="2"/>
-                        </w:rPr>
-                      </w:pPr>
-                    </w:p>
-                    <w:tbl>
-                      <w:tblPr>
-                        <w:tblStyle w:val="Tablaconcuadrcula"/>
-                        <w:tblW w:w="0" w:type="auto"/>
-                        <w:tblBorders>
-                          <w:top w:val="none" w:sz="0" w:space="0" w:color="auto"/>
-                          <w:left w:val="none" w:sz="0" w:space="0" w:color="auto"/>
-                          <w:bottom w:val="none" w:sz="0" w:space="0" w:color="auto"/>
-                          <w:right w:val="none" w:sz="0" w:space="0" w:color="auto"/>
-                          <w:insideH w:val="none" w:sz="0" w:space="0" w:color="auto"/>
-                          <w:insideV w:val="none" w:sz="0" w:space="0" w:color="auto"/>
-                        </w:tblBorders>
-                        <w:tblLook w:val="04A0" w:firstRow="1" w:lastRow="0" w:firstColumn="1" w:lastColumn="0" w:noHBand="0" w:noVBand="1"/>
-                      </w:tblPr>
-                      <w:tblGrid>
-                        <w:gridCol w:w="2081"/>
-                        <w:gridCol w:w="2213"/>
-                      </w:tblGrid>
-                      <w:tr>
-                        <w:tc>
-                          <w:tcPr>
-                            <w:tcW w:w="2081" w:type="dxa"/>
-                            <w:tcBorders>
-                              <w:top w:val="single" w:sz="4" w:space="0" w:color="auto"/>
-                            </w:tcBorders>
-                          </w:tcPr>
-                          <w:p>
-                            <w:pPr>
-                              <w:spacing w:before="0" w:after="0"/>
-                              <w:rPr>
-                                <w:rFonts w:ascii="Calibri" w:hAnsi="Calibri" w:cs="Calibri"/>
-                                <w:b/>
-                                <w:caps/>
-                                <w:noProof/>
-                                <w:sz w:val="22"/>
-                                <w:szCs w:val="22"/>
-                              </w:rPr>
-                            </w:pPr>
-                            <w:r>
-                              <w:rPr>
-                                <w:rFonts w:ascii="Calibri" w:hAnsi="Calibri" w:cs="Calibri"/>
-                                <w:b/>
-                                <w:caps/>
-                                <w:noProof/>
-                                <w:sz w:val="22"/>
-                                <w:szCs w:val="22"/>
-                              </w:rPr>
-                              <w:t>SUB-TOTAL  – 1</w:t>
-                            </w:r>
-                          </w:p>
-                        </w:tc>
-                        <w:tc>
-                          <w:tcPr>
-                            <w:tcW w:w="2213" w:type="dxa"/>
-                          </w:tcPr>
-                          <w:p>
-                            <w:pPr>
-                              <w:spacing w:before="0" w:after="0"/>
-                              <w:ind w:right="33"/>
-                              <w:rPr>
-                                <w:rFonts w:ascii="Calibri" w:hAnsi="Calibri" w:cs="Calibri"/>
-                                <w:b/>
-                                <w:bCs/>
-                                <w:caps/>
-                                <w:noProof/>
-                                <w:sz w:val="22"/>
-                                <w:szCs w:val="22"/>
-                              </w:rPr>
-                            </w:pPr>
-                            <w:r>
-                              <w:rPr>
                                 <w:rFonts w:ascii="Calibri" w:hAnsi="Calibri" w:cs="Calibri"/>
                                 <w:b/>
                                 <w:bCs/>
                                 <w:sz w:val="22"/>
                                 <w:szCs w:val="22"/>
                               </w:rPr>
-                              <w:fldChar w:fldCharType="begin"/>
-                            </w:r>
-                            <w:r>
-                              <w:rPr>
-                                <w:rFonts w:ascii="Calibri" w:hAnsi="Calibri" w:cs="Calibri"/>
-                                <w:b/>
-                                <w:bCs/>
-                                <w:sz w:val="22"/>
-                                <w:szCs w:val="22"/>
-                              </w:rPr>
-                              <w:instrText xml:space="preserve"> MERGEFIELD  total_neto_placa1  \* MERGEFORMAT </w:instrText>
-                            </w:r>
-                            <w:r>
-                              <w:rPr>
-                                <w:rFonts w:ascii="Calibri" w:hAnsi="Calibri" w:cs="Calibri"/>
-                                <w:b/>
-                                <w:bCs/>
-                                <w:sz w:val="22"/>
-                                <w:szCs w:val="22"/>
-                              </w:rPr>
-                              <w:fldChar w:fldCharType="separate"/>
-                            </w:r>
-                            <w:r>
-                              <w:rPr>
-                                <w:rFonts w:ascii="Calibri" w:hAnsi="Calibri" w:cs="Calibri"/>
-                                <w:b/>
-                                <w:bCs/>
-                                <w:noProof/>
-                                <w:sz w:val="22"/>
-                                <w:szCs w:val="22"/>
-                              </w:rPr>
-                              <w:t>«total_neto_placa1»</w:t>
-                            </w:r>
-                            <w:r>
-                              <w:rPr>
-                                <w:rFonts w:ascii="Calibri" w:hAnsi="Calibri" w:cs="Calibri"/>
-                                <w:b/>
-                                <w:bCs/>
-                                <w:sz w:val="22"/>
-                                <w:szCs w:val="22"/>
-                              </w:rPr>
-                              <w:fldChar w:fldCharType="end"/>
-                            </w:r>
+                            </w:pPr>
                           </w:p>
                         </w:tc>
                       </w:tr>
                     </w:tbl>
-                    <w:p>
-                      <w:pPr>
-                        <w:jc w:val="center"/>
-                      </w:pPr>
-                    </w:p>
+                    <w:p/>
                   </w:txbxContent>
                 </v:textbox>
-                <w10:wrap type="square"/>
+                <w10:wrap type="topAndBottom"/>
               </v:rect>
             </w:pict>
           </mc:Fallback>
@@ -5943,362 +4655,6 @@
         </w:rPr>
       </w:pPr>
     </w:p>
-    <w:p>
-      <w:pPr>
-        <w:spacing w:before="0" w:after="0"/>
-        <w:ind w:firstLine="142"/>
-        <w:rPr>
-          <w:rFonts w:ascii="Calibri" w:hAnsi="Calibri" w:cs="Calibri"/>
-          <w:b/>
-          <w:caps/>
-          <w:noProof/>
-          <w:sz w:val="2"/>
-          <w:szCs w:val="2"/>
-        </w:rPr>
-      </w:pPr>
-    </w:p>
-    <w:p>
-      <w:pPr>
-        <w:spacing w:before="0" w:after="0"/>
-        <w:ind w:firstLine="142"/>
-        <w:rPr>
-          <w:rFonts w:ascii="Calibri" w:hAnsi="Calibri" w:cs="Calibri"/>
-          <w:b/>
-          <w:caps/>
-          <w:noProof/>
-          <w:sz w:val="2"/>
-          <w:szCs w:val="2"/>
-        </w:rPr>
-      </w:pPr>
-    </w:p>
-    <w:p>
-      <w:pPr>
-        <w:spacing w:before="0" w:after="0"/>
-        <w:ind w:firstLine="142"/>
-        <w:rPr>
-          <w:rFonts w:ascii="Calibri" w:hAnsi="Calibri" w:cs="Calibri"/>
-          <w:b/>
-          <w:caps/>
-          <w:noProof/>
-          <w:sz w:val="2"/>
-          <w:szCs w:val="2"/>
-        </w:rPr>
-      </w:pPr>
-    </w:p>
-    <w:p>
-      <w:pPr>
-        <w:spacing w:before="0" w:after="0"/>
-        <w:ind w:firstLine="142"/>
-        <w:rPr>
-          <w:rFonts w:ascii="Calibri" w:hAnsi="Calibri" w:cs="Calibri"/>
-          <w:b/>
-          <w:caps/>
-          <w:noProof/>
-          <w:sz w:val="2"/>
-          <w:szCs w:val="2"/>
-        </w:rPr>
-      </w:pPr>
-    </w:p>
-    <w:p>
-      <w:pPr>
-        <w:spacing w:before="0" w:after="0"/>
-        <w:ind w:firstLine="142"/>
-        <w:rPr>
-          <w:rFonts w:ascii="Calibri" w:hAnsi="Calibri" w:cs="Calibri"/>
-          <w:b/>
-          <w:caps/>
-          <w:noProof/>
-          <w:sz w:val="2"/>
-          <w:szCs w:val="2"/>
-        </w:rPr>
-      </w:pPr>
-    </w:p>
-    <w:p>
-      <w:pPr>
-        <w:spacing w:before="0" w:after="0"/>
-        <w:ind w:firstLine="142"/>
-        <w:rPr>
-          <w:rFonts w:ascii="Calibri" w:hAnsi="Calibri" w:cs="Calibri"/>
-          <w:b/>
-          <w:caps/>
-          <w:noProof/>
-          <w:sz w:val="2"/>
-          <w:szCs w:val="2"/>
-        </w:rPr>
-      </w:pPr>
-    </w:p>
-    <w:p>
-      <w:pPr>
-        <w:spacing w:before="0" w:after="0"/>
-        <w:ind w:firstLine="142"/>
-        <w:rPr>
-          <w:rFonts w:ascii="Calibri" w:hAnsi="Calibri" w:cs="Calibri"/>
-          <w:b/>
-          <w:caps/>
-          <w:noProof/>
-          <w:sz w:val="2"/>
-          <w:szCs w:val="2"/>
-        </w:rPr>
-      </w:pPr>
-    </w:p>
-    <w:p>
-      <w:pPr>
-        <w:spacing w:before="0" w:after="0"/>
-        <w:ind w:firstLine="142"/>
-        <w:rPr>
-          <w:rFonts w:ascii="Calibri" w:hAnsi="Calibri" w:cs="Calibri"/>
-          <w:b/>
-          <w:caps/>
-          <w:noProof/>
-          <w:sz w:val="2"/>
-          <w:szCs w:val="2"/>
-        </w:rPr>
-      </w:pPr>
-    </w:p>
-    <w:p>
-      <w:pPr>
-        <w:spacing w:before="0" w:after="0"/>
-        <w:ind w:firstLine="142"/>
-        <w:rPr>
-          <w:rFonts w:ascii="Calibri" w:hAnsi="Calibri" w:cs="Calibri"/>
-          <w:b/>
-          <w:caps/>
-          <w:noProof/>
-          <w:sz w:val="2"/>
-          <w:szCs w:val="2"/>
-        </w:rPr>
-      </w:pPr>
-    </w:p>
-    <w:p>
-      <w:pPr>
-        <w:spacing w:before="0" w:after="0"/>
-        <w:ind w:firstLine="142"/>
-        <w:rPr>
-          <w:rFonts w:ascii="Calibri" w:hAnsi="Calibri" w:cs="Calibri"/>
-          <w:b/>
-          <w:caps/>
-          <w:noProof/>
-          <w:sz w:val="2"/>
-          <w:szCs w:val="2"/>
-        </w:rPr>
-      </w:pPr>
-    </w:p>
-    <w:p>
-      <w:pPr>
-        <w:spacing w:before="0" w:after="0"/>
-        <w:ind w:firstLine="142"/>
-        <w:rPr>
-          <w:rFonts w:ascii="Calibri" w:hAnsi="Calibri" w:cs="Calibri"/>
-          <w:b/>
-          <w:caps/>
-          <w:noProof/>
-          <w:sz w:val="2"/>
-          <w:szCs w:val="2"/>
-        </w:rPr>
-      </w:pPr>
-    </w:p>
-    <w:p>
-      <w:pPr>
-        <w:spacing w:before="0" w:after="0"/>
-        <w:rPr>
-          <w:rFonts w:ascii="Calibri" w:hAnsi="Calibri" w:cs="Calibri"/>
-          <w:b/>
-          <w:caps/>
-          <w:noProof/>
-          <w:sz w:val="2"/>
-          <w:szCs w:val="2"/>
-        </w:rPr>
-      </w:pPr>
-    </w:p>
-    <w:p>
-      <w:pPr>
-        <w:spacing w:before="0" w:after="0"/>
-        <w:rPr>
-          <w:rFonts w:ascii="Calibri" w:hAnsi="Calibri" w:cs="Calibri"/>
-          <w:b/>
-          <w:caps/>
-          <w:noProof/>
-          <w:sz w:val="2"/>
-          <w:szCs w:val="2"/>
-        </w:rPr>
-      </w:pPr>
-    </w:p>
-    <w:p>
-      <w:pPr>
-        <w:spacing w:before="0" w:after="0"/>
-        <w:rPr>
-          <w:rFonts w:ascii="Calibri" w:hAnsi="Calibri" w:cs="Calibri"/>
-          <w:b/>
-          <w:caps/>
-          <w:noProof/>
-          <w:sz w:val="2"/>
-          <w:szCs w:val="2"/>
-        </w:rPr>
-      </w:pPr>
-    </w:p>
-    <w:p>
-      <w:pPr>
-        <w:spacing w:before="0" w:after="0"/>
-        <w:rPr>
-          <w:rFonts w:ascii="Calibri" w:hAnsi="Calibri" w:cs="Calibri"/>
-          <w:b/>
-          <w:caps/>
-          <w:noProof/>
-          <w:sz w:val="2"/>
-          <w:szCs w:val="2"/>
-        </w:rPr>
-      </w:pPr>
-    </w:p>
-    <w:p>
-      <w:pPr>
-        <w:spacing w:before="0" w:after="0"/>
-        <w:rPr>
-          <w:rFonts w:ascii="Calibri" w:hAnsi="Calibri" w:cs="Calibri"/>
-          <w:b/>
-          <w:caps/>
-          <w:noProof/>
-          <w:sz w:val="2"/>
-          <w:szCs w:val="2"/>
-        </w:rPr>
-      </w:pPr>
-    </w:p>
-    <w:p>
-      <w:pPr>
-        <w:spacing w:before="0" w:after="0"/>
-        <w:rPr>
-          <w:rFonts w:ascii="Calibri" w:hAnsi="Calibri" w:cs="Calibri"/>
-          <w:b/>
-          <w:caps/>
-          <w:noProof/>
-          <w:sz w:val="2"/>
-          <w:szCs w:val="2"/>
-        </w:rPr>
-      </w:pPr>
-    </w:p>
-    <w:p>
-      <w:pPr>
-        <w:spacing w:before="0" w:after="0"/>
-        <w:rPr>
-          <w:rFonts w:ascii="Calibri" w:hAnsi="Calibri" w:cs="Calibri"/>
-          <w:b/>
-          <w:caps/>
-          <w:noProof/>
-          <w:sz w:val="2"/>
-          <w:szCs w:val="2"/>
-        </w:rPr>
-      </w:pPr>
-    </w:p>
-    <w:p>
-      <w:pPr>
-        <w:spacing w:before="0" w:after="0"/>
-        <w:rPr>
-          <w:rFonts w:ascii="Calibri" w:hAnsi="Calibri" w:cs="Calibri"/>
-          <w:b/>
-          <w:caps/>
-          <w:noProof/>
-          <w:sz w:val="2"/>
-          <w:szCs w:val="2"/>
-        </w:rPr>
-      </w:pPr>
-    </w:p>
-    <w:p>
-      <w:pPr>
-        <w:spacing w:before="0" w:after="0"/>
-        <w:rPr>
-          <w:rFonts w:ascii="Calibri" w:hAnsi="Calibri" w:cs="Calibri"/>
-          <w:b/>
-          <w:caps/>
-          <w:noProof/>
-          <w:sz w:val="2"/>
-          <w:szCs w:val="2"/>
-        </w:rPr>
-      </w:pPr>
-    </w:p>
-    <w:p>
-      <w:pPr>
-        <w:spacing w:before="0" w:after="0"/>
-        <w:rPr>
-          <w:rFonts w:ascii="Calibri" w:hAnsi="Calibri" w:cs="Calibri"/>
-          <w:b/>
-          <w:caps/>
-          <w:noProof/>
-          <w:sz w:val="2"/>
-          <w:szCs w:val="2"/>
-        </w:rPr>
-      </w:pPr>
-    </w:p>
-    <w:p>
-      <w:pPr>
-        <w:spacing w:before="0" w:after="0"/>
-        <w:rPr>
-          <w:rFonts w:ascii="Calibri" w:hAnsi="Calibri" w:cs="Calibri"/>
-          <w:b/>
-          <w:caps/>
-          <w:noProof/>
-          <w:sz w:val="2"/>
-          <w:szCs w:val="2"/>
-        </w:rPr>
-      </w:pPr>
-    </w:p>
-    <w:p>
-      <w:pPr>
-        <w:spacing w:before="0" w:after="0"/>
-        <w:rPr>
-          <w:rFonts w:ascii="Calibri" w:hAnsi="Calibri" w:cs="Calibri"/>
-          <w:b/>
-          <w:caps/>
-          <w:noProof/>
-          <w:sz w:val="2"/>
-          <w:szCs w:val="2"/>
-        </w:rPr>
-      </w:pPr>
-    </w:p>
-    <w:p>
-      <w:pPr>
-        <w:spacing w:before="0" w:after="0"/>
-        <w:rPr>
-          <w:rFonts w:ascii="Calibri" w:hAnsi="Calibri" w:cs="Calibri"/>
-          <w:b/>
-          <w:caps/>
-          <w:noProof/>
-          <w:sz w:val="2"/>
-          <w:szCs w:val="2"/>
-        </w:rPr>
-      </w:pPr>
-    </w:p>
-    <w:p>
-      <w:pPr>
-        <w:spacing w:before="0" w:after="0"/>
-        <w:rPr>
-          <w:rFonts w:ascii="Calibri" w:hAnsi="Calibri" w:cs="Calibri"/>
-          <w:b/>
-          <w:caps/>
-          <w:noProof/>
-        </w:rPr>
-      </w:pPr>
-    </w:p>
-    <w:p>
-      <w:pPr>
-        <w:spacing w:before="0" w:after="0"/>
-        <w:rPr>
-          <w:rFonts w:ascii="Calibri" w:hAnsi="Calibri" w:cs="Calibri"/>
-          <w:b/>
-          <w:caps/>
-          <w:noProof/>
-        </w:rPr>
-      </w:pPr>
-    </w:p>
-    <w:p>
-      <w:pPr>
-        <w:spacing w:before="0" w:after="0"/>
-        <w:rPr>
-          <w:rFonts w:ascii="Calibri" w:hAnsi="Calibri" w:cs="Calibri"/>
-          <w:b/>
-          <w:caps/>
-          <w:noProof/>
-        </w:rPr>
-      </w:pPr>
-    </w:p>
     <w:tbl>
       <w:tblPr>
         <w:tblStyle w:val="Tablaconcuadrcula"/>
@@ -6357,7 +4713,7 @@
         </w:tc>
         <w:tc>
           <w:tcPr>
-            <w:tcW w:w="1626" w:type="dxa"/>
+            <w:tcW w:w="2083" w:type="dxa"/>
             <w:tcBorders>
               <w:top w:val="single" w:sz="4" w:space="0" w:color="auto"/>
               <w:left w:val="single" w:sz="4" w:space="0" w:color="auto"/>
@@ -6491,7 +4847,7 @@
         </w:tc>
         <w:tc>
           <w:tcPr>
-            <w:tcW w:w="1158" w:type="dxa"/>
+            <w:tcW w:w="1508" w:type="dxa"/>
           </w:tcPr>
           <w:p>
             <w:pPr>
@@ -6630,7 +4986,7 @@
         </w:tc>
         <w:tc>
           <w:tcPr>
-            <w:tcW w:w="1626" w:type="dxa"/>
+            <w:tcW w:w="2083" w:type="dxa"/>
             <w:tcBorders>
               <w:top w:val="single" w:sz="4" w:space="0" w:color="auto"/>
               <w:bottom w:val="single" w:sz="4" w:space="0" w:color="auto"/>
@@ -6683,7 +5039,7 @@
         </w:tc>
         <w:tc>
           <w:tcPr>
-            <w:tcW w:w="1158" w:type="dxa"/>
+            <w:tcW w:w="1508" w:type="dxa"/>
           </w:tcPr>
           <w:p>
             <w:pPr>
@@ -6753,7 +5109,7 @@
         </w:tc>
         <w:tc>
           <w:tcPr>
-            <w:tcW w:w="1626" w:type="dxa"/>
+            <w:tcW w:w="2083" w:type="dxa"/>
             <w:tcBorders>
               <w:top w:val="single" w:sz="4" w:space="0" w:color="auto"/>
               <w:left w:val="single" w:sz="4" w:space="0" w:color="auto"/>
@@ -6821,7 +5177,7 @@
         </w:tc>
         <w:tc>
           <w:tcPr>
-            <w:tcW w:w="1158" w:type="dxa"/>
+            <w:tcW w:w="1508" w:type="dxa"/>
           </w:tcPr>
           <w:p>
             <w:pPr>
@@ -6931,7 +5287,7 @@
         </w:tc>
         <w:tc>
           <w:tcPr>
-            <w:tcW w:w="1626" w:type="dxa"/>
+            <w:tcW w:w="2083" w:type="dxa"/>
             <w:tcBorders>
               <w:top w:val="single" w:sz="4" w:space="0" w:color="auto"/>
               <w:left w:val="single" w:sz="4" w:space="0" w:color="auto"/>
@@ -7040,7 +5396,7 @@
         </w:tc>
         <w:tc>
           <w:tcPr>
-            <w:tcW w:w="1158" w:type="dxa"/>
+            <w:tcW w:w="1508" w:type="dxa"/>
           </w:tcPr>
           <w:p>
             <w:pPr>
@@ -7096,7 +5452,7 @@
         <mc:AlternateContent>
           <mc:Choice Requires="wps">
             <w:drawing>
-              <wp:anchor distT="0" distB="0" distL="114300" distR="114300" simplePos="0" relativeHeight="251682816" behindDoc="1" locked="0" layoutInCell="1" allowOverlap="1" wp14:anchorId="765002FB" wp14:editId="0D2A0292">
+              <wp:anchor distT="0" distB="0" distL="114300" distR="114300" simplePos="0" relativeHeight="251682816" behindDoc="1" locked="0" layoutInCell="1" allowOverlap="1" wp14:anchorId="765002FB" wp14:editId="440AAE54">
                 <wp:simplePos x="0" y="0"/>
                 <wp:positionH relativeFrom="column">
                   <wp:posOffset>2141855</wp:posOffset>
@@ -7104,7 +5460,7 @@
                 <wp:positionV relativeFrom="paragraph">
                   <wp:posOffset>1917065</wp:posOffset>
                 </wp:positionV>
-                <wp:extent cx="2934970" cy="1066800"/>
+                <wp:extent cx="2934970" cy="731520"/>
                 <wp:effectExtent l="0" t="0" r="0" b="0"/>
                 <wp:wrapTopAndBottom/>
                 <wp:docPr id="1233819399" name="Rectángulo 2"/>
@@ -7116,7 +5472,7 @@
                       <wps:spPr>
                         <a:xfrm>
                           <a:off x="0" y="0"/>
-                          <a:ext cx="2934970" cy="1066800"/>
+                          <a:ext cx="2934970" cy="731520"/>
                         </a:xfrm>
                         <a:prstGeom prst="rect">
                           <a:avLst/>
@@ -7277,7 +5633,7 @@
           </mc:Choice>
           <mc:Fallback>
             <w:pict>
-              <v:rect w14:anchorId="765002FB" id="_x0000_s1029" style="position:absolute;margin-left:168.65pt;margin-top:150.95pt;width:231.1pt;height:84pt;z-index:-251633664;visibility:visible;mso-wrap-style:square;mso-width-percent:0;mso-height-percent:0;mso-wrap-distance-left:9pt;mso-wrap-distance-top:0;mso-wrap-distance-right:9pt;mso-wrap-distance-bottom:0;mso-position-horizontal:absolute;mso-position-horizontal-relative:text;mso-position-vertical:absolute;mso-position-vertical-relative:text;mso-width-percent:0;mso-height-percent:0;mso-width-relative:margin;mso-height-relative:margin;v-text-anchor:middle" o:gfxdata="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" filled="f" stroked="f">
+              <v:rect w14:anchorId="765002FB" id="_x0000_s1028" style="position:absolute;margin-left:168.65pt;margin-top:150.95pt;width:231.1pt;height:57.6pt;z-index:-251633664;visibility:visible;mso-wrap-style:square;mso-width-percent:0;mso-height-percent:0;mso-wrap-distance-left:9pt;mso-wrap-distance-top:0;mso-wrap-distance-right:9pt;mso-wrap-distance-bottom:0;mso-position-horizontal:absolute;mso-position-horizontal-relative:text;mso-position-vertical:absolute;mso-position-vertical-relative:text;mso-width-percent:0;mso-height-percent:0;mso-width-relative:margin;mso-height-relative:margin;v-text-anchor:middle" o:gfxdata="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" filled="f" stroked="f">
                 <v:textbox>
                   <w:txbxContent>
                     <w:tbl>
@@ -7593,7 +5949,7 @@
           </mc:Choice>
           <mc:Fallback>
             <w:pict>
-              <v:rect w14:anchorId="3B26C10D" id="_x0000_s1030" style="position:absolute;margin-left:299.2pt;margin-top:52.55pt;width:231.1pt;height:80.6pt;z-index:-251635712;visibility:visible;mso-wrap-style:square;mso-width-percent:0;mso-height-percent:0;mso-wrap-distance-left:9pt;mso-wrap-distance-top:0;mso-wrap-distance-right:9pt;mso-wrap-distance-bottom:0;mso-position-horizontal:absolute;mso-position-horizontal-relative:text;mso-position-vertical:absolute;mso-position-vertical-relative:text;mso-width-percent:0;mso-height-percent:0;mso-width-relative:margin;mso-height-relative:margin;v-text-anchor:middle" o:gfxdata="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" filled="f" stroked="f">
+              <v:rect w14:anchorId="3B26C10D" id="_x0000_s1029" style="position:absolute;margin-left:299.2pt;margin-top:52.55pt;width:231.1pt;height:80.6pt;z-index:-251635712;visibility:visible;mso-wrap-style:square;mso-width-percent:0;mso-height-percent:0;mso-wrap-distance-left:9pt;mso-wrap-distance-top:0;mso-wrap-distance-right:9pt;mso-wrap-distance-bottom:0;mso-position-horizontal:absolute;mso-position-horizontal-relative:text;mso-position-vertical:absolute;mso-position-vertical-relative:text;mso-width-percent:0;mso-height-percent:0;mso-width-relative:margin;mso-height-relative:margin;v-text-anchor:middle" o:gfxdata="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" filled="f" stroked="f">
                 <v:textbox>
                   <w:txbxContent>
                     <w:tbl>
@@ -7879,7 +6235,7 @@
           </mc:Choice>
           <mc:Fallback>
             <w:pict>
-              <v:rect w14:anchorId="370B154C" id="_x0000_s1031" style="position:absolute;margin-left:26.1pt;margin-top:52.55pt;width:231.1pt;height:77.25pt;z-index:-251637760;visibility:visible;mso-wrap-style:square;mso-width-percent:0;mso-height-percent:0;mso-wrap-distance-left:9pt;mso-wrap-distance-top:0;mso-wrap-distance-right:9pt;mso-wrap-distance-bottom:0;mso-position-horizontal:absolute;mso-position-horizontal-relative:text;mso-position-vertical:absolute;mso-position-vertical-relative:text;mso-width-percent:0;mso-height-percent:0;mso-width-relative:margin;mso-height-relative:margin;v-text-anchor:middle" o:gfxdata="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" filled="f" stroked="f">
+              <v:rect w14:anchorId="370B154C" id="_x0000_s1030" style="position:absolute;margin-left:26.1pt;margin-top:52.55pt;width:231.1pt;height:77.25pt;z-index:-251637760;visibility:visible;mso-wrap-style:square;mso-width-percent:0;mso-height-percent:0;mso-wrap-distance-left:9pt;mso-wrap-distance-top:0;mso-wrap-distance-right:9pt;mso-wrap-distance-bottom:0;mso-position-horizontal:absolute;mso-position-horizontal-relative:text;mso-position-vertical:absolute;mso-position-vertical-relative:text;mso-width-percent:0;mso-height-percent:0;mso-width-relative:margin;mso-height-relative:margin;v-text-anchor:middle" o:gfxdata="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" filled="f" stroked="f">
                 <v:textbox>
                   <w:txbxContent>
                     <w:tbl>

</xml_diff>